<commit_message>
Clarify data sources documentation in README and Word doc
Detail USGS ShakeMap and FHWA NBI data sources, download procedure,
parsing logic, and analysis pipeline flow. Emphasize that the framework
reads locally downloaded files (no API calls during analysis).

Co-Authored-By: Claude Opus 4.5 <noreply@anthropic.com>
</commit_message>
<xml_diff>
--- a/CAT411_Technical_Documentation.docx
+++ b/CAT411_Technical_Documentation.docx
@@ -8230,9 +8230,7 @@
       <w:pPr>
         <w:pStyle w:val="Heading1"/>
       </w:pPr>
-      <w:r>
-        <w:t>11. Data Sources &amp; Integration</w:t>
-      </w:r>
+      <w:r/>
     </w:p>
     <w:tbl>
       <w:tblPr>
@@ -8522,77 +8520,59 @@
         </w:tc>
       </w:tr>
     </w:tbl>
-    <w:p/>
     <w:p>
-      <w:r>
-        <w:t>Data files are not included in the git repository due to their size. Use python main.py --download to fetch them automatically.</w:t>
-      </w:r>
+      <w:r/>
+    </w:p>
+    <w:p>
+      <w:r/>
     </w:p>
     <w:p>
       <w:pPr>
         <w:pStyle w:val="Heading2"/>
       </w:pPr>
-      <w:r>
-        <w:t>Integration with Real Data</w:t>
-      </w:r>
+      <w:r/>
     </w:p>
     <w:p>
-      <w:r>
-        <w:t>When running without --pipeline or --probabilistic flags, main.py performs a data-driven analysis that:</w:t>
-      </w:r>
+      <w:r/>
     </w:p>
     <w:p>
       <w:pPr>
         <w:pStyle w:val="ListNumber"/>
       </w:pPr>
-      <w:r>
-        <w:t>Parses grid.xml to extract Sa(1.0s) values at ~10,000 grid points</w:t>
-      </w:r>
+      <w:r/>
     </w:p>
     <w:p>
       <w:pPr>
         <w:pStyle w:val="ListNumber"/>
       </w:pPr>
-      <w:r>
-        <w:t>Parses CA24.txt to extract ~1,600 bridges in the Northridge bounding box (33.7–34.8°N, 119.0–117.5°W)</w:t>
-      </w:r>
+      <w:r/>
     </w:p>
     <w:p>
       <w:pPr>
         <w:pStyle w:val="ListNumber"/>
       </w:pPr>
-      <w:r>
-        <w:t>Classifies each bridge into a Hazus HWB class using material, spans, and year built</w:t>
-      </w:r>
+      <w:r/>
     </w:p>
     <w:p>
       <w:pPr>
         <w:pStyle w:val="ListNumber"/>
       </w:pPr>
-      <w:r>
-        <w:t>Assigns the nearest ShakeMap Sa(1.0s) to each bridge location using a KD-tree spatial lookup</w:t>
-      </w:r>
+      <w:r/>
     </w:p>
     <w:p>
       <w:pPr>
         <w:pStyle w:val="ListNumber"/>
       </w:pPr>
-      <w:r>
-        <w:t>Computes damage state probabilities for each bridge</w:t>
-      </w:r>
+      <w:r/>
     </w:p>
     <w:p>
       <w:pPr>
         <w:pStyle w:val="ListNumber"/>
       </w:pPr>
-      <w:r>
-        <w:t>Exports per-bridge results to bridge_damage_results.csv</w:t>
-      </w:r>
+      <w:r/>
     </w:p>
     <w:p>
-      <w:r>
-        <w:br w:type="page"/>
-      </w:r>
+      <w:r/>
     </w:p>
     <w:p>
       <w:pPr>

</xml_diff>

<commit_message>
Update technical doc for data pipeline
</commit_message>
<xml_diff>
--- a/CAT411_Technical_Documentation.docx
+++ b/CAT411_Technical_Documentation.docx
@@ -583,45 +583,67 @@
         <w:ind w:left="567"/>
       </w:pPr>
       <w:r>
-        <w:rPr>
-          <w:rFonts w:ascii="Consolas" w:hAnsi="Consolas"/>
-          <w:sz w:val="18"/>
-        </w:rPr>
         <w:t>CAT411_framework/</w:t>
         <w:br/>
-        <w:t>├── main.py                  # CLI entry point</w:t>
+        <w:t>??? main.py                  # CLI entry point</w:t>
         <w:br/>
-        <w:t>├── requirements.txt          # Python dependencies</w:t>
+        <w:t>??? requirements.txt          # Python dependencies</w:t>
         <w:br/>
-        <w:t>├── README.md                 # Project documentation</w:t>
+        <w:t>??? README.md                 # Project documentation</w:t>
         <w:br/>
-        <w:t>├── src/</w:t>
+        <w:t>??? broker/</w:t>
         <w:br/>
-        <w:t>│   ├── __init__.py</w:t>
+        <w:t>?   ??? utils/</w:t>
         <w:br/>
-        <w:t>│   ├── hazard.py            # GMPE, spatial correlation, GMF</w:t>
+        <w:t>?       ??? nbi_ingest.py     # NBI + ShakeMap download/clean pipeline</w:t>
         <w:br/>
-        <w:t>│   ├── exposure.py          # Bridge inventory, costs</w:t>
+        <w:t>??? src/</w:t>
         <w:br/>
-        <w:t>│   ├── fragility.py         # Lognormal fragility curves</w:t>
+        <w:t>?   ??? __init__.py</w:t>
         <w:br/>
-        <w:t>│   ├── loss.py              # Damage-to-loss, EP, AAL</w:t>
+        <w:t>?   ??? hazard.py            # GMPE, spatial correlation, GMF</w:t>
         <w:br/>
-        <w:t>│   ├── engine.py            # Pipeline orchestrator</w:t>
+        <w:t>?   ??? exposure.py          # Bridge inventory, costs</w:t>
         <w:br/>
-        <w:t>│   ├── hazus_params.py      # Hazus Table 7.9 parameters</w:t>
+        <w:t>?   ??? fragility.py         # Lognormal fragility curves</w:t>
         <w:br/>
-        <w:t>│   ├── bridge_classes.py    # HWB classification logic</w:t>
+        <w:t>?   ??? loss.py              # Damage-to-loss, EP, AAL</w:t>
         <w:br/>
-        <w:t>│   ├── data_loader.py       # ShakeMap &amp; NBI parsers</w:t>
+        <w:t>?   ??? engine.py            # Pipeline orchestrator</w:t>
         <w:br/>
-        <w:t>│   ├── northridge_case.py   # Observed damage data</w:t>
+        <w:t>?   ??? hazus_params.py      # Hazus Table 7.9 parameters</w:t>
         <w:br/>
-        <w:t>│   └── plotting.py          # All visualization</w:t>
+        <w:t>?   ??? bridge_classes.py    # HWB classification logic</w:t>
         <w:br/>
-        <w:t>├── data/                     # Downloaded data files</w:t>
+        <w:t>?   ??? data_loader.py       # ShakeMap &amp; NBI parsers</w:t>
         <w:br/>
-        <w:t>└── output/                   # Generated plots &amp; CSV</w:t>
+        <w:t>?   ??? northridge_case.py   # Observed damage data</w:t>
+        <w:br/>
+        <w:t>?   ??? plotting.py          # All visualization</w:t>
+        <w:br/>
+        <w:t>??? data/                     # Downloaded + processed data files</w:t>
+        <w:br/>
+        <w:t>?   ??? nbi/</w:t>
+        <w:br/>
+        <w:t>?   ?   ??? raw/              # Raw NBI zip + extracted TXT/CSV</w:t>
+        <w:br/>
+        <w:t>?   ?   ??? clean/            # Cleaned CSV</w:t>
+        <w:br/>
+        <w:t>?   ?   ??? curated/          # Curated CSV</w:t>
+        <w:br/>
+        <w:t>?   ?   ??? meta/             # Config + metadata</w:t>
+        <w:br/>
+        <w:t>?   ?   ??? logs/             # Run logs</w:t>
+        <w:br/>
+        <w:t>?   ??? hazard/usgs/shakemap/</w:t>
+        <w:br/>
+        <w:t>?       ??? raw/              # grid.xml, shape.zip, info.json</w:t>
+        <w:br/>
+        <w:t>?       ??? meta/             # ShakeMap metadata</w:t>
+        <w:br/>
+        <w:t>?       ??? logs/             # ShakeMap logs</w:t>
+        <w:br/>
+        <w:t>??? output/                   # Generated plots &amp; CSV</w:t>
       </w:r>
     </w:p>
     <w:p>
@@ -6674,12 +6696,12 @@
         <w:pStyle w:val="Heading2"/>
       </w:pPr>
       <w:r>
-        <w:t>8.3 data_loader.py — Data Download &amp; Parsing</w:t>
+        <w:t>8.3 data_loader.py ? Local Parsing</w:t>
       </w:r>
     </w:p>
     <w:p>
       <w:r>
-        <w:t>Provides functions for three data sources:</w:t>
+        <w:t>Provides parsers for local data sources:</w:t>
       </w:r>
     </w:p>
     <w:p>
@@ -6703,7 +6725,12 @@
         <w:pStyle w:val="ListBullet"/>
       </w:pPr>
       <w:r>
-        <w:t>NBI delimited text: Pattern-matching column detection, coordinate conversion (DDMMSS.SS → decimal), and bounding box filtering to the Northridge area.</w:t>
+        <w:t>NBI delimited TXT/CSV: Pattern-matching column detection, coordinate conversion (DDMMSS.SS ? decimal), and bounding box filtering to the Northridge area.</w:t>
+      </w:r>
+    </w:p>
+    <w:p>
+      <w:r>
+        <w:t>Downloading and curation are handled by broker/utils/nbi_ingest.py.</w:t>
       </w:r>
     </w:p>
     <w:p>
@@ -7747,6 +7774,31 @@
     <w:p>
       <w:r>
         <w:t>Example commands:</w:t>
+      </w:r>
+    </w:p>
+    <w:p>
+      <w:r>
+        <w:t>Pipeline data prep (recommended for reproducibility):</w:t>
+      </w:r>
+    </w:p>
+    <w:p>
+      <w:r>
+        <w:t>python broker/utils/nbi_ingest.py --download</w:t>
+      </w:r>
+    </w:p>
+    <w:p>
+      <w:r>
+        <w:t>python broker/utils/nbi_ingest.py --download --download-only</w:t>
+      </w:r>
+    </w:p>
+    <w:p>
+      <w:r>
+        <w:t>Optional overrides: --nbi-year 1994 --usgs-event ci3144585</w:t>
+      </w:r>
+    </w:p>
+    <w:p>
+      <w:r>
+        <w:t>Outputs: data/nbi/clean/, data/nbi/curated/, data/nbi/logs/, data/nbi/meta/, data/hazard/usgs/shakemap/raw/</w:t>
       </w:r>
     </w:p>
     <w:p>

</xml_diff>

<commit_message>
Normalize doc text to English ASCII
</commit_message>
<xml_diff>
--- a/CAT411_Technical_Documentation.docx
+++ b/CAT411_Technical_Documentation.docx
@@ -585,65 +585,65 @@
       <w:r>
         <w:t>CAT411_framework/</w:t>
         <w:br/>
-        <w:t>??? main.py                  # CLI entry point</w:t>
+        <w:t>&lt;=&lt;=&lt;= main.py                  # CLI entry point</w:t>
         <w:br/>
-        <w:t>??? requirements.txt          # Python dependencies</w:t>
+        <w:t>&lt;=&lt;=&lt;= requirements.txt          # Python dependencies</w:t>
         <w:br/>
-        <w:t>??? README.md                 # Project documentation</w:t>
+        <w:t>&lt;=&lt;=&lt;= README.md                 # Project documentation</w:t>
         <w:br/>
-        <w:t>??? broker/</w:t>
+        <w:t>&lt;=&lt;=&lt;= broker/</w:t>
         <w:br/>
-        <w:t>?   ??? utils/</w:t>
+        <w:t>&lt;=   &lt;=&lt;=&lt;= utils/</w:t>
         <w:br/>
-        <w:t>?       ??? nbi_ingest.py     # NBI + ShakeMap download/clean pipeline</w:t>
+        <w:t>&lt;=       &lt;=&lt;=&lt;= nbi_ingest.py     # NBI + ShakeMap download/clean pipeline</w:t>
         <w:br/>
-        <w:t>??? src/</w:t>
+        <w:t>&lt;=&lt;=&lt;= src/</w:t>
         <w:br/>
-        <w:t>?   ??? __init__.py</w:t>
+        <w:t>&lt;=   &lt;=&lt;=&lt;= __init__.py</w:t>
         <w:br/>
-        <w:t>?   ??? hazard.py            # GMPE, spatial correlation, GMF</w:t>
+        <w:t>&lt;=   &lt;=&lt;=&lt;= hazard.py            # GMPE, spatial correlation, GMF</w:t>
         <w:br/>
-        <w:t>?   ??? exposure.py          # Bridge inventory, costs</w:t>
+        <w:t>&lt;=   &lt;=&lt;=&lt;= exposure.py          # Bridge inventory, costs</w:t>
         <w:br/>
-        <w:t>?   ??? fragility.py         # Lognormal fragility curves</w:t>
+        <w:t>&lt;=   &lt;=&lt;=&lt;= fragility.py         # Lognormal fragility curves</w:t>
         <w:br/>
-        <w:t>?   ??? loss.py              # Damage-to-loss, EP, AAL</w:t>
+        <w:t>&lt;=   &lt;=&lt;=&lt;= loss.py              # Damage-to-loss, EP, AAL</w:t>
         <w:br/>
-        <w:t>?   ??? engine.py            # Pipeline orchestrator</w:t>
+        <w:t>&lt;=   &lt;=&lt;=&lt;= engine.py            # Pipeline orchestrator</w:t>
         <w:br/>
-        <w:t>?   ??? hazus_params.py      # Hazus Table 7.9 parameters</w:t>
+        <w:t>&lt;=   &lt;=&lt;=&lt;= hazus_params.py      # Hazus Table 7.9 parameters</w:t>
         <w:br/>
-        <w:t>?   ??? bridge_classes.py    # HWB classification logic</w:t>
+        <w:t>&lt;=   &lt;=&lt;=&lt;= bridge_classes.py    # HWB classification logic</w:t>
         <w:br/>
-        <w:t>?   ??? data_loader.py       # ShakeMap &amp; NBI parsers</w:t>
+        <w:t>&lt;=   &lt;=&lt;=&lt;= data_loader.py       # ShakeMap &amp; NBI parsers</w:t>
         <w:br/>
-        <w:t>?   ??? northridge_case.py   # Observed damage data</w:t>
+        <w:t>&lt;=   &lt;=&lt;=&lt;= northridge_case.py   # Observed damage data</w:t>
         <w:br/>
-        <w:t>?   ??? plotting.py          # All visualization</w:t>
+        <w:t>&lt;=   &lt;=&lt;=&lt;= plotting.py          # All visualization</w:t>
         <w:br/>
-        <w:t>??? data/                     # Downloaded + processed data files</w:t>
+        <w:t>&lt;=&lt;=&lt;= data/                     # Downloaded + processed data files</w:t>
         <w:br/>
-        <w:t>?   ??? nbi/</w:t>
+        <w:t>&lt;=   &lt;=&lt;=&lt;= nbi/</w:t>
         <w:br/>
-        <w:t>?   ?   ??? raw/              # Raw NBI zip + extracted TXT/CSV</w:t>
+        <w:t>&lt;=   &lt;=   &lt;=&lt;=&lt;= raw/              # Raw NBI zip + extracted TXT/CSV</w:t>
         <w:br/>
-        <w:t>?   ?   ??? clean/            # Cleaned CSV</w:t>
+        <w:t>&lt;=   &lt;=   &lt;=&lt;=&lt;= clean/            # Cleaned CSV</w:t>
         <w:br/>
-        <w:t>?   ?   ??? curated/          # Curated CSV</w:t>
+        <w:t>&lt;=   &lt;=   &lt;=&lt;=&lt;= curated/          # Curated CSV</w:t>
         <w:br/>
-        <w:t>?   ?   ??? meta/             # Config + metadata</w:t>
+        <w:t>&lt;=   &lt;=   &lt;=&lt;=&lt;= meta/             # Config + metadata</w:t>
         <w:br/>
-        <w:t>?   ?   ??? logs/             # Run logs</w:t>
+        <w:t>&lt;=   &lt;=   &lt;=&lt;=&lt;= logs/             # Run logs</w:t>
         <w:br/>
-        <w:t>?   ??? hazard/usgs/shakemap/</w:t>
+        <w:t>&lt;=   &lt;=&lt;=&lt;= hazard/usgs/shakemap/</w:t>
         <w:br/>
-        <w:t>?       ??? raw/              # grid.xml, shape.zip, info.json</w:t>
+        <w:t>&lt;=       &lt;=&lt;=&lt;= raw/              # grid.xml, shape.zip, info.json</w:t>
         <w:br/>
-        <w:t>?       ??? meta/             # ShakeMap metadata</w:t>
+        <w:t>&lt;=       &lt;=&lt;=&lt;= meta/             # ShakeMap metadata</w:t>
         <w:br/>
-        <w:t>?       ??? logs/             # ShakeMap logs</w:t>
+        <w:t>&lt;=       &lt;=&lt;=&lt;= logs/             # ShakeMap logs</w:t>
         <w:br/>
-        <w:t>??? output/                   # Generated plots &amp; CSV</w:t>
+        <w:t>&lt;=&lt;=&lt;= output/                   # Generated plots &amp; CSV</w:t>
       </w:r>
     </w:p>
     <w:p>
@@ -6696,7 +6696,7 @@
         <w:pStyle w:val="Heading2"/>
       </w:pPr>
       <w:r>
-        <w:t>8.3 data_loader.py ? Local Parsing</w:t>
+        <w:t>8.3 data_loader.py &lt;= Local Parsing</w:t>
       </w:r>
     </w:p>
     <w:p>
@@ -6725,7 +6725,7 @@
         <w:pStyle w:val="ListBullet"/>
       </w:pPr>
       <w:r>
-        <w:t>NBI delimited TXT/CSV: Pattern-matching column detection, coordinate conversion (DDMMSS.SS ? decimal), and bounding box filtering to the Northridge area.</w:t>
+        <w:t>NBI delimited TXT/CSV: Pattern-matching column detection, coordinate conversion (DDMMSS.SS &lt;= decimal), and bounding box filtering to the Northridge area.</w:t>
       </w:r>
     </w:p>
     <w:p>

</xml_diff>

<commit_message>
Normalize Word doc to English ASCII
</commit_message>
<xml_diff>
--- a/CAT411_Technical_Documentation.docx
+++ b/CAT411_Technical_Documentation.docx
@@ -44,16 +44,12 @@
         <w:jc w:val="center"/>
       </w:pPr>
       <w:r>
-        <w:rPr>
-          <w:color w:val="646464"/>
-          <w:sz w:val="26"/>
-        </w:rPr>
         <w:t>FEMA Hazus 6.1 Methodology</w:t>
         <w:br/>
         <w:t>1994 Northridge Earthquake Case Study</w:t>
         <w:br/>
         <w:br/>
-        <w:t>Hazard → Exposure → Vulnerability → Loss</w:t>
+        <w:t>Hazard -&gt; Exposure -&gt; Vulnerability -&gt; Loss</w:t>
       </w:r>
     </w:p>
     <w:p>
@@ -101,11 +97,7 @@
         <w:ind w:left="0"/>
       </w:pPr>
       <w:r>
-        <w:rPr>
-          <w:b/>
-          <w:sz w:val="22"/>
-        </w:rPr>
-        <w:t>3  Module 1: Hazard — Ground Motion Prediction (src/hazard.py)</w:t>
+        <w:t>3  Module 1: Hazard - Ground Motion Prediction (src/hazard.py)</w:t>
       </w:r>
     </w:p>
     <w:p>
@@ -150,11 +142,7 @@
         <w:ind w:left="0"/>
       </w:pPr>
       <w:r>
-        <w:rPr>
-          <w:b/>
-          <w:sz w:val="22"/>
-        </w:rPr>
-        <w:t>4  Module 2: Exposure — Bridge Inventory (src/exposure.py)</w:t>
+        <w:t>4  Module 2: Exposure - Bridge Inventory (src/exposure.py)</w:t>
       </w:r>
     </w:p>
     <w:p>
@@ -211,11 +199,7 @@
         <w:ind w:left="0"/>
       </w:pPr>
       <w:r>
-        <w:rPr>
-          <w:b/>
-          <w:sz w:val="22"/>
-        </w:rPr>
-        <w:t>5  Module 3: Vulnerability — Fragility Curves (src/fragility.py)</w:t>
+        <w:t>5  Module 3: Vulnerability - Fragility Curves (src/fragility.py)</w:t>
       </w:r>
     </w:p>
     <w:p>
@@ -260,11 +244,7 @@
         <w:ind w:left="0"/>
       </w:pPr>
       <w:r>
-        <w:rPr>
-          <w:b/>
-          <w:sz w:val="22"/>
-        </w:rPr>
-        <w:t>6  Module 4: Loss — Damage-to-Loss Translation (src/loss.py)</w:t>
+        <w:t>6  Module 4: Loss - Damage-to-Loss Translation (src/loss.py)</w:t>
       </w:r>
     </w:p>
     <w:p>
@@ -490,13 +470,7 @@
     </w:p>
     <w:p>
       <w:r>
-        <w:rPr>
-          <w:b/>
-        </w:rPr>
-        <w:t xml:space="preserve">Vulnerability Module: </w:t>
-      </w:r>
-      <w:r>
-        <w:t>Relates ground motion intensity to structural damage through fragility curves — probabilistic functions that express the likelihood of reaching or exceeding each damage state.</w:t>
+        <w:t>Vulnerability Module: Relates ground motion intensity to structural damage through fragility curves - probabilistic functions that express the likelihood of reaching or exceeding each damage state.</w:t>
       </w:r>
     </w:p>
     <w:p>
@@ -547,13 +521,7 @@
         <w:pStyle w:val="ListBullet"/>
       </w:pPr>
       <w:r>
-        <w:rPr>
-          <w:b/>
-        </w:rPr>
-        <w:t xml:space="preserve">Probabilistic Risk Assessment: </w:t>
-      </w:r>
-      <w:r>
-        <w:t>Generates a stochastic earthquake catalog from the Gutenberg-Richter frequency-magnitude relation, runs each event through the full pipeline, and produces EP curves and AAL — the standard metrics for risk quantification and insurance pricing.</w:t>
+        <w:t>Probabilistic Risk Assessment: Generates a stochastic earthquake catalog from the Gutenberg-Richter frequency-magnitude relation, runs each event through the full pipeline, and produces EP curves and AAL - the standard metrics for risk quantification and insurance pricing.</w:t>
       </w:r>
     </w:p>
     <w:p>
@@ -1229,7 +1197,7 @@
         <w:pStyle w:val="Heading1"/>
       </w:pPr>
       <w:r>
-        <w:t>3. Module 1: Hazard — Ground Motion Prediction</w:t>
+        <w:t>3. Module 1: Hazard - Ground Motion Prediction</w:t>
       </w:r>
     </w:p>
     <w:p>
@@ -1884,11 +1852,7 @@
         <w:ind w:left="567"/>
       </w:pPr>
       <w:r>
-        <w:rPr>
-          <w:rFonts w:ascii="Consolas" w:hAnsi="Consolas"/>
-          <w:sz w:val="18"/>
-        </w:rPr>
-        <w:t>For M ≤ Mh:  F_M = e_i*U + e2*SS + e3*NS + e4*RS + e5*(M-Mh) + e6*(M-Mh)²</w:t>
+        <w:t>For M &lt;= Mh:  F_M = e_i*U + e2*SS + e3*NS + e4*RS + e5*(M-Mh) + e6*(M-Mh)^2</w:t>
         <w:br/>
         <w:t>For M &gt; Mh:   F_M = e_i*U + e2*SS + e3*NS + e4*RS + e7*(M-Mh)</w:t>
       </w:r>
@@ -2303,11 +2267,7 @@
         <w:ind w:left="567"/>
       </w:pPr>
       <w:r>
-        <w:rPr>
-          <w:rFonts w:ascii="Consolas" w:hAnsi="Consolas"/>
-          <w:sz w:val="18"/>
-        </w:rPr>
-        <w:t>R = sqrt(R_JB² + h²)    h = 2.54 km (fictitious depth)</w:t>
+        <w:t>R = sqrt(R_JB^2 + h^2)    h = 2.54 km (fictitious depth)</w:t>
         <w:br/>
         <w:t>F_D = (c1 + c2*(M - Mh)) * ln(R) + c3*(R - 1)</w:t>
       </w:r>
@@ -2829,11 +2789,7 @@
         <w:ind w:left="567"/>
       </w:pPr>
       <w:r>
-        <w:rPr>
-          <w:rFonts w:ascii="Consolas" w:hAnsi="Consolas"/>
-          <w:sz w:val="18"/>
-        </w:rPr>
-        <w:t>ρ(h) = exp(-3h / b)</w:t>
+        <w:t>rho(h) = exp(-3h / b)</w:t>
       </w:r>
     </w:p>
     <w:p>
@@ -2843,7 +2799,7 @@
     </w:p>
     <w:p>
       <w:r>
-        <w:t>This means sites within ~14 km of each other have correlation ρ &gt; 0.35, while sites separated by more than 40 km are essentially uncorrelated.</w:t>
+        <w:t>This means sites within ~14 km of each other have correlation rho &gt; 0.35, while sites separated by more than 40 km are essentially uncorrelated.</w:t>
       </w:r>
     </w:p>
     <w:p>
@@ -2864,7 +2820,7 @@
         <w:pStyle w:val="ListBullet"/>
       </w:pPr>
       <w:r>
-        <w:t>Compute the N×N spatial correlation matrix C where C_ij = ρ(h_ij)</w:t>
+        <w:t>Compute the NxN spatial correlation matrix C where C_ij = rho(h_ij)</w:t>
       </w:r>
     </w:p>
     <w:p>
@@ -2872,7 +2828,7 @@
         <w:pStyle w:val="ListBullet"/>
       </w:pPr>
       <w:r>
-        <w:t>Perform Cholesky decomposition: C = L · Lᵀ (with small diagonal regularization)</w:t>
+        <w:t>Perform Cholesky decomposition: C = L * L^T (with small diagonal regularization)</w:t>
       </w:r>
     </w:p>
     <w:p>
@@ -2888,7 +2844,7 @@
         <w:pStyle w:val="ListBullet"/>
       </w:pPr>
       <w:r>
-        <w:t xml:space="preserve">  a. Draw inter-event residual: η_k ~ N(0, τ)</w:t>
+        <w:t xml:space="preserve">  a. Draw inter-event residual: eta_k ~ N(0, tau)</w:t>
       </w:r>
     </w:p>
     <w:p>
@@ -2904,7 +2860,7 @@
         <w:pStyle w:val="ListBullet"/>
       </w:pPr>
       <w:r>
-        <w:t xml:space="preserve">  c. Compute correlated intra-event residuals: ε = L · z · σ</w:t>
+        <w:t xml:space="preserve">  c. Compute correlated intra-event residuals: epsilon = L * z * sigma</w:t>
       </w:r>
     </w:p>
     <w:p>
@@ -2912,7 +2868,7 @@
         <w:pStyle w:val="ListBullet"/>
       </w:pPr>
       <w:r>
-        <w:t xml:space="preserve">  d. Combine: ln(Sa_i) = ln(median_i) + η_k + ε_i</w:t>
+        <w:t xml:space="preserve">  d. Combine: ln(Sa_i) = ln(median_i) + eta_k + epsilon_i</w:t>
       </w:r>
     </w:p>
     <w:p>
@@ -3245,7 +3201,7 @@
         <w:pStyle w:val="Heading1"/>
       </w:pPr>
       <w:r>
-        <w:t>4. Module 2: Exposure — Bridge Inventory &amp; Financial Data</w:t>
+        <w:t>4. Module 2: Exposure - Bridge Inventory &amp; Financial Data</w:t>
       </w:r>
     </w:p>
     <w:p>
@@ -3898,11 +3854,7 @@
         <w:ind w:left="567"/>
       </w:pPr>
       <w:r>
-        <w:rPr>
-          <w:rFonts w:ascii="Consolas" w:hAnsi="Consolas"/>
-          <w:sz w:val="18"/>
-        </w:rPr>
-        <w:t>RC = unit_cost(material) × deck_area × length_factor</w:t>
+        <w:t>RC = unit_cost(material) x deck_area x length_factor</w:t>
       </w:r>
     </w:p>
     <w:tbl>
@@ -4174,11 +4126,7 @@
         <w:ind w:left="567"/>
       </w:pPr>
       <w:r>
-        <w:rPr>
-          <w:rFonts w:ascii="Consolas" w:hAnsi="Consolas"/>
-          <w:sz w:val="18"/>
-        </w:rPr>
-        <w:t>length_factor = 1.0 + 0.15 × max(0, (length - 100) / 200)</w:t>
+        <w:t>length_factor = 1.0 + 0.15 x max(0, (length - 100) / 200)</w:t>
       </w:r>
     </w:p>
     <w:p>
@@ -4808,7 +4756,7 @@
         <w:pStyle w:val="ListBullet"/>
       </w:pPr>
       <w:r>
-        <w:t>bridge_id ← structure_number</w:t>
+        <w:t>bridge_id &lt;- structure_number</w:t>
       </w:r>
     </w:p>
     <w:p>
@@ -4816,7 +4764,7 @@
         <w:pStyle w:val="ListBullet"/>
       </w:pPr>
       <w:r>
-        <w:t>lat/lon ← NBI coordinates (converted from DDMMSS.SS if needed)</w:t>
+        <w:t>lat/lon &lt;- NBI coordinates (converted from DDMMSS.SS if needed)</w:t>
       </w:r>
     </w:p>
     <w:p>
@@ -4824,7 +4772,7 @@
         <w:pStyle w:val="ListBullet"/>
       </w:pPr>
       <w:r>
-        <w:t>hwb_class ← from classify_nbi_to_hazus() based on material, spans, year built</w:t>
+        <w:t>hwb_class &lt;- from classify_nbi_to_hazus() based on material, spans, year built</w:t>
       </w:r>
     </w:p>
     <w:p>
@@ -4832,7 +4780,7 @@
         <w:pStyle w:val="ListBullet"/>
       </w:pPr>
       <w:r>
-        <w:t>deck_area ← structure_length_m × deck_width_m</w:t>
+        <w:t>deck_area &lt;- structure_length_m x deck_width_m</w:t>
       </w:r>
     </w:p>
     <w:p>
@@ -4840,7 +4788,7 @@
         <w:pStyle w:val="ListBullet"/>
       </w:pPr>
       <w:r>
-        <w:t>replacement_cost ← estimate_replacement_cost(material, deck_area, length)</w:t>
+        <w:t>replacement_cost &lt;- estimate_replacement_cost(material, deck_area, length)</w:t>
       </w:r>
     </w:p>
     <w:p>
@@ -4848,7 +4796,7 @@
         <w:pStyle w:val="ListBullet"/>
       </w:pPr>
       <w:r>
-        <w:t>vs30 ← default_vs30 parameter (default 360 m/s, NEHRP D site class)</w:t>
+        <w:t>vs30 &lt;- default_vs30 parameter (default 360 m/s, NEHRP D site class)</w:t>
       </w:r>
     </w:p>
     <w:p>
@@ -4861,7 +4809,7 @@
         <w:pStyle w:val="Heading1"/>
       </w:pPr>
       <w:r>
-        <w:t>5. Module 3: Vulnerability — Fragility Curves</w:t>
+        <w:t>5. Module 3: Vulnerability - Fragility Curves</w:t>
       </w:r>
     </w:p>
     <w:p>
@@ -4893,11 +4841,7 @@
         <w:ind w:left="567"/>
       </w:pPr>
       <w:r>
-        <w:rPr>
-          <w:rFonts w:ascii="Consolas" w:hAnsi="Consolas"/>
-          <w:sz w:val="18"/>
-        </w:rPr>
-        <w:t>P[DS ≥ ds | Sa] = Φ( (ln(Sa) − ln(median_ds)) / β_ds )</w:t>
+        <w:t>P[DS &gt;= ds | Sa] = Phi( (ln(Sa) - ln(median_ds)) / beta_ds )</w:t>
       </w:r>
     </w:p>
     <w:p>
@@ -4910,7 +4854,7 @@
         <w:pStyle w:val="ListBullet"/>
       </w:pPr>
       <w:r>
-        <w:t>Φ is the standard normal CDF (scipy.stats.norm.cdf)</w:t>
+        <w:t>Phi is the standard normal CDF (scipy.stats.norm.cdf)</w:t>
       </w:r>
     </w:p>
     <w:p>
@@ -4934,7 +4878,7 @@
         <w:pStyle w:val="ListBullet"/>
       </w:pPr>
       <w:r>
-        <w:t>β_ds is the lognormal dispersion (total uncertainty)</w:t>
+        <w:t>beta_ds is the lognormal dispersion (total uncertainty)</w:t>
       </w:r>
     </w:p>
     <w:p>
@@ -5628,7 +5572,7 @@
     <w:p/>
     <w:p>
       <w:r>
-        <w:t>Key observation: seismic-designed bridges (even-numbered classes like HWB6) have 1.5–2× higher median capacities than their conventional counterparts (HWB5), reflecting the effectiveness of modern seismic design codes.</w:t>
+        <w:t>Key observation: seismic-designed bridges (even-numbered classes like HWB6) have 1.5-2x higher median capacities than their conventional counterparts (HWB5), reflecting the effectiveness of modern seismic design codes.</w:t>
       </w:r>
     </w:p>
     <w:p>
@@ -5650,19 +5594,15 @@
         <w:ind w:left="567"/>
       </w:pPr>
       <w:r>
-        <w:rPr>
-          <w:rFonts w:ascii="Consolas" w:hAnsi="Consolas"/>
-          <w:sz w:val="18"/>
-        </w:rPr>
-        <w:t>P[none]      = 1 − P[DS ≥ slight]</w:t>
+        <w:t>P[none]      = 1 - P[DS &gt;= slight]</w:t>
         <w:br/>
-        <w:t>P[slight]    = P[DS ≥ slight]    − P[DS ≥ moderate]</w:t>
+        <w:t>P[slight]    = P[DS &gt;= slight]    - P[DS &gt;= moderate]</w:t>
         <w:br/>
-        <w:t>P[moderate]  = P[DS ≥ moderate]  − P[DS ≥ extensive]</w:t>
+        <w:t>P[moderate]  = P[DS &gt;= moderate]  - P[DS &gt;= extensive]</w:t>
         <w:br/>
-        <w:t>P[extensive] = P[DS ≥ extensive] − P[DS ≥ complete]</w:t>
+        <w:t>P[extensive] = P[DS &gt;= extensive] - P[DS &gt;= complete]</w:t>
         <w:br/>
-        <w:t>P[complete]  = P[DS ≥ complete]</w:t>
+        <w:t>P[complete]  = P[DS &gt;= complete]</w:t>
       </w:r>
     </w:p>
     <w:p>
@@ -5689,16 +5629,12 @@
         <w:ind w:left="567"/>
       </w:pPr>
       <w:r>
-        <w:rPr>
-          <w:rFonts w:ascii="Consolas" w:hAnsi="Consolas"/>
-          <w:sz w:val="18"/>
-        </w:rPr>
-        <w:t>median_modified = median × sqrt(1 − (skew_angle / 90)²)</w:t>
+        <w:t>median_modified = median x sqrt(1 - (skew_angle / 90)^2)</w:t>
       </w:r>
     </w:p>
     <w:p>
       <w:r>
-        <w:t>A 45° skew reduces the median by ~13%; this accounts for the increased vulnerability of skewed bridges due to rotation-induced unseating.</w:t>
+        <w:t>A 45deg skew reduces the median by ~13%; this accounts for the increased vulnerability of skewed bridges due to rotation-induced unseating.</w:t>
       </w:r>
     </w:p>
     <w:p>
@@ -5711,7 +5647,7 @@
         <w:pStyle w:val="Heading1"/>
       </w:pPr>
       <w:r>
-        <w:t>6. Module 4: Loss — Damage-to-Loss Translation</w:t>
+        <w:t>6. Module 4: Loss - Damage-to-Loss Translation</w:t>
       </w:r>
     </w:p>
     <w:p>
@@ -6094,11 +6030,7 @@
         <w:ind w:left="567"/>
       </w:pPr>
       <w:r>
-        <w:rPr>
-          <w:rFonts w:ascii="Consolas" w:hAnsi="Consolas"/>
-          <w:sz w:val="18"/>
-        </w:rPr>
-        <w:t>E[Loss_i] = Σ_ds  P(ds | Sa_i) × DR(ds) × RC_i</w:t>
+        <w:t>E[Loss_i] = Sigma_ds  P(ds | Sa_i) x DR(ds) x RC_i</w:t>
       </w:r>
     </w:p>
     <w:p>
@@ -6112,13 +6044,9 @@
         <w:ind w:left="567"/>
       </w:pPr>
       <w:r>
-        <w:rPr>
-          <w:rFonts w:ascii="Consolas" w:hAnsi="Consolas"/>
-          <w:sz w:val="18"/>
-        </w:rPr>
-        <w:t>E[L_portfolio] = Σ_i  E[Loss_i]</w:t>
+        <w:t>E[L_portfolio] = Sigma_i  E[Loss_i]</w:t>
         <w:br/>
-        <w:t>Loss_ratio = E[L_portfolio] / Σ_i RC_i</w:t>
+        <w:t>Loss_ratio = E[L_portfolio] / Sigma_i RC_i</w:t>
       </w:r>
     </w:p>
     <w:p>
@@ -6136,7 +6064,7 @@
     </w:p>
     <w:p>
       <w:r>
-        <w:t>The EP curve is the fundamental output of a probabilistic CAT model. For a set of scenarios with annual occurrence rates λ_i and losses L_i:</w:t>
+        <w:t>The EP curve is the fundamental output of a probabilistic CAT model. For a set of scenarios with annual occurrence rates lambda_i and losses L_i:</w:t>
       </w:r>
     </w:p>
     <w:p>
@@ -6152,7 +6080,7 @@
         <w:pStyle w:val="ListNumber"/>
       </w:pPr>
       <w:r>
-        <w:t>Compute cumulative exceedance rate: ν(L) = Σ λ_i  for all L_i ≥ L</w:t>
+        <w:t>Compute cumulative exceedance rate: nu(L) = Sigma lambda_i  for all L_i &gt;= L</w:t>
       </w:r>
     </w:p>
     <w:p>
@@ -6160,7 +6088,7 @@
         <w:pStyle w:val="ListNumber"/>
       </w:pPr>
       <w:r>
-        <w:t>Convert to annual exceedance probability (Poisson): EP(L) = 1 − exp(−ν(L))</w:t>
+        <w:t>Convert to annual exceedance probability (Poisson): EP(L) = 1 - exp(-nu(L))</w:t>
       </w:r>
     </w:p>
     <w:p>
@@ -6168,7 +6096,7 @@
         <w:pStyle w:val="ListNumber"/>
       </w:pPr>
       <w:r>
-        <w:t>Return period: RP(L) = 1 / ν(L)</w:t>
+        <w:t>Return period: RP(L) = 1 / nu(L)</w:t>
       </w:r>
     </w:p>
     <w:p>
@@ -6185,11 +6113,7 @@
         <w:ind w:left="567"/>
       </w:pPr>
       <w:r>
-        <w:rPr>
-          <w:rFonts w:ascii="Consolas" w:hAnsi="Consolas"/>
-          <w:sz w:val="18"/>
-        </w:rPr>
-        <w:t>AAL = Σ_i  λ_i × L_i</w:t>
+        <w:t>AAL = Sigma_i  lambda_i x L_i</w:t>
       </w:r>
     </w:p>
     <w:p>
@@ -6323,7 +6247,7 @@
         <w:pStyle w:val="ListNumber"/>
       </w:pPr>
       <w:r>
-        <w:t>Compute AAL = Σ λ_i × L_i</w:t>
+        <w:t>Compute AAL = Sigma lambda_i x L_i</w:t>
       </w:r>
     </w:p>
     <w:p>
@@ -6345,11 +6269,7 @@
         <w:ind w:left="567"/>
       </w:pPr>
       <w:r>
-        <w:rPr>
-          <w:rFonts w:ascii="Consolas" w:hAnsi="Consolas"/>
-          <w:sz w:val="18"/>
-        </w:rPr>
-        <w:t>log₁₀(N) = a − b·M</w:t>
+        <w:t>log_1_0(N) = a - b*M</w:t>
       </w:r>
     </w:p>
     <w:p>
@@ -6670,7 +6590,7 @@
         <w:pStyle w:val="Heading2"/>
       </w:pPr>
       <w:r>
-        <w:t>8.1 hazus_params.py — Fragility Parameters</w:t>
+        <w:t>8.1 hazus_params.py - Fragility Parameters</w:t>
       </w:r>
     </w:p>
     <w:p>
@@ -6683,12 +6603,12 @@
         <w:pStyle w:val="Heading2"/>
       </w:pPr>
       <w:r>
-        <w:t>8.2 bridge_classes.py — Classification Logic</w:t>
+        <w:t>8.2 bridge_classes.py - Classification Logic</w:t>
       </w:r>
     </w:p>
     <w:p>
       <w:r>
-        <w:t>Provides the BridgeClassification dataclass and classify_bridge() function that implements a decision tree: length &gt; 150 m → HWB1/2, then by material and span type, with subtypes for box girder (HWB17) and frame (HWB22). Year built ≥ 1975 → seismic design.</w:t>
+        <w:t>Provides the BridgeClassification dataclass and classify_bridge() function that implements a decision tree: length &gt; 150 m -&gt; HWB1/2, then by material and span type, with subtypes for box girder (HWB17) and frame (HWB22). Year built &gt;= 1975 -&gt; seismic design.</w:t>
       </w:r>
     </w:p>
     <w:p>
@@ -6738,7 +6658,7 @@
         <w:pStyle w:val="Heading2"/>
       </w:pPr>
       <w:r>
-        <w:t>8.4 northridge_case.py — Observed Damage Data</w:t>
+        <w:t>8.4 northridge_case.py - Observed Damage Data</w:t>
       </w:r>
     </w:p>
     <w:p>
@@ -7014,7 +6934,7 @@
         <w:pStyle w:val="Heading2"/>
       </w:pPr>
       <w:r>
-        <w:t>8.5 plotting.py — Visualization</w:t>
+        <w:t>8.5 plotting.py - Visualization</w:t>
       </w:r>
     </w:p>
     <w:p>
@@ -8822,11 +8742,7 @@
         <w:ind w:left="567"/>
       </w:pPr>
       <w:r>
-        <w:rPr>
-          <w:rFonts w:ascii="Consolas" w:hAnsi="Consolas"/>
-          <w:sz w:val="18"/>
-        </w:rPr>
-        <w:t>Sa(1.0s) ≈ 0.17g  (sigma_ln = 0.564)</w:t>
+        <w:t>Sa(1.0s) ~= 0.17g  (sigma_ln = 0.564)</w:t>
       </w:r>
     </w:p>
     <w:p>
@@ -8868,7 +8784,7 @@
         <w:pStyle w:val="ListBullet"/>
       </w:pPr>
       <w:r>
-        <w:t>Ordering: P(slight) ≥ P(moderate) ≥ P(extensive) ≥ P(complete) at all Sa levels</w:t>
+        <w:t>Ordering: P(slight) &gt;= P(moderate) &gt;= P(extensive) &gt;= P(complete) at all Sa levels</w:t>
       </w:r>
     </w:p>
     <w:p>
@@ -8876,7 +8792,7 @@
         <w:pStyle w:val="ListBullet"/>
       </w:pPr>
       <w:r>
-        <w:t>Normalization: discrete probabilities sum to exactly 1.0 (within 10⁻⁶)</w:t>
+        <w:t>Normalization: discrete probabilities sum to exactly 1.0 (within 10-^6)</w:t>
       </w:r>
     </w:p>
     <w:p>
@@ -8907,24 +8823,12 @@
     </w:p>
     <w:p>
       <w:r>
-        <w:rPr>
-          <w:b/>
-        </w:rPr>
-        <w:t xml:space="preserve">[1]  </w:t>
-      </w:r>
-      <w:r>
-        <w:t>Boore, D.M. &amp; Atkinson, G.M. (2008). Ground-Motion Prediction Equations for the Average Horizontal Component of PGA, PGV, and 5%-Damped PSA at Spectral Periods between 0.01s and 10.0s. Earthquake Spectra, 24(1), 99–138.</w:t>
+        <w:t>[1]  Boore, D.M. &amp; Atkinson, G.M. (2008). Ground-Motion Prediction Equations for the Average Horizontal Component of PGA, PGV, and 5%-Damped PSA at Spectral Periods between 0.01s and 10.0s. Earthquake Spectra, 24(1), 99-138.</w:t>
       </w:r>
     </w:p>
     <w:p>
       <w:r>
-        <w:rPr>
-          <w:b/>
-        </w:rPr>
-        <w:t xml:space="preserve">[2]  </w:t>
-      </w:r>
-      <w:r>
-        <w:t>Jayaram, N. &amp; Baker, J.W. (2009). Correlation model for spatially distributed ground-motion intensities. Earthquake Engineering &amp; Structural Dynamics, 38(15), 1687–1708.</w:t>
+        <w:t>[2]  Jayaram, N. &amp; Baker, J.W. (2009). Correlation model for spatially distributed ground-motion intensities. Earthquake Engineering &amp; Structural Dynamics, 38(15), 1687-1708.</w:t>
       </w:r>
     </w:p>
     <w:p>

</xml_diff>

<commit_message>
Fix project tree formatting in doc
</commit_message>
<xml_diff>
--- a/CAT411_Technical_Documentation.docx
+++ b/CAT411_Technical_Documentation.docx
@@ -553,65 +553,65 @@
       <w:r>
         <w:t>CAT411_framework/</w:t>
         <w:br/>
-        <w:t>&lt;=&lt;=&lt;= main.py                  # CLI entry point</w:t>
+        <w:t>+-- main.py                  # CLI entry point</w:t>
         <w:br/>
-        <w:t>&lt;=&lt;=&lt;= requirements.txt          # Python dependencies</w:t>
+        <w:t>+-- requirements.txt          # Python dependencies</w:t>
         <w:br/>
-        <w:t>&lt;=&lt;=&lt;= README.md                 # Project documentation</w:t>
+        <w:t>+-- README.md                 # Project documentation</w:t>
         <w:br/>
-        <w:t>&lt;=&lt;=&lt;= broker/</w:t>
+        <w:t>+-- broker/</w:t>
         <w:br/>
-        <w:t>&lt;=   &lt;=&lt;=&lt;= utils/</w:t>
+        <w:t>|  +-- utils/</w:t>
         <w:br/>
-        <w:t>&lt;=       &lt;=&lt;=&lt;= nbi_ingest.py     # NBI + ShakeMap download/clean pipeline</w:t>
+        <w:t>|     +-- nbi_ingest.py       # NBI + ShakeMap download/clean pipeline</w:t>
         <w:br/>
-        <w:t>&lt;=&lt;=&lt;= src/</w:t>
+        <w:t>+-- src/</w:t>
         <w:br/>
-        <w:t>&lt;=   &lt;=&lt;=&lt;= __init__.py</w:t>
+        <w:t>|  +-- __init__.py</w:t>
         <w:br/>
-        <w:t>&lt;=   &lt;=&lt;=&lt;= hazard.py            # GMPE, spatial correlation, GMF</w:t>
+        <w:t>|  +-- hazard.py             # GMPE, spatial correlation, GMF</w:t>
         <w:br/>
-        <w:t>&lt;=   &lt;=&lt;=&lt;= exposure.py          # Bridge inventory, costs</w:t>
+        <w:t>|  +-- exposure.py           # Bridge inventory, costs</w:t>
         <w:br/>
-        <w:t>&lt;=   &lt;=&lt;=&lt;= fragility.py         # Lognormal fragility curves</w:t>
+        <w:t>|  +-- fragility.py          # Lognormal fragility curves</w:t>
         <w:br/>
-        <w:t>&lt;=   &lt;=&lt;=&lt;= loss.py              # Damage-to-loss, EP, AAL</w:t>
+        <w:t>|  +-- loss.py               # Damage-to-loss, EP, AAL</w:t>
         <w:br/>
-        <w:t>&lt;=   &lt;=&lt;=&lt;= engine.py            # Pipeline orchestrator</w:t>
+        <w:t>|  +-- engine.py             # Pipeline orchestrator</w:t>
         <w:br/>
-        <w:t>&lt;=   &lt;=&lt;=&lt;= hazus_params.py      # Hazus Table 7.9 parameters</w:t>
+        <w:t>|  +-- hazus_params.py       # Hazus Table 7.9 parameters</w:t>
         <w:br/>
-        <w:t>&lt;=   &lt;=&lt;=&lt;= bridge_classes.py    # HWB classification logic</w:t>
+        <w:t>|  +-- bridge_classes.py     # HWB classification logic</w:t>
         <w:br/>
-        <w:t>&lt;=   &lt;=&lt;=&lt;= data_loader.py       # ShakeMap &amp; NBI parsers</w:t>
+        <w:t>|  +-- data_loader.py        # ShakeMap &amp; NBI parsers</w:t>
         <w:br/>
-        <w:t>&lt;=   &lt;=&lt;=&lt;= northridge_case.py   # Observed damage data</w:t>
+        <w:t>|  +-- northridge_case.py    # Observed damage data</w:t>
         <w:br/>
-        <w:t>&lt;=   &lt;=&lt;=&lt;= plotting.py          # All visualization</w:t>
+        <w:t>|  +-- plotting.py           # All visualization</w:t>
         <w:br/>
-        <w:t>&lt;=&lt;=&lt;= data/                     # Downloaded + processed data files</w:t>
+        <w:t>+-- data/                    # Downloaded + processed data files</w:t>
         <w:br/>
-        <w:t>&lt;=   &lt;=&lt;=&lt;= nbi/</w:t>
+        <w:t>|  +-- nbi/</w:t>
         <w:br/>
-        <w:t>&lt;=   &lt;=   &lt;=&lt;=&lt;= raw/              # Raw NBI zip + extracted TXT/CSV</w:t>
+        <w:t>|  |  +-- raw/               # Raw NBI zip + extracted TXT/CSV</w:t>
         <w:br/>
-        <w:t>&lt;=   &lt;=   &lt;=&lt;=&lt;= clean/            # Cleaned CSV</w:t>
+        <w:t>|  |  +-- clean/             # Cleaned CSV</w:t>
         <w:br/>
-        <w:t>&lt;=   &lt;=   &lt;=&lt;=&lt;= curated/          # Curated CSV</w:t>
+        <w:t>|  |  +-- curated/           # Curated CSV</w:t>
         <w:br/>
-        <w:t>&lt;=   &lt;=   &lt;=&lt;=&lt;= meta/             # Config + metadata</w:t>
+        <w:t>|  |  +-- meta/              # Config + metadata</w:t>
         <w:br/>
-        <w:t>&lt;=   &lt;=   &lt;=&lt;=&lt;= logs/             # Run logs</w:t>
+        <w:t>|  |  +-- logs/              # Run logs</w:t>
         <w:br/>
-        <w:t>&lt;=   &lt;=&lt;=&lt;= hazard/usgs/shakemap/</w:t>
+        <w:t>|  +-- hazard/usgs/shakemap/</w:t>
         <w:br/>
-        <w:t>&lt;=       &lt;=&lt;=&lt;= raw/              # grid.xml, shape.zip, info.json</w:t>
+        <w:t>|     +-- raw/               # grid.xml, shape.zip, info.json</w:t>
         <w:br/>
-        <w:t>&lt;=       &lt;=&lt;=&lt;= meta/             # ShakeMap metadata</w:t>
+        <w:t>|     +-- meta/              # ShakeMap metadata</w:t>
         <w:br/>
-        <w:t>&lt;=       &lt;=&lt;=&lt;= logs/             # ShakeMap logs</w:t>
+        <w:t>|     +-- logs/              # ShakeMap logs</w:t>
         <w:br/>
-        <w:t>&lt;=&lt;=&lt;= output/                   # Generated plots &amp; CSV</w:t>
+        <w:t>+-- output/                  # Generated plots &amp; CSV</w:t>
       </w:r>
     </w:p>
     <w:p>

</xml_diff>

<commit_message>
Document download example location
</commit_message>
<xml_diff>
--- a/CAT411_Technical_Documentation.docx
+++ b/CAT411_Technical_Documentation.docx
@@ -7694,6 +7694,16 @@
     <w:p>
       <w:r>
         <w:t>Example commands:</w:t>
+      </w:r>
+    </w:p>
+    <w:p>
+      <w:r>
+        <w:t>Example folder:</w:t>
+      </w:r>
+    </w:p>
+    <w:p>
+      <w:r>
+        <w:t>See examples/pipeline_download/README.md for a step-by-step download tutorial.</w:t>
       </w:r>
     </w:p>
     <w:p>

</xml_diff>

<commit_message>
Add full usage instructions
</commit_message>
<xml_diff>
--- a/CAT411_Technical_Documentation.docx
+++ b/CAT411_Technical_Documentation.docx
@@ -7704,6 +7704,36 @@
     <w:p>
       <w:r>
         <w:t>See examples/pipeline_download/README.md for a step-by-step download tutorial.</w:t>
+      </w:r>
+    </w:p>
+    <w:p>
+      <w:r>
+        <w:t>Full usage (download + run):</w:t>
+      </w:r>
+    </w:p>
+    <w:p>
+      <w:r>
+        <w:t>A) Download data only: python broker/utils/nbi_ingest.py --download --download-only</w:t>
+      </w:r>
+    </w:p>
+    <w:p>
+      <w:r>
+        <w:t>B) Download and process: python broker/utils/nbi_ingest.py --download</w:t>
+      </w:r>
+    </w:p>
+    <w:p>
+      <w:r>
+        <w:t>C) Run main analysis: python main.py</w:t>
+      </w:r>
+    </w:p>
+    <w:p>
+      <w:r>
+        <w:t>D) Optional modes: python main.py --pipeline | --probabilistic | --fragility-only</w:t>
+      </w:r>
+    </w:p>
+    <w:p>
+      <w:r>
+        <w:t>E) Override: python broker/utils/nbi_ingest.py --download --nbi-year 1994 --usgs-event ci3144585</w:t>
       </w:r>
     </w:p>
     <w:p>

</xml_diff>

<commit_message>
Add verification and troubleshooting docs
</commit_message>
<xml_diff>
--- a/CAT411_Technical_Documentation.docx
+++ b/CAT411_Technical_Documentation.docx
@@ -7709,6 +7709,41 @@
     <w:p>
       <w:r>
         <w:t>Full usage (download + run):</w:t>
+      </w:r>
+    </w:p>
+    <w:p>
+      <w:r>
+        <w:t>Verify outputs:</w:t>
+      </w:r>
+    </w:p>
+    <w:p>
+      <w:r>
+        <w:t>NBI: data/nbi/clean, data/nbi/curated, data/nbi/logs</w:t>
+      </w:r>
+    </w:p>
+    <w:p>
+      <w:r>
+        <w:t>ShakeMap: data/hazard/usgs/shakemap/raw, data/hazard/usgs/shakemap/logs</w:t>
+      </w:r>
+    </w:p>
+    <w:p>
+      <w:r>
+        <w:t>Common issues:</w:t>
+      </w:r>
+    </w:p>
+    <w:p>
+      <w:r>
+        <w:t>BadZipFile or HTML instead of zip: FHWA link changed. Re-run nbi_ingest.py or update the resolver.</w:t>
+      </w:r>
+    </w:p>
+    <w:p>
+      <w:r>
+        <w:t>Many ParserWarning lines: malformed NBI rows are skipped. Check data/nbi/logs/nbi_latest_run.log.</w:t>
+      </w:r>
+    </w:p>
+    <w:p>
+      <w:r>
+        <w:t>ShakeMap files missing: event product may not include all files. Check data/hazard/usgs/shakemap/logs/shakemap_ci3144585_run.log.</w:t>
       </w:r>
     </w:p>
     <w:p>

</xml_diff>

<commit_message>
Add main download-only mode
</commit_message>
<xml_diff>
--- a/CAT411_Technical_Documentation.docx
+++ b/CAT411_Technical_Documentation.docx
@@ -7759,6 +7759,11 @@
     <w:p>
       <w:r>
         <w:t>C) Run main analysis: python main.py</w:t>
+      </w:r>
+    </w:p>
+    <w:p>
+      <w:r>
+        <w:t>C2) Download only: python main.py --download-only</w:t>
       </w:r>
     </w:p>
     <w:p>

</xml_diff>

<commit_message>
Add main download-pipeline option
</commit_message>
<xml_diff>
--- a/CAT411_Technical_Documentation.docx
+++ b/CAT411_Technical_Documentation.docx
@@ -7764,6 +7764,11 @@
     <w:p>
       <w:r>
         <w:t>C2) Download only: python main.py --download-only</w:t>
+      </w:r>
+    </w:p>
+    <w:p>
+      <w:r>
+        <w:t>C3) Download + process (pipeline): python main.py --download-pipeline</w:t>
       </w:r>
     </w:p>
     <w:p>

</xml_diff>

<commit_message>
chore: final cleanup of temp scripts and docs update
</commit_message>
<xml_diff>
--- a/CAT411_Technical_Documentation.docx
+++ b/CAT411_Technical_Documentation.docx
@@ -500,6 +500,110 @@
         <w:t>For issues or database updates, contact the modeling team.</w:t>
       </w:r>
     </w:p>
+    <w:p>
+      <w:pPr>
+        <w:pStyle w:val="Heading1"/>
+      </w:pPr>
+      <w:r>
+        <w:t>Framework Architecture Flowchart</w:t>
+      </w:r>
+    </w:p>
+    <w:p>
+      <w:r>
+        <w:t>The following diagram illustrates the integrated CAT model pipeline, spanning from automated data ingestion to high-level risk visualization.</w:t>
+      </w:r>
+    </w:p>
+    <w:p>
+      <w:pPr>
+        <w:jc w:val="center"/>
+      </w:pPr>
+      <w:r>
+        <w:drawing>
+          <wp:inline xmlns:a="http://schemas.openxmlformats.org/drawingml/2006/main" xmlns:pic="http://schemas.openxmlformats.org/drawingml/2006/picture">
+            <wp:extent cx="5486400" cy="3657600"/>
+            <wp:docPr id="1" name="Picture 1"/>
+            <wp:cNvGraphicFramePr>
+              <a:graphicFrameLocks noChangeAspect="1"/>
+            </wp:cNvGraphicFramePr>
+            <a:graphic>
+              <a:graphicData uri="http://schemas.openxmlformats.org/drawingml/2006/picture">
+                <pic:pic>
+                  <pic:nvPicPr>
+                    <pic:cNvPr id="0" name="framework_flowchart.png"/>
+                    <pic:cNvPicPr/>
+                  </pic:nvPicPr>
+                  <pic:blipFill>
+                    <a:blip r:embed="rId9"/>
+                    <a:stretch>
+                      <a:fillRect/>
+                    </a:stretch>
+                  </pic:blipFill>
+                  <pic:spPr>
+                    <a:xfrm>
+                      <a:off x="0" y="0"/>
+                      <a:ext cx="5486400" cy="3657600"/>
+                    </a:xfrm>
+                    <a:prstGeom prst="rect"/>
+                  </pic:spPr>
+                </pic:pic>
+              </a:graphicData>
+            </a:graphic>
+          </wp:inline>
+        </w:drawing>
+      </w:r>
+    </w:p>
+    <w:p>
+      <w:pPr>
+        <w:pStyle w:val="Heading2"/>
+      </w:pPr>
+      <w:r>
+        <w:t>Detailed System Architecture</w:t>
+      </w:r>
+    </w:p>
+    <w:p>
+      <w:r>
+        <w:t>The following detailed diagram illustrates the specific modules, data sources, and processing logic within the framework:</w:t>
+      </w:r>
+    </w:p>
+    <w:p>
+      <w:pPr>
+        <w:jc w:val="center"/>
+      </w:pPr>
+      <w:r>
+        <w:drawing>
+          <wp:inline xmlns:a="http://schemas.openxmlformats.org/drawingml/2006/main" xmlns:pic="http://schemas.openxmlformats.org/drawingml/2006/picture">
+            <wp:extent cx="5943600" cy="4230361"/>
+            <wp:docPr id="2" name="Picture 2"/>
+            <wp:cNvGraphicFramePr>
+              <a:graphicFrameLocks noChangeAspect="1"/>
+            </wp:cNvGraphicFramePr>
+            <a:graphic>
+              <a:graphicData uri="http://schemas.openxmlformats.org/drawingml/2006/picture">
+                <pic:pic>
+                  <pic:nvPicPr>
+                    <pic:cNvPr id="0" name="detailed_architecture.png"/>
+                    <pic:cNvPicPr/>
+                  </pic:nvPicPr>
+                  <pic:blipFill>
+                    <a:blip r:embed="rId10"/>
+                    <a:stretch>
+                      <a:fillRect/>
+                    </a:stretch>
+                  </pic:blipFill>
+                  <pic:spPr>
+                    <a:xfrm>
+                      <a:off x="0" y="0"/>
+                      <a:ext cx="5943600" cy="4230361"/>
+                    </a:xfrm>
+                    <a:prstGeom prst="rect"/>
+                  </pic:spPr>
+                </pic:pic>
+              </a:graphicData>
+            </a:graphic>
+          </wp:inline>
+        </w:drawing>
+      </w:r>
+    </w:p>
     <w:sectPr>
       <w:pgSz w:w="12240" w:h="15840"/>
       <w:pgMar w:top="1440" w:right="1800" w:bottom="1440" w:left="1800" w:header="720" w:footer="720" w:gutter="0"/>

</xml_diff>

<commit_message>
chore: organize outputs and enhance manual with URLs/methodology/refs
</commit_message>
<xml_diff>
--- a/CAT411_Technical_Documentation.docx
+++ b/CAT411_Technical_Documentation.docx
@@ -604,6 +604,254 @@
         </w:drawing>
       </w:r>
     </w:p>
+    <w:p>
+      <w:pPr>
+        <w:pStyle w:val="Heading1"/>
+      </w:pPr>
+      <w:r>
+        <w:t>7. Data Sources &amp; URLs</w:t>
+      </w:r>
+    </w:p>
+    <w:p>
+      <w:pPr>
+        <w:pStyle w:val="Heading2"/>
+      </w:pPr>
+      <w:r>
+        <w:t>7.1 Hazard Data (USGS)</w:t>
+      </w:r>
+    </w:p>
+    <w:p>
+      <w:r>
+        <w:rPr>
+          <w:b/>
+        </w:rPr>
+        <w:t xml:space="preserve">Source: </w:t>
+      </w:r>
+      <w:r>
+        <w:t>USGS Earthquake Hazards Program</w:t>
+        <w:br/>
+      </w:r>
+      <w:r>
+        <w:rPr>
+          <w:b/>
+        </w:rPr>
+        <w:t xml:space="preserve">API Endpoint: </w:t>
+      </w:r>
+      <w:r>
+        <w:t>https://earthquake.usgs.gov/fdsnws/event/1/</w:t>
+        <w:br/>
+      </w:r>
+      <w:r>
+        <w:rPr>
+          <w:b/>
+        </w:rPr>
+        <w:t xml:space="preserve">ShakeMap Event Page: </w:t>
+      </w:r>
+      <w:r>
+        <w:t>https://earthquake.usgs.gov/earthquakes/eventpage/ci3144585</w:t>
+        <w:br/>
+      </w:r>
+      <w:r>
+        <w:rPr>
+          <w:b/>
+        </w:rPr>
+        <w:t xml:space="preserve">Data Format: </w:t>
+      </w:r>
+      <w:r>
+        <w:t>XML (grid.xml), JSON (info.json), Shapefile (shape.zip)</w:t>
+      </w:r>
+    </w:p>
+    <w:p>
+      <w:pPr>
+        <w:pStyle w:val="Heading2"/>
+      </w:pPr>
+      <w:r>
+        <w:t>7.2 Exposure Data (NBI)</w:t>
+      </w:r>
+    </w:p>
+    <w:p>
+      <w:r>
+        <w:rPr>
+          <w:b/>
+        </w:rPr>
+        <w:t xml:space="preserve">Source: </w:t>
+      </w:r>
+      <w:r>
+        <w:t>Federal Highway Administration (FHWA)</w:t>
+        <w:br/>
+      </w:r>
+      <w:r>
+        <w:rPr>
+          <w:b/>
+        </w:rPr>
+        <w:t xml:space="preserve">Download Page: </w:t>
+      </w:r>
+      <w:r>
+        <w:t>https://www.fhwa.dot.gov/bridge/nbi/ascii.cfm</w:t>
+        <w:br/>
+      </w:r>
+      <w:r>
+        <w:rPr>
+          <w:b/>
+        </w:rPr>
+        <w:t xml:space="preserve">Data Format: </w:t>
+      </w:r>
+      <w:r>
+        <w:t>ASCII text files (CA18.txt for California 2018)</w:t>
+      </w:r>
+    </w:p>
+    <w:p>
+      <w:pPr>
+        <w:pStyle w:val="Heading2"/>
+      </w:pPr>
+      <w:r>
+        <w:t>7.3 Vulnerability Parameters</w:t>
+      </w:r>
+    </w:p>
+    <w:p>
+      <w:r>
+        <w:rPr>
+          <w:b/>
+        </w:rPr>
+        <w:t xml:space="preserve">Source: </w:t>
+      </w:r>
+      <w:r>
+        <w:t>FEMA Hazus-MH 4.0 / Hazus 6.1 Technical Manual</w:t>
+        <w:br/>
+      </w:r>
+      <w:r>
+        <w:rPr>
+          <w:b/>
+        </w:rPr>
+        <w:t xml:space="preserve">Download: </w:t>
+      </w:r>
+      <w:r>
+        <w:t>https://www.fema.gov/flood-maps/products-tools/hazus</w:t>
+      </w:r>
+    </w:p>
+    <w:p>
+      <w:pPr>
+        <w:pStyle w:val="Heading1"/>
+      </w:pPr>
+      <w:r>
+        <w:t>8. Calculation Methodology</w:t>
+      </w:r>
+    </w:p>
+    <w:p>
+      <w:pPr>
+        <w:pStyle w:val="Heading2"/>
+      </w:pPr>
+      <w:r>
+        <w:t>8.1 Ground Motion Prediction</w:t>
+      </w:r>
+    </w:p>
+    <w:p>
+      <w:r>
+        <w:t>Ground motion intensity (Sa) at each bridge site is interpolated from the USGS ShakeMap grid. For synthetic scenarios, the Boore-Atkinson (2008) Ground Motion Prediction Equation (GMPE) is used:</w:t>
+        <w:br/>
+        <w:br/>
+        <w:t>ln(Sa) = F_M(M) + F_D(R_JB, M) + F_S(V_s30) + ε</w:t>
+        <w:br/>
+        <w:br/>
+        <w:t>Where:</w:t>
+        <w:br/>
+        <w:t>• M = Moment magnitude</w:t>
+        <w:br/>
+        <w:t>• R_JB = Joyner-Boore distance (km)</w:t>
+        <w:br/>
+        <w:t>• V_s30 = Average shear-wave velocity in top 30m (m/s)</w:t>
+        <w:br/>
+        <w:t>• ε = Aleatory variability (standard normal)</w:t>
+      </w:r>
+    </w:p>
+    <w:p>
+      <w:pPr>
+        <w:pStyle w:val="Heading2"/>
+      </w:pPr>
+      <w:r>
+        <w:t>8.2 Fragility Curve Calculation</w:t>
+      </w:r>
+    </w:p>
+    <w:p>
+      <w:r>
+        <w:t>The probability of exceeding damage state DS given spectral acceleration Sa is:</w:t>
+        <w:br/>
+        <w:br/>
+        <w:t>P(DS ≥ ds | Sa) = Φ[ ln(Sa / θ) / β ]</w:t>
+        <w:br/>
+        <w:br/>
+        <w:t>Where:</w:t>
+        <w:br/>
+        <w:t>• Φ = Standard normal cumulative distribution function</w:t>
+        <w:br/>
+        <w:t>• θ = Median capacity (g) for damage state ds (from Hazus Table 7.9)</w:t>
+        <w:br/>
+        <w:t>• β = Lognormal standard deviation (from Hazus Table 7.9)</w:t>
+      </w:r>
+    </w:p>
+    <w:p>
+      <w:pPr>
+        <w:pStyle w:val="Heading2"/>
+      </w:pPr>
+      <w:r>
+        <w:t>8.3 Expected Loss Calculation</w:t>
+      </w:r>
+    </w:p>
+    <w:p>
+      <w:r>
+        <w:t>Expected loss for each bridge:</w:t>
+        <w:br/>
+        <w:br/>
+        <w:t>E[Loss] = Σ [ P(DS=ds) × DR(ds) × Replacement_Cost ]</w:t>
+        <w:br/>
+        <w:br/>
+        <w:t>Where:</w:t>
+        <w:br/>
+        <w:t>• P(DS=ds) = Probability of being in damage state ds</w:t>
+        <w:br/>
+        <w:t>• DR(ds) = Damage Ratio (from Hazus Table 7.11)</w:t>
+      </w:r>
+    </w:p>
+    <w:p>
+      <w:pPr>
+        <w:pStyle w:val="Heading1"/>
+      </w:pPr>
+      <w:r>
+        <w:t>9. References</w:t>
+      </w:r>
+    </w:p>
+    <w:p>
+      <w:pPr>
+        <w:pStyle w:val="ListNumber"/>
+      </w:pPr>
+      <w:r>
+        <w:t>[1] Boore, D. M., &amp; Atkinson, G. M. (2008). Ground-motion prediction equations for the average horizontal component of PGA, PGV, and 5%-damped PSA at spectral periods between 0.01 s and 10.0 s. Earthquake Spectra, 24(1), 99-138.</w:t>
+      </w:r>
+    </w:p>
+    <w:p>
+      <w:pPr>
+        <w:pStyle w:val="ListNumber"/>
+      </w:pPr>
+      <w:r>
+        <w:t>[2] FEMA (2022). Hazus Earthquake Model Technical Manual, Hazus 6.1. Federal Emergency Management Agency, Washington, D.C.</w:t>
+      </w:r>
+    </w:p>
+    <w:p>
+      <w:pPr>
+        <w:pStyle w:val="ListNumber"/>
+      </w:pPr>
+      <w:r>
+        <w:t>[3] FHWA (2023). Recording and Coding Guide for the Structure Inventory and Appraisal of the Nations Bridges. Federal Highway Administration, Report No. FHWA-PD-96-001.</w:t>
+      </w:r>
+    </w:p>
+    <w:p>
+      <w:pPr>
+        <w:pStyle w:val="ListNumber"/>
+      </w:pPr>
+      <w:r>
+        <w:t>[4] USGS (2024). ShakeMap Scientific Background. U.S. Geological Survey. https://earthquake.usgs.gov/data/shakemap/</w:t>
+      </w:r>
+    </w:p>
     <w:sectPr>
       <w:pgSz w:w="12240" w:h="15840"/>
       <w:pgMar w:top="1440" w:right="1800" w:bottom="1440" w:left="1800" w:header="720" w:footer="720" w:gutter="0"/>

</xml_diff>

<commit_message>
chore: finalize docs structure with Gemini architecture image
</commit_message>
<xml_diff>
--- a/CAT411_Technical_Documentation.docx
+++ b/CAT411_Technical_Documentation.docx
@@ -852,6 +852,57 @@
         <w:t>[4] USGS (2024). ShakeMap Scientific Background. U.S. Geological Survey. https://earthquake.usgs.gov/data/shakemap/</w:t>
       </w:r>
     </w:p>
+    <w:p>
+      <w:pPr>
+        <w:pStyle w:val="Heading1"/>
+      </w:pPr>
+      <w:r>
+        <w:t>CAT411 System Architecture (AI Generated)</w:t>
+      </w:r>
+    </w:p>
+    <w:p>
+      <w:pPr>
+        <w:jc w:val="center"/>
+      </w:pPr>
+      <w:r>
+        <w:drawing>
+          <wp:inline xmlns:a="http://schemas.openxmlformats.org/drawingml/2006/main" xmlns:pic="http://schemas.openxmlformats.org/drawingml/2006/picture">
+            <wp:extent cx="5943600" cy="5943600"/>
+            <wp:docPr id="3" name="Picture 3"/>
+            <wp:cNvGraphicFramePr>
+              <a:graphicFrameLocks noChangeAspect="1"/>
+            </wp:cNvGraphicFramePr>
+            <a:graphic>
+              <a:graphicData uri="http://schemas.openxmlformats.org/drawingml/2006/picture">
+                <pic:pic>
+                  <pic:nvPicPr>
+                    <pic:cNvPr id="0" name="cat411_detailed_architecture_v5_fixed.png"/>
+                    <pic:cNvPicPr/>
+                  </pic:nvPicPr>
+                  <pic:blipFill>
+                    <a:blip r:embed="rId11"/>
+                    <a:stretch>
+                      <a:fillRect/>
+                    </a:stretch>
+                  </pic:blipFill>
+                  <pic:spPr>
+                    <a:xfrm>
+                      <a:off x="0" y="0"/>
+                      <a:ext cx="5943600" cy="5943600"/>
+                    </a:xfrm>
+                    <a:prstGeom prst="rect"/>
+                  </pic:spPr>
+                </pic:pic>
+              </a:graphicData>
+            </a:graphic>
+          </wp:inline>
+        </w:drawing>
+      </w:r>
+      <w:r>
+        <w:br/>
+        <w:t>*Figure: AI-generated detailed architecture of the CAT411 framework.*</w:t>
+      </w:r>
+    </w:p>
     <w:sectPr>
       <w:pgSz w:w="12240" w:h="15840"/>
       <w:pgMar w:top="1440" w:right="1800" w:bottom="1440" w:left="1800" w:header="720" w:footer="720" w:gutter="0"/>

</xml_diff>

<commit_message>
docs: clean manual rebuild with only Gemini image
</commit_message>
<xml_diff>
--- a/CAT411_Technical_Documentation.docx
+++ b/CAT411_Technical_Documentation.docx
@@ -7,40 +7,7 @@
         <w:pStyle w:val="Title"/>
       </w:pPr>
       <w:r>
-        <w:t>CAT411 Framework</w:t>
-      </w:r>
-    </w:p>
-    <w:p>
-      <w:pPr>
-        <w:jc w:val="center"/>
-      </w:pPr>
-      <w:r>
-        <w:rPr>
-          <w:b/>
-          <w:sz w:val="48"/>
-        </w:rPr>
-        <w:t>Bridge Earthquake Catastrophe Modeling System</w:t>
-        <w:br/>
-        <w:t>Technical &amp; User Documentation</w:t>
-      </w:r>
-    </w:p>
-    <w:p>
-      <w:pPr>
-        <w:jc w:val="center"/>
-      </w:pPr>
-      <w:r>
-        <w:rPr>
-          <w:sz w:val="28"/>
-        </w:rPr>
-        <w:br/>
-        <w:t>Version: 2.0 (User-Friendly Overhaul)</w:t>
-        <w:br/>
-        <w:t>Date: February 2026</w:t>
-      </w:r>
-    </w:p>
-    <w:p>
-      <w:r>
-        <w:br w:type="page"/>
+        <w:t>CAT411 Framework Technical Manual</w:t>
       </w:r>
     </w:p>
     <w:p>
@@ -48,469 +15,12 @@
         <w:pStyle w:val="Heading1"/>
       </w:pPr>
       <w:r>
-        <w:t>Table of Contents</w:t>
+        <w:t>1. System Architecture</w:t>
       </w:r>
     </w:p>
     <w:p>
       <w:r>
-        <w:t>1. Introduction</w:t>
-      </w:r>
-    </w:p>
-    <w:p>
-      <w:r>
-        <w:t>2. Quick Start Guide</w:t>
-      </w:r>
-    </w:p>
-    <w:p>
-      <w:r>
-        <w:t>3. Interactive Mode</w:t>
-      </w:r>
-    </w:p>
-    <w:p>
-      <w:r>
-        <w:t>4. Command Line Interface (CLI) Reference</w:t>
-      </w:r>
-    </w:p>
-    <w:p>
-      <w:r>
-        <w:t>5. Data Integration (USGS API)</w:t>
-      </w:r>
-    </w:p>
-    <w:p>
-      <w:r>
-        <w:t>6. Analysis Methodology</w:t>
-      </w:r>
-    </w:p>
-    <w:p>
-      <w:r>
-        <w:t>7. Visualization &amp; Reports</w:t>
-      </w:r>
-    </w:p>
-    <w:p>
-      <w:r>
-        <w:br w:type="page"/>
-      </w:r>
-    </w:p>
-    <w:p>
-      <w:pPr>
-        <w:pStyle w:val="Heading1"/>
-      </w:pPr>
-      <w:r>
-        <w:t>1. Introduction</w:t>
-      </w:r>
-    </w:p>
-    <w:p>
-      <w:r>
-        <w:t>CAT411 is a comprehensive bridge earthquake risk assessment framework. It integrates USGS hazard data, NBI exposure data, and Hazus vulnerability metrics to estimate physical damage and economic loss for bridge portfolios.</w:t>
-      </w:r>
-    </w:p>
-    <w:p>
-      <w:pPr>
-        <w:pStyle w:val="Heading1"/>
-      </w:pPr>
-      <w:r>
-        <w:t>2. Quick Start Guide</w:t>
-      </w:r>
-    </w:p>
-    <w:p>
-      <w:r>
-        <w:t>The easiest way to use the system is via the automated full analysis mode:</w:t>
-      </w:r>
-    </w:p>
-    <w:p>
-      <w:r>
-        <w:rPr>
-          <w:rFonts w:ascii="Courier New" w:hAnsi="Courier New"/>
-        </w:rPr>
-        <w:t>python main.py --full-analysis</w:t>
-      </w:r>
-    </w:p>
-    <w:p>
-      <w:pPr>
-        <w:pStyle w:val="ListBullet"/>
-      </w:pPr>
-      <w:r>
-        <w:t>This single command will:</w:t>
-        <w:br/>
-        <w:t>• Download the latest ShakeMap for the Northridge event.</w:t>
-        <w:br/>
-        <w:t>• Load the California NBI bridge inventory.</w:t>
-        <w:br/>
-        <w:t>• Map ground motions to every bridge site.</w:t>
-        <w:br/>
-        <w:t>• Compute damage probabilities and economic losses.</w:t>
-        <w:br/>
-        <w:t>• Generate a complete suite of visual maps and dashboards.</w:t>
-      </w:r>
-    </w:p>
-    <w:p>
-      <w:pPr>
-        <w:pStyle w:val="Heading1"/>
-      </w:pPr>
-      <w:r>
-        <w:t>3. Interactive Mode</w:t>
-      </w:r>
-    </w:p>
-    <w:p>
-      <w:r>
-        <w:t>For non-technical users, CAT411 offers a menu-driven interface:</w:t>
-      </w:r>
-    </w:p>
-    <w:p>
-      <w:r>
-        <w:rPr>
-          <w:rFonts w:ascii="Courier New" w:hAnsi="Courier New"/>
-        </w:rPr>
-        <w:t>python main.py --interactive</w:t>
-      </w:r>
-    </w:p>
-    <w:p>
-      <w:r>
-        <w:t>Users can select analysis steps (1-4) directly from the terminal prompt.</w:t>
-      </w:r>
-    </w:p>
-    <w:p>
-      <w:pPr>
-        <w:pStyle w:val="Heading1"/>
-      </w:pPr>
-      <w:r>
-        <w:t>4. CLI Reference</w:t>
-      </w:r>
-    </w:p>
-    <w:p>
-      <w:r>
-        <w:t>Advanced users can control the framework using specific flags:</w:t>
-      </w:r>
-    </w:p>
-    <w:tbl>
-      <w:tblPr>
-        <w:tblStyle w:val="TableGrid"/>
-        <w:tblW w:type="auto" w:w="0"/>
-        <w:tblLook w:firstColumn="1" w:firstRow="1" w:lastColumn="0" w:lastRow="0" w:noHBand="0" w:noVBand="1" w:val="04A0"/>
-      </w:tblPr>
-      <w:tblGrid>
-        <w:gridCol w:w="4320"/>
-        <w:gridCol w:w="4320"/>
-      </w:tblGrid>
-      <w:tr>
-        <w:tc>
-          <w:tcPr>
-            <w:tcW w:type="dxa" w:w="4320"/>
-          </w:tcPr>
-          <w:p>
-            <w:r>
-              <w:t>Flag</w:t>
-            </w:r>
-          </w:p>
-        </w:tc>
-        <w:tc>
-          <w:tcPr>
-            <w:tcW w:type="dxa" w:w="4320"/>
-          </w:tcPr>
-          <w:p>
-            <w:r>
-              <w:t>Description</w:t>
-            </w:r>
-          </w:p>
-        </w:tc>
-      </w:tr>
-      <w:tr>
-        <w:tc>
-          <w:tcPr>
-            <w:tcW w:type="dxa" w:w="4320"/>
-          </w:tcPr>
-          <w:p>
-            <w:r>
-              <w:t>--full-analysis</w:t>
-            </w:r>
-          </w:p>
-        </w:tc>
-        <w:tc>
-          <w:tcPr>
-            <w:tcW w:type="dxa" w:w="4320"/>
-          </w:tcPr>
-          <w:p>
-            <w:r>
-              <w:t>Run the complete automated pipeline (Recommended).</w:t>
-            </w:r>
-          </w:p>
-        </w:tc>
-      </w:tr>
-      <w:tr>
-        <w:tc>
-          <w:tcPr>
-            <w:tcW w:type="dxa" w:w="4320"/>
-          </w:tcPr>
-          <w:p>
-            <w:r>
-              <w:t>--interactive</w:t>
-            </w:r>
-          </w:p>
-        </w:tc>
-        <w:tc>
-          <w:tcPr>
-            <w:tcW w:type="dxa" w:w="4320"/>
-          </w:tcPr>
-          <w:p>
-            <w:r>
-              <w:t>Start the menu-driven interface.</w:t>
-            </w:r>
-          </w:p>
-        </w:tc>
-      </w:tr>
-      <w:tr>
-        <w:tc>
-          <w:tcPr>
-            <w:tcW w:type="dxa" w:w="4320"/>
-          </w:tcPr>
-          <w:p>
-            <w:r>
-              <w:t>--download-hazard</w:t>
-            </w:r>
-          </w:p>
-        </w:tc>
-        <w:tc>
-          <w:tcPr>
-            <w:tcW w:type="dxa" w:w="4320"/>
-          </w:tcPr>
-          <w:p>
-            <w:r>
-              <w:t>Force redownload of USGS hazard data.</w:t>
-            </w:r>
-          </w:p>
-        </w:tc>
-      </w:tr>
-      <w:tr>
-        <w:tc>
-          <w:tcPr>
-            <w:tcW w:type="dxa" w:w="4320"/>
-          </w:tcPr>
-          <w:p>
-            <w:r>
-              <w:t>--probabilistic</w:t>
-            </w:r>
-          </w:p>
-        </w:tc>
-        <w:tc>
-          <w:tcPr>
-            <w:tcW w:type="dxa" w:w="4320"/>
-          </w:tcPr>
-          <w:p>
-            <w:r>
-              <w:t>Run stochastic analysis with multi-event catalogues.</w:t>
-            </w:r>
-          </w:p>
-        </w:tc>
-      </w:tr>
-      <w:tr>
-        <w:tc>
-          <w:tcPr>
-            <w:tcW w:type="dxa" w:w="4320"/>
-          </w:tcPr>
-          <w:p>
-            <w:r>
-              <w:t>--fragility-only</w:t>
-            </w:r>
-          </w:p>
-        </w:tc>
-        <w:tc>
-          <w:tcPr>
-            <w:tcW w:type="dxa" w:w="4320"/>
-          </w:tcPr>
-          <w:p>
-            <w:r>
-              <w:t>Generate the fragility curve reference library.</w:t>
-            </w:r>
-          </w:p>
-        </w:tc>
-      </w:tr>
-      <w:tr>
-        <w:tc>
-          <w:tcPr>
-            <w:tcW w:type="dxa" w:w="4320"/>
-          </w:tcPr>
-          <w:p>
-            <w:r>
-              <w:t>--hazard-event</w:t>
-            </w:r>
-          </w:p>
-        </w:tc>
-        <w:tc>
-          <w:tcPr>
-            <w:tcW w:type="dxa" w:w="4320"/>
-          </w:tcPr>
-          <w:p>
-            <w:r>
-              <w:t>USGS Event ID (e.g., ci3144585 for Northridge).</w:t>
-            </w:r>
-          </w:p>
-        </w:tc>
-      </w:tr>
-      <w:tr>
-        <w:tc>
-          <w:tcPr>
-            <w:tcW w:type="dxa" w:w="4320"/>
-          </w:tcPr>
-          <w:p>
-            <w:r>
-              <w:t>--n-bridges</w:t>
-            </w:r>
-          </w:p>
-        </w:tc>
-        <w:tc>
-          <w:tcPr>
-            <w:tcW w:type="dxa" w:w="4320"/>
-          </w:tcPr>
-          <w:p>
-            <w:r>
-              <w:t>Portfolio size for synthetic/stochastic simulations.</w:t>
-            </w:r>
-          </w:p>
-        </w:tc>
-      </w:tr>
-      <w:tr>
-        <w:tc>
-          <w:tcPr>
-            <w:tcW w:type="dxa" w:w="4320"/>
-          </w:tcPr>
-          <w:p>
-            <w:r>
-              <w:t>--overwrite</w:t>
-            </w:r>
-          </w:p>
-        </w:tc>
-        <w:tc>
-          <w:tcPr>
-            <w:tcW w:type="dxa" w:w="4320"/>
-          </w:tcPr>
-          <w:p>
-            <w:r>
-              <w:t>Overwrite existing files in data/ and output/ directories.</w:t>
-            </w:r>
-          </w:p>
-        </w:tc>
-      </w:tr>
-    </w:tbl>
-    <w:p>
-      <w:pPr>
-        <w:pStyle w:val="Heading1"/>
-      </w:pPr>
-      <w:r>
-        <w:t>5. Data &amp; Methodology</w:t>
-      </w:r>
-    </w:p>
-    <w:p>
-      <w:pPr>
-        <w:pStyle w:val="Heading2"/>
-      </w:pPr>
-      <w:r>
-        <w:t>5.1 Hazard (USGS)</w:t>
-      </w:r>
-    </w:p>
-    <w:p>
-      <w:r>
-        <w:t>Hazard data is pulled from the USGS Earthquake API. The grid.xml file provides spatial PGA and spectral acceleration (Sa) values.</w:t>
-      </w:r>
-    </w:p>
-    <w:p>
-      <w:pPr>
-        <w:pStyle w:val="Heading2"/>
-      </w:pPr>
-      <w:r>
-        <w:t>5.2 Exposure &amp; Vulnerability</w:t>
-      </w:r>
-    </w:p>
-    <w:p>
-      <w:r>
-        <w:t>Bridge properties are sourced from the FHMA National Bridge Inventory (NBI). Vulnerability is assessed using FHWA Hazus 6.1 seismic fragility parameters.</w:t>
-      </w:r>
-    </w:p>
-    <w:p>
-      <w:pPr>
-        <w:pStyle w:val="Heading1"/>
-      </w:pPr>
-      <w:r>
-        <w:t>6. Visualizations &amp; Reports</w:t>
-      </w:r>
-    </w:p>
-    <w:p>
-      <w:r>
-        <w:t>All outputs are saved to the /output directory. Key files include:</w:t>
-      </w:r>
-    </w:p>
-    <w:p>
-      <w:r>
-        <w:rPr>
-          <w:b/>
-        </w:rPr>
-        <w:t>00_analysis_dashboard.png</w:t>
-      </w:r>
-      <w:r>
-        <w:t>: A summary dashboard with damage stats, metrics, and histograms.</w:t>
-      </w:r>
-    </w:p>
-    <w:p>
-      <w:r>
-        <w:rPr>
-          <w:b/>
-        </w:rPr>
-        <w:t>01_shakemap_full_area.png</w:t>
-      </w:r>
-      <w:r>
-        <w:t>: Full map of the earthquake intensity grid.</w:t>
-      </w:r>
-    </w:p>
-    <w:p>
-      <w:r>
-        <w:rPr>
-          <w:b/>
-        </w:rPr>
-        <w:t>03_bridge_damage_spatial.png</w:t>
-      </w:r>
-      <w:r>
-        <w:t>: Map of bridges colored by damage probability.</w:t>
-      </w:r>
-    </w:p>
-    <w:p>
-      <w:r>
-        <w:rPr>
-          <w:b/>
-        </w:rPr>
-        <w:t>bridge_damage_results.csv</w:t>
-      </w:r>
-      <w:r>
-        <w:t>: Detailed per-bridge damage and loss spreadsheet.</w:t>
-      </w:r>
-    </w:p>
-    <w:p>
-      <w:r>
-        <w:br w:type="page"/>
-      </w:r>
-    </w:p>
-    <w:p>
-      <w:pPr>
-        <w:pStyle w:val="Heading1"/>
-      </w:pPr>
-      <w:r>
-        <w:t>Technical Support</w:t>
-      </w:r>
-    </w:p>
-    <w:p>
-      <w:r>
-        <w:t>For issues or database updates, contact the modeling team.</w:t>
-      </w:r>
-    </w:p>
-    <w:p>
-      <w:pPr>
-        <w:pStyle w:val="Heading1"/>
-      </w:pPr>
-      <w:r>
-        <w:t>Framework Architecture Flowchart</w:t>
-      </w:r>
-    </w:p>
-    <w:p>
-      <w:r>
-        <w:t>The following diagram illustrates the integrated CAT model pipeline, spanning from automated data ingestion to high-level risk visualization.</w:t>
+        <w:t>The following diagram represents the core architecture of the CAT411 framework.</w:t>
       </w:r>
     </w:p>
     <w:p>
@@ -520,7 +30,7 @@
       <w:r>
         <w:drawing>
           <wp:inline xmlns:a="http://schemas.openxmlformats.org/drawingml/2006/main" xmlns:pic="http://schemas.openxmlformats.org/drawingml/2006/picture">
-            <wp:extent cx="5486400" cy="3657600"/>
+            <wp:extent cx="5029200" cy="5029200"/>
             <wp:docPr id="1" name="Picture 1"/>
             <wp:cNvGraphicFramePr>
               <a:graphicFrameLocks noChangeAspect="1"/>
@@ -529,7 +39,7 @@
               <a:graphicData uri="http://schemas.openxmlformats.org/drawingml/2006/picture">
                 <pic:pic>
                   <pic:nvPicPr>
-                    <pic:cNvPr id="0" name="framework_flowchart.png"/>
+                    <pic:cNvPr id="0" name="fixed_arch.png"/>
                     <pic:cNvPicPr/>
                   </pic:nvPicPr>
                   <pic:blipFill>
@@ -541,59 +51,7 @@
                   <pic:spPr>
                     <a:xfrm>
                       <a:off x="0" y="0"/>
-                      <a:ext cx="5486400" cy="3657600"/>
-                    </a:xfrm>
-                    <a:prstGeom prst="rect"/>
-                  </pic:spPr>
-                </pic:pic>
-              </a:graphicData>
-            </a:graphic>
-          </wp:inline>
-        </w:drawing>
-      </w:r>
-    </w:p>
-    <w:p>
-      <w:pPr>
-        <w:pStyle w:val="Heading2"/>
-      </w:pPr>
-      <w:r>
-        <w:t>Detailed System Architecture</w:t>
-      </w:r>
-    </w:p>
-    <w:p>
-      <w:r>
-        <w:t>The following detailed diagram illustrates the specific modules, data sources, and processing logic within the framework:</w:t>
-      </w:r>
-    </w:p>
-    <w:p>
-      <w:pPr>
-        <w:jc w:val="center"/>
-      </w:pPr>
-      <w:r>
-        <w:drawing>
-          <wp:inline xmlns:a="http://schemas.openxmlformats.org/drawingml/2006/main" xmlns:pic="http://schemas.openxmlformats.org/drawingml/2006/picture">
-            <wp:extent cx="5943600" cy="4230361"/>
-            <wp:docPr id="2" name="Picture 2"/>
-            <wp:cNvGraphicFramePr>
-              <a:graphicFrameLocks noChangeAspect="1"/>
-            </wp:cNvGraphicFramePr>
-            <a:graphic>
-              <a:graphicData uri="http://schemas.openxmlformats.org/drawingml/2006/picture">
-                <pic:pic>
-                  <pic:nvPicPr>
-                    <pic:cNvPr id="0" name="detailed_architecture.png"/>
-                    <pic:cNvPicPr/>
-                  </pic:nvPicPr>
-                  <pic:blipFill>
-                    <a:blip r:embed="rId10"/>
-                    <a:stretch>
-                      <a:fillRect/>
-                    </a:stretch>
-                  </pic:blipFill>
-                  <pic:spPr>
-                    <a:xfrm>
-                      <a:off x="0" y="0"/>
-                      <a:ext cx="5943600" cy="4230361"/>
+                      <a:ext cx="5029200" cy="5029200"/>
                     </a:xfrm>
                     <a:prstGeom prst="rect"/>
                   </pic:spPr>
@@ -609,124 +67,13 @@
         <w:pStyle w:val="Heading1"/>
       </w:pPr>
       <w:r>
-        <w:t>7. Data Sources &amp; URLs</w:t>
+        <w:t>2. Quick Start</w:t>
       </w:r>
     </w:p>
     <w:p>
-      <w:pPr>
-        <w:pStyle w:val="Heading2"/>
-      </w:pPr>
+      <w:pPr/>
       <w:r>
-        <w:t>7.1 Hazard Data (USGS)</w:t>
-      </w:r>
-    </w:p>
-    <w:p>
-      <w:r>
-        <w:rPr>
-          <w:b/>
-        </w:rPr>
-        <w:t xml:space="preserve">Source: </w:t>
-      </w:r>
-      <w:r>
-        <w:t>USGS Earthquake Hazards Program</w:t>
-        <w:br/>
-      </w:r>
-      <w:r>
-        <w:rPr>
-          <w:b/>
-        </w:rPr>
-        <w:t xml:space="preserve">API Endpoint: </w:t>
-      </w:r>
-      <w:r>
-        <w:t>https://earthquake.usgs.gov/fdsnws/event/1/</w:t>
-        <w:br/>
-      </w:r>
-      <w:r>
-        <w:rPr>
-          <w:b/>
-        </w:rPr>
-        <w:t xml:space="preserve">ShakeMap Event Page: </w:t>
-      </w:r>
-      <w:r>
-        <w:t>https://earthquake.usgs.gov/earthquakes/eventpage/ci3144585</w:t>
-        <w:br/>
-      </w:r>
-      <w:r>
-        <w:rPr>
-          <w:b/>
-        </w:rPr>
-        <w:t xml:space="preserve">Data Format: </w:t>
-      </w:r>
-      <w:r>
-        <w:t>XML (grid.xml), JSON (info.json), Shapefile (shape.zip)</w:t>
-      </w:r>
-    </w:p>
-    <w:p>
-      <w:pPr>
-        <w:pStyle w:val="Heading2"/>
-      </w:pPr>
-      <w:r>
-        <w:t>7.2 Exposure Data (NBI)</w:t>
-      </w:r>
-    </w:p>
-    <w:p>
-      <w:r>
-        <w:rPr>
-          <w:b/>
-        </w:rPr>
-        <w:t xml:space="preserve">Source: </w:t>
-      </w:r>
-      <w:r>
-        <w:t>Federal Highway Administration (FHWA)</w:t>
-        <w:br/>
-      </w:r>
-      <w:r>
-        <w:rPr>
-          <w:b/>
-        </w:rPr>
-        <w:t xml:space="preserve">Download Page: </w:t>
-      </w:r>
-      <w:r>
-        <w:t>https://www.fhwa.dot.gov/bridge/nbi/ascii.cfm</w:t>
-        <w:br/>
-      </w:r>
-      <w:r>
-        <w:rPr>
-          <w:b/>
-        </w:rPr>
-        <w:t xml:space="preserve">Data Format: </w:t>
-      </w:r>
-      <w:r>
-        <w:t>ASCII text files (CA18.txt for California 2018)</w:t>
-      </w:r>
-    </w:p>
-    <w:p>
-      <w:pPr>
-        <w:pStyle w:val="Heading2"/>
-      </w:pPr>
-      <w:r>
-        <w:t>7.3 Vulnerability Parameters</w:t>
-      </w:r>
-    </w:p>
-    <w:p>
-      <w:r>
-        <w:rPr>
-          <w:b/>
-        </w:rPr>
-        <w:t xml:space="preserve">Source: </w:t>
-      </w:r>
-      <w:r>
-        <w:t>FEMA Hazus-MH 4.0 / Hazus 6.1 Technical Manual</w:t>
-        <w:br/>
-      </w:r>
-      <w:r>
-        <w:rPr>
-          <w:b/>
-        </w:rPr>
-        <w:t xml:space="preserve">Download: </w:t>
-      </w:r>
-      <w:r>
-        <w:t>https://www.fema.gov/flood-maps/products-tools/hazus</w:t>
+        <w:t>python main.py --full-analysis</w:t>
       </w:r>
     </w:p>
     <w:p>
@@ -734,173 +81,12 @@
         <w:pStyle w:val="Heading1"/>
       </w:pPr>
       <w:r>
-        <w:t>8. Calculation Methodology</w:t>
-      </w:r>
-    </w:p>
-    <w:p>
-      <w:pPr>
-        <w:pStyle w:val="Heading2"/>
-      </w:pPr>
-      <w:r>
-        <w:t>8.1 Ground Motion Prediction</w:t>
+        <w:t>3. Methodology</w:t>
       </w:r>
     </w:p>
     <w:p>
       <w:r>
-        <w:t>Ground motion intensity (Sa) at each bridge site is interpolated from the USGS ShakeMap grid. For synthetic scenarios, the Boore-Atkinson (2008) Ground Motion Prediction Equation (GMPE) is used:</w:t>
-        <w:br/>
-        <w:br/>
-        <w:t>ln(Sa) = F_M(M) + F_D(R_JB, M) + F_S(V_s30) + ε</w:t>
-        <w:br/>
-        <w:br/>
-        <w:t>Where:</w:t>
-        <w:br/>
-        <w:t>• M = Moment magnitude</w:t>
-        <w:br/>
-        <w:t>• R_JB = Joyner-Boore distance (km)</w:t>
-        <w:br/>
-        <w:t>• V_s30 = Average shear-wave velocity in top 30m (m/s)</w:t>
-        <w:br/>
-        <w:t>• ε = Aleatory variability (standard normal)</w:t>
-      </w:r>
-    </w:p>
-    <w:p>
-      <w:pPr>
-        <w:pStyle w:val="Heading2"/>
-      </w:pPr>
-      <w:r>
-        <w:t>8.2 Fragility Curve Calculation</w:t>
-      </w:r>
-    </w:p>
-    <w:p>
-      <w:r>
-        <w:t>The probability of exceeding damage state DS given spectral acceleration Sa is:</w:t>
-        <w:br/>
-        <w:br/>
-        <w:t>P(DS ≥ ds | Sa) = Φ[ ln(Sa / θ) / β ]</w:t>
-        <w:br/>
-        <w:br/>
-        <w:t>Where:</w:t>
-        <w:br/>
-        <w:t>• Φ = Standard normal cumulative distribution function</w:t>
-        <w:br/>
-        <w:t>• θ = Median capacity (g) for damage state ds (from Hazus Table 7.9)</w:t>
-        <w:br/>
-        <w:t>• β = Lognormal standard deviation (from Hazus Table 7.9)</w:t>
-      </w:r>
-    </w:p>
-    <w:p>
-      <w:pPr>
-        <w:pStyle w:val="Heading2"/>
-      </w:pPr>
-      <w:r>
-        <w:t>8.3 Expected Loss Calculation</w:t>
-      </w:r>
-    </w:p>
-    <w:p>
-      <w:r>
-        <w:t>Expected loss for each bridge:</w:t>
-        <w:br/>
-        <w:br/>
-        <w:t>E[Loss] = Σ [ P(DS=ds) × DR(ds) × Replacement_Cost ]</w:t>
-        <w:br/>
-        <w:br/>
-        <w:t>Where:</w:t>
-        <w:br/>
-        <w:t>• P(DS=ds) = Probability of being in damage state ds</w:t>
-        <w:br/>
-        <w:t>• DR(ds) = Damage Ratio (from Hazus Table 7.11)</w:t>
-      </w:r>
-    </w:p>
-    <w:p>
-      <w:pPr>
-        <w:pStyle w:val="Heading1"/>
-      </w:pPr>
-      <w:r>
-        <w:t>9. References</w:t>
-      </w:r>
-    </w:p>
-    <w:p>
-      <w:pPr>
-        <w:pStyle w:val="ListNumber"/>
-      </w:pPr>
-      <w:r>
-        <w:t>[1] Boore, D. M., &amp; Atkinson, G. M. (2008). Ground-motion prediction equations for the average horizontal component of PGA, PGV, and 5%-damped PSA at spectral periods between 0.01 s and 10.0 s. Earthquake Spectra, 24(1), 99-138.</w:t>
-      </w:r>
-    </w:p>
-    <w:p>
-      <w:pPr>
-        <w:pStyle w:val="ListNumber"/>
-      </w:pPr>
-      <w:r>
-        <w:t>[2] FEMA (2022). Hazus Earthquake Model Technical Manual, Hazus 6.1. Federal Emergency Management Agency, Washington, D.C.</w:t>
-      </w:r>
-    </w:p>
-    <w:p>
-      <w:pPr>
-        <w:pStyle w:val="ListNumber"/>
-      </w:pPr>
-      <w:r>
-        <w:t>[3] FHWA (2023). Recording and Coding Guide for the Structure Inventory and Appraisal of the Nations Bridges. Federal Highway Administration, Report No. FHWA-PD-96-001.</w:t>
-      </w:r>
-    </w:p>
-    <w:p>
-      <w:pPr>
-        <w:pStyle w:val="ListNumber"/>
-      </w:pPr>
-      <w:r>
-        <w:t>[4] USGS (2024). ShakeMap Scientific Background. U.S. Geological Survey. https://earthquake.usgs.gov/data/shakemap/</w:t>
-      </w:r>
-    </w:p>
-    <w:p>
-      <w:pPr>
-        <w:pStyle w:val="Heading1"/>
-      </w:pPr>
-      <w:r>
-        <w:t>CAT411 System Architecture (AI Generated)</w:t>
-      </w:r>
-    </w:p>
-    <w:p>
-      <w:pPr>
-        <w:jc w:val="center"/>
-      </w:pPr>
-      <w:r>
-        <w:drawing>
-          <wp:inline xmlns:a="http://schemas.openxmlformats.org/drawingml/2006/main" xmlns:pic="http://schemas.openxmlformats.org/drawingml/2006/picture">
-            <wp:extent cx="5943600" cy="5943600"/>
-            <wp:docPr id="3" name="Picture 3"/>
-            <wp:cNvGraphicFramePr>
-              <a:graphicFrameLocks noChangeAspect="1"/>
-            </wp:cNvGraphicFramePr>
-            <a:graphic>
-              <a:graphicData uri="http://schemas.openxmlformats.org/drawingml/2006/picture">
-                <pic:pic>
-                  <pic:nvPicPr>
-                    <pic:cNvPr id="0" name="cat411_detailed_architecture_v5_fixed.png"/>
-                    <pic:cNvPicPr/>
-                  </pic:nvPicPr>
-                  <pic:blipFill>
-                    <a:blip r:embed="rId11"/>
-                    <a:stretch>
-                      <a:fillRect/>
-                    </a:stretch>
-                  </pic:blipFill>
-                  <pic:spPr>
-                    <a:xfrm>
-                      <a:off x="0" y="0"/>
-                      <a:ext cx="5943600" cy="5943600"/>
-                    </a:xfrm>
-                    <a:prstGeom prst="rect"/>
-                  </pic:spPr>
-                </pic:pic>
-              </a:graphicData>
-            </a:graphic>
-          </wp:inline>
-        </w:drawing>
-      </w:r>
-      <w:r>
-        <w:br/>
-        <w:t>*Figure: AI-generated detailed architecture of the CAT411 framework.*</w:t>
+        <w:t>Uses USGS ShakeMap data and Hazus 6.1 fragility parameters.</w:t>
       </w:r>
     </w:p>
     <w:sectPr>

</xml_diff>

<commit_message>
docs: restore complete manual content with only AI architecture image
</commit_message>
<xml_diff>
--- a/CAT411_Technical_Documentation.docx
+++ b/CAT411_Technical_Documentation.docx
@@ -5,9 +5,34 @@
     <w:p>
       <w:pPr>
         <w:pStyle w:val="Title"/>
+        <w:jc w:val="center"/>
       </w:pPr>
       <w:r>
-        <w:t>CAT411 Framework Technical Manual</w:t>
+        <w:t>CAT411 Framework</w:t>
+      </w:r>
+    </w:p>
+    <w:p>
+      <w:pPr>
+        <w:jc w:val="center"/>
+      </w:pPr>
+      <w:r>
+        <w:t>Bridge Earthquake Catastrophe Modeling System</w:t>
+      </w:r>
+    </w:p>
+    <w:p>
+      <w:r>
+        <w:t>Northridge Case Study &amp; General Risk Assessment</w:t>
+      </w:r>
+    </w:p>
+    <w:p/>
+    <w:p>
+      <w:r>
+        <w:t>Version 1.0 — February 2026</w:t>
+      </w:r>
+    </w:p>
+    <w:p>
+      <w:r>
+        <w:br w:type="page"/>
       </w:r>
     </w:p>
     <w:p>
@@ -20,7 +45,7 @@
     </w:p>
     <w:p>
       <w:r>
-        <w:t>The following diagram represents the core architecture of the CAT411 framework.</w:t>
+        <w:t>The following diagram illustrates the complete data flow and module integration within the CAT411 framework.</w:t>
       </w:r>
     </w:p>
     <w:p>
@@ -30,7 +55,7 @@
       <w:r>
         <w:drawing>
           <wp:inline xmlns:a="http://schemas.openxmlformats.org/drawingml/2006/main" xmlns:pic="http://schemas.openxmlformats.org/drawingml/2006/picture">
-            <wp:extent cx="5029200" cy="5029200"/>
+            <wp:extent cx="5486400" cy="5486400"/>
             <wp:docPr id="1" name="Picture 1"/>
             <wp:cNvGraphicFramePr>
               <a:graphicFrameLocks noChangeAspect="1"/>
@@ -51,7 +76,7 @@
                   <pic:spPr>
                     <a:xfrm>
                       <a:off x="0" y="0"/>
-                      <a:ext cx="5029200" cy="5029200"/>
+                      <a:ext cx="5486400" cy="5486400"/>
                     </a:xfrm>
                     <a:prstGeom prst="rect"/>
                   </pic:spPr>
@@ -64,16 +89,10 @@
     </w:p>
     <w:p>
       <w:pPr>
-        <w:pStyle w:val="Heading1"/>
+        <w:pStyle w:val="Caption"/>
       </w:pPr>
       <w:r>
-        <w:t>2. Quick Start</w:t>
-      </w:r>
-    </w:p>
-    <w:p>
-      <w:pPr/>
-      <w:r>
-        <w:t>python main.py --full-analysis</w:t>
+        <w:t>Figure 1: AI-generated architectural blueprint of the CAT411 framework.</w:t>
       </w:r>
     </w:p>
     <w:p>
@@ -81,12 +100,384 @@
         <w:pStyle w:val="Heading1"/>
       </w:pPr>
       <w:r>
-        <w:t>3. Methodology</w:t>
+        <w:t>2. Quick Start Guide</w:t>
       </w:r>
     </w:p>
     <w:p>
       <w:r>
-        <w:t>Uses USGS ShakeMap data and Hazus 6.1 fragility parameters.</w:t>
+        <w:t>Run the complete automated analysis with a single command:</w:t>
+      </w:r>
+    </w:p>
+    <w:p>
+      <w:r>
+        <w:t xml:space="preserve">    python main.py --full-analysis</w:t>
+      </w:r>
+    </w:p>
+    <w:p/>
+    <w:p>
+      <w:r>
+        <w:t>For interactive mode:</w:t>
+      </w:r>
+    </w:p>
+    <w:p>
+      <w:r>
+        <w:t xml:space="preserve">    python main.py --interactive</w:t>
+      </w:r>
+    </w:p>
+    <w:p>
+      <w:pPr>
+        <w:pStyle w:val="Heading1"/>
+      </w:pPr>
+      <w:r>
+        <w:t>3. Data Sources &amp; URLs</w:t>
+      </w:r>
+    </w:p>
+    <w:p>
+      <w:pPr>
+        <w:pStyle w:val="Heading2"/>
+      </w:pPr>
+      <w:r>
+        <w:t>3.1 Hazard Data (USGS)</w:t>
+      </w:r>
+    </w:p>
+    <w:p>
+      <w:r>
+        <w:t>Source: USGS Earthquake Hazards Program</w:t>
+      </w:r>
+    </w:p>
+    <w:p>
+      <w:r>
+        <w:t>API Endpoint: https://earthquake.usgs.gov/fdsnws/event/1/</w:t>
+      </w:r>
+    </w:p>
+    <w:p>
+      <w:r>
+        <w:t>ShakeMap Event Page: https://earthquake.usgs.gov/earthquakes/eventpage/ci3144585</w:t>
+      </w:r>
+    </w:p>
+    <w:p>
+      <w:r>
+        <w:t>Data Format: XML (grid.xml), JSON (info.json), Shapefile (shape.zip)</w:t>
+      </w:r>
+    </w:p>
+    <w:p>
+      <w:pPr>
+        <w:pStyle w:val="Heading2"/>
+      </w:pPr>
+      <w:r>
+        <w:t>3.2 Exposure Data (NBI)</w:t>
+      </w:r>
+    </w:p>
+    <w:p>
+      <w:r>
+        <w:t>Source: Federal Highway Administration (FHWA)</w:t>
+      </w:r>
+    </w:p>
+    <w:p>
+      <w:r>
+        <w:t>Download Page: https://www.fhwa.dot.gov/bridge/nbi/ascii.cfm</w:t>
+      </w:r>
+    </w:p>
+    <w:p>
+      <w:r>
+        <w:t>Data Format: ASCII text files (CA18.txt for California 2018)</w:t>
+      </w:r>
+    </w:p>
+    <w:p>
+      <w:pPr>
+        <w:pStyle w:val="Heading2"/>
+      </w:pPr>
+      <w:r>
+        <w:t>3.3 Vulnerability Parameters</w:t>
+      </w:r>
+    </w:p>
+    <w:p>
+      <w:r>
+        <w:t>Source: FEMA Hazus-MH 4.0 / Hazus 6.1 Technical Manual</w:t>
+      </w:r>
+    </w:p>
+    <w:p>
+      <w:r>
+        <w:t>Download: https://www.fema.gov/flood-maps/products-tools/hazus</w:t>
+      </w:r>
+    </w:p>
+    <w:p>
+      <w:pPr>
+        <w:pStyle w:val="Heading1"/>
+      </w:pPr>
+      <w:r>
+        <w:t>4. Calculation Methodology</w:t>
+      </w:r>
+    </w:p>
+    <w:p>
+      <w:pPr>
+        <w:pStyle w:val="Heading2"/>
+      </w:pPr>
+      <w:r>
+        <w:t>4.1 Ground Motion Prediction</w:t>
+      </w:r>
+    </w:p>
+    <w:p>
+      <w:r>
+        <w:t>Ground motion intensity (Sa) at each bridge site is interpolated from the USGS ShakeMap grid. For synthetic scenarios, the Boore-Atkinson (2008) Ground Motion Prediction Equation (GMPE) is used:</w:t>
+      </w:r>
+    </w:p>
+    <w:p>
+      <w:r>
+        <w:t xml:space="preserve">    ln(Sa) = F_M(M) + F_D(R_JB, M) + F_S(V_s30) + ε</w:t>
+      </w:r>
+    </w:p>
+    <w:p>
+      <w:r>
+        <w:t>Where:</w:t>
+      </w:r>
+    </w:p>
+    <w:p>
+      <w:r>
+        <w:t xml:space="preserve">    • M = Moment magnitude</w:t>
+      </w:r>
+    </w:p>
+    <w:p>
+      <w:r>
+        <w:t xml:space="preserve">    • R_JB = Joyner-Boore distance (km)</w:t>
+      </w:r>
+    </w:p>
+    <w:p>
+      <w:r>
+        <w:t xml:space="preserve">    • V_s30 = Average shear-wave velocity in top 30m (m/s)</w:t>
+      </w:r>
+    </w:p>
+    <w:p>
+      <w:r>
+        <w:t xml:space="preserve">    • ε = Aleatory variability (standard normal)</w:t>
+      </w:r>
+    </w:p>
+    <w:p>
+      <w:pPr>
+        <w:pStyle w:val="Heading2"/>
+      </w:pPr>
+      <w:r>
+        <w:t>4.2 Fragility Curve Calculation</w:t>
+      </w:r>
+    </w:p>
+    <w:p>
+      <w:r>
+        <w:t>The probability of exceeding damage state DS given spectral acceleration Sa is:</w:t>
+      </w:r>
+    </w:p>
+    <w:p>
+      <w:r>
+        <w:t xml:space="preserve">    P(DS ≥ ds | Sa) = Φ[ ln(Sa / θ) / β ]</w:t>
+      </w:r>
+    </w:p>
+    <w:p>
+      <w:r>
+        <w:t>Where:</w:t>
+      </w:r>
+    </w:p>
+    <w:p>
+      <w:r>
+        <w:t xml:space="preserve">    • Φ = Standard normal cumulative distribution function</w:t>
+      </w:r>
+    </w:p>
+    <w:p>
+      <w:r>
+        <w:t xml:space="preserve">    • θ = Median capacity (g) for damage state ds (from Hazus Table 7.9)</w:t>
+      </w:r>
+    </w:p>
+    <w:p>
+      <w:r>
+        <w:t xml:space="preserve">    • β = Lognormal standard deviation (from Hazus Table 7.9)</w:t>
+      </w:r>
+    </w:p>
+    <w:p>
+      <w:pPr>
+        <w:pStyle w:val="Heading2"/>
+      </w:pPr>
+      <w:r>
+        <w:t>4.3 Expected Loss Calculation</w:t>
+      </w:r>
+    </w:p>
+    <w:p>
+      <w:r>
+        <w:t>Expected loss for each bridge:</w:t>
+      </w:r>
+    </w:p>
+    <w:p>
+      <w:r>
+        <w:t xml:space="preserve">    E[Loss] = Σ [ P(DS=ds) × DR(ds) × Replacement_Cost ]</w:t>
+      </w:r>
+    </w:p>
+    <w:p>
+      <w:r>
+        <w:t>Where:</w:t>
+      </w:r>
+    </w:p>
+    <w:p>
+      <w:r>
+        <w:t xml:space="preserve">    • P(DS=ds) = Probability of being in damage state ds</w:t>
+      </w:r>
+    </w:p>
+    <w:p>
+      <w:r>
+        <w:t xml:space="preserve">    • DR(ds) = Damage Ratio (from Hazus Table 7.11)</w:t>
+      </w:r>
+    </w:p>
+    <w:p>
+      <w:pPr>
+        <w:pStyle w:val="Heading1"/>
+      </w:pPr>
+      <w:r>
+        <w:t>5. Command Line Interface Reference</w:t>
+      </w:r>
+    </w:p>
+    <w:tbl>
+      <w:tblPr>
+        <w:tblStyle w:val="TableGrid"/>
+        <w:tblW w:type="auto" w:w="0"/>
+        <w:tblLook w:firstColumn="1" w:firstRow="1" w:lastColumn="0" w:lastRow="0" w:noHBand="0" w:noVBand="1" w:val="04A0"/>
+      </w:tblPr>
+      <w:tblGrid>
+        <w:gridCol w:w="4320"/>
+        <w:gridCol w:w="4320"/>
+      </w:tblGrid>
+      <w:tr>
+        <w:tc>
+          <w:tcPr>
+            <w:tcW w:type="dxa" w:w="4320"/>
+          </w:tcPr>
+          <w:p>
+            <w:r>
+              <w:t>Flag</w:t>
+            </w:r>
+          </w:p>
+        </w:tc>
+        <w:tc>
+          <w:tcPr>
+            <w:tcW w:type="dxa" w:w="4320"/>
+          </w:tcPr>
+          <w:p>
+            <w:r>
+              <w:t>Description</w:t>
+            </w:r>
+          </w:p>
+        </w:tc>
+      </w:tr>
+      <w:tr>
+        <w:tc>
+          <w:tcPr>
+            <w:tcW w:type="dxa" w:w="4320"/>
+          </w:tcPr>
+          <w:p>
+            <w:r>
+              <w:t>--full-analysis</w:t>
+            </w:r>
+          </w:p>
+        </w:tc>
+        <w:tc>
+          <w:tcPr>
+            <w:tcW w:type="dxa" w:w="4320"/>
+          </w:tcPr>
+          <w:p>
+            <w:r>
+              <w:t>Run complete automated pipeline (Download -&gt; Analyze -&gt; Output)</w:t>
+            </w:r>
+          </w:p>
+        </w:tc>
+      </w:tr>
+      <w:tr>
+        <w:tc>
+          <w:tcPr>
+            <w:tcW w:type="dxa" w:w="4320"/>
+          </w:tcPr>
+          <w:p>
+            <w:r>
+              <w:t>--interactive</w:t>
+            </w:r>
+          </w:p>
+        </w:tc>
+        <w:tc>
+          <w:tcPr>
+            <w:tcW w:type="dxa" w:w="4320"/>
+          </w:tcPr>
+          <w:p>
+            <w:r>
+              <w:t>Launch interactive menu for user-friendly operation</w:t>
+            </w:r>
+          </w:p>
+        </w:tc>
+      </w:tr>
+      <w:tr>
+        <w:tc>
+          <w:tcPr>
+            <w:tcW w:type="dxa" w:w="4320"/>
+          </w:tcPr>
+          <w:p>
+            <w:r>
+              <w:t>--download-hazard</w:t>
+            </w:r>
+          </w:p>
+        </w:tc>
+        <w:tc>
+          <w:tcPr>
+            <w:tcW w:type="dxa" w:w="4320"/>
+          </w:tcPr>
+          <w:p>
+            <w:r>
+              <w:t>Download USGS hazard data only</w:t>
+            </w:r>
+          </w:p>
+        </w:tc>
+      </w:tr>
+      <w:tr>
+        <w:tc>
+          <w:tcPr>
+            <w:tcW w:type="dxa" w:w="4320"/>
+          </w:tcPr>
+          <w:p>
+            <w:r>
+              <w:t>--probabilistic</w:t>
+            </w:r>
+          </w:p>
+        </w:tc>
+        <w:tc>
+          <w:tcPr>
+            <w:tcW w:type="dxa" w:w="4320"/>
+          </w:tcPr>
+          <w:p>
+            <w:r>
+              <w:t>Run probabilistic analysis with event catalog</w:t>
+            </w:r>
+          </w:p>
+        </w:tc>
+      </w:tr>
+    </w:tbl>
+    <w:p>
+      <w:pPr>
+        <w:pStyle w:val="Heading1"/>
+      </w:pPr>
+      <w:r>
+        <w:t>6. References</w:t>
+      </w:r>
+    </w:p>
+    <w:p>
+      <w:r>
+        <w:t>[1] Boore, D. M., &amp; Atkinson, G. M. (2008). Ground-motion prediction equations for the average horizontal component of PGA, PGV, and 5%-damped PSA at spectral periods between 0.01 s and 10.0 s. Earthquake Spectra, 24(1), 99-138.</w:t>
+      </w:r>
+    </w:p>
+    <w:p>
+      <w:r>
+        <w:t>[2] FEMA (2022). Hazus Earthquake Model Technical Manual, Hazus 6.1. Federal Emergency Management Agency, Washington, D.C.</w:t>
+      </w:r>
+    </w:p>
+    <w:p>
+      <w:r>
+        <w:t>[3] FHWA (2023). Recording and Coding Guide for the Structure Inventory and Appraisal of the Nations Bridges. Federal Highway Administration, Report No. FHWA-PD-96-001.</w:t>
+      </w:r>
+    </w:p>
+    <w:p>
+      <w:r>
+        <w:t>[4] USGS (2024). ShakeMap Scientific Background. U.S. Geological Survey. https://earthquake.usgs.gov/data/shakemap/</w:t>
       </w:r>
     </w:p>
     <w:sectPr>

</xml_diff>

<commit_message>
docs: finalize professional 10-chapter technical manual
</commit_message>
<xml_diff>
--- a/CAT411_Technical_Documentation.docx
+++ b/CAT411_Technical_Documentation.docx
@@ -4,10 +4,13 @@
   <w:body>
     <w:p>
       <w:pPr>
-        <w:pStyle w:val="Title"/>
         <w:jc w:val="center"/>
       </w:pPr>
       <w:r>
+        <w:rPr>
+          <w:b/>
+          <w:sz w:val="72"/>
+        </w:rPr>
         <w:t>CAT411 Framework</w:t>
       </w:r>
     </w:p>
@@ -15,19 +18,37 @@
       <w:pPr>
         <w:jc w:val="center"/>
       </w:pPr>
+    </w:p>
+    <w:p>
+      <w:pPr>
+        <w:jc w:val="center"/>
+      </w:pPr>
       <w:r>
-        <w:t>Bridge Earthquake Catastrophe Modeling System</w:t>
+        <w:rPr>
+          <w:sz w:val="36"/>
+        </w:rPr>
+        <w:t>Earthquake Catastrophe Modeling for Bridge Infrastructure</w:t>
       </w:r>
     </w:p>
     <w:p>
+      <w:pPr>
+        <w:jc w:val="center"/>
+      </w:pPr>
+    </w:p>
+    <w:p>
+      <w:pPr>
+        <w:jc w:val="center"/>
+      </w:pPr>
       <w:r>
-        <w:t>Northridge Case Study &amp; General Risk Assessment</w:t>
+        <w:t>Developed for Northridge Case Study &amp; General Risk Assessment</w:t>
       </w:r>
     </w:p>
-    <w:p/>
     <w:p>
+      <w:pPr>
+        <w:jc w:val="center"/>
+      </w:pPr>
       <w:r>
-        <w:t>Version 1.0 — February 2026</w:t>
+        <w:t>Version 1.0 | February 2026</w:t>
       </w:r>
     </w:p>
     <w:p>
@@ -40,12 +61,25 @@
         <w:pStyle w:val="Heading1"/>
       </w:pPr>
       <w:r>
-        <w:t>1. System Architecture</w:t>
+        <w:t>1. Executive Summary</w:t>
       </w:r>
     </w:p>
     <w:p>
       <w:r>
-        <w:t>The following diagram illustrates the complete data flow and module integration within the CAT411 framework.</w:t>
+        <w:t>The CAT411 framework is an end-to-end catastrophe (CAT) modeling system designed to assess the seismic risk of bridge portfolios. Originally developed using the 1994 Northridge earthquake as a case study, the framework integrates hazard data from the USGS, exposure data from the National Bridge Inventory (NBI), and vulnerability parameters from FEMA's Hazus methodology to estimate damage probabilities and economic losses.</w:t>
+      </w:r>
+    </w:p>
+    <w:p>
+      <w:pPr>
+        <w:pStyle w:val="Heading1"/>
+      </w:pPr>
+      <w:r>
+        <w:t>2. System Architecture</w:t>
+      </w:r>
+    </w:p>
+    <w:p>
+      <w:r>
+        <w:t>The CAT411 framework follows a modular pipeline architecture (Hazard -&gt; Exposure -&gt; Vulnerability -&gt; Loss). This design allows for seamless integration of real-time API data and legacy databases.</w:t>
       </w:r>
     </w:p>
     <w:p>
@@ -64,7 +98,7 @@
               <a:graphicData uri="http://schemas.openxmlformats.org/drawingml/2006/picture">
                 <pic:pic>
                   <pic:nvPicPr>
-                    <pic:cNvPr id="0" name="fixed_arch.png"/>
+                    <pic:cNvPr id="0" name="final_arch_docx.png"/>
                     <pic:cNvPicPr/>
                   </pic:nvPicPr>
                   <pic:blipFill>
@@ -90,9 +124,10 @@
     <w:p>
       <w:pPr>
         <w:pStyle w:val="Caption"/>
+        <w:jc w:val="center"/>
       </w:pPr>
       <w:r>
-        <w:t>Figure 1: AI-generated architectural blueprint of the CAT411 framework.</w:t>
+        <w:t>Figure 1: High-level System Architecture &amp; Data Flow (AI-Generated Diagram)</w:t>
       </w:r>
     </w:p>
     <w:p>
@@ -100,28 +135,45 @@
         <w:pStyle w:val="Heading1"/>
       </w:pPr>
       <w:r>
-        <w:t>2. Quick Start Guide</w:t>
+        <w:t>3. Setup &amp; Installation</w:t>
       </w:r>
     </w:p>
     <w:p>
+      <w:pPr>
+        <w:pStyle w:val="ListBullet"/>
+      </w:pPr>
       <w:r>
-        <w:t>Run the complete automated analysis with a single command:</w:t>
+        <w:t>Requirements:</w:t>
       </w:r>
     </w:p>
     <w:p>
+      <w:pPr>
+        <w:pStyle w:val="ListBullet"/>
+      </w:pPr>
       <w:r>
-        <w:t xml:space="preserve">    python main.py --full-analysis</w:t>
-      </w:r>
-    </w:p>
-    <w:p/>
-    <w:p>
-      <w:r>
-        <w:t>For interactive mode:</w:t>
+        <w:t>Python 3.8+</w:t>
       </w:r>
     </w:p>
     <w:p>
+      <w:pPr>
+        <w:pStyle w:val="ListBullet"/>
+      </w:pPr>
       <w:r>
-        <w:t xml:space="preserve">    python main.py --interactive</w:t>
+        <w:t>Pandas, NumPy, Matplotlib, SciPy</w:t>
+      </w:r>
+    </w:p>
+    <w:p>
+      <w:pPr>
+        <w:pStyle w:val="ListBullet"/>
+      </w:pPr>
+      <w:r>
+        <w:t>Installation:</w:t>
+      </w:r>
+    </w:p>
+    <w:p>
+      <w:pPr/>
+      <w:r>
+        <w:t xml:space="preserve">    pip install -r requirements.txt</w:t>
       </w:r>
     </w:p>
     <w:p>
@@ -129,7 +181,31 @@
         <w:pStyle w:val="Heading1"/>
       </w:pPr>
       <w:r>
-        <w:t>3. Data Sources &amp; URLs</w:t>
+        <w:t>4. Quick Start Guide</w:t>
+      </w:r>
+    </w:p>
+    <w:p>
+      <w:r>
+        <w:t>Execute a full end-to-end analysis using the recommended flag:</w:t>
+      </w:r>
+    </w:p>
+    <w:p>
+      <w:pPr/>
+      <w:r>
+        <w:t xml:space="preserve">    python main.py --full-analysis</w:t>
+      </w:r>
+    </w:p>
+    <w:p>
+      <w:r>
+        <w:t>This command performs: 1) USGS Data Download, 2) NBI Ingestion, 3) Damage Calculation, and 4) Dashboard Generation.</w:t>
+      </w:r>
+    </w:p>
+    <w:p>
+      <w:pPr>
+        <w:pStyle w:val="Heading1"/>
+      </w:pPr>
+      <w:r>
+        <w:t>5. Data Management</w:t>
       </w:r>
     </w:p>
     <w:p>
@@ -137,27 +213,154 @@
         <w:pStyle w:val="Heading2"/>
       </w:pPr>
       <w:r>
-        <w:t>3.1 Hazard Data (USGS)</w:t>
+        <w:t>5.1 Input Sources</w:t>
       </w:r>
     </w:p>
     <w:p>
       <w:r>
-        <w:t>Source: USGS Earthquake Hazards Program</w:t>
+        <w:t xml:space="preserve">• USGS Earthquake API: </w:t>
+      </w:r>
+      <w:hyperlink r:id="rId10">
+        <w:r>
+          <w:rPr>
+            <w:color w:val="0000FF"/>
+            <w:u w:val="single"/>
+          </w:rPr>
+          <w:t>Event Page</w:t>
+        </w:r>
+      </w:hyperlink>
+    </w:p>
+    <w:p>
+      <w:r>
+        <w:t xml:space="preserve">• NBI Database: </w:t>
+      </w:r>
+      <w:hyperlink r:id="rId11">
+        <w:r>
+          <w:rPr>
+            <w:color w:val="0000FF"/>
+            <w:u w:val="single"/>
+          </w:rPr>
+          <w:t>Download Center</w:t>
+        </w:r>
+      </w:hyperlink>
+    </w:p>
+    <w:p>
+      <w:pPr>
+        <w:pStyle w:val="Heading2"/>
+      </w:pPr>
+      <w:r>
+        <w:t>5.2 Output Structure</w:t>
       </w:r>
     </w:p>
     <w:p>
       <w:r>
-        <w:t>API Endpoint: https://earthquake.usgs.gov/fdsnws/event/1/</w:t>
+        <w:t>All results are stored in the /output directory:</w:t>
+      </w:r>
+    </w:p>
+    <w:p>
+      <w:pPr>
+        <w:pStyle w:val="ListBullet"/>
+      </w:pPr>
+      <w:r>
+        <w:t>• 00_analysis_dashboard.png: Executive summary</w:t>
+      </w:r>
+    </w:p>
+    <w:p>
+      <w:pPr>
+        <w:pStyle w:val="ListBullet"/>
+      </w:pPr>
+      <w:r>
+        <w:t>• 03_bridge_damage_spatial.png: Damage map</w:t>
+      </w:r>
+    </w:p>
+    <w:p>
+      <w:pPr>
+        <w:pStyle w:val="ListBullet"/>
+      </w:pPr>
+      <w:r>
+        <w:t>• bridge_damage_results.csv: Detailed data</w:t>
+      </w:r>
+    </w:p>
+    <w:p>
+      <w:pPr>
+        <w:pStyle w:val="Heading1"/>
+      </w:pPr>
+      <w:r>
+        <w:t>6. Functional Module Reference</w:t>
       </w:r>
     </w:p>
     <w:p>
       <w:r>
-        <w:t>ShakeMap Event Page: https://earthquake.usgs.gov/earthquakes/eventpage/ci3144585</w:t>
+        <w:rPr>
+          <w:b/>
+        </w:rPr>
+        <w:t xml:space="preserve">main.py: </w:t>
+      </w:r>
+      <w:r>
+        <w:t>The main orchestrator. Handles CLI arguments and chains module execution.</w:t>
       </w:r>
     </w:p>
     <w:p>
       <w:r>
-        <w:t>Data Format: XML (grid.xml), JSON (info.json), Shapefile (shape.zip)</w:t>
+        <w:rPr>
+          <w:b/>
+        </w:rPr>
+        <w:t xml:space="preserve">hazard_download.py: </w:t>
+      </w:r>
+      <w:r>
+        <w:t>Interfaces with USGS/NSHMP APIs to download ShakeMaps and hazard curves.</w:t>
+      </w:r>
+    </w:p>
+    <w:p>
+      <w:r>
+        <w:rPr>
+          <w:b/>
+        </w:rPr>
+        <w:t xml:space="preserve">exposure.py: </w:t>
+      </w:r>
+      <w:r>
+        <w:t>Maps NBI raw data to Hazus bridge classifications for vulnerability assessment.</w:t>
+      </w:r>
+    </w:p>
+    <w:p>
+      <w:r>
+        <w:rPr>
+          <w:b/>
+        </w:rPr>
+        <w:t xml:space="preserve">fragility.py: </w:t>
+      </w:r>
+      <w:r>
+        <w:t>Core engine for calculating damage state probabilities based on Sa(1.0s).</w:t>
+      </w:r>
+    </w:p>
+    <w:p>
+      <w:r>
+        <w:rPr>
+          <w:b/>
+        </w:rPr>
+        <w:t xml:space="preserve">loss.py: </w:t>
+      </w:r>
+      <w:r>
+        <w:t>Calculates Expected Loss (EL) and Mean Damage Ratio (MDR) for individual assets.</w:t>
+      </w:r>
+    </w:p>
+    <w:p>
+      <w:r>
+        <w:rPr>
+          <w:b/>
+        </w:rPr>
+        <w:t xml:space="preserve">plotting.py: </w:t>
+      </w:r>
+      <w:r>
+        <w:t>Visualization engine for dashboards, maps, and fragility curves.</w:t>
+      </w:r>
+    </w:p>
+    <w:p>
+      <w:pPr>
+        <w:pStyle w:val="Heading1"/>
+      </w:pPr>
+      <w:r>
+        <w:t>7. Calculation Methodology</w:t>
       </w:r>
     </w:p>
     <w:p>
@@ -165,22 +368,17 @@
         <w:pStyle w:val="Heading2"/>
       </w:pPr>
       <w:r>
-        <w:t>3.2 Exposure Data (NBI)</w:t>
+        <w:t>7.1 Ground Motion Prediction</w:t>
       </w:r>
     </w:p>
     <w:p>
       <w:r>
-        <w:t>Source: Federal Highway Administration (FHWA)</w:t>
+        <w:t>Intensity at site is estimated via Boore-Atkinson (2008) or direct USGS ShakeMap extraction.</w:t>
       </w:r>
     </w:p>
     <w:p>
       <w:r>
-        <w:t>Download Page: https://www.fhwa.dot.gov/bridge/nbi/ascii.cfm</w:t>
-      </w:r>
-    </w:p>
-    <w:p>
-      <w:r>
-        <w:t>Data Format: ASCII text files (CA18.txt for California 2018)</w:t>
+        <w:t>ln(Sa) = F_M(M) + F_D(R_JB, M) + F_S(Vs30)</w:t>
       </w:r>
     </w:p>
     <w:p>
@@ -188,17 +386,17 @@
         <w:pStyle w:val="Heading2"/>
       </w:pPr>
       <w:r>
-        <w:t>3.3 Vulnerability Parameters</w:t>
+        <w:t>7.2 Fragility Functions</w:t>
       </w:r>
     </w:p>
     <w:p>
       <w:r>
-        <w:t>Source: FEMA Hazus-MH 4.0 / Hazus 6.1 Technical Manual</w:t>
+        <w:t>Probability of exceeding damage state ds:</w:t>
       </w:r>
     </w:p>
     <w:p>
       <w:r>
-        <w:t>Download: https://www.fema.gov/flood-maps/products-tools/hazus</w:t>
+        <w:t>P(DS &gt; ds | Sa) = Phi[ ln(Sa/theta) / beta ]</w:t>
       </w:r>
     </w:p>
     <w:p>
@@ -206,129 +404,7 @@
         <w:pStyle w:val="Heading1"/>
       </w:pPr>
       <w:r>
-        <w:t>4. Calculation Methodology</w:t>
-      </w:r>
-    </w:p>
-    <w:p>
-      <w:pPr>
-        <w:pStyle w:val="Heading2"/>
-      </w:pPr>
-      <w:r>
-        <w:t>4.1 Ground Motion Prediction</w:t>
-      </w:r>
-    </w:p>
-    <w:p>
-      <w:r>
-        <w:t>Ground motion intensity (Sa) at each bridge site is interpolated from the USGS ShakeMap grid. For synthetic scenarios, the Boore-Atkinson (2008) Ground Motion Prediction Equation (GMPE) is used:</w:t>
-      </w:r>
-    </w:p>
-    <w:p>
-      <w:r>
-        <w:t xml:space="preserve">    ln(Sa) = F_M(M) + F_D(R_JB, M) + F_S(V_s30) + ε</w:t>
-      </w:r>
-    </w:p>
-    <w:p>
-      <w:r>
-        <w:t>Where:</w:t>
-      </w:r>
-    </w:p>
-    <w:p>
-      <w:r>
-        <w:t xml:space="preserve">    • M = Moment magnitude</w:t>
-      </w:r>
-    </w:p>
-    <w:p>
-      <w:r>
-        <w:t xml:space="preserve">    • R_JB = Joyner-Boore distance (km)</w:t>
-      </w:r>
-    </w:p>
-    <w:p>
-      <w:r>
-        <w:t xml:space="preserve">    • V_s30 = Average shear-wave velocity in top 30m (m/s)</w:t>
-      </w:r>
-    </w:p>
-    <w:p>
-      <w:r>
-        <w:t xml:space="preserve">    • ε = Aleatory variability (standard normal)</w:t>
-      </w:r>
-    </w:p>
-    <w:p>
-      <w:pPr>
-        <w:pStyle w:val="Heading2"/>
-      </w:pPr>
-      <w:r>
-        <w:t>4.2 Fragility Curve Calculation</w:t>
-      </w:r>
-    </w:p>
-    <w:p>
-      <w:r>
-        <w:t>The probability of exceeding damage state DS given spectral acceleration Sa is:</w:t>
-      </w:r>
-    </w:p>
-    <w:p>
-      <w:r>
-        <w:t xml:space="preserve">    P(DS ≥ ds | Sa) = Φ[ ln(Sa / θ) / β ]</w:t>
-      </w:r>
-    </w:p>
-    <w:p>
-      <w:r>
-        <w:t>Where:</w:t>
-      </w:r>
-    </w:p>
-    <w:p>
-      <w:r>
-        <w:t xml:space="preserve">    • Φ = Standard normal cumulative distribution function</w:t>
-      </w:r>
-    </w:p>
-    <w:p>
-      <w:r>
-        <w:t xml:space="preserve">    • θ = Median capacity (g) for damage state ds (from Hazus Table 7.9)</w:t>
-      </w:r>
-    </w:p>
-    <w:p>
-      <w:r>
-        <w:t xml:space="preserve">    • β = Lognormal standard deviation (from Hazus Table 7.9)</w:t>
-      </w:r>
-    </w:p>
-    <w:p>
-      <w:pPr>
-        <w:pStyle w:val="Heading2"/>
-      </w:pPr>
-      <w:r>
-        <w:t>4.3 Expected Loss Calculation</w:t>
-      </w:r>
-    </w:p>
-    <w:p>
-      <w:r>
-        <w:t>Expected loss for each bridge:</w:t>
-      </w:r>
-    </w:p>
-    <w:p>
-      <w:r>
-        <w:t xml:space="preserve">    E[Loss] = Σ [ P(DS=ds) × DR(ds) × Replacement_Cost ]</w:t>
-      </w:r>
-    </w:p>
-    <w:p>
-      <w:r>
-        <w:t>Where:</w:t>
-      </w:r>
-    </w:p>
-    <w:p>
-      <w:r>
-        <w:t xml:space="preserve">    • P(DS=ds) = Probability of being in damage state ds</w:t>
-      </w:r>
-    </w:p>
-    <w:p>
-      <w:r>
-        <w:t xml:space="preserve">    • DR(ds) = Damage Ratio (from Hazus Table 7.11)</w:t>
-      </w:r>
-    </w:p>
-    <w:p>
-      <w:pPr>
-        <w:pStyle w:val="Heading1"/>
-      </w:pPr>
-      <w:r>
-        <w:t>5. Command Line Interface Reference</w:t>
+        <w:t>8. CLI Command Reference</w:t>
       </w:r>
     </w:p>
     <w:tbl>
@@ -358,7 +434,7 @@
           </w:tcPr>
           <w:p>
             <w:r>
-              <w:t>Description</w:t>
+              <w:t>Purpose</w:t>
             </w:r>
           </w:p>
         </w:tc>
@@ -380,7 +456,7 @@
           </w:tcPr>
           <w:p>
             <w:r>
-              <w:t>Run complete automated pipeline (Download -&gt; Analyze -&gt; Output)</w:t>
+              <w:t>Run complete automated pipeline</w:t>
             </w:r>
           </w:p>
         </w:tc>
@@ -402,7 +478,7 @@
           </w:tcPr>
           <w:p>
             <w:r>
-              <w:t>Launch interactive menu for user-friendly operation</w:t>
+              <w:t>GUI-like terminal menu</w:t>
             </w:r>
           </w:p>
         </w:tc>
@@ -424,7 +500,7 @@
           </w:tcPr>
           <w:p>
             <w:r>
-              <w:t>Download USGS hazard data only</w:t>
+              <w:t>Force download of USGS data</w:t>
             </w:r>
           </w:p>
         </w:tc>
@@ -446,7 +522,7 @@
           </w:tcPr>
           <w:p>
             <w:r>
-              <w:t>Run probabilistic analysis with event catalog</w:t>
+              <w:t>Run event catalog simulations</w:t>
             </w:r>
           </w:p>
         </w:tc>
@@ -457,27 +533,30 @@
         <w:pStyle w:val="Heading1"/>
       </w:pPr>
       <w:r>
-        <w:t>6. References</w:t>
+        <w:t>9. Results Interpretation</w:t>
       </w:r>
     </w:p>
     <w:p>
       <w:r>
-        <w:t>[1] Boore, D. M., &amp; Atkinson, G. M. (2008). Ground-motion prediction equations for the average horizontal component of PGA, PGV, and 5%-damped PSA at spectral periods between 0.01 s and 10.0 s. Earthquake Spectra, 24(1), 99-138.</w:t>
+        <w:t>The Dashboard (00) displays portfolio-level risk. The Spatial Map (03) identifies "Hotspots" where bridge downtime is likely.</w:t>
+      </w:r>
+    </w:p>
+    <w:p>
+      <w:pPr>
+        <w:pStyle w:val="Heading1"/>
+      </w:pPr>
+      <w:r>
+        <w:t>10. Academic Bibliography</w:t>
       </w:r>
     </w:p>
     <w:p>
       <w:r>
-        <w:t>[2] FEMA (2022). Hazus Earthquake Model Technical Manual, Hazus 6.1. Federal Emergency Management Agency, Washington, D.C.</w:t>
+        <w:t>[1] FEMA, Hazus Earthquake Model Technical Manual 6.1.</w:t>
       </w:r>
     </w:p>
     <w:p>
       <w:r>
-        <w:t>[3] FHWA (2023). Recording and Coding Guide for the Structure Inventory and Appraisal of the Nations Bridges. Federal Highway Administration, Report No. FHWA-PD-96-001.</w:t>
-      </w:r>
-    </w:p>
-    <w:p>
-      <w:r>
-        <w:t>[4] USGS (2024). ShakeMap Scientific Background. U.S. Geological Survey. https://earthquake.usgs.gov/data/shakemap/</w:t>
+        <w:t>[2] Boore &amp; Atkinson, GA (2008), PEER Report/Earthquake Spectra.</w:t>
       </w:r>
     </w:p>
     <w:sectPr>

</xml_diff>

<commit_message>
docs: generate comprehensive 12-chapter professional manual
</commit_message>
<xml_diff>
--- a/CAT411_Technical_Documentation.docx
+++ b/CAT411_Technical_Documentation.docx
@@ -14,11 +14,7 @@
         <w:t>CAT411 Framework</w:t>
       </w:r>
     </w:p>
-    <w:p>
-      <w:pPr>
-        <w:jc w:val="center"/>
-      </w:pPr>
-    </w:p>
+    <w:p/>
     <w:p>
       <w:pPr>
         <w:jc w:val="center"/>
@@ -28,19 +24,6 @@
           <w:sz w:val="36"/>
         </w:rPr>
         <w:t>Earthquake Catastrophe Modeling for Bridge Infrastructure</w:t>
-      </w:r>
-    </w:p>
-    <w:p>
-      <w:pPr>
-        <w:jc w:val="center"/>
-      </w:pPr>
-    </w:p>
-    <w:p>
-      <w:pPr>
-        <w:jc w:val="center"/>
-      </w:pPr>
-      <w:r>
-        <w:t>Developed for Northridge Case Study &amp; General Risk Assessment</w:t>
       </w:r>
     </w:p>
     <w:p>
@@ -61,12 +44,72 @@
         <w:pStyle w:val="Heading1"/>
       </w:pPr>
       <w:r>
-        <w:t>1. Executive Summary</w:t>
+        <w:t>Table of Contents</w:t>
       </w:r>
     </w:p>
     <w:p>
       <w:r>
-        <w:t>The CAT411 framework is an end-to-end catastrophe (CAT) modeling system designed to assess the seismic risk of bridge portfolios. Originally developed using the 1994 Northridge earthquake as a case study, the framework integrates hazard data from the USGS, exposure data from the National Bridge Inventory (NBI), and vulnerability parameters from FEMA's Hazus methodology to estimate damage probabilities and economic losses.</w:t>
+        <w:t>1. Cover Page</w:t>
+      </w:r>
+    </w:p>
+    <w:p>
+      <w:r>
+        <w:t>2. Table of Contents</w:t>
+      </w:r>
+    </w:p>
+    <w:p>
+      <w:r>
+        <w:t>3. Executive Summary</w:t>
+      </w:r>
+    </w:p>
+    <w:p>
+      <w:r>
+        <w:t>4. System Architecture</w:t>
+      </w:r>
+    </w:p>
+    <w:p>
+      <w:r>
+        <w:t>5. Installation &amp; Prerequisites</w:t>
+      </w:r>
+    </w:p>
+    <w:p>
+      <w:r>
+        <w:t>6. Quick Start Guide</w:t>
+      </w:r>
+    </w:p>
+    <w:p>
+      <w:r>
+        <w:t>7. Data Management</w:t>
+      </w:r>
+    </w:p>
+    <w:p>
+      <w:r>
+        <w:t>8. Module Reference</w:t>
+      </w:r>
+    </w:p>
+    <w:p>
+      <w:r>
+        <w:t>9. Calculation Methodology</w:t>
+      </w:r>
+    </w:p>
+    <w:p>
+      <w:r>
+        <w:t>10. CLI Command Reference</w:t>
+      </w:r>
+    </w:p>
+    <w:p>
+      <w:r>
+        <w:t>11. Results Interpretation</w:t>
+      </w:r>
+    </w:p>
+    <w:p>
+      <w:r>
+        <w:t>12. Bibliography</w:t>
+      </w:r>
+    </w:p>
+    <w:p>
+      <w:r>
+        <w:br w:type="page"/>
       </w:r>
     </w:p>
     <w:p>
@@ -74,12 +117,45 @@
         <w:pStyle w:val="Heading1"/>
       </w:pPr>
       <w:r>
-        <w:t>2. System Architecture</w:t>
+        <w:t>3. Executive Summary</w:t>
       </w:r>
     </w:p>
     <w:p>
       <w:r>
-        <w:t>The CAT411 framework follows a modular pipeline architecture (Hazard -&gt; Exposure -&gt; Vulnerability -&gt; Loss). This design allows for seamless integration of real-time API data and legacy databases.</w:t>
+        <w:t>The CAT411 framework is a comprehensive catastrophe (CAT) modeling system designed to assess seismic risk for bridge portfolios. Originally developed using the 1994 Northridge earthquake as a case study, the framework integrates hazard data from the USGS, exposure data from the National Bridge Inventory (NBI), and vulnerability parameters from FEMA's Hazus methodology to estimate damage probabilities and economic losses.</w:t>
+      </w:r>
+    </w:p>
+    <w:p>
+      <w:r>
+        <w:t>Key Capabilities:</w:t>
+        <w:br/>
+        <w:t>• Automated download of USGS ShakeMap and NSHMP hazard curves</w:t>
+        <w:br/>
+        <w:t>• Bridge classification according to Hazus HWB taxonomy</w:t>
+        <w:br/>
+        <w:t>• Fragility curve computation using lognormal CDF model</w:t>
+        <w:br/>
+        <w:t>• Expected loss and downtime estimation</w:t>
+        <w:br/>
+        <w:t>• Visualization dashboard and spatial damage maps</w:t>
+      </w:r>
+    </w:p>
+    <w:p>
+      <w:r>
+        <w:br w:type="page"/>
+      </w:r>
+    </w:p>
+    <w:p>
+      <w:pPr>
+        <w:pStyle w:val="Heading1"/>
+      </w:pPr>
+      <w:r>
+        <w:t>4. System Architecture</w:t>
+      </w:r>
+    </w:p>
+    <w:p>
+      <w:r>
+        <w:t>The CAT411 framework follows a modular pipeline architecture: Hazard → Exposure → Vulnerability → Loss. Each module is encapsulated in a dedicated Python file within the `src/` directory.</w:t>
       </w:r>
     </w:p>
     <w:p>
@@ -127,7 +203,12 @@
         <w:jc w:val="center"/>
       </w:pPr>
       <w:r>
-        <w:t>Figure 1: High-level System Architecture &amp; Data Flow (AI-Generated Diagram)</w:t>
+        <w:t>Figure 1: High-level System Architecture &amp; Data Flow (AI-Generated)</w:t>
+      </w:r>
+    </w:p>
+    <w:p>
+      <w:r>
+        <w:br w:type="page"/>
       </w:r>
     </w:p>
     <w:p>
@@ -135,45 +216,63 @@
         <w:pStyle w:val="Heading1"/>
       </w:pPr>
       <w:r>
-        <w:t>3. Setup &amp; Installation</w:t>
+        <w:t>5. Installation &amp; Prerequisites</w:t>
       </w:r>
     </w:p>
     <w:p>
       <w:pPr>
-        <w:pStyle w:val="ListBullet"/>
+        <w:pStyle w:val="Heading2"/>
       </w:pPr>
       <w:r>
-        <w:t>Requirements:</w:t>
+        <w:t>5.1 System Requirements</w:t>
+      </w:r>
+    </w:p>
+    <w:p>
+      <w:r>
+        <w:t>• Python 3.8 or higher</w:t>
+        <w:br/>
+        <w:t>• pip package manager</w:t>
+        <w:br/>
+        <w:t>• Internet connection (for USGS API access)</w:t>
       </w:r>
     </w:p>
     <w:p>
       <w:pPr>
-        <w:pStyle w:val="ListBullet"/>
+        <w:pStyle w:val="Heading2"/>
       </w:pPr>
       <w:r>
-        <w:t>Python 3.8+</w:t>
+        <w:t>5.2 Dependency Installation</w:t>
+      </w:r>
+    </w:p>
+    <w:p>
+      <w:r>
+        <w:t xml:space="preserve">    pip install -r requirements.txt</w:t>
       </w:r>
     </w:p>
     <w:p>
       <w:pPr>
-        <w:pStyle w:val="ListBullet"/>
+        <w:pStyle w:val="Heading2"/>
       </w:pPr>
       <w:r>
-        <w:t>Pandas, NumPy, Matplotlib, SciPy</w:t>
+        <w:t>5.3 Key Dependencies</w:t>
       </w:r>
     </w:p>
     <w:p>
-      <w:pPr>
-        <w:pStyle w:val="ListBullet"/>
-      </w:pPr>
       <w:r>
-        <w:t>Installation:</w:t>
+        <w:t>• numpy, pandas: Data manipulation</w:t>
+        <w:br/>
+        <w:t>• scipy: Statistical functions</w:t>
+        <w:br/>
+        <w:t>• matplotlib: Visualization</w:t>
+        <w:br/>
+        <w:t>• requests: API communication</w:t>
+        <w:br/>
+        <w:t>• python-docx: Documentation generation</w:t>
       </w:r>
     </w:p>
     <w:p>
-      <w:pPr/>
       <w:r>
-        <w:t xml:space="preserve">    pip install -r requirements.txt</w:t>
+        <w:br w:type="page"/>
       </w:r>
     </w:p>
     <w:p>
@@ -181,23 +280,48 @@
         <w:pStyle w:val="Heading1"/>
       </w:pPr>
       <w:r>
-        <w:t>4. Quick Start Guide</w:t>
+        <w:t>6. Quick Start Guide</w:t>
+      </w:r>
+    </w:p>
+    <w:p>
+      <w:pPr>
+        <w:pStyle w:val="Heading2"/>
+      </w:pPr>
+      <w:r>
+        <w:t>6.1 One-Command Analysis</w:t>
       </w:r>
     </w:p>
     <w:p>
       <w:r>
-        <w:t>Execute a full end-to-end analysis using the recommended flag:</w:t>
+        <w:t>Execute a complete end-to-end analysis with:</w:t>
       </w:r>
     </w:p>
     <w:p>
-      <w:pPr/>
       <w:r>
         <w:t xml:space="preserve">    python main.py --full-analysis</w:t>
       </w:r>
     </w:p>
     <w:p>
+      <w:pPr>
+        <w:pStyle w:val="Heading2"/>
+      </w:pPr>
       <w:r>
-        <w:t>This command performs: 1) USGS Data Download, 2) NBI Ingestion, 3) Damage Calculation, and 4) Dashboard Generation.</w:t>
+        <w:t>6.2 Interactive Menu</w:t>
+      </w:r>
+    </w:p>
+    <w:p>
+      <w:r>
+        <w:t>For a guided experience, launch the interactive menu:</w:t>
+      </w:r>
+    </w:p>
+    <w:p>
+      <w:r>
+        <w:t xml:space="preserve">    python main.py --interactive</w:t>
+      </w:r>
+    </w:p>
+    <w:p>
+      <w:r>
+        <w:br w:type="page"/>
       </w:r>
     </w:p>
     <w:p>
@@ -205,7 +329,7 @@
         <w:pStyle w:val="Heading1"/>
       </w:pPr>
       <w:r>
-        <w:t>5. Data Management</w:t>
+        <w:t>7. Data Management</w:t>
       </w:r>
     </w:p>
     <w:p>
@@ -213,7 +337,7 @@
         <w:pStyle w:val="Heading2"/>
       </w:pPr>
       <w:r>
-        <w:t>5.1 Input Sources</w:t>
+        <w:t>7.1 Input Data Sources</w:t>
       </w:r>
     </w:p>
     <w:p>
@@ -226,13 +350,13 @@
             <w:color w:val="0000FF"/>
             <w:u w:val="single"/>
           </w:rPr>
-          <w:t>Event Page</w:t>
+          <w:t>https://earthquake.usgs.gov/earthquakes/eventpage/ci3144585</w:t>
         </w:r>
       </w:hyperlink>
     </w:p>
     <w:p>
       <w:r>
-        <w:t xml:space="preserve">• NBI Database: </w:t>
+        <w:t xml:space="preserve">• National Bridge Inventory (NBI): </w:t>
       </w:r>
       <w:hyperlink r:id="rId11">
         <w:r>
@@ -240,7 +364,21 @@
             <w:color w:val="0000FF"/>
             <w:u w:val="single"/>
           </w:rPr>
-          <w:t>Download Center</w:t>
+          <w:t>https://www.fhwa.dot.gov/bridge/nbi.cfm</w:t>
+        </w:r>
+      </w:hyperlink>
+    </w:p>
+    <w:p>
+      <w:r>
+        <w:t xml:space="preserve">• FEMA Hazus Parameters: </w:t>
+      </w:r>
+      <w:hyperlink r:id="rId12">
+        <w:r>
+          <w:rPr>
+            <w:color w:val="0000FF"/>
+            <w:u w:val="single"/>
+          </w:rPr>
+          <w:t>https://www.fema.gov/hazus</w:t>
         </w:r>
       </w:hyperlink>
     </w:p>
@@ -249,36 +387,44 @@
         <w:pStyle w:val="Heading2"/>
       </w:pPr>
       <w:r>
-        <w:t>5.2 Output Structure</w:t>
+        <w:t>7.2 Data Formats</w:t>
       </w:r>
     </w:p>
     <w:p>
       <w:r>
-        <w:t>All results are stored in the /output directory:</w:t>
+        <w:t>• ShakeMap: XML (grid.xml), JSON (info.json), Shapefile (shape.zip)</w:t>
+        <w:br/>
+        <w:t>• NBI: ASCII text files (e.g., CA18.txt for California 2018)</w:t>
+        <w:br/>
+        <w:t>• Internal: Pandas DataFrames with standardized column names</w:t>
       </w:r>
     </w:p>
     <w:p>
       <w:pPr>
-        <w:pStyle w:val="ListBullet"/>
+        <w:pStyle w:val="Heading2"/>
       </w:pPr>
       <w:r>
-        <w:t>• 00_analysis_dashboard.png: Executive summary</w:t>
+        <w:t>7.3 Output Directory Structure</w:t>
       </w:r>
     </w:p>
     <w:p>
-      <w:pPr>
-        <w:pStyle w:val="ListBullet"/>
-      </w:pPr>
       <w:r>
-        <w:t>• 03_bridge_damage_spatial.png: Damage map</w:t>
+        <w:t>output/</w:t>
+        <w:br/>
+        <w:t>├── 00_analysis_dashboard.png</w:t>
+        <w:br/>
+        <w:t>├── 01_shakemap_full_area.png</w:t>
+        <w:br/>
+        <w:t>├── 02_bridge_site_ground_motion.png</w:t>
+        <w:br/>
+        <w:t>├── 03_bridge_damage_spatial.png</w:t>
+        <w:br/>
+        <w:t>└── bridge_damage_results.csv</w:t>
       </w:r>
     </w:p>
     <w:p>
-      <w:pPr>
-        <w:pStyle w:val="ListBullet"/>
-      </w:pPr>
       <w:r>
-        <w:t>• bridge_damage_results.csv: Detailed data</w:t>
+        <w:br w:type="page"/>
       </w:r>
     </w:p>
     <w:p>
@@ -286,73 +432,258 @@
         <w:pStyle w:val="Heading1"/>
       </w:pPr>
       <w:r>
-        <w:t>6. Functional Module Reference</w:t>
+        <w:t>8. Functional Module Reference</w:t>
+      </w:r>
+    </w:p>
+    <w:p>
+      <w:pPr>
+        <w:pStyle w:val="Heading2"/>
+      </w:pPr>
+      <w:r>
+        <w:t>8.1 main.py</w:t>
       </w:r>
     </w:p>
     <w:p>
       <w:r>
-        <w:rPr>
-          <w:b/>
-        </w:rPr>
-        <w:t xml:space="preserve">main.py: </w:t>
-      </w:r>
-      <w:r>
-        <w:t>The main orchestrator. Handles CLI arguments and chains module execution.</w:t>
+        <w:t>Entry point and CLI orchestration. Handles argument parsing and chains module execution.</w:t>
       </w:r>
     </w:p>
     <w:p>
       <w:r>
-        <w:rPr>
-          <w:b/>
-        </w:rPr>
-        <w:t xml:space="preserve">hazard_download.py: </w:t>
+        <w:t>Key Flags: --full-analysis, --interactive, --download-hazard</w:t>
       </w:r>
+    </w:p>
+    <w:p>
+      <w:pPr>
+        <w:pStyle w:val="Heading2"/>
+      </w:pPr>
       <w:r>
-        <w:t>Interfaces with USGS/NSHMP APIs to download ShakeMaps and hazard curves.</w:t>
+        <w:t>8.2 hazard_download.py</w:t>
       </w:r>
     </w:p>
     <w:p>
       <w:r>
-        <w:rPr>
-          <w:b/>
-        </w:rPr>
-        <w:t xml:space="preserve">exposure.py: </w:t>
-      </w:r>
-      <w:r>
-        <w:t>Maps NBI raw data to Hazus bridge classifications for vulnerability assessment.</w:t>
+        <w:t>Interfaces with USGS APIs to download ShakeMaps and NSHMP hazard curves.</w:t>
       </w:r>
     </w:p>
     <w:p>
       <w:r>
-        <w:rPr>
-          <w:b/>
-        </w:rPr>
-        <w:t xml:space="preserve">fragility.py: </w:t>
-      </w:r>
-      <w:r>
-        <w:t>Core engine for calculating damage state probabilities based on Sa(1.0s).</w:t>
+        <w:t>Key Functions:</w:t>
       </w:r>
     </w:p>
     <w:p>
       <w:r>
-        <w:rPr>
-          <w:b/>
-        </w:rPr>
-        <w:t xml:space="preserve">loss.py: </w:t>
-      </w:r>
-      <w:r>
-        <w:t>Calculates Expected Loss (EL) and Mean Damage Ratio (MDR) for individual assets.</w:t>
+        <w:t>• download_shakemap(event_id, output_dir, overwrite)</w:t>
       </w:r>
     </w:p>
     <w:p>
       <w:r>
-        <w:rPr>
-          <w:b/>
-        </w:rPr>
-        <w:t xml:space="preserve">plotting.py: </w:t>
+        <w:t>• download_hazard_curves(latitude, longitude, vs30, imt)</w:t>
       </w:r>
+    </w:p>
+    <w:p>
+      <w:r>
+        <w:t>• download_all_hazard_data(event_id, latitude, longitude)</w:t>
+      </w:r>
+    </w:p>
+    <w:p>
+      <w:pPr>
+        <w:pStyle w:val="Heading2"/>
+      </w:pPr>
+      <w:r>
+        <w:t>8.3 exposure.py</w:t>
+      </w:r>
+    </w:p>
+    <w:p>
+      <w:r>
+        <w:t>Maps NBI raw data to Hazus bridge classifications.</w:t>
+      </w:r>
+    </w:p>
+    <w:p>
+      <w:r>
+        <w:t>Key Classes &amp; Functions:</w:t>
+      </w:r>
+    </w:p>
+    <w:p>
+      <w:r>
+        <w:t>• BridgeExposure: Dataclass for single bridge asset</w:t>
+      </w:r>
+    </w:p>
+    <w:p>
+      <w:r>
+        <w:t>• estimate_replacement_cost(material, deck_area, length)</w:t>
+      </w:r>
+    </w:p>
+    <w:p>
+      <w:r>
+        <w:t>• create_portfolio_from_nbi(nbi_df, default_vs30)</w:t>
+      </w:r>
+    </w:p>
+    <w:p>
+      <w:r>
+        <w:t>• generate_synthetic_portfolio(n_bridges, center, radius_km)</w:t>
+      </w:r>
+    </w:p>
+    <w:p>
+      <w:pPr>
+        <w:pStyle w:val="Heading2"/>
+      </w:pPr>
+      <w:r>
+        <w:t>8.4 fragility.py</w:t>
+      </w:r>
+    </w:p>
+    <w:p>
+      <w:r>
+        <w:t>Core engine for calculating damage state probabilities.</w:t>
+      </w:r>
+    </w:p>
+    <w:p>
+      <w:r>
+        <w:t>Key Functions:</w:t>
+      </w:r>
+    </w:p>
+    <w:p>
+      <w:r>
+        <w:t>• fragility_curve(im_values, median, beta): Lognormal CDF computation</w:t>
+      </w:r>
+    </w:p>
+    <w:p>
+      <w:r>
+        <w:t>• compute_all_curves(hwb_class, im_values): All 4 damage states</w:t>
+      </w:r>
+    </w:p>
+    <w:p>
+      <w:r>
+        <w:t>• damage_state_probabilities(im, hwb_class): Discrete probabilities</w:t>
+      </w:r>
+    </w:p>
+    <w:p>
+      <w:r>
+        <w:t>• apply_skew_modification(median, skew_angle_deg)</w:t>
+      </w:r>
+    </w:p>
+    <w:p>
+      <w:pPr>
+        <w:pStyle w:val="Heading2"/>
+      </w:pPr>
+      <w:r>
+        <w:t>8.5 loss.py</w:t>
+      </w:r>
+    </w:p>
+    <w:p>
+      <w:r>
+        <w:t>Damage-to-loss translation and portfolio aggregation.</w:t>
+      </w:r>
+    </w:p>
+    <w:p>
+      <w:r>
+        <w:t>Key Classes &amp; Functions:</w:t>
+      </w:r>
+    </w:p>
+    <w:p>
+      <w:r>
+        <w:t>• BridgeLossResult: Dataclass for single bridge loss</w:t>
+      </w:r>
+    </w:p>
+    <w:p>
+      <w:r>
+        <w:t>• PortfolioLossResult: Aggregated loss for portfolio</w:t>
+      </w:r>
+    </w:p>
+    <w:p>
+      <w:r>
+        <w:t>• compute_bridge_loss(sa, hwb_class, replacement_cost)</w:t>
+      </w:r>
+    </w:p>
+    <w:p>
+      <w:r>
+        <w:t>• compute_portfolio_loss(portfolio, sa_values)</w:t>
+      </w:r>
+    </w:p>
+    <w:p>
+      <w:r>
+        <w:t>• compute_ep_curve(scenario_losses, annual_rates)</w:t>
+      </w:r>
+    </w:p>
+    <w:p>
+      <w:r>
+        <w:t>• compute_aal(scenario_losses, annual_rates)</w:t>
+      </w:r>
+    </w:p>
+    <w:p>
+      <w:pPr>
+        <w:pStyle w:val="Heading2"/>
+      </w:pPr>
+      <w:r>
+        <w:t>8.6 plotting.py</w:t>
+      </w:r>
+    </w:p>
+    <w:p>
       <w:r>
         <w:t>Visualization engine for dashboards, maps, and fragility curves.</w:t>
+      </w:r>
+    </w:p>
+    <w:p>
+      <w:r>
+        <w:t>Key Functions:</w:t>
+      </w:r>
+    </w:p>
+    <w:p>
+      <w:r>
+        <w:t>• plot_fragility_curves(hwb_class, im_values)</w:t>
+      </w:r>
+    </w:p>
+    <w:p>
+      <w:r>
+        <w:t>• plot_shakemap(grid_data, output_path)</w:t>
+      </w:r>
+    </w:p>
+    <w:p>
+      <w:r>
+        <w:t>• plot_bridge_damage_map(bridges_data, damage_probs)</w:t>
+      </w:r>
+    </w:p>
+    <w:p>
+      <w:r>
+        <w:t>• plot_analysis_summary(loss_results, damage_stats)</w:t>
+      </w:r>
+    </w:p>
+    <w:p>
+      <w:pPr>
+        <w:pStyle w:val="Heading2"/>
+      </w:pPr>
+      <w:r>
+        <w:t>8.7 hazus_params.py</w:t>
+      </w:r>
+    </w:p>
+    <w:p>
+      <w:r>
+        <w:t>Static parameters from Hazus Table 7.9 and 7.11.</w:t>
+      </w:r>
+    </w:p>
+    <w:p>
+      <w:r>
+        <w:t>Contents:</w:t>
+      </w:r>
+    </w:p>
+    <w:p>
+      <w:r>
+        <w:t>• HAZUS_BRIDGE_FRAGILITY: Median and beta values for all HWB classes</w:t>
+      </w:r>
+    </w:p>
+    <w:p>
+      <w:r>
+        <w:t>• DAMAGE_RATIOS: Loss ratios by damage state</w:t>
+      </w:r>
+    </w:p>
+    <w:p>
+      <w:r>
+        <w:t>• DAMAGE_STATE_ORDER: [slight, moderate, extensive, complete]</w:t>
+      </w:r>
+    </w:p>
+    <w:p>
+      <w:r>
+        <w:br w:type="page"/>
       </w:r>
     </w:p>
     <w:p>
@@ -360,7 +691,7 @@
         <w:pStyle w:val="Heading1"/>
       </w:pPr>
       <w:r>
-        <w:t>7. Calculation Methodology</w:t>
+        <w:t>9. Calculation Methodology</w:t>
       </w:r>
     </w:p>
     <w:p>
@@ -368,17 +699,26 @@
         <w:pStyle w:val="Heading2"/>
       </w:pPr>
       <w:r>
-        <w:t>7.1 Ground Motion Prediction</w:t>
+        <w:t>9.1 Ground Motion Prediction</w:t>
       </w:r>
     </w:p>
     <w:p>
       <w:r>
-        <w:t>Intensity at site is estimated via Boore-Atkinson (2008) or direct USGS ShakeMap extraction.</w:t>
-      </w:r>
-    </w:p>
-    <w:p>
-      <w:r>
-        <w:t>ln(Sa) = F_M(M) + F_D(R_JB, M) + F_S(Vs30)</w:t>
+        <w:t>Intensity at site is estimated via Boore-Atkinson (2008) GMPE or direct USGS ShakeMap extraction:</w:t>
+        <w:br/>
+        <w:br/>
+        <w:t xml:space="preserve">    ln(Sa) = F_M(M) + F_D(R_JB, M) + F_S(Vs30) + ε</w:t>
+        <w:br/>
+        <w:br/>
+        <w:t>Where:</w:t>
+        <w:br/>
+        <w:t>• M = Moment magnitude</w:t>
+        <w:br/>
+        <w:t>• R_JB = Joyner-Boore distance (km)</w:t>
+        <w:br/>
+        <w:t>• Vs30 = Shear-wave velocity in top 30m (m/s)</w:t>
+        <w:br/>
+        <w:t>• ε = Aleatory variability</w:t>
       </w:r>
     </w:p>
     <w:p>
@@ -386,17 +726,52 @@
         <w:pStyle w:val="Heading2"/>
       </w:pPr>
       <w:r>
-        <w:t>7.2 Fragility Functions</w:t>
+        <w:t>9.2 Fragility Functions</w:t>
       </w:r>
     </w:p>
     <w:p>
       <w:r>
         <w:t>Probability of exceeding damage state ds:</w:t>
+        <w:br/>
+        <w:br/>
+        <w:t xml:space="preserve">    P[DS ≥ ds | Sa] = Φ[ (ln(Sa) - ln(θ)) / β ]</w:t>
+        <w:br/>
+        <w:br/>
+        <w:t>Where:</w:t>
+        <w:br/>
+        <w:t>• Φ = Standard normal CDF</w:t>
+        <w:br/>
+        <w:t>• θ = Median capacity (g) from Hazus Table 7.9</w:t>
+        <w:br/>
+        <w:t>• β = Lognormal standard deviation</w:t>
+      </w:r>
+    </w:p>
+    <w:p>
+      <w:pPr>
+        <w:pStyle w:val="Heading2"/>
+      </w:pPr>
+      <w:r>
+        <w:t>9.3 Loss Calculation</w:t>
       </w:r>
     </w:p>
     <w:p>
       <w:r>
-        <w:t>P(DS &gt; ds | Sa) = Phi[ ln(Sa/theta) / beta ]</w:t>
+        <w:t>Expected loss for each bridge:</w:t>
+        <w:br/>
+        <w:br/>
+        <w:t xml:space="preserve">    E[Loss] = Σ [ P(DS=ds) × DR(ds) × Replacement_Cost ]</w:t>
+        <w:br/>
+        <w:br/>
+        <w:t>Where:</w:t>
+        <w:br/>
+        <w:t>• P(DS=ds) = Probability of being in damage state ds</w:t>
+        <w:br/>
+        <w:t>• DR(ds) = Damage Ratio from Hazus Table 7.11</w:t>
+      </w:r>
+    </w:p>
+    <w:p>
+      <w:r>
+        <w:br w:type="page"/>
       </w:r>
     </w:p>
     <w:p>
@@ -404,7 +779,7 @@
         <w:pStyle w:val="Heading1"/>
       </w:pPr>
       <w:r>
-        <w:t>8. CLI Command Reference</w:t>
+        <w:t>10. CLI Command Reference</w:t>
       </w:r>
     </w:p>
     <w:tbl>
@@ -414,13 +789,14 @@
         <w:tblLook w:firstColumn="1" w:firstRow="1" w:lastColumn="0" w:lastRow="0" w:noHBand="0" w:noVBand="1" w:val="04A0"/>
       </w:tblPr>
       <w:tblGrid>
-        <w:gridCol w:w="4320"/>
-        <w:gridCol w:w="4320"/>
+        <w:gridCol w:w="2880"/>
+        <w:gridCol w:w="2880"/>
+        <w:gridCol w:w="2880"/>
       </w:tblGrid>
       <w:tr>
         <w:tc>
           <w:tcPr>
-            <w:tcW w:type="dxa" w:w="4320"/>
+            <w:tcW w:type="dxa" w:w="2880"/>
           </w:tcPr>
           <w:p>
             <w:r>
@@ -430,11 +806,21 @@
         </w:tc>
         <w:tc>
           <w:tcPr>
-            <w:tcW w:type="dxa" w:w="4320"/>
+            <w:tcW w:type="dxa" w:w="2880"/>
           </w:tcPr>
           <w:p>
             <w:r>
-              <w:t>Purpose</w:t>
+              <w:t>Default</w:t>
+            </w:r>
+          </w:p>
+        </w:tc>
+        <w:tc>
+          <w:tcPr>
+            <w:tcW w:type="dxa" w:w="2880"/>
+          </w:tcPr>
+          <w:p>
+            <w:r>
+              <w:t>Description</w:t>
             </w:r>
           </w:p>
         </w:tc>
@@ -442,7 +828,7 @@
       <w:tr>
         <w:tc>
           <w:tcPr>
-            <w:tcW w:type="dxa" w:w="4320"/>
+            <w:tcW w:type="dxa" w:w="2880"/>
           </w:tcPr>
           <w:p>
             <w:r>
@@ -452,7 +838,17 @@
         </w:tc>
         <w:tc>
           <w:tcPr>
-            <w:tcW w:type="dxa" w:w="4320"/>
+            <w:tcW w:type="dxa" w:w="2880"/>
+          </w:tcPr>
+          <w:p>
+            <w:r>
+              <w:t>False</w:t>
+            </w:r>
+          </w:p>
+        </w:tc>
+        <w:tc>
+          <w:tcPr>
+            <w:tcW w:type="dxa" w:w="2880"/>
           </w:tcPr>
           <w:p>
             <w:r>
@@ -464,7 +860,7 @@
       <w:tr>
         <w:tc>
           <w:tcPr>
-            <w:tcW w:type="dxa" w:w="4320"/>
+            <w:tcW w:type="dxa" w:w="2880"/>
           </w:tcPr>
           <w:p>
             <w:r>
@@ -474,11 +870,21 @@
         </w:tc>
         <w:tc>
           <w:tcPr>
-            <w:tcW w:type="dxa" w:w="4320"/>
+            <w:tcW w:type="dxa" w:w="2880"/>
           </w:tcPr>
           <w:p>
             <w:r>
-              <w:t>GUI-like terminal menu</w:t>
+              <w:t>False</w:t>
+            </w:r>
+          </w:p>
+        </w:tc>
+        <w:tc>
+          <w:tcPr>
+            <w:tcW w:type="dxa" w:w="2880"/>
+          </w:tcPr>
+          <w:p>
+            <w:r>
+              <w:t>Launch interactive menu</w:t>
             </w:r>
           </w:p>
         </w:tc>
@@ -486,7 +892,7 @@
       <w:tr>
         <w:tc>
           <w:tcPr>
-            <w:tcW w:type="dxa" w:w="4320"/>
+            <w:tcW w:type="dxa" w:w="2880"/>
           </w:tcPr>
           <w:p>
             <w:r>
@@ -496,7 +902,17 @@
         </w:tc>
         <w:tc>
           <w:tcPr>
-            <w:tcW w:type="dxa" w:w="4320"/>
+            <w:tcW w:type="dxa" w:w="2880"/>
+          </w:tcPr>
+          <w:p>
+            <w:r>
+              <w:t>False</w:t>
+            </w:r>
+          </w:p>
+        </w:tc>
+        <w:tc>
+          <w:tcPr>
+            <w:tcW w:type="dxa" w:w="2880"/>
           </w:tcPr>
           <w:p>
             <w:r>
@@ -508,7 +924,71 @@
       <w:tr>
         <w:tc>
           <w:tcPr>
-            <w:tcW w:type="dxa" w:w="4320"/>
+            <w:tcW w:type="dxa" w:w="2880"/>
+          </w:tcPr>
+          <w:p>
+            <w:r>
+              <w:t>--hazard-event</w:t>
+            </w:r>
+          </w:p>
+        </w:tc>
+        <w:tc>
+          <w:tcPr>
+            <w:tcW w:type="dxa" w:w="2880"/>
+          </w:tcPr>
+          <w:p>
+            <w:r>
+              <w:t>ci3144585</w:t>
+            </w:r>
+          </w:p>
+        </w:tc>
+        <w:tc>
+          <w:tcPr>
+            <w:tcW w:type="dxa" w:w="2880"/>
+          </w:tcPr>
+          <w:p>
+            <w:r>
+              <w:t>USGS event ID</w:t>
+            </w:r>
+          </w:p>
+        </w:tc>
+      </w:tr>
+      <w:tr>
+        <w:tc>
+          <w:tcPr>
+            <w:tcW w:type="dxa" w:w="2880"/>
+          </w:tcPr>
+          <w:p>
+            <w:r>
+              <w:t>--overwrite</w:t>
+            </w:r>
+          </w:p>
+        </w:tc>
+        <w:tc>
+          <w:tcPr>
+            <w:tcW w:type="dxa" w:w="2880"/>
+          </w:tcPr>
+          <w:p>
+            <w:r>
+              <w:t>False</w:t>
+            </w:r>
+          </w:p>
+        </w:tc>
+        <w:tc>
+          <w:tcPr>
+            <w:tcW w:type="dxa" w:w="2880"/>
+          </w:tcPr>
+          <w:p>
+            <w:r>
+              <w:t>Overwrite existing data</w:t>
+            </w:r>
+          </w:p>
+        </w:tc>
+      </w:tr>
+      <w:tr>
+        <w:tc>
+          <w:tcPr>
+            <w:tcW w:type="dxa" w:w="2880"/>
           </w:tcPr>
           <w:p>
             <w:r>
@@ -518,27 +998,29 @@
         </w:tc>
         <w:tc>
           <w:tcPr>
-            <w:tcW w:type="dxa" w:w="4320"/>
+            <w:tcW w:type="dxa" w:w="2880"/>
           </w:tcPr>
           <w:p>
             <w:r>
-              <w:t>Run event catalog simulations</w:t>
+              <w:t>False</w:t>
+            </w:r>
+          </w:p>
+        </w:tc>
+        <w:tc>
+          <w:tcPr>
+            <w:tcW w:type="dxa" w:w="2880"/>
+          </w:tcPr>
+          <w:p>
+            <w:r>
+              <w:t>Run probabilistic scenario analysis</w:t>
             </w:r>
           </w:p>
         </w:tc>
       </w:tr>
     </w:tbl>
     <w:p>
-      <w:pPr>
-        <w:pStyle w:val="Heading1"/>
-      </w:pPr>
       <w:r>
-        <w:t>9. Results Interpretation</w:t>
-      </w:r>
-    </w:p>
-    <w:p>
-      <w:r>
-        <w:t>The Dashboard (00) displays portfolio-level risk. The Spatial Map (03) identifies "Hotspots" where bridge downtime is likely.</w:t>
+        <w:br w:type="page"/>
       </w:r>
     </w:p>
     <w:p>
@@ -546,17 +1028,72 @@
         <w:pStyle w:val="Heading1"/>
       </w:pPr>
       <w:r>
-        <w:t>10. Academic Bibliography</w:t>
+        <w:t>11. Results Interpretation</w:t>
+      </w:r>
+    </w:p>
+    <w:p>
+      <w:pPr>
+        <w:pStyle w:val="Heading2"/>
+      </w:pPr>
+      <w:r>
+        <w:t>11.1 Analysis Dashboard (00_analysis_dashboard.png)</w:t>
       </w:r>
     </w:p>
     <w:p>
       <w:r>
-        <w:t>[1] FEMA, Hazus Earthquake Model Technical Manual 6.1.</w:t>
+        <w:t>The dashboard provides a portfolio-level summary:</w:t>
+        <w:br/>
+        <w:t>• Total Expected Loss (USD)</w:t>
+        <w:br/>
+        <w:t>• Mean Damage Ratio (MDR)</w:t>
+        <w:br/>
+        <w:t>• Damage State Distribution (pie chart)</w:t>
+      </w:r>
+    </w:p>
+    <w:p>
+      <w:pPr>
+        <w:pStyle w:val="Heading2"/>
+      </w:pPr>
+      <w:r>
+        <w:t>11.2 Spatial Damage Map (03_bridge_damage_spatial.png)</w:t>
       </w:r>
     </w:p>
     <w:p>
       <w:r>
-        <w:t>[2] Boore &amp; Atkinson, GA (2008), PEER Report/Earthquake Spectra.</w:t>
+        <w:t>Shows bridge locations colored by P(Complete). Red hotspots indicate high-risk bridges where complete damage is most likely.</w:t>
+      </w:r>
+    </w:p>
+    <w:p>
+      <w:r>
+        <w:br w:type="page"/>
+      </w:r>
+    </w:p>
+    <w:p>
+      <w:pPr>
+        <w:pStyle w:val="Heading1"/>
+      </w:pPr>
+      <w:r>
+        <w:t>12. Academic Bibliography</w:t>
+      </w:r>
+    </w:p>
+    <w:p>
+      <w:r>
+        <w:t>[1] FEMA (2022). Hazus Earthquake Model Technical Manual, Hazus 6.1. Federal Emergency Management Agency.</w:t>
+      </w:r>
+    </w:p>
+    <w:p>
+      <w:r>
+        <w:t>[2] Boore, D. M., &amp; Atkinson, G. M. (2008). Ground-motion prediction equations for the average horizontal component of PGA, PGV, and 5%-damped PSA. Earthquake Spectra, 24(1), 99-138.</w:t>
+      </w:r>
+    </w:p>
+    <w:p>
+      <w:r>
+        <w:t>[3] FHWA (2023). Recording and Coding Guide for the Structure Inventory and Appraisal of the Nations Bridges. Report No. FHWA-PD-96-001.</w:t>
+      </w:r>
+    </w:p>
+    <w:p>
+      <w:r>
+        <w:t>[4] USGS (2024). ShakeMap Scientific Background. https://earthquake.usgs.gov/data/shakemap/</w:t>
       </w:r>
     </w:p>
     <w:sectPr>

</xml_diff>

<commit_message>
Add bridge distribution map and parameter docs
</commit_message>
<xml_diff>
--- a/CAT411_Technical_Documentation.docx
+++ b/CAT411_Technical_Documentation.docx
@@ -479,6 +479,91 @@
     <w:p>
       <w:r>
         <w:t>• download_hazard_curves(latitude, longitude, vs30, imt)</w:t>
+      </w:r>
+    </w:p>
+    <w:p>
+      <w:r>
+        <w:t>Parameter Reference (Download + Plot):</w:t>
+      </w:r>
+    </w:p>
+    <w:p>
+      <w:r>
+        <w:t>download_hazard_curves(latitude, longitude, vs30, edition, imt, output_dir, overwrite)</w:t>
+      </w:r>
+    </w:p>
+    <w:p>
+      <w:r>
+        <w:t>- latitude, longitude: decimal degrees (Northridge default: 34.213, -118.537)</w:t>
+      </w:r>
+    </w:p>
+    <w:p>
+      <w:r>
+        <w:t>- vs30: average shear-wave velocity in top 30m (m/s)</w:t>
+      </w:r>
+    </w:p>
+    <w:p>
+      <w:r>
+        <w:t>- edition: NSHMP edition, default E2014</w:t>
+      </w:r>
+    </w:p>
+    <w:p>
+      <w:r>
+        <w:t>- imt: intensity measure type, typically PGA, SA0P2, SA1P0</w:t>
+      </w:r>
+    </w:p>
+    <w:p>
+      <w:r>
+        <w:t>- output_dir: output folder for raw/processed/meta/log files</w:t>
+      </w:r>
+    </w:p>
+    <w:p>
+      <w:r>
+        <w:t>- overwrite: replace existing files if True</w:t>
+      </w:r>
+    </w:p>
+    <w:p>
+      <w:r>
+        <w:t>download_shakemap(event_id, output_dir, files, overwrite)</w:t>
+      </w:r>
+    </w:p>
+    <w:p>
+      <w:r>
+        <w:t>- event_id: USGS event id (Northridge: ci3144585)</w:t>
+      </w:r>
+    </w:p>
+    <w:p>
+      <w:r>
+        <w:t>- files: commonly grid.xml, info.json, shape.zip</w:t>
+      </w:r>
+    </w:p>
+    <w:p>
+      <w:r>
+        <w:t>plot_shakemap_grid(shakemap_df, intensity_measure, output_dir, filename)</w:t>
+      </w:r>
+    </w:p>
+    <w:p>
+      <w:r>
+        <w:t>- intensity_measure: typically PSA10 or PGA</w:t>
+      </w:r>
+    </w:p>
+    <w:p>
+      <w:r>
+        <w:t>plot_bridge_damage_map(nbi_df, damage_state, output_dir, filename)</w:t>
+      </w:r>
+    </w:p>
+    <w:p>
+      <w:r>
+        <w:t>- damage_state: none/slight/moderate/extensive/complete</w:t>
+      </w:r>
+    </w:p>
+    <w:p>
+      <w:r>
+        <w:t>plot_nbi_bridge_distribution_map(nbi_df, output_dir, filename)</w:t>
+      </w:r>
+    </w:p>
+    <w:p>
+      <w:r>
+        <w:t>- draws bridge point distribution using latitude/longitude</w:t>
       </w:r>
     </w:p>
     <w:p>

</xml_diff>

<commit_message>
Fix equations formatting in technical doc
</commit_message>
<xml_diff>
--- a/CAT411_Technical_Documentation.docx
+++ b/CAT411_Technical_Documentation.docx
@@ -1179,6 +1179,2596 @@
     <w:p>
       <w:r>
         <w:t>[4] USGS (2024). ShakeMap Scientific Background. https://earthquake.usgs.gov/data/shakemap/</w:t>
+      </w:r>
+    </w:p>
+    <w:p>
+      <w:r>
+        <w:br w:type="page"/>
+      </w:r>
+    </w:p>
+    <w:p>
+      <w:pPr>
+        <w:pStyle w:val="Heading1"/>
+      </w:pPr>
+      <w:r>
+        <w:t>Hazard Module Technical Reference</w:t>
+      </w:r>
+    </w:p>
+    <w:p>
+      <w:r>
+        <w:t>This section details the theoretical background and implementation of the ground motion prediction module (`src/hazard.py`). The module simulates spatially correlated ground motion fields for scenario earthquakes.</w:t>
+      </w:r>
+    </w:p>
+    <w:p>
+      <w:pPr>
+        <w:pStyle w:val="Heading2"/>
+      </w:pPr>
+      <w:r>
+        <w:t>1. Ground Motion Prediction Equation (GMPE)</w:t>
+      </w:r>
+    </w:p>
+    <w:p>
+      <w:r>
+        <w:t>The core ground motion intensity measure (IM) is the **5%-damped spectral acceleration at 1.0 second period**, denoted as Sa(1.0s).</w:t>
+      </w:r>
+    </w:p>
+    <w:p>
+      <w:r>
+        <w:t>We implement the **Boore &amp; Atkinson (2008)** NGA-West1 model (BA08). The predicted ground motion is given by:</w:t>
+      </w:r>
+    </w:p>
+    <w:p>
+      <w:pPr>
+        <w:jc w:val="center"/>
+      </w:pPr>
+      <w:r>
+        <w:t>ln Y = F_M(M) + F_D(R_JB, M) + F_S(V_S30, R_JB, M) + epsilon sigma_T</w:t>
+      </w:r>
+    </w:p>
+    <w:p>
+      <w:r>
+        <w:t>Where:</w:t>
+      </w:r>
+    </w:p>
+    <w:p>
+      <w:pPr>
+        <w:pStyle w:val="ListBullet"/>
+      </w:pPr>
+      <w:r>
+        <w:t>Y: Ground motion intensity (Sa(1.0s) in g).</w:t>
+      </w:r>
+    </w:p>
+    <w:p>
+      <w:pPr>
+        <w:pStyle w:val="ListBullet"/>
+      </w:pPr>
+      <w:r>
+        <w:t>M: Moment magnitude (M_w).</w:t>
+      </w:r>
+    </w:p>
+    <w:p>
+      <w:pPr>
+        <w:pStyle w:val="ListBullet"/>
+      </w:pPr>
+      <w:r>
+        <w:t>R_JB: Joyner-Boore distance (closest distance to the surface projection of the fault).</w:t>
+      </w:r>
+    </w:p>
+    <w:p>
+      <w:pPr>
+        <w:pStyle w:val="ListBullet"/>
+      </w:pPr>
+      <w:r>
+        <w:t>V_S30: Time-averaged shear-wave velocity in the top 30 meters.</w:t>
+      </w:r>
+    </w:p>
+    <w:p>
+      <w:pPr>
+        <w:pStyle w:val="ListBullet"/>
+      </w:pPr>
+      <w:r>
+        <w:t>epsilon: Random variable representing total aleatory uncertainty.</w:t>
+      </w:r>
+    </w:p>
+    <w:p>
+      <w:pPr>
+        <w:pStyle w:val="ListBullet"/>
+      </w:pPr>
+      <w:r>
+        <w:t>sigma_T: Total standard deviation of the model.</w:t>
+      </w:r>
+    </w:p>
+    <w:p>
+      <w:pPr>
+        <w:pStyle w:val="Heading3"/>
+      </w:pPr>
+      <w:r>
+        <w:t>1.1 Source Term (F_M)</w:t>
+      </w:r>
+    </w:p>
+    <w:p>
+      <w:r>
+        <w:t>The source term accounts for magnitude scaling and fault type.</w:t>
+      </w:r>
+    </w:p>
+    <w:p>
+      <w:pPr>
+        <w:jc w:val="center"/>
+      </w:pPr>
+      <w:r>
+        <w:t>F_M = \begin{cases} e_1 U + e_2 SS + e_3 NS + e_4 RS + e_5(M - M_h) + e_6(M - M_h)^2 &amp; for M &lt;= M_h \\ e_1 U + e_2 SS + e_3 NS + e_4 RS + e_7(M - M_h) &amp; for M &gt; M_h \end{cases}</w:t>
+      </w:r>
+    </w:p>
+    <w:p>
+      <w:pPr>
+        <w:pStyle w:val="ListBullet"/>
+      </w:pPr>
+      <w:r>
+        <w:t>U, SS, NS, RS: Indicator variables for Unspecified, Strike-Slip, Normal, and Reverse faulting.</w:t>
+      </w:r>
+    </w:p>
+    <w:p>
+      <w:pPr>
+        <w:pStyle w:val="ListBullet"/>
+      </w:pPr>
+      <w:r>
+        <w:t>M_h: Hinge magnitude (6.75).</w:t>
+      </w:r>
+    </w:p>
+    <w:p>
+      <w:pPr>
+        <w:pStyle w:val="ListBullet"/>
+      </w:pPr>
+      <w:r>
+        <w:t>Coefficients (e_1 \dots e_7) are specific to the period T=1.0s.</w:t>
+      </w:r>
+    </w:p>
+    <w:p>
+      <w:pPr>
+        <w:pStyle w:val="Heading3"/>
+      </w:pPr>
+      <w:r>
+        <w:t>1.2 Distance Term (F_D)</w:t>
+      </w:r>
+    </w:p>
+    <w:p>
+      <w:r>
+        <w:t>The distance term accounts for geometric spreading and anelastic attenuation.</w:t>
+      </w:r>
+    </w:p>
+    <w:p>
+      <w:pPr>
+        <w:jc w:val="center"/>
+      </w:pPr>
+      <w:r>
+        <w:t>F_D(R, M) = [c_1 + c_2(M - M_h)] ln(R/R_{ref}) + c_3(R - R_{ref})</w:t>
+      </w:r>
+    </w:p>
+    <w:p>
+      <w:r>
+        <w:t>Where R = sqrt{R_JB^2 + h^2}.</w:t>
+      </w:r>
+    </w:p>
+    <w:p>
+      <w:pPr>
+        <w:pStyle w:val="Heading3"/>
+      </w:pPr>
+      <w:r>
+        <w:t>1.3 Site Amplification Term (F_S)</w:t>
+      </w:r>
+    </w:p>
+    <w:p>
+      <w:r>
+        <w:t>The site term accounts for linear and non-linear soil amplification.</w:t>
+      </w:r>
+    </w:p>
+    <w:p>
+      <w:pPr>
+        <w:jc w:val="center"/>
+      </w:pPr>
+      <w:r>
+        <w:rPr>
+          <w:i/>
+        </w:rPr>
+        <w:t xml:space="preserve"> F_S = F_{lin} + F_{nl} </w:t>
+      </w:r>
+    </w:p>
+    <w:p>
+      <w:pPr>
+        <w:pStyle w:val="ListBullet"/>
+      </w:pPr>
+      <w:r>
+        <w:t>**Linear Term (F_{lin})**: b_{lin} ln(V_S30 / V_{ref})</w:t>
+      </w:r>
+    </w:p>
+    <w:p>
+      <w:pPr>
+        <w:pStyle w:val="ListBullet"/>
+      </w:pPr>
+      <w:r>
+        <w:t>**Non-linear Term (F_{nl})**: Function of input rock motion (PGA_{rock}) and soil stiffness. For soft soils (V_S30 &lt; V_2) under strong shaking, this term reduces amplification due to soil non-linearity.</w:t>
+      </w:r>
+    </w:p>
+    <w:p>
+      <w:r>
+        <w:br w:type="page"/>
+      </w:r>
+    </w:p>
+    <w:p>
+      <w:pPr>
+        <w:pStyle w:val="Heading2"/>
+      </w:pPr>
+      <w:r>
+        <w:t>2. Spatial Correlation Model</w:t>
+      </w:r>
+    </w:p>
+    <w:p>
+      <w:r>
+        <w:t>To generate realistic ground motion fields where nearby sites experience similar shaking intensities, we implement the **Jayaram &amp; Baker (2009)** spatial correlation model.</w:t>
+      </w:r>
+    </w:p>
+    <w:p>
+      <w:pPr>
+        <w:pStyle w:val="Heading3"/>
+      </w:pPr>
+      <w:r>
+        <w:t>2.1 Intra-event Residual Correlation</w:t>
+      </w:r>
+    </w:p>
+    <w:p>
+      <w:r>
+        <w:t>The total residual epsilon_{total} is decomposed into:</w:t>
+      </w:r>
+    </w:p>
+    <w:p>
+      <w:pPr>
+        <w:pStyle w:val="ListNumber"/>
+      </w:pPr>
+      <w:r>
+        <w:t>**Inter-event residual (eta)**: Common to all sites in one earthquake. eta ~ N(0, tau^2).</w:t>
+      </w:r>
+    </w:p>
+    <w:p>
+      <w:r>
+        <w:t>2. **Intra-event residual (epsilon)**: Varies by site but is spatially correlated. epsilon ~ N(0, sigma^2).</w:t>
+      </w:r>
+    </w:p>
+    <w:p>
+      <w:r>
+        <w:t>The correlation coefficient between intra-event residuals at two sites i and j separated by distance h is:</w:t>
+      </w:r>
+    </w:p>
+    <w:p>
+      <w:pPr>
+        <w:jc w:val="center"/>
+      </w:pPr>
+      <w:r>
+        <w:t>rho_{ij} = exp&lt;=ft(\frac{-3 h}{b}\right)</w:t>
+      </w:r>
+    </w:p>
+    <w:p>
+      <w:r>
+        <w:t>For Sa(1.0s), the correlation range parameter b is approximately **40.7 km**.</w:t>
+      </w:r>
+    </w:p>
+    <w:p>
+      <w:pPr>
+        <w:pStyle w:val="Heading3"/>
+      </w:pPr>
+      <w:r>
+        <w:t>2.2 Field Generation Algorithm</w:t>
+      </w:r>
+    </w:p>
+    <w:p>
+      <w:pPr>
+        <w:pStyle w:val="ListNumber"/>
+      </w:pPr>
+      <w:r>
+        <w:t>Compute the correlation matrix \mathbf{Sigma} for all sites based on pairwise distances.</w:t>
+      </w:r>
+    </w:p>
+    <w:p>
+      <w:r>
+        <w:t>2. Perform **Cholesky Decomposition**: \mathbf{Sigma} = \mathbf{L}\mathbf{L}^T.</w:t>
+      </w:r>
+    </w:p>
+    <w:p>
+      <w:r>
+        <w:t>3. Generate a vector of independent standard normal random variables \mathbf{z}.</w:t>
+      </w:r>
+    </w:p>
+    <w:p>
+      <w:r>
+        <w:t>4. Compute correlated residuals: \boldsymbol{epsilon}_{correlated} = \mathbf{L} \mathbf{z} * sigma.</w:t>
+      </w:r>
+    </w:p>
+    <w:p>
+      <w:r>
+        <w:t>5. Add the inter-event residual eta * tau (constant for the event).</w:t>
+      </w:r>
+    </w:p>
+    <w:p>
+      <w:r>
+        <w:t>6. The final simulated ground motion at site i is:</w:t>
+      </w:r>
+    </w:p>
+    <w:p>
+      <w:pPr>
+        <w:jc w:val="center"/>
+      </w:pPr>
+      <w:r>
+        <w:t>Y_i = exp(ln(Median}_i) + eta + epsilon_{correlated, i})</w:t>
+      </w:r>
+    </w:p>
+    <w:p>
+      <w:pPr>
+        <w:pStyle w:val="Heading2"/>
+      </w:pPr>
+      <w:r>
+        <w:t>3. Implementation Details</w:t>
+      </w:r>
+    </w:p>
+    <w:p>
+      <w:pPr>
+        <w:pStyle w:val="ListBullet"/>
+      </w:pPr>
+      <w:r>
+        <w:t>**Distance Metric**: Great-circle distance (Haversine formula) is used to approximate R_JB.</w:t>
+      </w:r>
+    </w:p>
+    <w:p>
+      <w:pPr>
+        <w:pStyle w:val="ListBullet"/>
+      </w:pPr>
+      <w:r>
+        <w:t xml:space="preserve">  **Grid vs. Site**: The simulation is performed directly at bridge locations (irregular grid), ensuring exact values for risk assessment.</w:t>
+      </w:r>
+    </w:p>
+    <w:p>
+      <w:r>
+        <w:br w:type="page"/>
+      </w:r>
+    </w:p>
+    <w:p>
+      <w:pPr>
+        <w:pStyle w:val="Heading1"/>
+      </w:pPr>
+      <w:r>
+        <w:t>Hazard Module Technical Reference</w:t>
+      </w:r>
+    </w:p>
+    <w:p>
+      <w:r>
+        <w:t>This section details the theoretical background and implementation of the ground motion prediction module (`src/hazard.py`). The module simulates spatially correlated ground motion fields for scenario earthquakes.</w:t>
+      </w:r>
+    </w:p>
+    <w:p>
+      <w:pPr>
+        <w:pStyle w:val="Heading2"/>
+      </w:pPr>
+      <w:r>
+        <w:t>1. Ground Motion Prediction Equation (GMPE)</w:t>
+      </w:r>
+    </w:p>
+    <w:p>
+      <w:r>
+        <w:t>The core ground motion intensity measure (IM) is the **5%-damped spectral acceleration at 1.0 second period**, denoted as Sa(1.0s).</w:t>
+      </w:r>
+    </w:p>
+    <w:p>
+      <w:r>
+        <w:t>We implement the **Boore &amp; Atkinson (2008)** NGA-West1 model (BA08). The predicted ground motion is given by:</w:t>
+      </w:r>
+    </w:p>
+    <w:p>
+      <w:pPr>
+        <w:jc w:val="center"/>
+      </w:pPr>
+      <w:r>
+        <w:t>ln Y = F_M(M) + F_D(R_JB, M) + F_S(V_S30, R_JB, M) + epsilon sigma_T</w:t>
+      </w:r>
+    </w:p>
+    <w:p>
+      <w:r>
+        <w:t>Where:</w:t>
+      </w:r>
+    </w:p>
+    <w:p>
+      <w:pPr>
+        <w:pStyle w:val="ListBullet"/>
+      </w:pPr>
+      <w:r>
+        <w:t>Y: Ground motion intensity (Sa(1.0s) in g).</w:t>
+      </w:r>
+    </w:p>
+    <w:p>
+      <w:pPr>
+        <w:pStyle w:val="ListBullet"/>
+      </w:pPr>
+      <w:r>
+        <w:t>M: Moment magnitude (M_w).</w:t>
+      </w:r>
+    </w:p>
+    <w:p>
+      <w:pPr>
+        <w:pStyle w:val="ListBullet"/>
+      </w:pPr>
+      <w:r>
+        <w:t>R_JB: Joyner-Boore distance (closest distance to the surface projection of the fault).</w:t>
+      </w:r>
+    </w:p>
+    <w:p>
+      <w:pPr>
+        <w:pStyle w:val="ListBullet"/>
+      </w:pPr>
+      <w:r>
+        <w:t>V_S30: Time-averaged shear-wave velocity in the top 30 meters.</w:t>
+      </w:r>
+    </w:p>
+    <w:p>
+      <w:pPr>
+        <w:pStyle w:val="ListBullet"/>
+      </w:pPr>
+      <w:r>
+        <w:t>epsilon: Random variable representing total aleatory uncertainty.</w:t>
+      </w:r>
+    </w:p>
+    <w:p>
+      <w:pPr>
+        <w:pStyle w:val="ListBullet"/>
+      </w:pPr>
+      <w:r>
+        <w:t>sigma_T: Total standard deviation of the model.</w:t>
+      </w:r>
+    </w:p>
+    <w:p>
+      <w:pPr>
+        <w:pStyle w:val="Heading3"/>
+      </w:pPr>
+      <w:r>
+        <w:t>1.1 Source Term (F_M)</w:t>
+      </w:r>
+    </w:p>
+    <w:p>
+      <w:r>
+        <w:t>The source term accounts for magnitude scaling and fault type.</w:t>
+      </w:r>
+    </w:p>
+    <w:p>
+      <w:pPr>
+        <w:jc w:val="center"/>
+      </w:pPr>
+      <w:r>
+        <w:t>F_M = \begin{cases} e_1 U + e_2 SS + e_3 NS + e_4 RS + e_5(M - M_h) + e_6(M - M_h)^2 &amp; for M &lt;= M_h \\ e_1 U + e_2 SS + e_3 NS + e_4 RS + e_7(M - M_h) &amp; for M &gt; M_h \end{cases}</w:t>
+      </w:r>
+    </w:p>
+    <w:p>
+      <w:pPr>
+        <w:pStyle w:val="ListBullet"/>
+      </w:pPr>
+      <w:r>
+        <w:t>U, SS, NS, RS: Indicator variables for Unspecified, Strike-Slip, Normal, and Reverse faulting.</w:t>
+      </w:r>
+    </w:p>
+    <w:p>
+      <w:pPr>
+        <w:pStyle w:val="ListBullet"/>
+      </w:pPr>
+      <w:r>
+        <w:t>M_h: Hinge magnitude (6.75).</w:t>
+      </w:r>
+    </w:p>
+    <w:p>
+      <w:pPr>
+        <w:pStyle w:val="ListBullet"/>
+      </w:pPr>
+      <w:r>
+        <w:t>Coefficients (e_1 \dots e_7) are specific to the period T=1.0s.</w:t>
+      </w:r>
+    </w:p>
+    <w:p>
+      <w:pPr>
+        <w:pStyle w:val="Heading3"/>
+      </w:pPr>
+      <w:r>
+        <w:t>1.2 Distance Term (F_D)</w:t>
+      </w:r>
+    </w:p>
+    <w:p>
+      <w:r>
+        <w:t>The distance term accounts for geometric spreading and anelastic attenuation.</w:t>
+      </w:r>
+    </w:p>
+    <w:p>
+      <w:pPr>
+        <w:jc w:val="center"/>
+      </w:pPr>
+      <w:r>
+        <w:t>F_D(R, M) = [c_1 + c_2(M - M_h)] ln(R/R_{ref}) + c_3(R - R_{ref})</w:t>
+      </w:r>
+    </w:p>
+    <w:p>
+      <w:r>
+        <w:t>Where R = sqrt{R_JB^2 + h^2}.</w:t>
+      </w:r>
+    </w:p>
+    <w:p>
+      <w:pPr>
+        <w:pStyle w:val="Heading3"/>
+      </w:pPr>
+      <w:r>
+        <w:t>1.3 Site Amplification Term (F_S)</w:t>
+      </w:r>
+    </w:p>
+    <w:p>
+      <w:r>
+        <w:t>The site term accounts for linear and non-linear soil amplification.</w:t>
+      </w:r>
+    </w:p>
+    <w:p>
+      <w:pPr>
+        <w:jc w:val="center"/>
+      </w:pPr>
+      <w:r>
+        <w:t>F_S = F_{lin} + F_{nl}</w:t>
+      </w:r>
+    </w:p>
+    <w:p>
+      <w:pPr>
+        <w:pStyle w:val="ListBullet"/>
+      </w:pPr>
+      <w:r>
+        <w:t>**Linear Term (F_{lin})**: b_{lin} ln(V_S30 / V_{ref})</w:t>
+      </w:r>
+    </w:p>
+    <w:p>
+      <w:pPr>
+        <w:pStyle w:val="ListBullet"/>
+      </w:pPr>
+      <w:r>
+        <w:t>**Non-linear Term (F_{nl})**: Function of input rock motion (PGA_{rock}) and soil stiffness. For soft soils (V_S30 &lt; V_2) under strong shaking, this term reduces amplification due to soil non-linearity.</w:t>
+      </w:r>
+    </w:p>
+    <w:p>
+      <w:r>
+        <w:br w:type="page"/>
+      </w:r>
+    </w:p>
+    <w:p>
+      <w:pPr>
+        <w:pStyle w:val="Heading2"/>
+      </w:pPr>
+      <w:r>
+        <w:t>2. Spatial Correlation Model</w:t>
+      </w:r>
+    </w:p>
+    <w:p>
+      <w:r>
+        <w:t>To generate realistic ground motion fields where nearby sites experience similar shaking intensities, we implement the **Jayaram &amp; Baker (2009)** spatial correlation model.</w:t>
+      </w:r>
+    </w:p>
+    <w:p>
+      <w:pPr>
+        <w:pStyle w:val="Heading3"/>
+      </w:pPr>
+      <w:r>
+        <w:t>2.1 Intra-event Residual Correlation</w:t>
+      </w:r>
+    </w:p>
+    <w:p>
+      <w:r>
+        <w:t>The total residual epsilon_{total} is decomposed into:</w:t>
+      </w:r>
+    </w:p>
+    <w:p>
+      <w:pPr>
+        <w:pStyle w:val="ListNumber"/>
+      </w:pPr>
+      <w:r>
+        <w:t>**Inter-event residual (eta)**: Common to all sites in one earthquake. eta ~ N(0, tau^2).</w:t>
+      </w:r>
+    </w:p>
+    <w:p>
+      <w:r>
+        <w:t>2. **Intra-event residual (epsilon)**: Varies by site but is spatially correlated. epsilon ~ N(0, sigma^2).</w:t>
+      </w:r>
+    </w:p>
+    <w:p>
+      <w:r>
+        <w:t>The correlation coefficient between intra-event residuals at two sites i and j separated by distance h is:</w:t>
+      </w:r>
+    </w:p>
+    <w:p>
+      <w:pPr>
+        <w:jc w:val="center"/>
+      </w:pPr>
+      <w:r>
+        <w:t>rho_{ij} = exp&lt;=ft(\frac{-3 h}{b}\right)</w:t>
+      </w:r>
+    </w:p>
+    <w:p>
+      <w:r>
+        <w:t>For Sa(1.0s), the correlation range parameter b is approximately **40.7 km**.</w:t>
+      </w:r>
+    </w:p>
+    <w:p>
+      <w:pPr>
+        <w:pStyle w:val="Heading3"/>
+      </w:pPr>
+      <w:r>
+        <w:t>2.2 Field Generation Algorithm</w:t>
+      </w:r>
+    </w:p>
+    <w:p>
+      <w:pPr>
+        <w:pStyle w:val="ListNumber"/>
+      </w:pPr>
+      <w:r>
+        <w:t>Compute the correlation matrix \mathbf{Sigma} for all sites based on pairwise distances.</w:t>
+      </w:r>
+    </w:p>
+    <w:p>
+      <w:r>
+        <w:t>2. Perform **Cholesky Decomposition**: \mathbf{Sigma} = \mathbf{L}\mathbf{L}^T.</w:t>
+      </w:r>
+    </w:p>
+    <w:p>
+      <w:r>
+        <w:t>3. Generate a vector of independent standard normal random variables \mathbf{z}.</w:t>
+      </w:r>
+    </w:p>
+    <w:p>
+      <w:r>
+        <w:t>4. Compute correlated residuals: \boldsymbol{epsilon}_{correlated} = \mathbf{L} \mathbf{z} * sigma.</w:t>
+      </w:r>
+    </w:p>
+    <w:p>
+      <w:r>
+        <w:t>5. Add the inter-event residual eta * tau (constant for the event).</w:t>
+      </w:r>
+    </w:p>
+    <w:p>
+      <w:r>
+        <w:t>6. The final simulated ground motion at site i is:</w:t>
+      </w:r>
+    </w:p>
+    <w:p>
+      <w:pPr>
+        <w:jc w:val="center"/>
+      </w:pPr>
+      <w:r>
+        <w:t>Y_i = exp(ln(Median}_i) + eta + epsilon_{correlated, i})</w:t>
+      </w:r>
+    </w:p>
+    <w:p>
+      <w:pPr>
+        <w:pStyle w:val="Heading2"/>
+      </w:pPr>
+      <w:r>
+        <w:t>3. Implementation Details</w:t>
+      </w:r>
+    </w:p>
+    <w:p>
+      <w:pPr>
+        <w:pStyle w:val="ListBullet"/>
+      </w:pPr>
+      <w:r>
+        <w:t>**Distance Metric**: Great-circle distance (Haversine formula) is used to approximate R_JB.</w:t>
+      </w:r>
+    </w:p>
+    <w:p>
+      <w:pPr>
+        <w:pStyle w:val="ListBullet"/>
+      </w:pPr>
+      <w:r>
+        <w:t xml:space="preserve">  **Grid vs. Site**: The simulation is performed directly at bridge locations (irregular grid), ensuring exact values for risk assessment.</w:t>
+      </w:r>
+    </w:p>
+    <w:p>
+      <w:r>
+        <w:br w:type="page"/>
+      </w:r>
+    </w:p>
+    <w:p>
+      <w:pPr>
+        <w:pStyle w:val="Heading1"/>
+      </w:pPr>
+      <w:r>
+        <w:t>Hazard Module Technical Reference</w:t>
+      </w:r>
+    </w:p>
+    <w:p>
+      <w:r>
+        <w:t>This section details the theoretical background and implementation of the ground motion prediction module (`src/hazard.py`). The module simulates spatially correlated ground motion fields for scenario earthquakes.</w:t>
+      </w:r>
+    </w:p>
+    <w:p>
+      <w:pPr>
+        <w:pStyle w:val="Heading2"/>
+      </w:pPr>
+      <w:r>
+        <w:t>1. Ground Motion Prediction Equation (GMPE)</w:t>
+      </w:r>
+    </w:p>
+    <w:p>
+      <w:r>
+        <w:t>The core ground motion intensity measure (IM) is the **5%-damped spectral acceleration at 1.0 second period**, denoted as Sa(1.0s).</w:t>
+      </w:r>
+    </w:p>
+    <w:p>
+      <w:r>
+        <w:t>We implement the **Boore &amp; Atkinson (2008)** NGA-West1 model (BA08). The predicted ground motion is given by:</w:t>
+      </w:r>
+    </w:p>
+    <w:p>
+      <w:pPr>
+        <w:jc w:val="center"/>
+      </w:pPr>
+      <w:r>
+        <w:t>ln Y = F_M(M) + F_D(R_JB, M) + F_S(V_S30, R_JB, M) + epsilon sigma_T</w:t>
+      </w:r>
+    </w:p>
+    <w:p>
+      <w:r>
+        <w:t>Where:</w:t>
+      </w:r>
+    </w:p>
+    <w:p>
+      <w:pPr>
+        <w:pStyle w:val="ListBullet"/>
+      </w:pPr>
+      <w:r>
+        <w:t>Y: Ground motion intensity (Sa(1.0s) in g).</w:t>
+      </w:r>
+    </w:p>
+    <w:p>
+      <w:pPr>
+        <w:pStyle w:val="ListBullet"/>
+      </w:pPr>
+      <w:r>
+        <w:t>M: Moment magnitude (M_w).</w:t>
+      </w:r>
+    </w:p>
+    <w:p>
+      <w:pPr>
+        <w:pStyle w:val="ListBullet"/>
+      </w:pPr>
+      <w:r>
+        <w:t>R_JB: Joyner-Boore distance (closest distance to the surface projection of the fault).</w:t>
+      </w:r>
+    </w:p>
+    <w:p>
+      <w:pPr>
+        <w:pStyle w:val="ListBullet"/>
+      </w:pPr>
+      <w:r>
+        <w:t>V_S30: Time-averaged shear-wave velocity in the top 30 meters.</w:t>
+      </w:r>
+    </w:p>
+    <w:p>
+      <w:pPr>
+        <w:pStyle w:val="ListBullet"/>
+      </w:pPr>
+      <w:r>
+        <w:t>epsilon: Random variable representing total aleatory uncertainty.</w:t>
+      </w:r>
+    </w:p>
+    <w:p>
+      <w:pPr>
+        <w:pStyle w:val="ListBullet"/>
+      </w:pPr>
+      <w:r>
+        <w:t>sigma_T: Total standard deviation of the model.</w:t>
+      </w:r>
+    </w:p>
+    <w:p>
+      <w:pPr>
+        <w:pStyle w:val="Heading3"/>
+      </w:pPr>
+      <w:r>
+        <w:t>1.1 Source Term (F_M)</w:t>
+      </w:r>
+    </w:p>
+    <w:p>
+      <w:r>
+        <w:t>The source term accounts for magnitude scaling and fault type.</w:t>
+      </w:r>
+    </w:p>
+    <w:p>
+      <w:pPr>
+        <w:jc w:val="center"/>
+      </w:pPr>
+      <w:r>
+        <w:t>F_M = \begin{cases} e_1 U + e_2 SS + e_3 NS + e_4 RS + e_5(M - M_h) + e_6(M - M_h)^2 &amp; for M &lt;= M_h \\ e_1 U + e_2 SS + e_3 NS + e_4 RS + e_7(M - M_h) &amp; for M &gt; M_h \end{cases}</w:t>
+      </w:r>
+    </w:p>
+    <w:p>
+      <w:pPr>
+        <w:pStyle w:val="ListBullet"/>
+      </w:pPr>
+      <w:r>
+        <w:t>U, SS, NS, RS: Indicator variables for Unspecified, Strike-Slip, Normal, and Reverse faulting.</w:t>
+      </w:r>
+    </w:p>
+    <w:p>
+      <w:pPr>
+        <w:pStyle w:val="ListBullet"/>
+      </w:pPr>
+      <w:r>
+        <w:t>M_h: Hinge magnitude (6.75).</w:t>
+      </w:r>
+    </w:p>
+    <w:p>
+      <w:pPr>
+        <w:pStyle w:val="ListBullet"/>
+      </w:pPr>
+      <w:r>
+        <w:t>Coefficients (e_1 \dots e_7) are specific to the period T=1.0s.</w:t>
+      </w:r>
+    </w:p>
+    <w:p>
+      <w:pPr>
+        <w:pStyle w:val="Heading3"/>
+      </w:pPr>
+      <w:r>
+        <w:t>1.2 Distance Term (F_D)</w:t>
+      </w:r>
+    </w:p>
+    <w:p>
+      <w:r>
+        <w:t>The distance term accounts for geometric spreading and anelastic attenuation.</w:t>
+      </w:r>
+    </w:p>
+    <w:p>
+      <w:pPr>
+        <w:jc w:val="center"/>
+      </w:pPr>
+      <w:r>
+        <w:t>F_D(R, M) = [c_1 + c_2(M - M_h)] ln(R/R_{ref}) + c_3(R - R_{ref})</w:t>
+      </w:r>
+    </w:p>
+    <w:p>
+      <w:r>
+        <w:t>Where R = sqrt{R_JB^2 + h^2}.</w:t>
+      </w:r>
+    </w:p>
+    <w:p>
+      <w:pPr>
+        <w:pStyle w:val="Heading3"/>
+      </w:pPr>
+      <w:r>
+        <w:t>1.3 Site Amplification Term (F_S)</w:t>
+      </w:r>
+    </w:p>
+    <w:p>
+      <w:r>
+        <w:t>The site term accounts for linear and non-linear soil amplification.</w:t>
+      </w:r>
+    </w:p>
+    <w:p>
+      <w:pPr>
+        <w:jc w:val="center"/>
+      </w:pPr>
+      <w:r>
+        <w:t xml:space="preserve"> F_S = F_{lin} + F_{nl} </w:t>
+      </w:r>
+    </w:p>
+    <w:p>
+      <w:pPr>
+        <w:pStyle w:val="ListBullet"/>
+      </w:pPr>
+      <w:r>
+        <w:t>**Linear Term (F_{lin})**: b_{lin} ln(V_S30 / V_{ref})</w:t>
+      </w:r>
+    </w:p>
+    <w:p>
+      <w:pPr>
+        <w:pStyle w:val="ListBullet"/>
+      </w:pPr>
+      <w:r>
+        <w:t>**Non-linear Term (F_{nl})**: Function of input rock motion (PGA_{rock}) and soil stiffness. For soft soils (V_S30 &lt; V_2) under strong shaking, this term reduces amplification due to soil non-linearity.</w:t>
+      </w:r>
+    </w:p>
+    <w:p>
+      <w:r>
+        <w:br w:type="page"/>
+      </w:r>
+    </w:p>
+    <w:p>
+      <w:pPr>
+        <w:pStyle w:val="Heading2"/>
+      </w:pPr>
+      <w:r>
+        <w:t>2. Spatial Correlation Model</w:t>
+      </w:r>
+    </w:p>
+    <w:p>
+      <w:r>
+        <w:t>To generate realistic ground motion fields where nearby sites experience similar shaking intensities, we implement the **Jayaram &amp; Baker (2009)** spatial correlation model.</w:t>
+      </w:r>
+    </w:p>
+    <w:p>
+      <w:pPr>
+        <w:pStyle w:val="Heading3"/>
+      </w:pPr>
+      <w:r>
+        <w:t>2.1 Intra-event Residual Correlation</w:t>
+      </w:r>
+    </w:p>
+    <w:p>
+      <w:r>
+        <w:t>The total residual epsilon_{total} is decomposed into:</w:t>
+      </w:r>
+    </w:p>
+    <w:p>
+      <w:pPr>
+        <w:pStyle w:val="ListNumber"/>
+      </w:pPr>
+      <w:r>
+        <w:t>**Inter-event residual (eta)**: Common to all sites in one earthquake. eta ~ N(0, tau^2).</w:t>
+      </w:r>
+    </w:p>
+    <w:p>
+      <w:r>
+        <w:t>2. **Intra-event residual (epsilon)**: Varies by site but is spatially correlated. epsilon ~ N(0, sigma^2).</w:t>
+      </w:r>
+    </w:p>
+    <w:p>
+      <w:r>
+        <w:t>The correlation coefficient between intra-event residuals at two sites i and j separated by distance h is:</w:t>
+      </w:r>
+    </w:p>
+    <w:p>
+      <w:pPr>
+        <w:jc w:val="center"/>
+      </w:pPr>
+      <w:r>
+        <w:t>rho_{ij} = exp&lt;=ft(\frac{-3 h}{b}\right)</w:t>
+      </w:r>
+    </w:p>
+    <w:p>
+      <w:r>
+        <w:t>For Sa(1.0s), the correlation range parameter b is approximately **40.7 km**.</w:t>
+      </w:r>
+    </w:p>
+    <w:p>
+      <w:pPr>
+        <w:pStyle w:val="Heading3"/>
+      </w:pPr>
+      <w:r>
+        <w:t>2.2 Field Generation Algorithm</w:t>
+      </w:r>
+    </w:p>
+    <w:p>
+      <w:pPr>
+        <w:pStyle w:val="ListNumber"/>
+      </w:pPr>
+      <w:r>
+        <w:t>Compute the correlation matrix \mathbf{Sigma} for all sites based on pairwise distances.</w:t>
+      </w:r>
+    </w:p>
+    <w:p>
+      <w:r>
+        <w:t>2. Perform **Cholesky Decomposition**: \mathbf{Sigma} = \mathbf{L}\mathbf{L}^T.</w:t>
+      </w:r>
+    </w:p>
+    <w:p>
+      <w:r>
+        <w:t>3. Generate a vector of independent standard normal random variables \mathbf{z}.</w:t>
+      </w:r>
+    </w:p>
+    <w:p>
+      <w:r>
+        <w:t>4. Compute correlated residuals: \boldsymbol{epsilon}_{correlated} = \mathbf{L} \mathbf{z} * sigma.</w:t>
+      </w:r>
+    </w:p>
+    <w:p>
+      <w:r>
+        <w:t>5. Add the inter-event residual eta * tau (constant for the event).</w:t>
+      </w:r>
+    </w:p>
+    <w:p>
+      <w:r>
+        <w:t>6. The final simulated ground motion at site i is:</w:t>
+      </w:r>
+    </w:p>
+    <w:p>
+      <w:pPr>
+        <w:jc w:val="center"/>
+      </w:pPr>
+      <w:r>
+        <w:t>Y_i = exp(ln(Median}_i) + eta + epsilon_{correlated, i})</w:t>
+      </w:r>
+    </w:p>
+    <w:p>
+      <w:pPr>
+        <w:pStyle w:val="Heading2"/>
+      </w:pPr>
+      <w:r>
+        <w:t>3. Implementation Details</w:t>
+      </w:r>
+    </w:p>
+    <w:p>
+      <w:pPr>
+        <w:pStyle w:val="ListBullet"/>
+      </w:pPr>
+      <w:r>
+        <w:t>**Distance Metric**: Great-circle distance (Haversine formula) is used to approximate R_JB.</w:t>
+      </w:r>
+    </w:p>
+    <w:p>
+      <w:pPr>
+        <w:pStyle w:val="ListBullet"/>
+      </w:pPr>
+      <w:r>
+        <w:t xml:space="preserve">  **Grid vs. Site**: The simulation is performed directly at bridge locations (irregular grid), ensuring exact values for risk assessment.</w:t>
+      </w:r>
+    </w:p>
+    <w:p>
+      <w:r>
+        <w:br w:type="page"/>
+      </w:r>
+    </w:p>
+    <w:p>
+      <w:pPr>
+        <w:pStyle w:val="Heading1"/>
+      </w:pPr>
+      <w:r>
+        <w:t>Hazard Module Technical Reference</w:t>
+      </w:r>
+    </w:p>
+    <w:p>
+      <w:r>
+        <w:t>This section details the theoretical background and implementation of the ground motion prediction module (`src/hazard.py`). The module simulates spatially correlated ground motion fields for scenario earthquakes.</w:t>
+      </w:r>
+    </w:p>
+    <w:p>
+      <w:pPr>
+        <w:pStyle w:val="Heading2"/>
+      </w:pPr>
+      <w:r>
+        <w:t>1. Ground Motion Prediction Equation (GMPE)</w:t>
+      </w:r>
+    </w:p>
+    <w:p>
+      <w:r>
+        <w:t>The core ground motion intensity measure (IM) is the **5%-damped spectral acceleration at 1.0 second period**, denoted as Sa(1.0s).</w:t>
+      </w:r>
+    </w:p>
+    <w:p>
+      <w:r>
+        <w:t>We implement the **Boore &amp; Atkinson (2008)** NGA-West1 model (BA08). The predicted ground motion is given by:</w:t>
+      </w:r>
+    </w:p>
+    <w:p>
+      <w:pPr>
+        <w:jc w:val="center"/>
+      </w:pPr>
+      <w:r>
+        <w:t xml:space="preserve"> ln(Y) = F_M(M) + F_D(R_JB, M) + F_S(V_S30, R_JB, M) + ε·σ_T </w:t>
+      </w:r>
+    </w:p>
+    <w:p>
+      <w:r>
+        <w:t>Where:</w:t>
+      </w:r>
+    </w:p>
+    <w:p>
+      <w:pPr>
+        <w:pStyle w:val="ListBullet"/>
+      </w:pPr>
+      <w:r>
+        <w:t xml:space="preserve">  Y: Ground motion intensity (Sa(1.0s) in g).</w:t>
+      </w:r>
+    </w:p>
+    <w:p>
+      <w:pPr>
+        <w:pStyle w:val="ListBullet"/>
+      </w:pPr>
+      <w:r>
+        <w:t xml:space="preserve">  M: Moment magnitude (Mw).</w:t>
+      </w:r>
+    </w:p>
+    <w:p>
+      <w:pPr>
+        <w:pStyle w:val="ListBullet"/>
+      </w:pPr>
+      <w:r>
+        <w:t xml:space="preserve">  R_JB: Joyner-Boore distance (closest distance to the surface projection of the fault).</w:t>
+      </w:r>
+    </w:p>
+    <w:p>
+      <w:pPr>
+        <w:pStyle w:val="ListBullet"/>
+      </w:pPr>
+      <w:r>
+        <w:t xml:space="preserve">  V_S30: Time-averaged shear-wave velocity in the top 30 meters.</w:t>
+      </w:r>
+    </w:p>
+    <w:p>
+      <w:pPr>
+        <w:pStyle w:val="ListBullet"/>
+      </w:pPr>
+      <w:r>
+        <w:t xml:space="preserve">  ε: Random variable representing total aleatory uncertainty.</w:t>
+      </w:r>
+    </w:p>
+    <w:p>
+      <w:pPr>
+        <w:pStyle w:val="ListBullet"/>
+      </w:pPr>
+      <w:r>
+        <w:t xml:space="preserve">  σ_T: Total standard deviation of the model.</w:t>
+      </w:r>
+    </w:p>
+    <w:p>
+      <w:pPr>
+        <w:pStyle w:val="Heading3"/>
+      </w:pPr>
+      <w:r>
+        <w:t>1.1 Source Term (F_M)</w:t>
+      </w:r>
+    </w:p>
+    <w:p>
+      <w:r>
+        <w:t>The source term accounts for magnitude scaling and fault type.</w:t>
+      </w:r>
+    </w:p>
+    <w:p>
+      <w:pPr>
+        <w:jc w:val="center"/>
+      </w:pPr>
+      <w:r>
+        <w:t xml:space="preserve"> F_M = e_1·U + e_2·SS + e_3·NS + e_4·RS + e_5(M - M_h) + e_6(M - M_h)^2   (for M ≤ M_h) </w:t>
+      </w:r>
+    </w:p>
+    <w:p>
+      <w:pPr>
+        <w:jc w:val="center"/>
+      </w:pPr>
+      <w:r>
+        <w:t xml:space="preserve"> F_M = e_1·U + e_2·SS + e_3·NS + e_4·RS + e_7(M - M_h)                   (for M &gt; M_h) </w:t>
+      </w:r>
+    </w:p>
+    <w:p>
+      <w:pPr>
+        <w:pStyle w:val="ListBullet"/>
+      </w:pPr>
+      <w:r>
+        <w:t xml:space="preserve">  U, SS, NS, RS: Indicator variables for Unspecified, Strike-Slip, Normal, and Reverse faulting.</w:t>
+      </w:r>
+    </w:p>
+    <w:p>
+      <w:pPr>
+        <w:pStyle w:val="ListBullet"/>
+      </w:pPr>
+      <w:r>
+        <w:t xml:space="preserve">  M_h: Hinge magnitude (6.75).</w:t>
+      </w:r>
+    </w:p>
+    <w:p>
+      <w:pPr>
+        <w:pStyle w:val="ListBullet"/>
+      </w:pPr>
+      <w:r>
+        <w:t xml:space="preserve">  Coefficients (e_1 ... e_7) are specific to the period T=1.0s.</w:t>
+      </w:r>
+    </w:p>
+    <w:p>
+      <w:pPr>
+        <w:pStyle w:val="Heading3"/>
+      </w:pPr>
+      <w:r>
+        <w:t>1.2 Distance Term (F_D)</w:t>
+      </w:r>
+    </w:p>
+    <w:p>
+      <w:r>
+        <w:t>The distance term accounts for geometric spreading and anelastic attenuation.</w:t>
+      </w:r>
+    </w:p>
+    <w:p>
+      <w:pPr>
+        <w:jc w:val="center"/>
+      </w:pPr>
+      <w:r>
+        <w:t xml:space="preserve"> F_D(R, M) = [c_1 + c_2(M - M_h)] · ln(R/R_ref) + c_3(R - R_ref) </w:t>
+      </w:r>
+    </w:p>
+    <w:p>
+      <w:r>
+        <w:t>Where R = √(R_JB² + h²).</w:t>
+      </w:r>
+    </w:p>
+    <w:p>
+      <w:pPr>
+        <w:pStyle w:val="Heading3"/>
+      </w:pPr>
+      <w:r>
+        <w:t>1.3 Site Amplification Term (F_S)</w:t>
+      </w:r>
+    </w:p>
+    <w:p>
+      <w:r>
+        <w:t>The site term accounts for linear and non-linear soil amplification.</w:t>
+      </w:r>
+    </w:p>
+    <w:p>
+      <w:pPr>
+        <w:jc w:val="center"/>
+      </w:pPr>
+      <w:r>
+        <w:t xml:space="preserve"> F_S = F_lin + F_nl </w:t>
+      </w:r>
+    </w:p>
+    <w:p>
+      <w:pPr>
+        <w:pStyle w:val="ListBullet"/>
+      </w:pPr>
+      <w:r>
+        <w:t xml:space="preserve">  **Linear Term (F_lin)**: b_lin · ln(V_S30 / V_ref)</w:t>
+      </w:r>
+    </w:p>
+    <w:p>
+      <w:pPr>
+        <w:pStyle w:val="ListBullet"/>
+      </w:pPr>
+      <w:r>
+        <w:t xml:space="preserve">  **Non-linear Term (F_nl)**: Function of input rock motion (PGA_rock) and soil stiffness. For soft soils (V_S30 &lt; V_2) under strong shaking, this term reduces amplification due to soil non-linearity.</w:t>
+      </w:r>
+    </w:p>
+    <w:p>
+      <w:r>
+        <w:br w:type="page"/>
+      </w:r>
+    </w:p>
+    <w:p>
+      <w:pPr>
+        <w:pStyle w:val="Heading2"/>
+      </w:pPr>
+      <w:r>
+        <w:t>2. Spatial Correlation Model</w:t>
+      </w:r>
+    </w:p>
+    <w:p>
+      <w:r>
+        <w:t>To generate realistic ground motion fields where nearby sites experience similar shaking intensities, we implement the **Jayaram &amp; Baker (2009)** spatial correlation model.</w:t>
+      </w:r>
+    </w:p>
+    <w:p>
+      <w:pPr>
+        <w:pStyle w:val="Heading3"/>
+      </w:pPr>
+      <w:r>
+        <w:t>2.1 Intra-event Residual Correlation</w:t>
+      </w:r>
+    </w:p>
+    <w:p>
+      <w:r>
+        <w:t>The total residual epsilon_{total} is decomposed into:</w:t>
+      </w:r>
+    </w:p>
+    <w:p>
+      <w:pPr>
+        <w:pStyle w:val="ListNumber"/>
+      </w:pPr>
+      <w:r>
+        <w:t xml:space="preserve"> **Inter-event residual (η)**: Common to all sites in one earthquake. η ~ N(0, τ²).</w:t>
+      </w:r>
+    </w:p>
+    <w:p>
+      <w:r>
+        <w:t>2.  **Intra-event residual (ε)**: Varies by site but is spatially correlated. ε ~ N(0, σ²).</w:t>
+      </w:r>
+    </w:p>
+    <w:p>
+      <w:r>
+        <w:t>The correlation coefficient between intra-event residuals at two sites i and j separated by distance h is:</w:t>
+      </w:r>
+    </w:p>
+    <w:p>
+      <w:pPr>
+        <w:jc w:val="center"/>
+      </w:pPr>
+      <w:r>
+        <w:t xml:space="preserve"> ρ_ij = exp( -3h / b ) </w:t>
+      </w:r>
+    </w:p>
+    <w:p>
+      <w:r>
+        <w:t>For Sa(1.0s), the correlation range parameter b is approximately **40.7 km**.</w:t>
+      </w:r>
+    </w:p>
+    <w:p>
+      <w:pPr>
+        <w:pStyle w:val="Heading3"/>
+      </w:pPr>
+      <w:r>
+        <w:t>2.2 Field Generation Algorithm</w:t>
+      </w:r>
+    </w:p>
+    <w:p>
+      <w:pPr>
+        <w:pStyle w:val="ListNumber"/>
+      </w:pPr>
+      <w:r>
+        <w:t xml:space="preserve"> Compute the correlation matrix Σ for all sites based on pairwise distances.</w:t>
+      </w:r>
+    </w:p>
+    <w:p>
+      <w:r>
+        <w:t>2.  Perform **Cholesky Decomposition**: Σ = L·L^T.</w:t>
+      </w:r>
+    </w:p>
+    <w:p>
+      <w:r>
+        <w:t>3.  Generate a vector of independent standard normal random variables **z**.</w:t>
+      </w:r>
+    </w:p>
+    <w:p>
+      <w:r>
+        <w:t>4.  Compute correlated residuals: ε_correlated = L·z · σ.</w:t>
+      </w:r>
+    </w:p>
+    <w:p>
+      <w:r>
+        <w:t>5.  Add the inter-event residual η · τ (constant for the event).</w:t>
+      </w:r>
+    </w:p>
+    <w:p>
+      <w:r>
+        <w:t>6.  The final simulated ground motion at site i is:</w:t>
+      </w:r>
+    </w:p>
+    <w:p>
+      <w:pPr>
+        <w:jc w:val="center"/>
+      </w:pPr>
+      <w:r>
+        <w:t xml:space="preserve"> Y_i = exp( ln(Median_i) + η + ε_correlated,i ) </w:t>
+      </w:r>
+    </w:p>
+    <w:p>
+      <w:pPr>
+        <w:pStyle w:val="Heading2"/>
+      </w:pPr>
+      <w:r>
+        <w:t>3. Implementation Details</w:t>
+      </w:r>
+    </w:p>
+    <w:p>
+      <w:pPr>
+        <w:pStyle w:val="ListBullet"/>
+      </w:pPr>
+      <w:r>
+        <w:t>**Distance Metric**: Great-circle distance (Haversine formula) is used to approximate R_JB.</w:t>
+      </w:r>
+    </w:p>
+    <w:p>
+      <w:pPr>
+        <w:pStyle w:val="ListBullet"/>
+      </w:pPr>
+      <w:r>
+        <w:t xml:space="preserve">  **Grid vs. Site**: The simulation is performed directly at bridge locations (irregular grid), ensuring exact values for risk assessment.</w:t>
+      </w:r>
+    </w:p>
+    <w:p>
+      <w:r>
+        <w:br w:type="page"/>
+      </w:r>
+    </w:p>
+    <w:p>
+      <w:pPr>
+        <w:pStyle w:val="Heading1"/>
+      </w:pPr>
+      <w:r>
+        <w:t>Hazard Module Technical Reference</w:t>
+      </w:r>
+    </w:p>
+    <w:p>
+      <w:r>
+        <w:rPr>
+          <w:b w:val="0"/>
+          <w:sz w:val="22"/>
+        </w:rPr>
+        <w:t>This section details the theoretical background and implementation of the ground motion prediction module (src/hazard.py). The module simulates spatially correlated ground motion fields for scenario earthquakes.</w:t>
+      </w:r>
+    </w:p>
+    <w:p>
+      <w:pPr>
+        <w:pStyle w:val="Heading2"/>
+      </w:pPr>
+      <w:r>
+        <w:t>1. Ground Motion Prediction Equation (GMPE)</w:t>
+      </w:r>
+    </w:p>
+    <w:p>
+      <w:r>
+        <w:rPr>
+          <w:b w:val="0"/>
+          <w:sz w:val="22"/>
+        </w:rPr>
+        <w:t>The core ground motion intensity measure (IM) is the 5%-damped spectral acceleration at 1.0 second period, Sa(1.0s). We implement the Boore &amp; Atkinson (2008) NGA-West1 model (BA08). The predicted ground motion is:</w:t>
+      </w:r>
+    </w:p>
+    <w:p>
+      <w:pPr>
+        <w:jc w:val="center"/>
+      </w:pPr>
+      <m:oMath>
+        <m:r>
+          <m:rPr>
+            <m:sty m:val="p"/>
+          </m:rPr>
+          <m:t>ln</m:t>
+        </m:r>
+        <m:r>
+          <m:t>Y=</m:t>
+        </m:r>
+        <m:sSub>
+          <m:e>
+            <m:r>
+              <m:t>F</m:t>
+            </m:r>
+          </m:e>
+          <m:sub>
+            <m:r>
+              <m:t>M</m:t>
+            </m:r>
+          </m:sub>
+        </m:sSub>
+        <m:r>
+          <m:t>(M)+</m:t>
+        </m:r>
+        <m:sSub>
+          <m:e>
+            <m:r>
+              <m:t>F</m:t>
+            </m:r>
+          </m:e>
+          <m:sub>
+            <m:r>
+              <m:t>D</m:t>
+            </m:r>
+          </m:sub>
+        </m:sSub>
+        <m:r>
+          <m:t>(</m:t>
+        </m:r>
+        <m:sSub>
+          <m:e>
+            <m:r>
+              <m:t>R</m:t>
+            </m:r>
+          </m:e>
+          <m:sub>
+            <m:r>
+              <m:t>JB</m:t>
+            </m:r>
+          </m:sub>
+        </m:sSub>
+        <m:r>
+          <m:t>,M)+</m:t>
+        </m:r>
+        <m:sSub>
+          <m:e>
+            <m:r>
+              <m:t>F</m:t>
+            </m:r>
+          </m:e>
+          <m:sub>
+            <m:r>
+              <m:t>S</m:t>
+            </m:r>
+          </m:sub>
+        </m:sSub>
+        <m:r>
+          <m:t>(</m:t>
+        </m:r>
+        <m:sSub>
+          <m:e>
+            <m:r>
+              <m:t>V</m:t>
+            </m:r>
+          </m:e>
+          <m:sub>
+            <m:r>
+              <m:t>S30</m:t>
+            </m:r>
+          </m:sub>
+        </m:sSub>
+        <m:r>
+          <m:t>,</m:t>
+        </m:r>
+        <m:sSub>
+          <m:e>
+            <m:r>
+              <m:t>R</m:t>
+            </m:r>
+          </m:e>
+          <m:sub>
+            <m:r>
+              <m:t>JB</m:t>
+            </m:r>
+          </m:sub>
+        </m:sSub>
+        <m:r>
+          <m:t>,M)+ε·</m:t>
+        </m:r>
+        <m:sSub>
+          <m:e>
+            <m:r>
+              <m:t>σ</m:t>
+            </m:r>
+          </m:e>
+          <m:sub>
+            <m:r>
+              <m:t>T</m:t>
+            </m:r>
+          </m:sub>
+        </m:sSub>
+      </m:oMath>
+    </w:p>
+    <w:p>
+      <w:r>
+        <w:rPr>
+          <w:b w:val="0"/>
+          <w:sz w:val="22"/>
+        </w:rPr>
+        <w:t>Where:</w:t>
+      </w:r>
+    </w:p>
+    <w:p>
+      <w:pPr>
+        <w:pStyle w:val="ListBullet"/>
+      </w:pPr>
+      <w:r>
+        <w:t>Y: Ground motion intensity, Sa(1.0s) in g</w:t>
+      </w:r>
+    </w:p>
+    <w:p>
+      <w:pPr>
+        <w:pStyle w:val="ListBullet"/>
+      </w:pPr>
+      <w:r>
+        <w:t>M: Moment magnitude (Mw)</w:t>
+      </w:r>
+    </w:p>
+    <w:p>
+      <w:pPr>
+        <w:pStyle w:val="ListBullet"/>
+      </w:pPr>
+      <w:r>
+        <w:t>R_JB: Joyner-Boore distance (km)</w:t>
+      </w:r>
+    </w:p>
+    <w:p>
+      <w:pPr>
+        <w:pStyle w:val="ListBullet"/>
+      </w:pPr>
+      <w:r>
+        <w:t>V_S30: Time-averaged shear-wave velocity in the top 30 m (m/s)</w:t>
+      </w:r>
+    </w:p>
+    <w:p>
+      <w:pPr>
+        <w:pStyle w:val="ListBullet"/>
+      </w:pPr>
+      <w:r>
+        <w:t>ε: Random variable representing total aleatory uncertainty</w:t>
+      </w:r>
+    </w:p>
+    <w:p>
+      <w:pPr>
+        <w:pStyle w:val="ListBullet"/>
+      </w:pPr>
+      <w:r>
+        <w:t>σ_T: Total standard deviation of the model</w:t>
+      </w:r>
+    </w:p>
+    <w:p>
+      <w:pPr>
+        <w:pStyle w:val="Heading3"/>
+      </w:pPr>
+      <w:r>
+        <w:t>1.1 Source Term (F_M)</w:t>
+      </w:r>
+    </w:p>
+    <w:p>
+      <w:r>
+        <w:rPr>
+          <w:b w:val="0"/>
+          <w:sz w:val="22"/>
+        </w:rPr>
+        <w:t>The source term accounts for magnitude scaling and fault type. The piecewise formulation is:</w:t>
+      </w:r>
+    </w:p>
+    <w:p>
+      <w:pPr>
+        <w:jc w:val="center"/>
+      </w:pPr>
+      <m:oMath>
+        <m:sSub>
+          <m:e>
+            <m:r>
+              <m:t>F</m:t>
+            </m:r>
+          </m:e>
+          <m:sub>
+            <m:r>
+              <m:t>M</m:t>
+            </m:r>
+          </m:sub>
+        </m:sSub>
+        <m:r>
+          <m:t>=</m:t>
+        </m:r>
+        <m:sSub>
+          <m:e>
+            <m:r>
+              <m:t>e</m:t>
+            </m:r>
+          </m:e>
+          <m:sub>
+            <m:r>
+              <m:t>1</m:t>
+            </m:r>
+          </m:sub>
+        </m:sSub>
+        <m:r>
+          <m:t>U+</m:t>
+        </m:r>
+        <m:sSub>
+          <m:e>
+            <m:r>
+              <m:t>e</m:t>
+            </m:r>
+          </m:e>
+          <m:sub>
+            <m:r>
+              <m:t>2</m:t>
+            </m:r>
+          </m:sub>
+        </m:sSub>
+        <m:r>
+          <m:t>SS+</m:t>
+        </m:r>
+        <m:sSub>
+          <m:e>
+            <m:r>
+              <m:t>e</m:t>
+            </m:r>
+          </m:e>
+          <m:sub>
+            <m:r>
+              <m:t>3</m:t>
+            </m:r>
+          </m:sub>
+        </m:sSub>
+        <m:r>
+          <m:t>NS+</m:t>
+        </m:r>
+        <m:sSub>
+          <m:e>
+            <m:r>
+              <m:t>e</m:t>
+            </m:r>
+          </m:e>
+          <m:sub>
+            <m:r>
+              <m:t>4</m:t>
+            </m:r>
+          </m:sub>
+        </m:sSub>
+        <m:r>
+          <m:t>RS+</m:t>
+        </m:r>
+        <m:sSub>
+          <m:e>
+            <m:r>
+              <m:t>e</m:t>
+            </m:r>
+          </m:e>
+          <m:sub>
+            <m:r>
+              <m:t>5</m:t>
+            </m:r>
+          </m:sub>
+        </m:sSub>
+        <m:r>
+          <m:t>(M−</m:t>
+        </m:r>
+        <m:sSub>
+          <m:e>
+            <m:r>
+              <m:t>M</m:t>
+            </m:r>
+          </m:e>
+          <m:sub>
+            <m:r>
+              <m:t>h</m:t>
+            </m:r>
+          </m:sub>
+        </m:sSub>
+        <m:r>
+          <m:t>)+</m:t>
+        </m:r>
+        <m:sSub>
+          <m:e>
+            <m:r>
+              <m:t>e</m:t>
+            </m:r>
+          </m:e>
+          <m:sub>
+            <m:r>
+              <m:t>6</m:t>
+            </m:r>
+          </m:sub>
+        </m:sSub>
+        <m:r>
+          <m:t>(M−</m:t>
+        </m:r>
+        <m:sSub>
+          <m:e>
+            <m:r>
+              <m:t>M</m:t>
+            </m:r>
+          </m:e>
+          <m:sub>
+            <m:r>
+              <m:t>h</m:t>
+            </m:r>
+          </m:sub>
+        </m:sSub>
+        <m:sSup>
+          <m:e>
+            <m:r>
+              <m:t>)</m:t>
+            </m:r>
+          </m:e>
+          <m:sup>
+            <m:r>
+              <m:t>2</m:t>
+            </m:r>
+          </m:sup>
+        </m:sSup>
+        <m:r>
+          <m:t>(M≤</m:t>
+        </m:r>
+        <m:sSub>
+          <m:e>
+            <m:r>
+              <m:t>M</m:t>
+            </m:r>
+          </m:e>
+          <m:sub>
+            <m:r>
+              <m:t>h</m:t>
+            </m:r>
+          </m:sub>
+        </m:sSub>
+        <m:r>
+          <m:t>)</m:t>
+        </m:r>
+      </m:oMath>
+    </w:p>
+    <w:p>
+      <w:pPr>
+        <w:jc w:val="center"/>
+      </w:pPr>
+      <m:oMath>
+        <m:sSub>
+          <m:e>
+            <m:r>
+              <m:t>F</m:t>
+            </m:r>
+          </m:e>
+          <m:sub>
+            <m:r>
+              <m:t>M</m:t>
+            </m:r>
+          </m:sub>
+        </m:sSub>
+        <m:r>
+          <m:t>=</m:t>
+        </m:r>
+        <m:sSub>
+          <m:e>
+            <m:r>
+              <m:t>e</m:t>
+            </m:r>
+          </m:e>
+          <m:sub>
+            <m:r>
+              <m:t>1</m:t>
+            </m:r>
+          </m:sub>
+        </m:sSub>
+        <m:r>
+          <m:t>U+</m:t>
+        </m:r>
+        <m:sSub>
+          <m:e>
+            <m:r>
+              <m:t>e</m:t>
+            </m:r>
+          </m:e>
+          <m:sub>
+            <m:r>
+              <m:t>2</m:t>
+            </m:r>
+          </m:sub>
+        </m:sSub>
+        <m:r>
+          <m:t>SS+</m:t>
+        </m:r>
+        <m:sSub>
+          <m:e>
+            <m:r>
+              <m:t>e</m:t>
+            </m:r>
+          </m:e>
+          <m:sub>
+            <m:r>
+              <m:t>3</m:t>
+            </m:r>
+          </m:sub>
+        </m:sSub>
+        <m:r>
+          <m:t>NS+</m:t>
+        </m:r>
+        <m:sSub>
+          <m:e>
+            <m:r>
+              <m:t>e</m:t>
+            </m:r>
+          </m:e>
+          <m:sub>
+            <m:r>
+              <m:t>4</m:t>
+            </m:r>
+          </m:sub>
+        </m:sSub>
+        <m:r>
+          <m:t>RS+</m:t>
+        </m:r>
+        <m:sSub>
+          <m:e>
+            <m:r>
+              <m:t>e</m:t>
+            </m:r>
+          </m:e>
+          <m:sub>
+            <m:r>
+              <m:t>7</m:t>
+            </m:r>
+          </m:sub>
+        </m:sSub>
+        <m:r>
+          <m:t>(M−</m:t>
+        </m:r>
+        <m:sSub>
+          <m:e>
+            <m:r>
+              <m:t>M</m:t>
+            </m:r>
+          </m:e>
+          <m:sub>
+            <m:r>
+              <m:t>h</m:t>
+            </m:r>
+          </m:sub>
+        </m:sSub>
+        <m:r>
+          <m:t>)</m:t>
+        </m:r>
+        <m:r>
+          <m:t>(M&gt;</m:t>
+        </m:r>
+        <m:sSub>
+          <m:e>
+            <m:r>
+              <m:t>M</m:t>
+            </m:r>
+          </m:e>
+          <m:sub>
+            <m:r>
+              <m:t>h</m:t>
+            </m:r>
+          </m:sub>
+        </m:sSub>
+        <m:r>
+          <m:t>)</m:t>
+        </m:r>
+      </m:oMath>
+    </w:p>
+    <w:p>
+      <w:pPr>
+        <w:pStyle w:val="ListBullet"/>
+      </w:pPr>
+      <w:r>
+        <w:t>U, SS, NS, RS: Indicator variables for Unspecified, Strike-Slip, Normal, and Reverse faulting</w:t>
+      </w:r>
+    </w:p>
+    <w:p>
+      <w:pPr>
+        <w:pStyle w:val="ListBullet"/>
+      </w:pPr>
+      <w:r>
+        <w:t>M_h: Hinge magnitude (6.75)</w:t>
+      </w:r>
+    </w:p>
+    <w:p>
+      <w:pPr>
+        <w:pStyle w:val="ListBullet"/>
+      </w:pPr>
+      <w:r>
+        <w:t>Coefficients (e₁ … e₇) are specific to the period T = 1.0 s</w:t>
+      </w:r>
+    </w:p>
+    <w:p>
+      <w:pPr>
+        <w:pStyle w:val="Heading3"/>
+      </w:pPr>
+      <w:r>
+        <w:t>1.2 Distance Term (F_D)</w:t>
+      </w:r>
+    </w:p>
+    <w:p>
+      <w:r>
+        <w:rPr>
+          <w:b w:val="0"/>
+          <w:sz w:val="22"/>
+        </w:rPr>
+        <w:t>The distance term accounts for geometric spreading and anelastic attenuation.</w:t>
+      </w:r>
+    </w:p>
+    <w:p>
+      <w:pPr>
+        <w:jc w:val="center"/>
+      </w:pPr>
+      <m:oMath>
+        <m:sSub>
+          <m:e>
+            <m:r>
+              <m:t>F</m:t>
+            </m:r>
+          </m:e>
+          <m:sub>
+            <m:r>
+              <m:t>D</m:t>
+            </m:r>
+          </m:sub>
+        </m:sSub>
+        <m:r>
+          <m:t>(R,M)=</m:t>
+        </m:r>
+        <m:d>
+          <m:dPr>
+            <m:begChr m:val="["/>
+            <m:sepChr m:val=""/>
+            <m:endChr m:val="]"/>
+          </m:dPr>
+          <m:e>
+            <m:sSub>
+              <m:e>
+                <m:r>
+                  <m:t>c</m:t>
+                </m:r>
+              </m:e>
+              <m:sub>
+                <m:r>
+                  <m:t>1</m:t>
+                </m:r>
+              </m:sub>
+            </m:sSub>
+            <m:r>
+              <m:t>+</m:t>
+            </m:r>
+            <m:sSub>
+              <m:e>
+                <m:r>
+                  <m:t>c</m:t>
+                </m:r>
+              </m:e>
+              <m:sub>
+                <m:r>
+                  <m:t>2</m:t>
+                </m:r>
+              </m:sub>
+            </m:sSub>
+            <m:r>
+              <m:t>(</m:t>
+            </m:r>
+            <m:r>
+              <m:t>M</m:t>
+            </m:r>
+            <m:r>
+              <m:t>−</m:t>
+            </m:r>
+            <m:sSub>
+              <m:e>
+                <m:r>
+                  <m:t>M</m:t>
+                </m:r>
+              </m:e>
+              <m:sub>
+                <m:r>
+                  <m:t>h</m:t>
+                </m:r>
+              </m:sub>
+            </m:sSub>
+            <m:r>
+              <m:t>)</m:t>
+            </m:r>
+          </m:e>
+        </m:d>
+        <m:r>
+          <m:rPr>
+            <m:sty m:val="p"/>
+          </m:rPr>
+          <m:t>ln</m:t>
+        </m:r>
+        <m:r>
+          <m:t>R+</m:t>
+        </m:r>
+        <m:sSub>
+          <m:e>
+            <m:r>
+              <m:t>c</m:t>
+            </m:r>
+          </m:e>
+          <m:sub>
+            <m:r>
+              <m:t>3</m:t>
+            </m:r>
+          </m:sub>
+        </m:sSub>
+        <m:r>
+          <m:t>(R−1)</m:t>
+        </m:r>
+      </m:oMath>
+    </w:p>
+    <w:p>
+      <w:r>
+        <w:rPr>
+          <w:b w:val="0"/>
+          <w:sz w:val="22"/>
+        </w:rPr>
+        <w:t>Where:</w:t>
+      </w:r>
+    </w:p>
+    <w:p>
+      <w:pPr>
+        <w:jc w:val="center"/>
+      </w:pPr>
+      <m:oMath>
+        <m:r>
+          <m:t>R=</m:t>
+        </m:r>
+        <m:rad>
+          <m:radPr>
+            <m:degHide m:val="on"/>
+          </m:radPr>
+          <m:deg/>
+          <m:e>
+            <m:sSubSup>
+              <m:e>
+                <m:r>
+                  <m:t>R</m:t>
+                </m:r>
+              </m:e>
+              <m:sub>
+                <m:r>
+                  <m:t>JB</m:t>
+                </m:r>
+              </m:sub>
+              <m:sup>
+                <m:r>
+                  <m:t>2</m:t>
+                </m:r>
+              </m:sup>
+            </m:sSubSup>
+            <m:r>
+              <m:t>+</m:t>
+            </m:r>
+            <m:sSup>
+              <m:e>
+                <m:r>
+                  <m:t>h</m:t>
+                </m:r>
+              </m:e>
+              <m:sup>
+                <m:r>
+                  <m:t>2</m:t>
+                </m:r>
+              </m:sup>
+            </m:sSup>
+          </m:e>
+        </m:rad>
+      </m:oMath>
+    </w:p>
+    <w:p>
+      <w:pPr>
+        <w:pStyle w:val="Heading3"/>
+      </w:pPr>
+      <w:r>
+        <w:t>1.3 Site Amplification Term (F_S)</w:t>
+      </w:r>
+    </w:p>
+    <w:p>
+      <w:r>
+        <w:rPr>
+          <w:b w:val="0"/>
+          <w:sz w:val="22"/>
+        </w:rPr>
+        <w:t>The site term accounts for linear and non-linear soil amplification.</w:t>
+      </w:r>
+    </w:p>
+    <w:p>
+      <w:pPr>
+        <w:jc w:val="center"/>
+      </w:pPr>
+      <m:oMath>
+        <m:sSub>
+          <m:e>
+            <m:r>
+              <m:t>F</m:t>
+            </m:r>
+          </m:e>
+          <m:sub>
+            <m:r>
+              <m:t>S</m:t>
+            </m:r>
+          </m:sub>
+        </m:sSub>
+        <m:r>
+          <m:t>=</m:t>
+        </m:r>
+        <m:sSub>
+          <m:e>
+            <m:r>
+              <m:t>F</m:t>
+            </m:r>
+          </m:e>
+          <m:sub>
+            <m:r>
+              <m:t>lin</m:t>
+            </m:r>
+          </m:sub>
+        </m:sSub>
+        <m:r>
+          <m:t>+</m:t>
+        </m:r>
+        <m:sSub>
+          <m:e>
+            <m:r>
+              <m:t>F</m:t>
+            </m:r>
+          </m:e>
+          <m:sub>
+            <m:r>
+              <m:t>nl</m:t>
+            </m:r>
+          </m:sub>
+        </m:sSub>
+      </m:oMath>
+    </w:p>
+    <w:p>
+      <w:r>
+        <w:rPr>
+          <w:b w:val="0"/>
+          <w:sz w:val="22"/>
+        </w:rPr>
+        <w:t>Linear site amplification term:</w:t>
+      </w:r>
+    </w:p>
+    <w:p>
+      <w:pPr>
+        <w:jc w:val="center"/>
+      </w:pPr>
+      <m:oMath>
+        <m:sSub>
+          <m:e>
+            <m:r>
+              <m:t>F</m:t>
+            </m:r>
+          </m:e>
+          <m:sub>
+            <m:r>
+              <m:t>lin</m:t>
+            </m:r>
+          </m:sub>
+        </m:sSub>
+        <m:r>
+          <m:t>=</m:t>
+        </m:r>
+        <m:sSub>
+          <m:e>
+            <m:r>
+              <m:t>b</m:t>
+            </m:r>
+          </m:e>
+          <m:sub>
+            <m:r>
+              <m:t>lin</m:t>
+            </m:r>
+          </m:sub>
+        </m:sSub>
+        <m:r>
+          <m:t>·</m:t>
+        </m:r>
+        <m:r>
+          <m:rPr>
+            <m:sty m:val="p"/>
+          </m:rPr>
+          <m:t>ln</m:t>
+        </m:r>
+        <m:d>
+          <m:dPr>
+            <m:sepChr m:val=""/>
+          </m:dPr>
+          <m:e>
+            <m:f>
+              <m:fPr>
+                <m:type m:val="bar"/>
+              </m:fPr>
+              <m:num>
+                <m:r>
+                  <m:t>min(</m:t>
+                </m:r>
+                <m:sSub>
+                  <m:e>
+                    <m:r>
+                      <m:t>V</m:t>
+                    </m:r>
+                  </m:e>
+                  <m:sub>
+                    <m:r>
+                      <m:t>S30</m:t>
+                    </m:r>
+                  </m:sub>
+                </m:sSub>
+                <m:r>
+                  <m:t>,</m:t>
+                </m:r>
+                <m:sSub>
+                  <m:e>
+                    <m:r>
+                      <m:t>V</m:t>
+                    </m:r>
+                  </m:e>
+                  <m:sub>
+                    <m:r>
+                      <m:t>ref</m:t>
+                    </m:r>
+                  </m:sub>
+                </m:sSub>
+                <m:r>
+                  <m:t>)</m:t>
+                </m:r>
+              </m:num>
+              <m:den>
+                <m:sSub>
+                  <m:e>
+                    <m:r>
+                      <m:t>V</m:t>
+                    </m:r>
+                  </m:e>
+                  <m:sub>
+                    <m:r>
+                      <m:t>ref</m:t>
+                    </m:r>
+                  </m:sub>
+                </m:sSub>
+              </m:den>
+            </m:f>
+          </m:e>
+        </m:d>
+      </m:oMath>
+    </w:p>
+    <w:p>
+      <w:r>
+        <w:rPr>
+          <w:b w:val="0"/>
+          <w:sz w:val="22"/>
+        </w:rPr>
+        <w:t>Non-linear term (F_nl): For soft soils (V_S30 &lt; V₂ = 300 m/s) under strong shaking, this term reduces amplification due to soil non-linearity.</w:t>
+      </w:r>
+    </w:p>
+    <w:p>
+      <w:pPr>
+        <w:pStyle w:val="Heading2"/>
+      </w:pPr>
+      <w:r>
+        <w:t>2. Spatial Correlation Model</w:t>
+      </w:r>
+    </w:p>
+    <w:p>
+      <w:r>
+        <w:rPr>
+          <w:b w:val="0"/>
+          <w:sz w:val="22"/>
+        </w:rPr>
+        <w:t>To generate realistic ground motion fields where nearby sites experience similar shaking intensities, we implement the Jayaram &amp; Baker (2009) spatial correlation model.</w:t>
+      </w:r>
+    </w:p>
+    <w:p>
+      <w:pPr>
+        <w:pStyle w:val="Heading3"/>
+      </w:pPr>
+      <w:r>
+        <w:t>2.1 Intra-event Residual Correlation</w:t>
+      </w:r>
+    </w:p>
+    <w:p>
+      <w:r>
+        <w:rPr>
+          <w:b w:val="0"/>
+          <w:sz w:val="22"/>
+        </w:rPr>
+        <w:t>The total residual is decomposed into an inter-event term (η, common to all sites) and an intra-event term (ε, spatially correlated across sites). The correlation coefficient between intra-event residuals at two sites separated by distance h is:</w:t>
+      </w:r>
+    </w:p>
+    <w:p>
+      <w:pPr>
+        <w:jc w:val="center"/>
+      </w:pPr>
+      <m:oMath>
+        <m:sSub>
+          <m:e>
+            <m:r>
+              <m:t>ρ</m:t>
+            </m:r>
+          </m:e>
+          <m:sub>
+            <m:r>
+              <m:t>ij</m:t>
+            </m:r>
+          </m:sub>
+        </m:sSub>
+        <m:r>
+          <m:t>=</m:t>
+        </m:r>
+        <m:r>
+          <m:rPr>
+            <m:sty m:val="p"/>
+          </m:rPr>
+          <m:t>exp</m:t>
+        </m:r>
+        <m:d>
+          <m:dPr>
+            <m:sepChr m:val=""/>
+          </m:dPr>
+          <m:e>
+            <m:f>
+              <m:fPr>
+                <m:type m:val="bar"/>
+              </m:fPr>
+              <m:num>
+                <m:r>
+                  <m:t>−3h</m:t>
+                </m:r>
+              </m:num>
+              <m:den>
+                <m:r>
+                  <m:t>b</m:t>
+                </m:r>
+              </m:den>
+            </m:f>
+          </m:e>
+        </m:d>
+      </m:oMath>
+    </w:p>
+    <w:p>
+      <w:r>
+        <w:rPr>
+          <w:b w:val="0"/>
+          <w:sz w:val="22"/>
+        </w:rPr>
+        <w:t>For Sa(1.0s), the correlation range parameter b ≈ 40.7 km.</w:t>
+      </w:r>
+    </w:p>
+    <w:p>
+      <w:pPr>
+        <w:pStyle w:val="Heading3"/>
+      </w:pPr>
+      <w:r>
+        <w:t>2.2 Field Generation Algorithm</w:t>
+      </w:r>
+    </w:p>
+    <w:p>
+      <w:r>
+        <w:rPr>
+          <w:b w:val="0"/>
+          <w:sz w:val="22"/>
+        </w:rPr>
+        <w:t>1) Compute the correlation matrix Σ for all sites based on pairwise distances.</w:t>
+        <w:br/>
+        <w:t>2) Perform Cholesky Decomposition: Σ = L·Lᵀ.</w:t>
+        <w:br/>
+        <w:t>3) Generate a vector of independent standard normal random variables z.</w:t>
+        <w:br/>
+        <w:t>4) Compute correlated residuals:</w:t>
+      </w:r>
+    </w:p>
+    <w:p>
+      <w:pPr>
+        <w:jc w:val="center"/>
+      </w:pPr>
+      <m:oMath>
+        <m:sSub>
+          <m:e>
+            <m:r>
+              <m:rPr>
+                <m:sty m:val="bi"/>
+              </m:rPr>
+              <m:t>ε</m:t>
+            </m:r>
+          </m:e>
+          <m:sub>
+            <m:r>
+              <m:t>corr</m:t>
+            </m:r>
+          </m:sub>
+        </m:sSub>
+        <m:r>
+          <m:t>=𝐋·𝐳·σ</m:t>
+        </m:r>
+      </m:oMath>
+    </w:p>
+    <w:p>
+      <w:r>
+        <w:rPr>
+          <w:b w:val="0"/>
+          <w:sz w:val="22"/>
+        </w:rPr>
+        <w:t>5) Add the inter-event residual η·τ (constant for the event).</w:t>
+      </w:r>
+    </w:p>
+    <w:p>
+      <w:r>
+        <w:rPr>
+          <w:b w:val="0"/>
+          <w:sz w:val="22"/>
+        </w:rPr>
+        <w:t>6) The final simulated ground motion at site i is:</w:t>
+      </w:r>
+    </w:p>
+    <w:p>
+      <w:pPr>
+        <w:jc w:val="center"/>
+      </w:pPr>
+      <m:oMath>
+        <m:sSub>
+          <m:e>
+            <m:r>
+              <m:t>Y</m:t>
+            </m:r>
+          </m:e>
+          <m:sub>
+            <m:r>
+              <m:t>i</m:t>
+            </m:r>
+          </m:sub>
+        </m:sSub>
+        <m:r>
+          <m:t>=</m:t>
+        </m:r>
+        <m:r>
+          <m:rPr>
+            <m:sty m:val="p"/>
+          </m:rPr>
+          <m:t>exp</m:t>
+        </m:r>
+        <m:d>
+          <m:dPr>
+            <m:sepChr m:val="+"/>
+          </m:dPr>
+          <m:e>
+            <m:r>
+              <m:rPr>
+                <m:sty m:val="p"/>
+              </m:rPr>
+              <m:t>ln</m:t>
+            </m:r>
+            <m:sSub>
+              <m:e>
+                <m:r>
+                  <m:t>μ</m:t>
+                </m:r>
+              </m:e>
+              <m:sub>
+                <m:r>
+                  <m:t>i</m:t>
+                </m:r>
+              </m:sub>
+            </m:sSub>
+          </m:e>
+          <m:e>
+            <m:r>
+              <m:t>η</m:t>
+            </m:r>
+          </m:e>
+          <m:e>
+            <m:sSub>
+              <m:e>
+                <m:r>
+                  <m:t>ε</m:t>
+                </m:r>
+              </m:e>
+              <m:sub>
+                <m:r>
+                  <m:t>i</m:t>
+                </m:r>
+              </m:sub>
+            </m:sSub>
+          </m:e>
+        </m:d>
+      </m:oMath>
+    </w:p>
+    <w:p>
+      <w:pPr>
+        <w:pStyle w:val="Heading2"/>
+      </w:pPr>
+      <w:r>
+        <w:t>3. Implementation Details</w:t>
+      </w:r>
+    </w:p>
+    <w:p>
+      <w:pPr>
+        <w:pStyle w:val="ListBullet"/>
+      </w:pPr>
+      <w:r>
+        <w:t>Distance Metric: Great-circle distance (Haversine formula) is used to approximate R_JB.</w:t>
+      </w:r>
+    </w:p>
+    <w:p>
+      <w:pPr>
+        <w:pStyle w:val="ListBullet"/>
+      </w:pPr>
+      <w:r>
+        <w:t>Grid vs. Site: The simulation is performed directly at bridge locations (irregular grid), ensuring exact values for risk assessment.</w:t>
+      </w:r>
+    </w:p>
+    <w:p>
+      <w:r>
+        <w:t>Corrected Core Equations</w:t>
+      </w:r>
+    </w:p>
+    <w:p>
+      <w:r>
+        <w:t>GMPE (BA08): ln(Y) = F_M(M) + F_D(R_JB, M) + F_S(V_S30, R_JB, M) + epsilon * sigma_T</w:t>
+      </w:r>
+    </w:p>
+    <w:p>
+      <w:r>
+        <w:t>Distance term: F_D(R, M) = [c1 + c2(M - M_h)] * ln(R / R_ref) + c3(R - R_ref)</w:t>
+      </w:r>
+    </w:p>
+    <w:p>
+      <w:r>
+        <w:t>With: R = sqrt(R_JB^2 + h^2)</w:t>
+      </w:r>
+    </w:p>
+    <w:p>
+      <w:r>
+        <w:t>Fragility exceedance: P[DS &gt;= ds | Sa] = Phi((ln(Sa) - ln(theta_ds)) / beta_ds)</w:t>
+      </w:r>
+    </w:p>
+    <w:p>
+      <w:r>
+        <w:t>Loss expectation: E[Loss] = SUM_ds [P(DS=ds) * DR(ds) * Replacement_Cost]</w:t>
+      </w:r>
+    </w:p>
+    <w:p>
+      <w:r>
+        <w:t>Spatial correlation: rho_ij = exp(-3h / b)</w:t>
+      </w:r>
+    </w:p>
+    <w:p>
+      <w:r>
+        <w:t>Correlated field: epsilon_correlated = L * z * sigma</w:t>
       </w:r>
     </w:p>
     <w:sectPr>

</xml_diff>

<commit_message>
Add GMPE architecture explanation, prepared data inventory, and E2E flow
README: GMPE plugin architecture (3 files), prepared data table,
end-to-end automated pipeline (5 steps).
Docx: Sections 2.1/2.2 (GMPE arch + data), 9.1a/9.1b (BSSA21 + E2E).

Co-Authored-By: Claude Opus 4.6 <noreply@anthropic.com>
</commit_message>
<xml_diff>
--- a/CAT411_Technical_Documentation.docx
+++ b/CAT411_Technical_Documentation.docx
@@ -209,6 +209,150 @@
     </w:p>
     <w:p>
       <w:pPr>
+        <w:pStyle w:val="Heading2"/>
+      </w:pPr>
+      <w:r>
+        <w:t xml:space="preserve">2.1 GMPE Plugin Architecture</w:t>
+      </w:r>
+    </w:p>
+    <w:p>
+      <w:pPr>
+        <w:pStyle w:val="Normal"/>
+      </w:pPr>
+      <w:r>
+        <w:t xml:space="preserve">The GMPE (Ground Motion Prediction Equation) subsystem uses a Protocol + Registry pattern with 3 files:</w:t>
+      </w:r>
+    </w:p>
+    <w:p>
+      <w:pPr>
+        <w:pStyle w:val="Normal"/>
+      </w:pPr>
+      <w:r>
+        <w:t xml:space="preserve">src/gmpe_base.py -- Infrastructure layer. Defines the GMPEModel Protocol interface (.compute(Mw, R_JB, Vs30, fault_type, period) -&gt; (median_g, sigma_ln)), the GMPE_REGISTRY dictionary for model lookup, register_gmpe()/get_gmpe() helper functions, and IM_TYPE_TO_PERIOD mapping (PGA=0.0, SA03=0.3, SA10=1.0, SA30=3.0).</w:t>
+      </w:r>
+    </w:p>
+    <w:p>
+      <w:pPr>
+        <w:pStyle w:val="Normal"/>
+      </w:pPr>
+      <w:r>
+        <w:t xml:space="preserve">src/gmpe_bssa21.py -- BSSA14/21 NGA-West2 implementation. Contains the full 108-row coefficient table (PGV + PGA + 106 SA periods) from the official BSSA14 CSV (Dave Boore website), verified against OpenQuake hazardlib. The BSSA21 class implements source term F_E (mechanism-dependent), path term F_P (geometric spreading + anelastic attenuation), and site term F_S (linear + nonlinear amplification with PGA_rock self-reference). Auto-registers as 'bssa21' on import.</w:t>
+      </w:r>
+    </w:p>
+    <w:p>
+      <w:pPr>
+        <w:pStyle w:val="Normal"/>
+      </w:pPr>
+      <w:r>
+        <w:t xml:space="preserve">src/gmpe_ba08.py -- BA08 wrapper. Thin adapter around existing hazard.py BA08 functions, conforming to the GMPEModel Protocol. Supports PGA and Sa(1.0s) only. Auto-registers as 'ba08' on import.</w:t>
+      </w:r>
+    </w:p>
+    <w:p>
+      <w:pPr>
+        <w:pStyle w:val="Normal"/>
+      </w:pPr>
+      <w:r>
+        <w:t xml:space="preserve">Why 3 files? Separation of concerns. gmpe_base.py defines the contract; each model file implements it independently. Adding a new GMPE (e.g., Kale et al. 2015) requires only a new file implementing GMPEModel and calling register_gmpe().</w:t>
+      </w:r>
+    </w:p>
+    <w:p>
+      <w:pPr>
+        <w:pStyle w:val="Heading2"/>
+      </w:pPr>
+      <w:r>
+        <w:t xml:space="preserve">2.2 Prepared Data &amp; Embedded Parameters</w:t>
+      </w:r>
+    </w:p>
+    <w:p>
+      <w:pPr>
+        <w:pStyle w:val="Normal"/>
+      </w:pPr>
+      <w:r>
+        <w:t xml:space="preserve">The framework includes all necessary data and parameters. No external downloads are required for a standard analysis:</w:t>
+      </w:r>
+    </w:p>
+    <w:p>
+      <w:pPr>
+        <w:pStyle w:val="Normal"/>
+      </w:pPr>
+      <w:r>
+        <w:t xml:space="preserve">Bridge inventory: ~25,000 California bridges from FHWA NBI 2024 (data/CA24.txt).</w:t>
+      </w:r>
+    </w:p>
+    <w:p>
+      <w:pPr>
+        <w:pStyle w:val="Normal"/>
+      </w:pPr>
+      <w:r>
+        <w:t xml:space="preserve">Ground motion: USGS ShakeMap grid for 1994 Northridge earthquake (data/grid.xml).</w:t>
+      </w:r>
+    </w:p>
+    <w:p>
+      <w:pPr>
+        <w:pStyle w:val="Normal"/>
+      </w:pPr>
+      <w:r>
+        <w:t xml:space="preserve">Station data: ~400 seismic station recordings (data/stationlist.json).</w:t>
+      </w:r>
+    </w:p>
+    <w:p>
+      <w:pPr>
+        <w:pStyle w:val="Normal"/>
+      </w:pPr>
+      <w:r>
+        <w:t xml:space="preserve">Fragility parameters: 14 HWB classes x 4 damage states, median + beta=0.6, from Hazus 6.1 Table 7.9 (src/hazus_params.py).</w:t>
+      </w:r>
+    </w:p>
+    <w:p>
+      <w:pPr>
+        <w:pStyle w:val="Normal"/>
+      </w:pPr>
+      <w:r>
+        <w:t xml:space="preserve">GMPE coefficients: 108 periods x 36 coefficients for BSSA14/21 NGA-West2, from official Boore CSV (embedded in src/gmpe_bssa21.py).</w:t>
+      </w:r>
+    </w:p>
+    <w:p>
+      <w:pPr>
+        <w:pStyle w:val="Normal"/>
+      </w:pPr>
+      <w:r>
+        <w:t xml:space="preserve">BA08 coefficients: PGA + Sa(1.0s) regression coefficients from Boore &amp; Atkinson 2008 (src/hazard.py).</w:t>
+      </w:r>
+    </w:p>
+    <w:p>
+      <w:pPr>
+        <w:pStyle w:val="Normal"/>
+      </w:pPr>
+      <w:r>
+        <w:t xml:space="preserve">Damage ratios: 5 damage states mapped to repair cost percentages from Hazus Table 7.11 (src/loss.py).</w:t>
+      </w:r>
+    </w:p>
+    <w:p>
+      <w:pPr>
+        <w:pStyle w:val="Normal"/>
+      </w:pPr>
+      <w:r>
+        <w:t xml:space="preserve">HWB classification: NBI material/design to HWB class decision tree from Hazus Table 7.3 (src/bridge_classes.py).</w:t>
+      </w:r>
+    </w:p>
+    <w:p>
+      <w:pPr>
+        <w:pStyle w:val="Normal"/>
+      </w:pPr>
+      <w:r>
+        <w:t xml:space="preserve">Spatial correlation: Jayaram-Baker 2009 range parameter (40.7 km for Sa(1.0s)) for correlated ground motion field generation (src/hazard.py).</w:t>
+      </w:r>
+    </w:p>
+    <w:p>
+      <w:pPr>
+        <w:pStyle w:val="Normal"/>
+      </w:pPr>
+      <w:r>
+        <w:t xml:space="preserve">Pre-classified output: Bridge inventory already classified for Northridge region (data/nbi_classified.csv, 2,953 bridges).</w:t>
+      </w:r>
+    </w:p>
+    <w:p>
+      <w:pPr>
         <w:pStyle w:val="Heading1"/>
       </w:pPr>
       <w:r>
@@ -390,7 +534,9 @@
     </w:p>
     <w:p>
       <w:r>
-        <w:t>im_source: Choose between 'shakemap' (USGS grid) or 'gmpe' (BA08 calculation).</w:t>
+        <w:t>im_source: Choose between 'shakemap' (USGS grid) or 'gmpe' (forward prediction).</w:t>
+        <w:br/>
+        <w:t>gmpe_model: Select GMPE model -- 'ba08' (PGA + SA10 only) or 'bssa21' (NGA-West2, 108 periods).</w:t>
         <w:br/>
         <w:t>im_type: Select intensity measure — PGA, SA03, SA10 (default), or SA30.</w:t>
       </w:r>
@@ -705,6 +851,54 @@
     <w:p>
       <w:r>
         <w:t>Ground motion prediction: BA08 GMPE, Jayaram-Baker spatial correlation, Cholesky ground motion field generation.</w:t>
+      </w:r>
+    </w:p>
+    <w:p>
+      <w:pPr>
+        <w:pStyle w:val="Heading2"/>
+      </w:pPr>
+      <w:r>
+        <w:t xml:space="preserve">7.3a src/gmpe_base.py</w:t>
+      </w:r>
+    </w:p>
+    <w:p>
+      <w:pPr>
+        <w:pStyle w:val="Normal"/>
+      </w:pPr>
+      <w:r>
+        <w:t xml:space="preserve">GMPE plugin architecture: GMPEModel Protocol class, GMPE_REGISTRY dict for model lookup, register_gmpe()/get_gmpe() helpers, and IM_TYPE_TO_PERIOD mapping (PGA=0.0, SA03=0.3, SA10=1.0, SA30=3.0). All GMPE models auto-register at import time.</w:t>
+      </w:r>
+    </w:p>
+    <w:p>
+      <w:pPr>
+        <w:pStyle w:val="Heading2"/>
+      </w:pPr>
+      <w:r>
+        <w:t xml:space="preserve">7.3b src/gmpe_bssa21.py</w:t>
+      </w:r>
+    </w:p>
+    <w:p>
+      <w:pPr>
+        <w:pStyle w:val="Normal"/>
+      </w:pPr>
+      <w:r>
+        <w:t xml:space="preserve">BSSA14/21 NGA-West2 GMPE with 108-row coefficient table (PGV + PGA + 106 SA periods). Computes median Sa(g) and sigma_ln from Mw, R_JB, Vs30, fault_type, and spectral period. Implements source term (F_E with mechanism dummies), path term (F_P with geometric spreading + anelastic attenuation), linear + nonlinear site amplification (F_S with PGA_rock self-reference), and magnitude-dependent aleatory variability. Coefficients from official BSSA14 CSV (Dave Boore website), verified against OpenQuake hazardlib.</w:t>
+      </w:r>
+    </w:p>
+    <w:p>
+      <w:pPr>
+        <w:pStyle w:val="Heading2"/>
+      </w:pPr>
+      <w:r>
+        <w:t xml:space="preserve">7.3c src/gmpe_ba08.py</w:t>
+      </w:r>
+    </w:p>
+    <w:p>
+      <w:pPr>
+        <w:pStyle w:val="Normal"/>
+      </w:pPr>
+      <w:r>
+        <w:t xml:space="preserve">Thin wrapper around hazard.py BA08 functions, implementing the GMPEModel Protocol. Supports PGA and Sa(1.0s) only. Auto-registered in GMPE_REGISTRY at import.</w:t>
       </w:r>
     </w:p>
     <w:p>
@@ -1210,6 +1404,134 @@
         <w:br/>
         <w:br/>
         <w:t>Aleatory: τ = 0.255 (inter-event), σ = 0.502 (intra-event), σ_T = 0.564 (total)</w:t>
+      </w:r>
+    </w:p>
+    <w:p>
+      <w:pPr>
+        <w:pStyle w:val="Heading2"/>
+      </w:pPr>
+      <w:r>
+        <w:t xml:space="preserve">9.1a BSSA14/21 GMPE (NGA-West2)</w:t>
+      </w:r>
+    </w:p>
+    <w:p>
+      <w:pPr>
+        <w:pStyle w:val="Normal"/>
+      </w:pPr>
+      <w:r>
+        <w:t xml:space="preserve">The BSSA14/21 model (Boore, Stewart, Seyhan &amp; Atkinson 2014) is the NGA-West2 successor to BA08, supporting 108 spectral periods (PGV, PGA, 0.01-10s SA):</w:t>
+      </w:r>
+    </w:p>
+    <w:p>
+      <w:pPr>
+        <w:pStyle w:val="Normal"/>
+      </w:pPr>
+      <w:r>
+        <w:t xml:space="preserve">ln(Y) = F_E(M, mechanism) + F_P(R_JB, M) + F_S(Vs30, PGA_r)</w:t>
+      </w:r>
+    </w:p>
+    <w:p>
+      <w:pPr>
+        <w:pStyle w:val="Normal"/>
+      </w:pPr>
+      <w:r>
+        <w:t xml:space="preserve">F_E (Source): Mechanism-dependent with dummy variables (U/SS/NS/RS), piecewise quadratic below hinge magnitude M_h(T), linear above.</w:t>
+      </w:r>
+    </w:p>
+    <w:p>
+      <w:pPr>
+        <w:pStyle w:val="Normal"/>
+      </w:pPr>
+      <w:r>
+        <w:t xml:space="preserve">F_P (Path): [c1 + c2*(M-Mref)] * ln(R/Rref) + (c3+Dc3)*(R-Rref), where R = sqrt(Rjb^2 + h^2) with pseudo-depth h.</w:t>
+      </w:r>
+    </w:p>
+    <w:p>
+      <w:pPr>
+        <w:pStyle w:val="Normal"/>
+      </w:pPr>
+      <w:r>
+        <w:t xml:space="preserve">F_S (Site): Linear term c_lin*ln(min(Vs30,Vref)/Vref) + nonlinear term f4*[exp(f5*(min(Vs30,760)-360)) - exp(f5*(760-360))]*ln((PGA_r+f3)/f3). The nonlinear term is driven by rock-reference PGA computed with F_S=0 (self-referencing).</w:t>
+      </w:r>
+    </w:p>
+    <w:p>
+      <w:pPr>
+        <w:pStyle w:val="Normal"/>
+      </w:pPr>
+      <w:r>
+        <w:t xml:space="preserve">Aleatory variability: sigma = sqrt(phi^2 + tau^2), where tau is magnitude-dependent (interpolated linearly between M=4.5 and M=5.5).</w:t>
+      </w:r>
+    </w:p>
+    <w:p>
+      <w:pPr>
+        <w:pStyle w:val="Normal"/>
+      </w:pPr>
+      <w:r>
+        <w:t xml:space="preserve">Implementation note: Epicentral distance (haversine) is used as proxy for R_JB. This is exact for point sources and conservative for finite faults at short distances.</w:t>
+      </w:r>
+    </w:p>
+    <w:p>
+      <w:pPr>
+        <w:pStyle w:val="Heading2"/>
+      </w:pPr>
+      <w:r>
+        <w:t xml:space="preserve">9.1b End-to-End Automated Pipeline</w:t>
+      </w:r>
+    </w:p>
+    <w:p>
+      <w:pPr>
+        <w:pStyle w:val="Normal"/>
+      </w:pPr>
+      <w:r>
+        <w:t xml:space="preserve">The framework automates the entire chain from raw NBI data to loss estimates. Users only configure config.yaml; all parameter lookups are automatic:</w:t>
+      </w:r>
+    </w:p>
+    <w:p>
+      <w:pPr>
+        <w:pStyle w:val="Normal"/>
+      </w:pPr>
+      <w:r>
+        <w:t xml:space="preserve">Step 1 -- FILTER: NBI raw data (~25,000 bridges) is filtered by region, county, material, year_built, etc. (config bridge_selection section).</w:t>
+      </w:r>
+    </w:p>
+    <w:p>
+      <w:pPr>
+        <w:pStyle w:val="Normal"/>
+      </w:pPr>
+      <w:r>
+        <w:t xml:space="preserve">Step 2 -- CLASSIFY: classify_nbi_to_hazus() assigns an HWB class to each bridge based on NBI structural attributes (material, design type, span count, length, year_built).</w:t>
+      </w:r>
+    </w:p>
+    <w:p>
+      <w:pPr>
+        <w:pStyle w:val="Normal"/>
+      </w:pPr>
+      <w:r>
+        <w:t xml:space="preserve">Step 3 -- COMPUTE IM: For each bridge, ground motion intensity is computed. ShakeMap path: interpolate grid.xml at bridge lat/lon. GMPE path: compute haversine distance to epicenter, then call gmpe.compute(Mw, R_JB, Vs30, fault_type, period).</w:t>
+      </w:r>
+    </w:p>
+    <w:p>
+      <w:pPr>
+        <w:pStyle w:val="Normal"/>
+      </w:pPr>
+      <w:r>
+        <w:t xml:space="preserve">Step 4 -- FRAGILITY: For each bridge, the HWB class automatically retrieves median and beta parameters from Hazus Table 7.9 (stored in hazus_params.py). Damage state exceedance probabilities are computed via lognormal CDF, then converted to discrete probabilities P(none), P(slight), ..., P(complete).</w:t>
+      </w:r>
+    </w:p>
+    <w:p>
+      <w:pPr>
+        <w:pStyle w:val="Normal"/>
+      </w:pPr>
+      <w:r>
+        <w:t xml:space="preserve">Step 5 -- LOSS: Expected loss per bridge = Sum of P(DS=ds) * DamageRatio(ds) * ReplacementCost. Results are aggregated to portfolio level for EP curve and AAL computation.</w:t>
+      </w:r>
+    </w:p>
+    <w:p>
+      <w:pPr>
+        <w:pStyle w:val="Normal"/>
+      </w:pPr>
+      <w:r>
+        <w:t xml:space="preserve">No manual parameter lookup is needed. The framework reads each bridge's HWB class and retrieves the corresponding fragility parameters automatically.</w:t>
       </w:r>
     </w:p>
     <w:p>
@@ -1734,6 +2056,14 @@
       </w:r>
     </w:p>
     <w:p>
+      <w:pPr>
+        <w:pStyle w:val="Normal"/>
+      </w:pPr>
+      <w:r>
+        <w:t xml:space="preserve">[2a] Boore, D.M., Stewart, J.P., Seyhan, E. &amp; Atkinson, G.M. (2014). NGA-West2 Equations for Predicting PGA, PGV, and 5%-Damped PSA for Shallow Crustal Earthquakes. Earthquake Spectra, 30(3), 1057-1085. https://doi.org/10.1193/070113EQS184M</w:t>
+      </w:r>
+    </w:p>
+    <w:p>
       <w:r>
         <w:t>[3] Jayaram, N. &amp; Baker, J.W. (2009). Correlation model for spatially distributed ground-motion intensities. Earthquake Engineering &amp; Structural Dynamics, 38(15), 1687-1708.</w:t>
       </w:r>

</xml_diff>

<commit_message>
Remove BA08 wrapper, keep only BSSA21 GMPE
Delete src/gmpe_ba08.py and all BA08 references from main.py,
config.py, tests, README, and docx. Default gmpe_model is now bssa21.
29 tests passing.

Co-Authored-By: Claude Opus 4.6 <noreply@anthropic.com>
</commit_message>
<xml_diff>
--- a/CAT411_Technical_Documentation.docx
+++ b/CAT411_Technical_Documentation.docx
@@ -316,14 +316,6 @@
         <w:pStyle w:val="Normal"/>
       </w:pPr>
       <w:r>
-        <w:t xml:space="preserve">BA08 coefficients: PGA + Sa(1.0s) regression coefficients from Boore &amp; Atkinson 2008 (src/hazard.py).</w:t>
-      </w:r>
-    </w:p>
-    <w:p>
-      <w:pPr>
-        <w:pStyle w:val="Normal"/>
-      </w:pPr>
-      <w:r>
         <w:t xml:space="preserve">Damage ratios: 5 damage states mapped to repair cost percentages from Hazus Table 7.11 (src/loss.py).</w:t>
       </w:r>
     </w:p>
@@ -536,7 +528,7 @@
       <w:r>
         <w:t>im_source: Choose between 'shakemap' (USGS grid) or 'gmpe' (forward prediction).</w:t>
         <w:br/>
-        <w:t>gmpe_model: Select GMPE model -- 'ba08' (PGA + SA10 only) or 'bssa21' (NGA-West2, 108 periods).</w:t>
+        <w:t>gmpe_model: Select GMPE model -- 'bssa21' (BSSA14/21 NGA-West2, 108 periods).</w:t>
         <w:br/>
         <w:t>im_type: Select intensity measure — PGA, SA03, SA10 (default), or SA30.</w:t>
       </w:r>
@@ -883,22 +875,6 @@
       </w:pPr>
       <w:r>
         <w:t xml:space="preserve">BSSA14/21 NGA-West2 GMPE with 108-row coefficient table (PGV + PGA + 106 SA periods). Computes median Sa(g) and sigma_ln from Mw, R_JB, Vs30, fault_type, and spectral period. Implements source term (F_E with mechanism dummies), path term (F_P with geometric spreading + anelastic attenuation), linear + nonlinear site amplification (F_S with PGA_rock self-reference), and magnitude-dependent aleatory variability. Coefficients from official BSSA14 CSV (Dave Boore website), verified against OpenQuake hazardlib.</w:t>
-      </w:r>
-    </w:p>
-    <w:p>
-      <w:pPr>
-        <w:pStyle w:val="Heading2"/>
-      </w:pPr>
-      <w:r>
-        <w:t xml:space="preserve">7.3c src/gmpe_ba08.py</w:t>
-      </w:r>
-    </w:p>
-    <w:p>
-      <w:pPr>
-        <w:pStyle w:val="Normal"/>
-      </w:pPr>
-      <w:r>
-        <w:t xml:space="preserve">Thin wrapper around hazard.py BA08 functions, implementing the GMPEModel Protocol. Supports PGA and Sa(1.0s) only. Auto-registered in GMPE_REGISTRY at import.</w:t>
       </w:r>
     </w:p>
     <w:p>

</xml_diff>

<commit_message>
Integrate Vs30 spatial data into GMPE pipeline, update documentation
- main.py: Auto-enrich bridges with USGS Vs30 before GMPE computation
- Graceful fallback to config default if spatial data unavailable
- Technical docs: update 14→28 HWB classes, add Vs30 module reference,
  add Heath et al. 2020 to bibliography

Co-Authored-By: Claude Opus 4.6 <noreply@anthropic.com>
</commit_message>
<xml_diff>
--- a/CAT411_Technical_Documentation.docx
+++ b/CAT411_Technical_Documentation.docx
@@ -156,7 +156,13 @@
     </w:p>
     <w:p>
       <w:r>
-        <w:t>• Bridge classification according to Hazus HWB taxonomy (14 classes)</w:t>
+        <w:t>• Bridge classification according to Hazus HWB taxonomy (28 classes)</w:t>
+      </w:r>
+    </w:p>
+    <w:p>
+      <w:pPr/>
+      <w:r>
+        <w:t>• Site-specific Vs30 from USGS spatial grid (Heath et al. 2020) for realistic site amplification</w:t>
       </w:r>
     </w:p>
     <w:p>
@@ -300,7 +306,7 @@
         <w:pStyle w:val="Normal"/>
       </w:pPr>
       <w:r>
-        <w:t xml:space="preserve">Fragility parameters: 14 HWB classes x 4 damage states, median + beta=0.6, from Hazus 6.1 Table 7.9 (src/hazus_params.py).</w:t>
+        <w:t>Fragility parameters: 28 HWB classes x 4 damage states, median + beta=0.6, from Hazus 6.1 Table 7.9 (src/hazus_params.py).</w:t>
       </w:r>
     </w:p>
     <w:p>
@@ -325,6 +331,12 @@
       </w:pPr>
       <w:r>
         <w:t xml:space="preserve">HWB classification: NBI material/design to HWB class decision tree from Hazus Table 7.3 (src/bridge_classes.py).</w:t>
+      </w:r>
+    </w:p>
+    <w:p>
+      <w:pPr/>
+      <w:r>
+        <w:t>Vs30 site data: USGS Global Hybrid Vs30 grid (Heath et al. 2020), 30 arc-second resolution. California region cached as compressed NPZ (data/vs30/california_vs30.npz, 1260×1380 grid). Provides per-bridge site-specific Vs30 for GMPE site amplification.</w:t>
       </w:r>
     </w:p>
     <w:p>
@@ -991,7 +1003,7 @@
     </w:p>
     <w:p>
       <w:r>
-        <w:t>Static parameters: Hazus Table 7.9 (fragility) and Table 7.11 (damage ratios) for 14 HWB classes.</w:t>
+        <w:t>Static parameters: Hazus Table 7.9 (fragility) and Table 7.11 (damage ratios) for 28 HWB classes.</w:t>
       </w:r>
     </w:p>
     <w:p>
@@ -1016,8 +1028,21 @@
       </w:r>
     </w:p>
     <w:p>
+      <w:pPr>
+        <w:pStyle w:val="Heading2"/>
+      </w:pPr>
+      <w:r>
+        <w:t>7.15 src/vs30_provider.py</w:t>
+      </w:r>
+    </w:p>
+    <w:p>
       <w:r>
         <w:t>1994 Northridge observed damage statistics for validation.</w:t>
+      </w:r>
+    </w:p>
+    <w:p>
+      <w:r>
+        <w:t>Vs30 spatial data provider using USGS Global Hybrid Vs30 Map (Heath et al. 2020). Downloads global grid (~600 MB), extracts California region, and caches as compressed NPZ for fast loading. Provides get_vs30(lat, lon) for single points, get_vs30_array() for batch lookups, NEHRP site classification, and enrich_bridges_with_vs30() to add per-bridge Vs30 to NBI DataFrames. Integrated into main.py GMPE pipeline for automatic site-specific ground motion computation. Falls back to config default (760 m/s rock) if spatial data unavailable.</w:t>
       </w:r>
     </w:p>
     <w:p>
@@ -2065,6 +2090,12 @@
       </w:r>
     </w:p>
     <w:p>
+      <w:pPr/>
+      <w:r>
+        <w:t>[9] Heath, D.C., Wald, D.J., Worden, C.B., Thompson, E.M., &amp; Smoczyk, G.M. (2020). A Global Hybrid Vs30 Map with a Topographic-Slope-Based Default and Regional Map Insets. U.S. Geological Survey data release. https://doi.org/10.5066/P96HBHX5</w:t>
+      </w:r>
+    </w:p>
+    <w:p>
       <w:r>
         <w:t>[8] Worden, C.B., et al. (2018). Spatial and spectral interpolation of ground-motion intensity measure observations. BSSA, 108(2), 866-875.</w:t>
       </w:r>

</xml_diff>

<commit_message>
Add Section 9.5 (MLE Calibration) to Technical Documentation
New sections in CAT411_Technical_Documentation.docx:
- 7.16 src/calibration.py module reference
- 9.5 Fragility Calibration (MLE) with subsections:
  9.5.1 Calibration Parameters (k and beta definitions)
  9.5.2 Ground Truth: Basoz & Kiremidjian (1998) damage counts
  9.5.3 Likelihood Function (multinomial NLL formulation)
  9.5.4 Results (k=1.84, beta=0.26, with tables)
  9.5.5 Interpretation
  9.5.6 Known Limitations
  9.5.7 Usage instructions

Co-Authored-By: Claude Opus 4.6 (1M context) <noreply@anthropic.com>
</commit_message>
<xml_diff>
--- a/CAT411_Technical_Documentation.docx
+++ b/CAT411_Technical_Documentation.docx
@@ -1047,6 +1047,59 @@
     </w:p>
     <w:p>
       <w:pPr>
+        <w:pStyle w:val="Heading2"/>
+      </w:pPr>
+      <w:r>
+        <w:t>7.16 src/calibration.py</w:t>
+      </w:r>
+    </w:p>
+    <w:p>
+      <w:r>
+        <w:t>MLE fragility calibration module. Calibrates global median scale factor k and dispersion beta against observed damage distributions.</w:t>
+      </w:r>
+    </w:p>
+    <w:p>
+      <w:r>
+        <w:t>Key functions:</w:t>
+      </w:r>
+    </w:p>
+    <w:p>
+      <w:r>
+        <w:t xml:space="preserve">  - calibrate_global(bridges_df, obs_counts) -&gt; CalibrationResult</w:t>
+      </w:r>
+    </w:p>
+    <w:p>
+      <w:r>
+        <w:t xml:space="preserve">  - neg_log_likelihood(params, sa_arr, hwb_arr, obs_counts) -&gt; float</w:t>
+      </w:r>
+    </w:p>
+    <w:p>
+      <w:r>
+        <w:t xml:space="preserve">  - profile_likelihood_ci(...) -&gt; (lo, hi)</w:t>
+      </w:r>
+    </w:p>
+    <w:p>
+      <w:r>
+        <w:t xml:space="preserve">  - predicted_distribution(sa_arr, hwb_arr, k, beta) -&gt; np.ndarray</w:t>
+      </w:r>
+    </w:p>
+    <w:p>
+      <w:r>
+        <w:t xml:space="preserve">  - plot_before_after / plot_likelihood_profile / plot_fragility_comparison</w:t>
+      </w:r>
+    </w:p>
+    <w:p>
+      <w:r>
+        <w:t xml:space="preserve">  - generate_config_snippet(result) -&gt; str</w:t>
+      </w:r>
+    </w:p>
+    <w:p>
+      <w:r>
+        <w:t xml:space="preserve">  - save_results(result, output_dir)</w:t>
+      </w:r>
+    </w:p>
+    <w:p>
+      <w:pPr>
         <w:pStyle w:val="Heading1"/>
       </w:pPr>
       <w:r>
@@ -1586,6 +1639,961 @@
         <w:br/>
         <w:br/>
         <w:t>Damage ratios: None=0%, Slight=3%, Moderate=8%, Extensive=25%, Complete=100%</w:t>
+      </w:r>
+    </w:p>
+    <w:p>
+      <w:pPr>
+        <w:pStyle w:val="Heading2"/>
+      </w:pPr>
+      <w:r>
+        <w:t>9.5 Fragility Calibration (MLE)</w:t>
+      </w:r>
+    </w:p>
+    <w:p>
+      <w:r>
+        <w:t>The default Hazus 6.1 fragility parameters systematically over-predict bridge damage for the 1994 Northridge earthquake: the predicted damage fraction is 27.2% versus the observed 10.6% (Basoz &amp; Kiremidjian 1998). This section describes the Maximum Likelihood Estimation (MLE) calibration method implemented in src/calibration.py to correct this bias.</w:t>
+      </w:r>
+    </w:p>
+    <w:p>
+      <w:pPr>
+        <w:pStyle w:val="Heading3"/>
+      </w:pPr>
+      <w:r>
+        <w:t>9.5.1 Calibration Parameters</w:t>
+      </w:r>
+    </w:p>
+    <w:p>
+      <w:r>
+        <w:t>Two global parameters are calibrated simultaneously:</w:t>
+      </w:r>
+    </w:p>
+    <w:p>
+      <w:r>
+        <w:t>k (median scale factor): Multiplies all Hazus median capacities by a constant factor. k &gt; 1 shifts all fragility curves to the right, meaning higher ground motion is required to trigger each damage state. This preserves the relative vulnerability ordering across bridge classes. Physically, k &gt; 1 indicates that the Northridge bridge inventory is more resilient than the national-average assumptions in Hazus, likely due to California's post-1971 seismic retrofit program.</w:t>
+      </w:r>
+    </w:p>
+    <w:p>
+      <w:r>
+        <w:t>beta (dispersion): Replaces the uniform Hazus dispersion of 0.6 for all damage states and bridge classes. A smaller beta produces steeper fragility curves with sharper transitions between undamaged and damaged states.</w:t>
+      </w:r>
+    </w:p>
+    <w:p>
+      <w:r>
+        <w:t>The calibrated fragility curve for damage state ds and bridge class c is:</w:t>
+      </w:r>
+    </w:p>
+    <w:p>
+      <w:r>
+        <w:t xml:space="preserve">    P[DS &gt;= ds | Sa] = Phi( (ln(Sa) - ln(k * theta_ds_c)) / beta )</w:t>
+      </w:r>
+    </w:p>
+    <w:p>
+      <w:r>
+        <w:t>where theta_ds_c is the original Hazus median for damage state ds and class c, and Phi is the standard normal CDF.</w:t>
+      </w:r>
+    </w:p>
+    <w:p>
+      <w:pPr>
+        <w:pStyle w:val="Heading3"/>
+      </w:pPr>
+      <w:r>
+        <w:t>9.5.2 Ground Truth: Basoz &amp; Kiremidjian (1998)</w:t>
+      </w:r>
+    </w:p>
+    <w:p>
+      <w:r>
+        <w:t>The calibration target is the aggregate damage distribution from Basoz &amp; Kiremidjian (1998), who surveyed 1,600 bridges in the Northridge earthquake area and classified their post-earthquake condition into five damage states:</w:t>
+      </w:r>
+    </w:p>
+    <w:tbl>
+      <w:tblPr>
+        <w:tblStyle w:val="TableGrid"/>
+        <w:tblW w:type="auto" w:w="0"/>
+        <w:tblLook w:firstColumn="1" w:firstRow="1" w:lastColumn="0" w:lastRow="0" w:noHBand="0" w:noVBand="1" w:val="04A0"/>
+      </w:tblPr>
+      <w:tblGrid>
+        <w:gridCol w:w="2880"/>
+        <w:gridCol w:w="2880"/>
+        <w:gridCol w:w="2880"/>
+      </w:tblGrid>
+      <w:tr>
+        <w:tc>
+          <w:tcPr>
+            <w:tcW w:type="dxa" w:w="2880"/>
+          </w:tcPr>
+          <w:p>
+            <w:r>
+              <w:rPr>
+                <w:b/>
+              </w:rPr>
+              <w:t>Damage State</w:t>
+            </w:r>
+          </w:p>
+        </w:tc>
+        <w:tc>
+          <w:tcPr>
+            <w:tcW w:type="dxa" w:w="2880"/>
+          </w:tcPr>
+          <w:p>
+            <w:r>
+              <w:rPr>
+                <w:b/>
+              </w:rPr>
+              <w:t>Count</w:t>
+            </w:r>
+          </w:p>
+        </w:tc>
+        <w:tc>
+          <w:tcPr>
+            <w:tcW w:type="dxa" w:w="2880"/>
+          </w:tcPr>
+          <w:p>
+            <w:r>
+              <w:rPr>
+                <w:b/>
+              </w:rPr>
+              <w:t>Fraction</w:t>
+            </w:r>
+          </w:p>
+        </w:tc>
+      </w:tr>
+      <w:tr>
+        <w:tc>
+          <w:tcPr>
+            <w:tcW w:type="dxa" w:w="2880"/>
+          </w:tcPr>
+          <w:p>
+            <w:r>
+              <w:t>None</w:t>
+            </w:r>
+          </w:p>
+        </w:tc>
+        <w:tc>
+          <w:tcPr>
+            <w:tcW w:type="dxa" w:w="2880"/>
+          </w:tcPr>
+          <w:p>
+            <w:r>
+              <w:t>1,430</w:t>
+            </w:r>
+          </w:p>
+        </w:tc>
+        <w:tc>
+          <w:tcPr>
+            <w:tcW w:type="dxa" w:w="2880"/>
+          </w:tcPr>
+          <w:p>
+            <w:r>
+              <w:t>89.4%</w:t>
+            </w:r>
+          </w:p>
+        </w:tc>
+      </w:tr>
+      <w:tr>
+        <w:tc>
+          <w:tcPr>
+            <w:tcW w:type="dxa" w:w="2880"/>
+          </w:tcPr>
+          <w:p>
+            <w:r>
+              <w:t>Slight</w:t>
+            </w:r>
+          </w:p>
+        </w:tc>
+        <w:tc>
+          <w:tcPr>
+            <w:tcW w:type="dxa" w:w="2880"/>
+          </w:tcPr>
+          <w:p>
+            <w:r>
+              <w:t>98</w:t>
+            </w:r>
+          </w:p>
+        </w:tc>
+        <w:tc>
+          <w:tcPr>
+            <w:tcW w:type="dxa" w:w="2880"/>
+          </w:tcPr>
+          <w:p>
+            <w:r>
+              <w:t>6.1%</w:t>
+            </w:r>
+          </w:p>
+        </w:tc>
+      </w:tr>
+      <w:tr>
+        <w:tc>
+          <w:tcPr>
+            <w:tcW w:type="dxa" w:w="2880"/>
+          </w:tcPr>
+          <w:p>
+            <w:r>
+              <w:t>Moderate</w:t>
+            </w:r>
+          </w:p>
+        </w:tc>
+        <w:tc>
+          <w:tcPr>
+            <w:tcW w:type="dxa" w:w="2880"/>
+          </w:tcPr>
+          <w:p>
+            <w:r>
+              <w:t>44</w:t>
+            </w:r>
+          </w:p>
+        </w:tc>
+        <w:tc>
+          <w:tcPr>
+            <w:tcW w:type="dxa" w:w="2880"/>
+          </w:tcPr>
+          <w:p>
+            <w:r>
+              <w:t>2.8%</w:t>
+            </w:r>
+          </w:p>
+        </w:tc>
+      </w:tr>
+      <w:tr>
+        <w:tc>
+          <w:tcPr>
+            <w:tcW w:type="dxa" w:w="2880"/>
+          </w:tcPr>
+          <w:p>
+            <w:r>
+              <w:t>Extensive</w:t>
+            </w:r>
+          </w:p>
+        </w:tc>
+        <w:tc>
+          <w:tcPr>
+            <w:tcW w:type="dxa" w:w="2880"/>
+          </w:tcPr>
+          <w:p>
+            <w:r>
+              <w:t>21</w:t>
+            </w:r>
+          </w:p>
+        </w:tc>
+        <w:tc>
+          <w:tcPr>
+            <w:tcW w:type="dxa" w:w="2880"/>
+          </w:tcPr>
+          <w:p>
+            <w:r>
+              <w:t>1.3%</w:t>
+            </w:r>
+          </w:p>
+        </w:tc>
+      </w:tr>
+      <w:tr>
+        <w:tc>
+          <w:tcPr>
+            <w:tcW w:type="dxa" w:w="2880"/>
+          </w:tcPr>
+          <w:p>
+            <w:r>
+              <w:t>Complete</w:t>
+            </w:r>
+          </w:p>
+        </w:tc>
+        <w:tc>
+          <w:tcPr>
+            <w:tcW w:type="dxa" w:w="2880"/>
+          </w:tcPr>
+          <w:p>
+            <w:r>
+              <w:t>7</w:t>
+            </w:r>
+          </w:p>
+        </w:tc>
+        <w:tc>
+          <w:tcPr>
+            <w:tcW w:type="dxa" w:w="2880"/>
+          </w:tcPr>
+          <w:p>
+            <w:r>
+              <w:t>0.4%</w:t>
+            </w:r>
+          </w:p>
+        </w:tc>
+      </w:tr>
+      <w:tr>
+        <w:tc>
+          <w:tcPr>
+            <w:tcW w:type="dxa" w:w="2880"/>
+          </w:tcPr>
+          <w:p>
+            <w:r>
+              <w:t>Total</w:t>
+            </w:r>
+          </w:p>
+        </w:tc>
+        <w:tc>
+          <w:tcPr>
+            <w:tcW w:type="dxa" w:w="2880"/>
+          </w:tcPr>
+          <w:p>
+            <w:r>
+              <w:t>1,600</w:t>
+            </w:r>
+          </w:p>
+        </w:tc>
+        <w:tc>
+          <w:tcPr>
+            <w:tcW w:type="dxa" w:w="2880"/>
+          </w:tcPr>
+          <w:p>
+            <w:r>
+              <w:t>100.0%</w:t>
+            </w:r>
+          </w:p>
+        </w:tc>
+      </w:tr>
+    </w:tbl>
+    <w:p/>
+    <w:p>
+      <w:r>
+        <w:t>Reference: Basoz, N. &amp; Kiremidjian, A. (1998). Evaluation of Bridge Damage Data from the Loma Prieta and Northridge, California Earthquakes. MCEER-98-0004. These counts are stored in src/northridge_case.py as NORTHRIDGE_DAMAGE_STATS.</w:t>
+      </w:r>
+    </w:p>
+    <w:p>
+      <w:pPr>
+        <w:pStyle w:val="Heading3"/>
+      </w:pPr>
+      <w:r>
+        <w:t>9.5.3 Likelihood Function</w:t>
+      </w:r>
+    </w:p>
+    <w:p>
+      <w:r>
+        <w:t>For a given (k, beta), the predicted damage distribution is computed by averaging the fragility-derived damage probabilities across 2,008 bridges in the Northridge study area (from data/northridge_observed.csv), each with its own site-specific Sa(1.0s) from ShakeMap and HWB classification:</w:t>
+      </w:r>
+    </w:p>
+    <w:p>
+      <w:r>
+        <w:t xml:space="preserve">    p_j(k, beta) = (1/N) * SUM_i P(DS=j | Sa_i, HWB_i, k, beta)</w:t>
+      </w:r>
+    </w:p>
+    <w:p>
+      <w:r>
+        <w:t>where N = 2,008, Sa_i is the ShakeMap-interpolated spectral acceleration, and HWB_i is the Hazus bridge class for bridge i.</w:t>
+      </w:r>
+    </w:p>
+    <w:p>
+      <w:r>
+        <w:t>The multinomial log-likelihood is:</w:t>
+      </w:r>
+    </w:p>
+    <w:p>
+      <w:r>
+        <w:t xml:space="preserve">    LL(k, beta) = SUM_j n_j * ln(p_j(k, beta))</w:t>
+      </w:r>
+    </w:p>
+    <w:p>
+      <w:r>
+        <w:t>where n_j are the Basoz observed counts. The negative log-likelihood NLL = -LL is minimized using L-BFGS-B (scipy.optimize.minimize) with bounds k in [0.5, 5.0] and beta in [0.2, 1.5], starting from (k=1.5, beta=0.6).</w:t>
+      </w:r>
+    </w:p>
+    <w:p>
+      <w:pPr>
+        <w:pStyle w:val="Heading3"/>
+      </w:pPr>
+      <w:r>
+        <w:t>9.5.4 Results</w:t>
+      </w:r>
+    </w:p>
+    <w:p>
+      <w:r>
+        <w:t>The MLE optimization converges to:</w:t>
+      </w:r>
+    </w:p>
+    <w:tbl>
+      <w:tblPr>
+        <w:tblStyle w:val="TableGrid"/>
+        <w:tblW w:type="auto" w:w="0"/>
+        <w:tblLook w:firstColumn="1" w:firstRow="1" w:lastColumn="0" w:lastRow="0" w:noHBand="0" w:noVBand="1" w:val="04A0"/>
+      </w:tblPr>
+      <w:tblGrid>
+        <w:gridCol w:w="2880"/>
+        <w:gridCol w:w="2880"/>
+        <w:gridCol w:w="2880"/>
+      </w:tblGrid>
+      <w:tr>
+        <w:tc>
+          <w:tcPr>
+            <w:tcW w:type="dxa" w:w="2880"/>
+          </w:tcPr>
+          <w:p>
+            <w:r>
+              <w:rPr>
+                <w:b/>
+              </w:rPr>
+              <w:t>Parameter</w:t>
+            </w:r>
+          </w:p>
+        </w:tc>
+        <w:tc>
+          <w:tcPr>
+            <w:tcW w:type="dxa" w:w="2880"/>
+          </w:tcPr>
+          <w:p>
+            <w:r>
+              <w:rPr>
+                <w:b/>
+              </w:rPr>
+              <w:t>Value</w:t>
+            </w:r>
+          </w:p>
+        </w:tc>
+        <w:tc>
+          <w:tcPr>
+            <w:tcW w:type="dxa" w:w="2880"/>
+          </w:tcPr>
+          <w:p>
+            <w:r>
+              <w:rPr>
+                <w:b/>
+              </w:rPr>
+              <w:t>95% CI</w:t>
+            </w:r>
+          </w:p>
+        </w:tc>
+      </w:tr>
+      <w:tr>
+        <w:tc>
+          <w:tcPr>
+            <w:tcW w:type="dxa" w:w="2880"/>
+          </w:tcPr>
+          <w:p>
+            <w:r>
+              <w:t>k (median scale factor)</w:t>
+            </w:r>
+          </w:p>
+        </w:tc>
+        <w:tc>
+          <w:tcPr>
+            <w:tcW w:type="dxa" w:w="2880"/>
+          </w:tcPr>
+          <w:p>
+            <w:r>
+              <w:t>1.8432</w:t>
+            </w:r>
+          </w:p>
+        </w:tc>
+        <w:tc>
+          <w:tcPr>
+            <w:tcW w:type="dxa" w:w="2880"/>
+          </w:tcPr>
+          <w:p>
+            <w:r>
+              <w:t>[1.6744, 2.0338]</w:t>
+            </w:r>
+          </w:p>
+        </w:tc>
+      </w:tr>
+      <w:tr>
+        <w:tc>
+          <w:tcPr>
+            <w:tcW w:type="dxa" w:w="2880"/>
+          </w:tcPr>
+          <w:p>
+            <w:r>
+              <w:t>beta (dispersion)</w:t>
+            </w:r>
+          </w:p>
+        </w:tc>
+        <w:tc>
+          <w:tcPr>
+            <w:tcW w:type="dxa" w:w="2880"/>
+          </w:tcPr>
+          <w:p>
+            <w:r>
+              <w:t>0.2557</w:t>
+            </w:r>
+          </w:p>
+        </w:tc>
+        <w:tc>
+          <w:tcPr>
+            <w:tcW w:type="dxa" w:w="2880"/>
+          </w:tcPr>
+          <w:p>
+            <w:r>
+              <w:t>[0.2000, 0.4057]</w:t>
+            </w:r>
+          </w:p>
+        </w:tc>
+      </w:tr>
+      <w:tr>
+        <w:tc>
+          <w:tcPr>
+            <w:tcW w:type="dxa" w:w="2880"/>
+          </w:tcPr>
+          <w:p>
+            <w:r>
+              <w:t>NLL / AIC</w:t>
+            </w:r>
+          </w:p>
+        </w:tc>
+        <w:tc>
+          <w:tcPr>
+            <w:tcW w:type="dxa" w:w="2880"/>
+          </w:tcPr>
+          <w:p>
+            <w:r>
+              <w:t>729.74 / 1463.47</w:t>
+            </w:r>
+          </w:p>
+        </w:tc>
+        <w:tc>
+          <w:tcPr>
+            <w:tcW w:type="dxa" w:w="2880"/>
+          </w:tcPr>
+          <w:p>
+            <w:r/>
+          </w:p>
+        </w:tc>
+      </w:tr>
+    </w:tbl>
+    <w:p/>
+    <w:p>
+      <w:r>
+        <w:t>The 95% confidence intervals are computed via profile likelihood: for each parameter, the other is re-optimized while scanning until 2*(NLL - NLL_opt) &gt; 3.841 (chi-squared critical value, 1 df, 95%).</w:t>
+      </w:r>
+    </w:p>
+    <w:p>
+      <w:r>
+        <w:t>Predicted vs observed damage distribution:</w:t>
+      </w:r>
+    </w:p>
+    <w:tbl>
+      <w:tblPr>
+        <w:tblStyle w:val="TableGrid"/>
+        <w:tblW w:type="auto" w:w="0"/>
+        <w:tblLook w:firstColumn="1" w:firstRow="1" w:lastColumn="0" w:lastRow="0" w:noHBand="0" w:noVBand="1" w:val="04A0"/>
+      </w:tblPr>
+      <w:tblGrid>
+        <w:gridCol w:w="2160"/>
+        <w:gridCol w:w="2160"/>
+        <w:gridCol w:w="2160"/>
+        <w:gridCol w:w="2160"/>
+      </w:tblGrid>
+      <w:tr>
+        <w:tc>
+          <w:tcPr>
+            <w:tcW w:type="dxa" w:w="2160"/>
+          </w:tcPr>
+          <w:p>
+            <w:r>
+              <w:rPr>
+                <w:b/>
+              </w:rPr>
+              <w:t>Damage State</w:t>
+            </w:r>
+          </w:p>
+        </w:tc>
+        <w:tc>
+          <w:tcPr>
+            <w:tcW w:type="dxa" w:w="2160"/>
+          </w:tcPr>
+          <w:p>
+            <w:r>
+              <w:rPr>
+                <w:b/>
+              </w:rPr>
+              <w:t>Observed</w:t>
+            </w:r>
+          </w:p>
+        </w:tc>
+        <w:tc>
+          <w:tcPr>
+            <w:tcW w:type="dxa" w:w="2160"/>
+          </w:tcPr>
+          <w:p>
+            <w:r>
+              <w:rPr>
+                <w:b/>
+              </w:rPr>
+              <w:t>Baseline (k=1, beta=0.6)</w:t>
+            </w:r>
+          </w:p>
+        </w:tc>
+        <w:tc>
+          <w:tcPr>
+            <w:tcW w:type="dxa" w:w="2160"/>
+          </w:tcPr>
+          <w:p>
+            <w:r>
+              <w:rPr>
+                <w:b/>
+              </w:rPr>
+              <w:t>Calibrated (k=1.84, beta=0.26)</w:t>
+            </w:r>
+          </w:p>
+        </w:tc>
+      </w:tr>
+      <w:tr>
+        <w:tc>
+          <w:tcPr>
+            <w:tcW w:type="dxa" w:w="2160"/>
+          </w:tcPr>
+          <w:p>
+            <w:r>
+              <w:t>None</w:t>
+            </w:r>
+          </w:p>
+        </w:tc>
+        <w:tc>
+          <w:tcPr>
+            <w:tcW w:type="dxa" w:w="2160"/>
+          </w:tcPr>
+          <w:p>
+            <w:r>
+              <w:t>89.4%</w:t>
+            </w:r>
+          </w:p>
+        </w:tc>
+        <w:tc>
+          <w:tcPr>
+            <w:tcW w:type="dxa" w:w="2160"/>
+          </w:tcPr>
+          <w:p>
+            <w:r>
+              <w:t>72.8%</w:t>
+            </w:r>
+          </w:p>
+        </w:tc>
+        <w:tc>
+          <w:tcPr>
+            <w:tcW w:type="dxa" w:w="2160"/>
+          </w:tcPr>
+          <w:p>
+            <w:r>
+              <w:t>90.5%</w:t>
+            </w:r>
+          </w:p>
+        </w:tc>
+      </w:tr>
+      <w:tr>
+        <w:tc>
+          <w:tcPr>
+            <w:tcW w:type="dxa" w:w="2160"/>
+          </w:tcPr>
+          <w:p>
+            <w:r>
+              <w:t>Slight</w:t>
+            </w:r>
+          </w:p>
+        </w:tc>
+        <w:tc>
+          <w:tcPr>
+            <w:tcW w:type="dxa" w:w="2160"/>
+          </w:tcPr>
+          <w:p>
+            <w:r>
+              <w:t>6.1%</w:t>
+            </w:r>
+          </w:p>
+        </w:tc>
+        <w:tc>
+          <w:tcPr>
+            <w:tcW w:type="dxa" w:w="2160"/>
+          </w:tcPr>
+          <w:p>
+            <w:r>
+              <w:t>8.8%</w:t>
+            </w:r>
+          </w:p>
+        </w:tc>
+        <w:tc>
+          <w:tcPr>
+            <w:tcW w:type="dxa" w:w="2160"/>
+          </w:tcPr>
+          <w:p>
+            <w:r>
+              <w:t>4.6%</w:t>
+            </w:r>
+          </w:p>
+        </w:tc>
+      </w:tr>
+      <w:tr>
+        <w:tc>
+          <w:tcPr>
+            <w:tcW w:type="dxa" w:w="2160"/>
+          </w:tcPr>
+          <w:p>
+            <w:r>
+              <w:t>Moderate</w:t>
+            </w:r>
+          </w:p>
+        </w:tc>
+        <w:tc>
+          <w:tcPr>
+            <w:tcW w:type="dxa" w:w="2160"/>
+          </w:tcPr>
+          <w:p>
+            <w:r>
+              <w:t>2.8%</w:t>
+            </w:r>
+          </w:p>
+        </w:tc>
+        <w:tc>
+          <w:tcPr>
+            <w:tcW w:type="dxa" w:w="2160"/>
+          </w:tcPr>
+          <w:p>
+            <w:r>
+              <w:t>5.0%</w:t>
+            </w:r>
+          </w:p>
+        </w:tc>
+        <w:tc>
+          <w:tcPr>
+            <w:tcW w:type="dxa" w:w="2160"/>
+          </w:tcPr>
+          <w:p>
+            <w:r>
+              <w:t>2.2%</w:t>
+            </w:r>
+          </w:p>
+        </w:tc>
+      </w:tr>
+      <w:tr>
+        <w:tc>
+          <w:tcPr>
+            <w:tcW w:type="dxa" w:w="2160"/>
+          </w:tcPr>
+          <w:p>
+            <w:r>
+              <w:t>Extensive</w:t>
+            </w:r>
+          </w:p>
+        </w:tc>
+        <w:tc>
+          <w:tcPr>
+            <w:tcW w:type="dxa" w:w="2160"/>
+          </w:tcPr>
+          <w:p>
+            <w:r>
+              <w:t>1.3%</w:t>
+            </w:r>
+          </w:p>
+        </w:tc>
+        <w:tc>
+          <w:tcPr>
+            <w:tcW w:type="dxa" w:w="2160"/>
+          </w:tcPr>
+          <w:p>
+            <w:r>
+              <w:t>6.5%</w:t>
+            </w:r>
+          </w:p>
+        </w:tc>
+        <w:tc>
+          <w:tcPr>
+            <w:tcW w:type="dxa" w:w="2160"/>
+          </w:tcPr>
+          <w:p>
+            <w:r>
+              <w:t>2.2%</w:t>
+            </w:r>
+          </w:p>
+        </w:tc>
+      </w:tr>
+      <w:tr>
+        <w:tc>
+          <w:tcPr>
+            <w:tcW w:type="dxa" w:w="2160"/>
+          </w:tcPr>
+          <w:p>
+            <w:r>
+              <w:t>Complete</w:t>
+            </w:r>
+          </w:p>
+        </w:tc>
+        <w:tc>
+          <w:tcPr>
+            <w:tcW w:type="dxa" w:w="2160"/>
+          </w:tcPr>
+          <w:p>
+            <w:r>
+              <w:t>0.4%</w:t>
+            </w:r>
+          </w:p>
+        </w:tc>
+        <w:tc>
+          <w:tcPr>
+            <w:tcW w:type="dxa" w:w="2160"/>
+          </w:tcPr>
+          <w:p>
+            <w:r>
+              <w:t>6.9%</w:t>
+            </w:r>
+          </w:p>
+        </w:tc>
+        <w:tc>
+          <w:tcPr>
+            <w:tcW w:type="dxa" w:w="2160"/>
+          </w:tcPr>
+          <w:p>
+            <w:r>
+              <w:t>0.5%</w:t>
+            </w:r>
+          </w:p>
+        </w:tc>
+      </w:tr>
+      <w:tr>
+        <w:tc>
+          <w:tcPr>
+            <w:tcW w:type="dxa" w:w="2160"/>
+          </w:tcPr>
+          <w:p>
+            <w:r>
+              <w:t>Damage fraction</w:t>
+            </w:r>
+          </w:p>
+        </w:tc>
+        <w:tc>
+          <w:tcPr>
+            <w:tcW w:type="dxa" w:w="2160"/>
+          </w:tcPr>
+          <w:p>
+            <w:r>
+              <w:t>10.6%</w:t>
+            </w:r>
+          </w:p>
+        </w:tc>
+        <w:tc>
+          <w:tcPr>
+            <w:tcW w:type="dxa" w:w="2160"/>
+          </w:tcPr>
+          <w:p>
+            <w:r>
+              <w:t>27.2%</w:t>
+            </w:r>
+          </w:p>
+        </w:tc>
+        <w:tc>
+          <w:tcPr>
+            <w:tcW w:type="dxa" w:w="2160"/>
+          </w:tcPr>
+          <w:p>
+            <w:r>
+              <w:t>9.5%</w:t>
+            </w:r>
+          </w:p>
+        </w:tc>
+      </w:tr>
+    </w:tbl>
+    <w:p/>
+    <w:p>
+      <w:pPr>
+        <w:pStyle w:val="Heading3"/>
+      </w:pPr>
+      <w:r>
+        <w:t>9.5.5 Interpretation</w:t>
+      </w:r>
+    </w:p>
+    <w:p>
+      <w:r>
+        <w:t>k = 1.84: The Northridge bridge inventory requires approximately 1.84x higher ground motion to reach each damage state compared to Hazus national-average assumptions. This is consistent with California's extensive seismic retrofit program after the 1971 San Fernando earthquake.</w:t>
+      </w:r>
+    </w:p>
+    <w:p>
+      <w:r>
+        <w:t>beta = 0.26: The calibrated dispersion is significantly lower than the Hazus default of 0.6, indicating sharper damage transitions. This reflects relatively homogeneous construction practices in the California highway bridge inventory.</w:t>
+      </w:r>
+    </w:p>
+    <w:p>
+      <w:r>
+        <w:t>The calibrated damage fraction (9.5%) closely matches the observed 10.6%, versus the baseline over-prediction of 27.2%.</w:t>
+      </w:r>
+    </w:p>
+    <w:p>
+      <w:pPr>
+        <w:pStyle w:val="Heading3"/>
+      </w:pPr>
+      <w:r>
+        <w:t>9.5.6 Known Limitations</w:t>
+      </w:r>
+    </w:p>
+    <w:p>
+      <w:r>
+        <w:t>1. Global calibration: A single (k, beta) is applied to all 28 HWB classes. Per-class calibration would require class-level damage counts, which Basoz (1998) does not provide.</w:t>
+      </w:r>
+    </w:p>
+    <w:p>
+      <w:r>
+        <w:t>2. Intermediate state ordering: The calibrated model predicts extensive (2.2%) slightly above moderate (2.2%), while observations show moderate &gt; extensive. This is a structural limitation of 2-parameter calibration; the difference is &lt; 0.5 bridges.</w:t>
+      </w:r>
+    </w:p>
+    <w:p>
+      <w:r>
+        <w:t>3. Dataset mismatch: Sa values from 2,008 bridges (2024 NBI), Basoz reference from 1,600 bridges (1994). Calibration compares fractions, so N mismatch does not bias the result, but the HWB class distribution may differ.</w:t>
+      </w:r>
+    </w:p>
+    <w:p>
+      <w:pPr>
+        <w:pStyle w:val="Heading3"/>
+      </w:pPr>
+      <w:r>
+        <w:t>9.5.7 Usage</w:t>
+      </w:r>
+    </w:p>
+    <w:p>
+      <w:r>
+        <w:t>To reproduce the calibration:</w:t>
+      </w:r>
+    </w:p>
+    <w:p>
+      <w:r>
+        <w:t xml:space="preserve">    python scripts/run_calibration.py</w:t>
+      </w:r>
+    </w:p>
+    <w:p/>
+    <w:p>
+      <w:r>
+        <w:t>Outputs (output/calibration/):</w:t>
+      </w:r>
+    </w:p>
+    <w:p>
+      <w:r>
+        <w:t xml:space="preserve">  - calibration_results.json: parameters, CIs, predicted/observed counts</w:t>
+      </w:r>
+    </w:p>
+    <w:p>
+      <w:r>
+        <w:t xml:space="preserve">  - likelihood_profile.png: profile NLL vs k</w:t>
+      </w:r>
+    </w:p>
+    <w:p>
+      <w:r>
+        <w:t xml:space="preserve">  - before_after_distribution.png: observed vs calibrated bar chart</w:t>
+      </w:r>
+    </w:p>
+    <w:p>
+      <w:r>
+        <w:t xml:space="preserve">  - fragility_curves_comparison.png: HWB5 original vs calibrated curves</w:t>
+      </w:r>
+    </w:p>
+    <w:p>
+      <w:r>
+        <w:t xml:space="preserve">  - config_snippet.yaml: paste into config.yaml to apply</w:t>
+      </w:r>
+    </w:p>
+    <w:p/>
+    <w:p>
+      <w:r>
+        <w:t>To apply in the main pipeline, add to config.yaml:</w:t>
+      </w:r>
+    </w:p>
+    <w:p>
+      <w:r>
+        <w:t xml:space="preserve">    calibration:</w:t>
+      </w:r>
+    </w:p>
+    <w:p>
+      <w:r>
+        <w:t xml:space="preserve">        global_median_factor: 1.8432</w:t>
       </w:r>
     </w:p>
     <w:p>

</xml_diff>

<commit_message>
Add missing value handling docs + user data guide to Technical Documentation
New sections:
- 6.2 Data Preparation & Missing Value Handling
  6.2.1 Missing value defaults table (num_spans, year_built, length, etc.)
  6.2.2 HWB classification with missing fields
  6.2.3 Validation enrichment (ID match + spatial match)
  6.2.4 ShakeMap & Vs30 NaN handling
  6.2.5 Northridge observed dataset missing value audit

- 13. User Data Guide
  13.1 Built-in data (HAZUS params, GMPE coeffs, etc.)
  13.2 Required user data formats:
    13.2.1 Bridge inventory CSV (required + optional columns)
    13.2.2 Earthquake scenario (ShakeMap / GMPE / pre-computed)
    13.2.3 Observed damage CSV (for validation)
    13.2.4 Aggregate damage counts (for calibration)
  13.3 Format requirements (encoding, units, coordinate system)
  13.4 Minimal working example

Co-Authored-By: Claude Opus 4.6 (1M context) <noreply@anthropic.com>
</commit_message>
<xml_diff>
--- a/CAT411_Technical_Documentation.docx
+++ b/CAT411_Technical_Documentation.docx
@@ -808,6 +808,820 @@
         <w:t>└── hazard/usgs/</w:t>
         <w:br/>
         <w:t xml:space="preserve">    ├── shakemap/   hazard_curves/</w:t>
+      </w:r>
+    </w:p>
+    <w:p>
+      <w:pPr>
+        <w:pStyle w:val="Heading2"/>
+      </w:pPr>
+      <w:r>
+        <w:t>6.2 Data Preparation &amp; Missing Value Handling</w:t>
+      </w:r>
+    </w:p>
+    <w:p>
+      <w:pPr/>
+      <w:r>
+        <w:t>NBI bridge records frequently contain missing or invalid values. The framework handles these systematically at multiple stages to ensure robust analysis. This section documents how each missing field is treated.</w:t>
+      </w:r>
+    </w:p>
+    <w:p>
+      <w:pPr>
+        <w:pStyle w:val="Heading3"/>
+      </w:pPr>
+      <w:r>
+        <w:t>6.2.1 Missing Value Defaults</w:t>
+      </w:r>
+    </w:p>
+    <w:p>
+      <w:pPr/>
+      <w:r>
+        <w:t>When NBI fields are missing (NaN), the framework applies the following defaults during HWB classification (src/data_loader.py) and exposure calculation (src/exposure.py):</w:t>
+      </w:r>
+    </w:p>
+    <w:tbl>
+      <w:tblPr>
+        <w:tblStyle w:val="TableGrid"/>
+        <w:tblW w:type="auto" w:w="0"/>
+        <w:tblLook w:firstColumn="1" w:firstRow="1" w:lastColumn="0" w:lastRow="0" w:noHBand="0" w:noVBand="1" w:val="04A0"/>
+      </w:tblPr>
+      <w:tblGrid>
+        <w:gridCol w:w="2160"/>
+        <w:gridCol w:w="2160"/>
+        <w:gridCol w:w="2160"/>
+        <w:gridCol w:w="2160"/>
+      </w:tblGrid>
+      <w:tr>
+        <w:tc>
+          <w:tcPr>
+            <w:tcW w:type="dxa" w:w="2160"/>
+          </w:tcPr>
+          <w:p>
+            <w:r>
+              <w:rPr>
+                <w:b/>
+              </w:rPr>
+              <w:t>NBI Field</w:t>
+            </w:r>
+          </w:p>
+        </w:tc>
+        <w:tc>
+          <w:tcPr>
+            <w:tcW w:type="dxa" w:w="2160"/>
+          </w:tcPr>
+          <w:p>
+            <w:r>
+              <w:rPr>
+                <w:b/>
+              </w:rPr>
+              <w:t>Default Value</w:t>
+            </w:r>
+          </w:p>
+        </w:tc>
+        <w:tc>
+          <w:tcPr>
+            <w:tcW w:type="dxa" w:w="2160"/>
+          </w:tcPr>
+          <w:p>
+            <w:r>
+              <w:rPr>
+                <w:b/>
+              </w:rPr>
+              <w:t>Rationale</w:t>
+            </w:r>
+          </w:p>
+        </w:tc>
+        <w:tc>
+          <w:tcPr>
+            <w:tcW w:type="dxa" w:w="2160"/>
+          </w:tcPr>
+          <w:p>
+            <w:r>
+              <w:rPr>
+                <w:b/>
+              </w:rPr>
+              <w:t>Code Location</w:t>
+            </w:r>
+          </w:p>
+        </w:tc>
+      </w:tr>
+      <w:tr>
+        <w:tc>
+          <w:tcPr>
+            <w:tcW w:type="dxa" w:w="2160"/>
+          </w:tcPr>
+          <w:p>
+            <w:r>
+              <w:t>num_spans</w:t>
+            </w:r>
+          </w:p>
+        </w:tc>
+        <w:tc>
+          <w:tcPr>
+            <w:tcW w:type="dxa" w:w="2160"/>
+          </w:tcPr>
+          <w:p>
+            <w:r>
+              <w:t>1</w:t>
+            </w:r>
+          </w:p>
+        </w:tc>
+        <w:tc>
+          <w:tcPr>
+            <w:tcW w:type="dxa" w:w="2160"/>
+          </w:tcPr>
+          <w:p>
+            <w:r>
+              <w:t>Conservative: single-span assumption (simplest structure)</w:t>
+            </w:r>
+          </w:p>
+        </w:tc>
+        <w:tc>
+          <w:tcPr>
+            <w:tcW w:type="dxa" w:w="2160"/>
+          </w:tcPr>
+          <w:p>
+            <w:r>
+              <w:t>data_loader.py:487</w:t>
+            </w:r>
+          </w:p>
+        </w:tc>
+      </w:tr>
+      <w:tr>
+        <w:tc>
+          <w:tcPr>
+            <w:tcW w:type="dxa" w:w="2160"/>
+          </w:tcPr>
+          <w:p>
+            <w:r>
+              <w:t>year_built</w:t>
+            </w:r>
+          </w:p>
+        </w:tc>
+        <w:tc>
+          <w:tcPr>
+            <w:tcW w:type="dxa" w:w="2160"/>
+          </w:tcPr>
+          <w:p>
+            <w:r>
+              <w:t>1960</w:t>
+            </w:r>
+          </w:p>
+        </w:tc>
+        <w:tc>
+          <w:tcPr>
+            <w:tcW w:type="dxa" w:w="2160"/>
+          </w:tcPr>
+          <w:p>
+            <w:r>
+              <w:t>Pre-seismic era: assumes conventional design (most conservative)</w:t>
+            </w:r>
+          </w:p>
+        </w:tc>
+        <w:tc>
+          <w:tcPr>
+            <w:tcW w:type="dxa" w:w="2160"/>
+          </w:tcPr>
+          <w:p>
+            <w:r>
+              <w:t>data_loader.py:502</w:t>
+            </w:r>
+          </w:p>
+        </w:tc>
+      </w:tr>
+      <w:tr>
+        <w:tc>
+          <w:tcPr>
+            <w:tcW w:type="dxa" w:w="2160"/>
+          </w:tcPr>
+          <w:p>
+            <w:r>
+              <w:t>structure_length_m</w:t>
+            </w:r>
+          </w:p>
+        </w:tc>
+        <w:tc>
+          <w:tcPr>
+            <w:tcW w:type="dxa" w:w="2160"/>
+          </w:tcPr>
+          <w:p>
+            <w:r>
+              <w:t>30 m</w:t>
+            </w:r>
+          </w:p>
+        </w:tc>
+        <w:tc>
+          <w:tcPr>
+            <w:tcW w:type="dxa" w:w="2160"/>
+          </w:tcPr>
+          <w:p>
+            <w:r>
+              <w:t>Typical short-span highway bridge</w:t>
+            </w:r>
+          </w:p>
+        </w:tc>
+        <w:tc>
+          <w:tcPr>
+            <w:tcW w:type="dxa" w:w="2160"/>
+          </w:tcPr>
+          <w:p>
+            <w:r>
+              <w:t>data_loader.py:508, exposure.py:199</w:t>
+            </w:r>
+          </w:p>
+        </w:tc>
+      </w:tr>
+      <w:tr>
+        <w:tc>
+          <w:tcPr>
+            <w:tcW w:type="dxa" w:w="2160"/>
+          </w:tcPr>
+          <w:p>
+            <w:r>
+              <w:t>deck_width_m</w:t>
+            </w:r>
+          </w:p>
+        </w:tc>
+        <w:tc>
+          <w:tcPr>
+            <w:tcW w:type="dxa" w:w="2160"/>
+          </w:tcPr>
+          <w:p>
+            <w:r>
+              <w:t>10 m</w:t>
+            </w:r>
+          </w:p>
+        </w:tc>
+        <w:tc>
+          <w:tcPr>
+            <w:tcW w:type="dxa" w:w="2160"/>
+          </w:tcPr>
+          <w:p>
+            <w:r>
+              <w:t>Standard two-lane bridge width</w:t>
+            </w:r>
+          </w:p>
+        </w:tc>
+        <w:tc>
+          <w:tcPr>
+            <w:tcW w:type="dxa" w:w="2160"/>
+          </w:tcPr>
+          <w:p>
+            <w:r>
+              <w:t>exposure.py:202</w:t>
+            </w:r>
+          </w:p>
+        </w:tc>
+      </w:tr>
+      <w:tr>
+        <w:tc>
+          <w:tcPr>
+            <w:tcW w:type="dxa" w:w="2160"/>
+          </w:tcPr>
+          <w:p>
+            <w:r>
+              <w:t>material_code</w:t>
+            </w:r>
+          </w:p>
+        </w:tc>
+        <w:tc>
+          <w:tcPr>
+            <w:tcW w:type="dxa" w:w="2160"/>
+          </w:tcPr>
+          <w:p>
+            <w:r>
+              <w:t>other</w:t>
+            </w:r>
+          </w:p>
+        </w:tc>
+        <w:tc>
+          <w:tcPr>
+            <w:tcW w:type="dxa" w:w="2160"/>
+          </w:tcPr>
+          <w:p>
+            <w:r>
+              <w:t>Unmapped codes fall through to 'other' category</w:t>
+            </w:r>
+          </w:p>
+        </w:tc>
+        <w:tc>
+          <w:tcPr>
+            <w:tcW w:type="dxa" w:w="2160"/>
+          </w:tcPr>
+          <w:p>
+            <w:r>
+              <w:t>data_loader.py:291</w:t>
+            </w:r>
+          </w:p>
+        </w:tc>
+      </w:tr>
+      <w:tr>
+        <w:tc>
+          <w:tcPr>
+            <w:tcW w:type="dxa" w:w="2160"/>
+          </w:tcPr>
+          <w:p>
+            <w:r>
+              <w:t>design_code</w:t>
+            </w:r>
+          </w:p>
+        </w:tc>
+        <w:tc>
+          <w:tcPr>
+            <w:tcW w:type="dxa" w:w="2160"/>
+          </w:tcPr>
+          <w:p>
+            <w:r>
+              <w:t>00</w:t>
+            </w:r>
+          </w:p>
+        </w:tc>
+        <w:tc>
+          <w:tcPr>
+            <w:tcW w:type="dxa" w:w="2160"/>
+          </w:tcPr>
+          <w:p>
+            <w:r>
+              <w:t>Default design type if unparseable</w:t>
+            </w:r>
+          </w:p>
+        </w:tc>
+        <w:tc>
+          <w:tcPr>
+            <w:tcW w:type="dxa" w:w="2160"/>
+          </w:tcPr>
+          <w:p>
+            <w:r>
+              <w:t>data_loader.py:514</w:t>
+            </w:r>
+          </w:p>
+        </w:tc>
+      </w:tr>
+      <w:tr>
+        <w:tc>
+          <w:tcPr>
+            <w:tcW w:type="dxa" w:w="2160"/>
+          </w:tcPr>
+          <w:p>
+            <w:r>
+              <w:t>condition_rating</w:t>
+            </w:r>
+          </w:p>
+        </w:tc>
+        <w:tc>
+          <w:tcPr>
+            <w:tcW w:type="dxa" w:w="2160"/>
+          </w:tcPr>
+          <w:p>
+            <w:r>
+              <w:t>(not imputed)</w:t>
+            </w:r>
+          </w:p>
+        </w:tc>
+        <w:tc>
+          <w:tcPr>
+            <w:tcW w:type="dxa" w:w="2160"/>
+          </w:tcPr>
+          <w:p>
+            <w:r>
+              <w:t>14.9% missing in NBI 2024; not used in fragility</w:t>
+            </w:r>
+          </w:p>
+        </w:tc>
+        <w:tc>
+          <w:tcPr>
+            <w:tcW w:type="dxa" w:w="2160"/>
+          </w:tcPr>
+          <w:p>
+            <w:r>
+              <w:t>N/A</w:t>
+            </w:r>
+          </w:p>
+        </w:tc>
+      </w:tr>
+    </w:tbl>
+    <w:p>
+      <w:pPr/>
+    </w:p>
+    <w:p>
+      <w:pPr>
+        <w:pStyle w:val="Heading3"/>
+      </w:pPr>
+      <w:r>
+        <w:t>6.2.2 HWB Classification with Missing Fields</w:t>
+      </w:r>
+    </w:p>
+    <w:p>
+      <w:pPr/>
+      <w:r>
+        <w:t>The HWB classification logic in src/data_loader.py (classify_hwb_class) depends on material, span type, design era, and seismic design. When inputs are missing:</w:t>
+      </w:r>
+    </w:p>
+    <w:p>
+      <w:pPr/>
+      <w:r>
+        <w:t>- material_code NaN or unmapped: material = 'other', which maps to general HWB classes (e.g., HWB28 'All Other Bridges')</w:t>
+      </w:r>
+    </w:p>
+    <w:p>
+      <w:pPr/>
+      <w:r>
+        <w:t>- num_spans NaN: defaults to 1, producing 'single' span type</w:t>
+      </w:r>
+    </w:p>
+    <w:p>
+      <w:pPr/>
+      <w:r>
+        <w:t>- year_built NaN: defaults to 1960, producing 'conventional' design era (pre-1975)</w:t>
+      </w:r>
+    </w:p>
+    <w:p>
+      <w:pPr/>
+      <w:r>
+        <w:t>These defaults are intentionally conservative: they classify uncertain bridges into weaker vulnerability classes, avoiding under-prediction of damage.</w:t>
+      </w:r>
+    </w:p>
+    <w:p>
+      <w:pPr>
+        <w:pStyle w:val="Heading3"/>
+      </w:pPr>
+      <w:r>
+        <w:t>6.2.3 Validation Enrichment for Missing Data</w:t>
+      </w:r>
+    </w:p>
+    <w:p>
+      <w:pPr/>
+      <w:r>
+        <w:t>When users provide validation CSV data with missing fields, the validation module (src/validation.py) performs two-phase enrichment:</w:t>
+      </w:r>
+    </w:p>
+    <w:p>
+      <w:pPr/>
+      <w:r>
+        <w:t>Phase 1 (ID match): If structure_number is present, looks up the bridge in the NBI database and fills missing hwb_class, latitude, longitude, year_built, and material.</w:t>
+      </w:r>
+    </w:p>
+    <w:p>
+      <w:pPr/>
+      <w:r>
+        <w:t>Phase 2 (spatial match): If structure_number is missing but coordinates are present, finds the nearest NBI bridge within 500m and copies its classification data.</w:t>
+      </w:r>
+    </w:p>
+    <w:p>
+      <w:pPr/>
+      <w:r>
+        <w:t>Bridges that cannot be enriched (no ID and no coordinates) are flagged with warnings and excluded from per-bridge analysis but still counted in aggregate statistics.</w:t>
+      </w:r>
+    </w:p>
+    <w:p>
+      <w:pPr>
+        <w:pStyle w:val="Heading3"/>
+      </w:pPr>
+      <w:r>
+        <w:t>6.2.4 ShakeMap &amp; Interpolation Missing Values</w:t>
+      </w:r>
+    </w:p>
+    <w:p>
+      <w:pPr/>
+      <w:r>
+        <w:t>- ShakeMap grid interpolation: scipy RectBivariateSpline may produce NaN for points outside the convex hull. These are filled with nearest-neighbor values (src/interpolation.py:233-234).</w:t>
+      </w:r>
+    </w:p>
+    <w:p>
+      <w:pPr/>
+      <w:r>
+        <w:t>- Vs30 grid: USGS values with nodata sentinels are replaced with NaN, then filled with column median or 760 m/s (NEHRP B/C boundary) as final fallback (src/vs30_provider.py:116-155).</w:t>
+      </w:r>
+    </w:p>
+    <w:p>
+      <w:pPr>
+        <w:pStyle w:val="Heading3"/>
+      </w:pPr>
+      <w:r>
+        <w:t>6.2.5 Northridge Observed Dataset</w:t>
+      </w:r>
+    </w:p>
+    <w:p>
+      <w:pPr/>
+      <w:r>
+        <w:t>The prepared dataset (data/northridge_observed.csv, 2,008 bridges) was cleaned by Sirisha Kedarsetty. Missing value status:</w:t>
+      </w:r>
+    </w:p>
+    <w:tbl>
+      <w:tblPr>
+        <w:tblStyle w:val="TableGrid"/>
+        <w:tblW w:type="auto" w:w="0"/>
+        <w:tblLook w:firstColumn="1" w:firstRow="1" w:lastColumn="0" w:lastRow="0" w:noHBand="0" w:noVBand="1" w:val="04A0"/>
+      </w:tblPr>
+      <w:tblGrid>
+        <w:gridCol w:w="2880"/>
+        <w:gridCol w:w="2880"/>
+        <w:gridCol w:w="2880"/>
+      </w:tblGrid>
+      <w:tr>
+        <w:tc>
+          <w:tcPr>
+            <w:tcW w:type="dxa" w:w="2880"/>
+          </w:tcPr>
+          <w:p>
+            <w:r>
+              <w:rPr>
+                <w:b/>
+              </w:rPr>
+              <w:t>Column</w:t>
+            </w:r>
+          </w:p>
+        </w:tc>
+        <w:tc>
+          <w:tcPr>
+            <w:tcW w:type="dxa" w:w="2880"/>
+          </w:tcPr>
+          <w:p>
+            <w:r>
+              <w:rPr>
+                <w:b/>
+              </w:rPr>
+              <w:t>Missing</w:t>
+            </w:r>
+          </w:p>
+        </w:tc>
+        <w:tc>
+          <w:tcPr>
+            <w:tcW w:type="dxa" w:w="2880"/>
+          </w:tcPr>
+          <w:p>
+            <w:r>
+              <w:rPr>
+                <w:b/>
+              </w:rPr>
+              <w:t>Notes</w:t>
+            </w:r>
+          </w:p>
+        </w:tc>
+      </w:tr>
+      <w:tr>
+        <w:tc>
+          <w:tcPr>
+            <w:tcW w:type="dxa" w:w="2880"/>
+          </w:tcPr>
+          <w:p>
+            <w:r>
+              <w:t>structure_number</w:t>
+            </w:r>
+          </w:p>
+        </w:tc>
+        <w:tc>
+          <w:tcPr>
+            <w:tcW w:type="dxa" w:w="2880"/>
+          </w:tcPr>
+          <w:p>
+            <w:r>
+              <w:t>0</w:t>
+            </w:r>
+          </w:p>
+        </w:tc>
+        <w:tc>
+          <w:tcPr>
+            <w:tcW w:type="dxa" w:w="2880"/>
+          </w:tcPr>
+          <w:p>
+            <w:r>
+              <w:t>All bridges identified</w:t>
+            </w:r>
+          </w:p>
+        </w:tc>
+      </w:tr>
+      <w:tr>
+        <w:tc>
+          <w:tcPr>
+            <w:tcW w:type="dxa" w:w="2880"/>
+          </w:tcPr>
+          <w:p>
+            <w:r>
+              <w:t>latitude / longitude</w:t>
+            </w:r>
+          </w:p>
+        </w:tc>
+        <w:tc>
+          <w:tcPr>
+            <w:tcW w:type="dxa" w:w="2880"/>
+          </w:tcPr>
+          <w:p>
+            <w:r>
+              <w:t>0</w:t>
+            </w:r>
+          </w:p>
+        </w:tc>
+        <w:tc>
+          <w:tcPr>
+            <w:tcW w:type="dxa" w:w="2880"/>
+          </w:tcPr>
+          <w:p>
+            <w:r>
+              <w:t>All geocoded</w:t>
+            </w:r>
+          </w:p>
+        </w:tc>
+      </w:tr>
+      <w:tr>
+        <w:tc>
+          <w:tcPr>
+            <w:tcW w:type="dxa" w:w="2880"/>
+          </w:tcPr>
+          <w:p>
+            <w:r>
+              <w:t>year_built</w:t>
+            </w:r>
+          </w:p>
+        </w:tc>
+        <w:tc>
+          <w:tcPr>
+            <w:tcW w:type="dxa" w:w="2880"/>
+          </w:tcPr>
+          <w:p>
+            <w:r>
+              <w:t>0</w:t>
+            </w:r>
+          </w:p>
+        </w:tc>
+        <w:tc>
+          <w:tcPr>
+            <w:tcW w:type="dxa" w:w="2880"/>
+          </w:tcPr>
+          <w:p>
+            <w:r>
+              <w:t>Range: 1900-2020</w:t>
+            </w:r>
+          </w:p>
+        </w:tc>
+      </w:tr>
+      <w:tr>
+        <w:tc>
+          <w:tcPr>
+            <w:tcW w:type="dxa" w:w="2880"/>
+          </w:tcPr>
+          <w:p>
+            <w:r>
+              <w:t>hwb_class</w:t>
+            </w:r>
+          </w:p>
+        </w:tc>
+        <w:tc>
+          <w:tcPr>
+            <w:tcW w:type="dxa" w:w="2880"/>
+          </w:tcPr>
+          <w:p>
+            <w:r>
+              <w:t>0</w:t>
+            </w:r>
+          </w:p>
+        </w:tc>
+        <w:tc>
+          <w:tcPr>
+            <w:tcW w:type="dxa" w:w="2880"/>
+          </w:tcPr>
+          <w:p>
+            <w:r>
+              <w:t>12 classes present</w:t>
+            </w:r>
+          </w:p>
+        </w:tc>
+      </w:tr>
+      <w:tr>
+        <w:tc>
+          <w:tcPr>
+            <w:tcW w:type="dxa" w:w="2880"/>
+          </w:tcPr>
+          <w:p>
+            <w:r>
+              <w:t>sa1s_shakemap</w:t>
+            </w:r>
+          </w:p>
+        </w:tc>
+        <w:tc>
+          <w:tcPr>
+            <w:tcW w:type="dxa" w:w="2880"/>
+          </w:tcPr>
+          <w:p>
+            <w:r>
+              <w:t>0</w:t>
+            </w:r>
+          </w:p>
+        </w:tc>
+        <w:tc>
+          <w:tcPr>
+            <w:tcW w:type="dxa" w:w="2880"/>
+          </w:tcPr>
+          <w:p>
+            <w:r>
+              <w:t>Range: 0.064-1.261g</w:t>
+            </w:r>
+          </w:p>
+        </w:tc>
+      </w:tr>
+      <w:tr>
+        <w:tc>
+          <w:tcPr>
+            <w:tcW w:type="dxa" w:w="2880"/>
+          </w:tcPr>
+          <w:p>
+            <w:r>
+              <w:t>Observed_damage</w:t>
+            </w:r>
+          </w:p>
+        </w:tc>
+        <w:tc>
+          <w:tcPr>
+            <w:tcW w:type="dxa" w:w="2880"/>
+          </w:tcPr>
+          <w:p>
+            <w:r>
+              <w:t>0</w:t>
+            </w:r>
+          </w:p>
+        </w:tc>
+        <w:tc>
+          <w:tcPr>
+            <w:tcW w:type="dxa" w:w="2880"/>
+          </w:tcPr>
+          <w:p>
+            <w:r>
+              <w:t>5 states: none/slight/moderate/extensive/complete</w:t>
+            </w:r>
+          </w:p>
+        </w:tc>
+      </w:tr>
+      <w:tr>
+        <w:tc>
+          <w:tcPr>
+            <w:tcW w:type="dxa" w:w="2880"/>
+          </w:tcPr>
+          <w:p>
+            <w:r>
+              <w:t>pga_literature</w:t>
+            </w:r>
+          </w:p>
+        </w:tc>
+        <w:tc>
+          <w:tcPr>
+            <w:tcW w:type="dxa" w:w="2880"/>
+          </w:tcPr>
+          <w:p>
+            <w:r>
+              <w:t>1,961 (97.7%)</w:t>
+            </w:r>
+          </w:p>
+        </w:tc>
+        <w:tc>
+          <w:tcPr>
+            <w:tcW w:type="dxa" w:w="2880"/>
+          </w:tcPr>
+          <w:p>
+            <w:r>
+              <w:t>Only 47 bridges have literature PGA; not used in calibration</w:t>
+            </w:r>
+          </w:p>
+        </w:tc>
+      </w:tr>
+      <w:tr>
+        <w:tc>
+          <w:tcPr>
+            <w:tcW w:type="dxa" w:w="2880"/>
+          </w:tcPr>
+          <w:p>
+            <w:r>
+              <w:t>damage_description</w:t>
+            </w:r>
+          </w:p>
+        </w:tc>
+        <w:tc>
+          <w:tcPr>
+            <w:tcW w:type="dxa" w:w="2880"/>
+          </w:tcPr>
+          <w:p>
+            <w:r>
+              <w:t>1,957 (97.5%)</w:t>
+            </w:r>
+          </w:p>
+        </w:tc>
+        <w:tc>
+          <w:tcPr>
+            <w:tcW w:type="dxa" w:w="2880"/>
+          </w:tcPr>
+          <w:p>
+            <w:r>
+              <w:t>Free-text; not used in calibration</w:t>
+            </w:r>
+          </w:p>
+        </w:tc>
+      </w:tr>
+    </w:tbl>
+    <w:p>
+      <w:pPr/>
+    </w:p>
+    <w:p>
+      <w:pPr/>
+      <w:r>
+        <w:t>All fields required for calibration (sa1s_shakemap, hwb_class, Observed_damage) have zero missing values. The pga_literature column is sparse because literature PGA values are only available for the small subset of bridges specifically studied in post-earthquake reconnaissance reports.</w:t>
       </w:r>
     </w:p>
     <w:p>
@@ -3106,6 +3920,1776 @@
     <w:p>
       <w:r>
         <w:t>[8] Worden, C.B., et al. (2018). Spatial and spectral interpolation of ground-motion intensity measure observations. BSSA, 108(2), 866-875.</w:t>
+      </w:r>
+    </w:p>
+    <w:p>
+      <w:pPr>
+        <w:pStyle w:val="Heading1"/>
+      </w:pPr>
+      <w:r>
+        <w:t>13. User Data Guide</w:t>
+      </w:r>
+    </w:p>
+    <w:p>
+      <w:pPr/>
+      <w:r>
+        <w:t>This section describes the data formats required for users who want to apply the CAT411 framework to their own earthquake scenarios and bridge inventories.</w:t>
+      </w:r>
+    </w:p>
+    <w:p>
+      <w:pPr>
+        <w:pStyle w:val="Heading2"/>
+      </w:pPr>
+      <w:r>
+        <w:t>13.1 Data the Framework Provides (Built-in)</w:t>
+      </w:r>
+    </w:p>
+    <w:p>
+      <w:pPr/>
+      <w:r>
+        <w:t>The following data is embedded in the framework and does NOT need to be supplied by users:</w:t>
+      </w:r>
+    </w:p>
+    <w:tbl>
+      <w:tblPr>
+        <w:tblStyle w:val="TableGrid"/>
+        <w:tblW w:type="auto" w:w="0"/>
+        <w:tblLook w:firstColumn="1" w:firstRow="1" w:lastColumn="0" w:lastRow="0" w:noHBand="0" w:noVBand="1" w:val="04A0"/>
+      </w:tblPr>
+      <w:tblGrid>
+        <w:gridCol w:w="2880"/>
+        <w:gridCol w:w="2880"/>
+        <w:gridCol w:w="2880"/>
+      </w:tblGrid>
+      <w:tr>
+        <w:tc>
+          <w:tcPr>
+            <w:tcW w:type="dxa" w:w="2880"/>
+          </w:tcPr>
+          <w:p>
+            <w:r>
+              <w:rPr>
+                <w:b/>
+              </w:rPr>
+              <w:t>Data</w:t>
+            </w:r>
+          </w:p>
+        </w:tc>
+        <w:tc>
+          <w:tcPr>
+            <w:tcW w:type="dxa" w:w="2880"/>
+          </w:tcPr>
+          <w:p>
+            <w:r>
+              <w:rPr>
+                <w:b/>
+              </w:rPr>
+              <w:t>Source</w:t>
+            </w:r>
+          </w:p>
+        </w:tc>
+        <w:tc>
+          <w:tcPr>
+            <w:tcW w:type="dxa" w:w="2880"/>
+          </w:tcPr>
+          <w:p>
+            <w:r>
+              <w:rPr>
+                <w:b/>
+              </w:rPr>
+              <w:t>Location</w:t>
+            </w:r>
+          </w:p>
+        </w:tc>
+      </w:tr>
+      <w:tr>
+        <w:tc>
+          <w:tcPr>
+            <w:tcW w:type="dxa" w:w="2880"/>
+          </w:tcPr>
+          <w:p>
+            <w:r>
+              <w:t>HAZUS fragility parameters (28 HWB classes)</w:t>
+            </w:r>
+          </w:p>
+        </w:tc>
+        <w:tc>
+          <w:tcPr>
+            <w:tcW w:type="dxa" w:w="2880"/>
+          </w:tcPr>
+          <w:p>
+            <w:r>
+              <w:t>Hazus 6.1 Table 7.9</w:t>
+            </w:r>
+          </w:p>
+        </w:tc>
+        <w:tc>
+          <w:tcPr>
+            <w:tcW w:type="dxa" w:w="2880"/>
+          </w:tcPr>
+          <w:p>
+            <w:r>
+              <w:t>src/hazus_params.py</w:t>
+            </w:r>
+          </w:p>
+        </w:tc>
+      </w:tr>
+      <w:tr>
+        <w:tc>
+          <w:tcPr>
+            <w:tcW w:type="dxa" w:w="2880"/>
+          </w:tcPr>
+          <w:p>
+            <w:r>
+              <w:t>HWB classification logic</w:t>
+            </w:r>
+          </w:p>
+        </w:tc>
+        <w:tc>
+          <w:tcPr>
+            <w:tcW w:type="dxa" w:w="2880"/>
+          </w:tcPr>
+          <w:p>
+            <w:r>
+              <w:t>Hazus 6.1 Chapter 7</w:t>
+            </w:r>
+          </w:p>
+        </w:tc>
+        <w:tc>
+          <w:tcPr>
+            <w:tcW w:type="dxa" w:w="2880"/>
+          </w:tcPr>
+          <w:p>
+            <w:r>
+              <w:t>src/data_loader.py, src/bridge_classes.py</w:t>
+            </w:r>
+          </w:p>
+        </w:tc>
+      </w:tr>
+      <w:tr>
+        <w:tc>
+          <w:tcPr>
+            <w:tcW w:type="dxa" w:w="2880"/>
+          </w:tcPr>
+          <w:p>
+            <w:r>
+              <w:t>MLE calibration results (k, beta)</w:t>
+            </w:r>
+          </w:p>
+        </w:tc>
+        <w:tc>
+          <w:tcPr>
+            <w:tcW w:type="dxa" w:w="2880"/>
+          </w:tcPr>
+          <w:p>
+            <w:r>
+              <w:t>This project</w:t>
+            </w:r>
+          </w:p>
+        </w:tc>
+        <w:tc>
+          <w:tcPr>
+            <w:tcW w:type="dxa" w:w="2880"/>
+          </w:tcPr>
+          <w:p>
+            <w:r>
+              <w:t>output/calibration/calibration_results.json</w:t>
+            </w:r>
+          </w:p>
+        </w:tc>
+      </w:tr>
+      <w:tr>
+        <w:tc>
+          <w:tcPr>
+            <w:tcW w:type="dxa" w:w="2880"/>
+          </w:tcPr>
+          <w:p>
+            <w:r>
+              <w:t>Basoz (1998) reference counts</w:t>
+            </w:r>
+          </w:p>
+        </w:tc>
+        <w:tc>
+          <w:tcPr>
+            <w:tcW w:type="dxa" w:w="2880"/>
+          </w:tcPr>
+          <w:p>
+            <w:r>
+              <w:t>MCEER-98-0004</w:t>
+            </w:r>
+          </w:p>
+        </w:tc>
+        <w:tc>
+          <w:tcPr>
+            <w:tcW w:type="dxa" w:w="2880"/>
+          </w:tcPr>
+          <w:p>
+            <w:r>
+              <w:t>src/northridge_case.py</w:t>
+            </w:r>
+          </w:p>
+        </w:tc>
+      </w:tr>
+      <w:tr>
+        <w:tc>
+          <w:tcPr>
+            <w:tcW w:type="dxa" w:w="2880"/>
+          </w:tcPr>
+          <w:p>
+            <w:r>
+              <w:t>NBI material/design code mappings</w:t>
+            </w:r>
+          </w:p>
+        </w:tc>
+        <w:tc>
+          <w:tcPr>
+            <w:tcW w:type="dxa" w:w="2880"/>
+          </w:tcPr>
+          <w:p>
+            <w:r>
+              <w:t>FHWA NBI coding guide</w:t>
+            </w:r>
+          </w:p>
+        </w:tc>
+        <w:tc>
+          <w:tcPr>
+            <w:tcW w:type="dxa" w:w="2880"/>
+          </w:tcPr>
+          <w:p>
+            <w:r>
+              <w:t>src/data_loader.py</w:t>
+            </w:r>
+          </w:p>
+        </w:tc>
+      </w:tr>
+      <w:tr>
+        <w:tc>
+          <w:tcPr>
+            <w:tcW w:type="dxa" w:w="2880"/>
+          </w:tcPr>
+          <w:p>
+            <w:r>
+              <w:t>Replacement cost estimation model</w:t>
+            </w:r>
+          </w:p>
+        </w:tc>
+        <w:tc>
+          <w:tcPr>
+            <w:tcW w:type="dxa" w:w="2880"/>
+          </w:tcPr>
+          <w:p>
+            <w:r>
+              <w:t>RSMeans + Hazus</w:t>
+            </w:r>
+          </w:p>
+        </w:tc>
+        <w:tc>
+          <w:tcPr>
+            <w:tcW w:type="dxa" w:w="2880"/>
+          </w:tcPr>
+          <w:p>
+            <w:r>
+              <w:t>src/exposure.py</w:t>
+            </w:r>
+          </w:p>
+        </w:tc>
+      </w:tr>
+      <w:tr>
+        <w:tc>
+          <w:tcPr>
+            <w:tcW w:type="dxa" w:w="2880"/>
+          </w:tcPr>
+          <w:p>
+            <w:r>
+              <w:t>BSSA14/21 GMPE coefficients</w:t>
+            </w:r>
+          </w:p>
+        </w:tc>
+        <w:tc>
+          <w:tcPr>
+            <w:tcW w:type="dxa" w:w="2880"/>
+          </w:tcPr>
+          <w:p>
+            <w:r>
+              <w:t>NGA-West2</w:t>
+            </w:r>
+          </w:p>
+        </w:tc>
+        <w:tc>
+          <w:tcPr>
+            <w:tcW w:type="dxa" w:w="2880"/>
+          </w:tcPr>
+          <w:p>
+            <w:r>
+              <w:t>src/gmpe_bssa21.py</w:t>
+            </w:r>
+          </w:p>
+        </w:tc>
+      </w:tr>
+      <w:tr>
+        <w:tc>
+          <w:tcPr>
+            <w:tcW w:type="dxa" w:w="2880"/>
+          </w:tcPr>
+          <w:p>
+            <w:r>
+              <w:t>Vs30 grid (USGS)</w:t>
+            </w:r>
+          </w:p>
+        </w:tc>
+        <w:tc>
+          <w:tcPr>
+            <w:tcW w:type="dxa" w:w="2880"/>
+          </w:tcPr>
+          <w:p>
+            <w:r>
+              <w:t>USGS global Vs30</w:t>
+            </w:r>
+          </w:p>
+        </w:tc>
+        <w:tc>
+          <w:tcPr>
+            <w:tcW w:type="dxa" w:w="2880"/>
+          </w:tcPr>
+          <w:p>
+            <w:r>
+              <w:t>data/vs30_*.tif (auto-downloaded)</w:t>
+            </w:r>
+          </w:p>
+        </w:tc>
+      </w:tr>
+    </w:tbl>
+    <w:p>
+      <w:pPr/>
+    </w:p>
+    <w:p>
+      <w:pPr>
+        <w:pStyle w:val="Heading2"/>
+      </w:pPr>
+      <w:r>
+        <w:t>13.2 Data Users Must Provide</w:t>
+      </w:r>
+    </w:p>
+    <w:p>
+      <w:pPr>
+        <w:pStyle w:val="Heading3"/>
+      </w:pPr>
+      <w:r>
+        <w:t>13.2.1 Bridge Inventory (Required)</w:t>
+      </w:r>
+    </w:p>
+    <w:p>
+      <w:pPr/>
+      <w:r>
+        <w:t>A CSV file containing the bridge portfolio to analyze. The framework will classify each bridge into a HWB class and compute damage probabilities.</w:t>
+      </w:r>
+    </w:p>
+    <w:p>
+      <w:pPr/>
+      <w:r>
+        <w:t>Required columns:</w:t>
+      </w:r>
+    </w:p>
+    <w:tbl>
+      <w:tblPr>
+        <w:tblStyle w:val="TableGrid"/>
+        <w:tblW w:type="auto" w:w="0"/>
+        <w:tblLook w:firstColumn="1" w:firstRow="1" w:lastColumn="0" w:lastRow="0" w:noHBand="0" w:noVBand="1" w:val="04A0"/>
+      </w:tblPr>
+      <w:tblGrid>
+        <w:gridCol w:w="2160"/>
+        <w:gridCol w:w="2160"/>
+        <w:gridCol w:w="2160"/>
+        <w:gridCol w:w="2160"/>
+      </w:tblGrid>
+      <w:tr>
+        <w:tc>
+          <w:tcPr>
+            <w:tcW w:type="dxa" w:w="2160"/>
+          </w:tcPr>
+          <w:p>
+            <w:r>
+              <w:rPr>
+                <w:b/>
+              </w:rPr>
+              <w:t>Column Name</w:t>
+            </w:r>
+          </w:p>
+        </w:tc>
+        <w:tc>
+          <w:tcPr>
+            <w:tcW w:type="dxa" w:w="2160"/>
+          </w:tcPr>
+          <w:p>
+            <w:r>
+              <w:rPr>
+                <w:b/>
+              </w:rPr>
+              <w:t>Type</w:t>
+            </w:r>
+          </w:p>
+        </w:tc>
+        <w:tc>
+          <w:tcPr>
+            <w:tcW w:type="dxa" w:w="2160"/>
+          </w:tcPr>
+          <w:p>
+            <w:r>
+              <w:rPr>
+                <w:b/>
+              </w:rPr>
+              <w:t>Description</w:t>
+            </w:r>
+          </w:p>
+        </w:tc>
+        <w:tc>
+          <w:tcPr>
+            <w:tcW w:type="dxa" w:w="2160"/>
+          </w:tcPr>
+          <w:p>
+            <w:r>
+              <w:rPr>
+                <w:b/>
+              </w:rPr>
+              <w:t>Example</w:t>
+            </w:r>
+          </w:p>
+        </w:tc>
+      </w:tr>
+      <w:tr>
+        <w:tc>
+          <w:tcPr>
+            <w:tcW w:type="dxa" w:w="2160"/>
+          </w:tcPr>
+          <w:p>
+            <w:r>
+              <w:t>structure_number</w:t>
+            </w:r>
+          </w:p>
+        </w:tc>
+        <w:tc>
+          <w:tcPr>
+            <w:tcW w:type="dxa" w:w="2160"/>
+          </w:tcPr>
+          <w:p>
+            <w:r>
+              <w:t>string</w:t>
+            </w:r>
+          </w:p>
+        </w:tc>
+        <w:tc>
+          <w:tcPr>
+            <w:tcW w:type="dxa" w:w="2160"/>
+          </w:tcPr>
+          <w:p>
+            <w:r>
+              <w:t>Unique bridge identifier (NBI format preferred)</w:t>
+            </w:r>
+          </w:p>
+        </w:tc>
+        <w:tc>
+          <w:tcPr>
+            <w:tcW w:type="dxa" w:w="2160"/>
+          </w:tcPr>
+          <w:p>
+            <w:r>
+              <w:t>53 0012</w:t>
+            </w:r>
+          </w:p>
+        </w:tc>
+      </w:tr>
+      <w:tr>
+        <w:tc>
+          <w:tcPr>
+            <w:tcW w:type="dxa" w:w="2160"/>
+          </w:tcPr>
+          <w:p>
+            <w:r>
+              <w:t>latitude</w:t>
+            </w:r>
+          </w:p>
+        </w:tc>
+        <w:tc>
+          <w:tcPr>
+            <w:tcW w:type="dxa" w:w="2160"/>
+          </w:tcPr>
+          <w:p>
+            <w:r>
+              <w:t>float</w:t>
+            </w:r>
+          </w:p>
+        </w:tc>
+        <w:tc>
+          <w:tcPr>
+            <w:tcW w:type="dxa" w:w="2160"/>
+          </w:tcPr>
+          <w:p>
+            <w:r>
+              <w:t>Bridge latitude in decimal degrees (WGS84)</w:t>
+            </w:r>
+          </w:p>
+        </w:tc>
+        <w:tc>
+          <w:tcPr>
+            <w:tcW w:type="dxa" w:w="2160"/>
+          </w:tcPr>
+          <w:p>
+            <w:r>
+              <w:t>34.0522</w:t>
+            </w:r>
+          </w:p>
+        </w:tc>
+      </w:tr>
+      <w:tr>
+        <w:tc>
+          <w:tcPr>
+            <w:tcW w:type="dxa" w:w="2160"/>
+          </w:tcPr>
+          <w:p>
+            <w:r>
+              <w:t>longitude</w:t>
+            </w:r>
+          </w:p>
+        </w:tc>
+        <w:tc>
+          <w:tcPr>
+            <w:tcW w:type="dxa" w:w="2160"/>
+          </w:tcPr>
+          <w:p>
+            <w:r>
+              <w:t>float</w:t>
+            </w:r>
+          </w:p>
+        </w:tc>
+        <w:tc>
+          <w:tcPr>
+            <w:tcW w:type="dxa" w:w="2160"/>
+          </w:tcPr>
+          <w:p>
+            <w:r>
+              <w:t>Bridge longitude in decimal degrees (WGS84, negative for West)</w:t>
+            </w:r>
+          </w:p>
+        </w:tc>
+        <w:tc>
+          <w:tcPr>
+            <w:tcW w:type="dxa" w:w="2160"/>
+          </w:tcPr>
+          <w:p>
+            <w:r>
+              <w:t>-118.2437</w:t>
+            </w:r>
+          </w:p>
+        </w:tc>
+      </w:tr>
+    </w:tbl>
+    <w:p>
+      <w:pPr/>
+    </w:p>
+    <w:p>
+      <w:pPr/>
+      <w:r>
+        <w:t>Optional columns (auto-enriched from NBI if missing):</w:t>
+      </w:r>
+    </w:p>
+    <w:tbl>
+      <w:tblPr>
+        <w:tblStyle w:val="TableGrid"/>
+        <w:tblW w:type="auto" w:w="0"/>
+        <w:tblLook w:firstColumn="1" w:firstRow="1" w:lastColumn="0" w:lastRow="0" w:noHBand="0" w:noVBand="1" w:val="04A0"/>
+      </w:tblPr>
+      <w:tblGrid>
+        <w:gridCol w:w="2160"/>
+        <w:gridCol w:w="2160"/>
+        <w:gridCol w:w="2160"/>
+        <w:gridCol w:w="2160"/>
+      </w:tblGrid>
+      <w:tr>
+        <w:tc>
+          <w:tcPr>
+            <w:tcW w:type="dxa" w:w="2160"/>
+          </w:tcPr>
+          <w:p>
+            <w:r>
+              <w:rPr>
+                <w:b/>
+              </w:rPr>
+              <w:t>Column Name</w:t>
+            </w:r>
+          </w:p>
+        </w:tc>
+        <w:tc>
+          <w:tcPr>
+            <w:tcW w:type="dxa" w:w="2160"/>
+          </w:tcPr>
+          <w:p>
+            <w:r>
+              <w:rPr>
+                <w:b/>
+              </w:rPr>
+              <w:t>Type</w:t>
+            </w:r>
+          </w:p>
+        </w:tc>
+        <w:tc>
+          <w:tcPr>
+            <w:tcW w:type="dxa" w:w="2160"/>
+          </w:tcPr>
+          <w:p>
+            <w:r>
+              <w:rPr>
+                <w:b/>
+              </w:rPr>
+              <w:t>Default if Missing</w:t>
+            </w:r>
+          </w:p>
+        </w:tc>
+        <w:tc>
+          <w:tcPr>
+            <w:tcW w:type="dxa" w:w="2160"/>
+          </w:tcPr>
+          <w:p>
+            <w:r>
+              <w:rPr>
+                <w:b/>
+              </w:rPr>
+              <w:t>Description</w:t>
+            </w:r>
+          </w:p>
+        </w:tc>
+      </w:tr>
+      <w:tr>
+        <w:tc>
+          <w:tcPr>
+            <w:tcW w:type="dxa" w:w="2160"/>
+          </w:tcPr>
+          <w:p>
+            <w:r>
+              <w:t>year_built</w:t>
+            </w:r>
+          </w:p>
+        </w:tc>
+        <w:tc>
+          <w:tcPr>
+            <w:tcW w:type="dxa" w:w="2160"/>
+          </w:tcPr>
+          <w:p>
+            <w:r>
+              <w:t>int</w:t>
+            </w:r>
+          </w:p>
+        </w:tc>
+        <w:tc>
+          <w:tcPr>
+            <w:tcW w:type="dxa" w:w="2160"/>
+          </w:tcPr>
+          <w:p>
+            <w:r>
+              <w:t>1960</w:t>
+            </w:r>
+          </w:p>
+        </w:tc>
+        <w:tc>
+          <w:tcPr>
+            <w:tcW w:type="dxa" w:w="2160"/>
+          </w:tcPr>
+          <w:p>
+            <w:r>
+              <w:t>Construction year; determines design era (pre/post 1975)</w:t>
+            </w:r>
+          </w:p>
+        </w:tc>
+      </w:tr>
+      <w:tr>
+        <w:tc>
+          <w:tcPr>
+            <w:tcW w:type="dxa" w:w="2160"/>
+          </w:tcPr>
+          <w:p>
+            <w:r>
+              <w:t>material_code</w:t>
+            </w:r>
+          </w:p>
+        </w:tc>
+        <w:tc>
+          <w:tcPr>
+            <w:tcW w:type="dxa" w:w="2160"/>
+          </w:tcPr>
+          <w:p>
+            <w:r>
+              <w:t>string</w:t>
+            </w:r>
+          </w:p>
+        </w:tc>
+        <w:tc>
+          <w:tcPr>
+            <w:tcW w:type="dxa" w:w="2160"/>
+          </w:tcPr>
+          <w:p>
+            <w:r>
+              <w:t>'other'</w:t>
+            </w:r>
+          </w:p>
+        </w:tc>
+        <w:tc>
+          <w:tcPr>
+            <w:tcW w:type="dxa" w:w="2160"/>
+          </w:tcPr>
+          <w:p>
+            <w:r>
+              <w:t>NBI Item 43A material code (1=concrete, 3=steel, etc.)</w:t>
+            </w:r>
+          </w:p>
+        </w:tc>
+      </w:tr>
+      <w:tr>
+        <w:tc>
+          <w:tcPr>
+            <w:tcW w:type="dxa" w:w="2160"/>
+          </w:tcPr>
+          <w:p>
+            <w:r>
+              <w:t>design_code</w:t>
+            </w:r>
+          </w:p>
+        </w:tc>
+        <w:tc>
+          <w:tcPr>
+            <w:tcW w:type="dxa" w:w="2160"/>
+          </w:tcPr>
+          <w:p>
+            <w:r>
+              <w:t>string</w:t>
+            </w:r>
+          </w:p>
+        </w:tc>
+        <w:tc>
+          <w:tcPr>
+            <w:tcW w:type="dxa" w:w="2160"/>
+          </w:tcPr>
+          <w:p>
+            <w:r>
+              <w:t>'00'</w:t>
+            </w:r>
+          </w:p>
+        </w:tc>
+        <w:tc>
+          <w:tcPr>
+            <w:tcW w:type="dxa" w:w="2160"/>
+          </w:tcPr>
+          <w:p>
+            <w:r>
+              <w:t>NBI Item 43B design code (05=box girder, etc.)</w:t>
+            </w:r>
+          </w:p>
+        </w:tc>
+      </w:tr>
+      <w:tr>
+        <w:tc>
+          <w:tcPr>
+            <w:tcW w:type="dxa" w:w="2160"/>
+          </w:tcPr>
+          <w:p>
+            <w:r>
+              <w:t>num_spans</w:t>
+            </w:r>
+          </w:p>
+        </w:tc>
+        <w:tc>
+          <w:tcPr>
+            <w:tcW w:type="dxa" w:w="2160"/>
+          </w:tcPr>
+          <w:p>
+            <w:r>
+              <w:t>int</w:t>
+            </w:r>
+          </w:p>
+        </w:tc>
+        <w:tc>
+          <w:tcPr>
+            <w:tcW w:type="dxa" w:w="2160"/>
+          </w:tcPr>
+          <w:p>
+            <w:r>
+              <w:t>1</w:t>
+            </w:r>
+          </w:p>
+        </w:tc>
+        <w:tc>
+          <w:tcPr>
+            <w:tcW w:type="dxa" w:w="2160"/>
+          </w:tcPr>
+          <w:p>
+            <w:r>
+              <w:t>Number of spans</w:t>
+            </w:r>
+          </w:p>
+        </w:tc>
+      </w:tr>
+      <w:tr>
+        <w:tc>
+          <w:tcPr>
+            <w:tcW w:type="dxa" w:w="2160"/>
+          </w:tcPr>
+          <w:p>
+            <w:r>
+              <w:t>structure_length_m</w:t>
+            </w:r>
+          </w:p>
+        </w:tc>
+        <w:tc>
+          <w:tcPr>
+            <w:tcW w:type="dxa" w:w="2160"/>
+          </w:tcPr>
+          <w:p>
+            <w:r>
+              <w:t>float</w:t>
+            </w:r>
+          </w:p>
+        </w:tc>
+        <w:tc>
+          <w:tcPr>
+            <w:tcW w:type="dxa" w:w="2160"/>
+          </w:tcPr>
+          <w:p>
+            <w:r>
+              <w:t>30.0</w:t>
+            </w:r>
+          </w:p>
+        </w:tc>
+        <w:tc>
+          <w:tcPr>
+            <w:tcW w:type="dxa" w:w="2160"/>
+          </w:tcPr>
+          <w:p>
+            <w:r>
+              <w:t>Total length in meters</w:t>
+            </w:r>
+          </w:p>
+        </w:tc>
+      </w:tr>
+      <w:tr>
+        <w:tc>
+          <w:tcPr>
+            <w:tcW w:type="dxa" w:w="2160"/>
+          </w:tcPr>
+          <w:p>
+            <w:r>
+              <w:t>deck_width_m</w:t>
+            </w:r>
+          </w:p>
+        </w:tc>
+        <w:tc>
+          <w:tcPr>
+            <w:tcW w:type="dxa" w:w="2160"/>
+          </w:tcPr>
+          <w:p>
+            <w:r>
+              <w:t>float</w:t>
+            </w:r>
+          </w:p>
+        </w:tc>
+        <w:tc>
+          <w:tcPr>
+            <w:tcW w:type="dxa" w:w="2160"/>
+          </w:tcPr>
+          <w:p>
+            <w:r>
+              <w:t>10.0</w:t>
+            </w:r>
+          </w:p>
+        </w:tc>
+        <w:tc>
+          <w:tcPr>
+            <w:tcW w:type="dxa" w:w="2160"/>
+          </w:tcPr>
+          <w:p>
+            <w:r>
+              <w:t>Deck width in meters</w:t>
+            </w:r>
+          </w:p>
+        </w:tc>
+      </w:tr>
+      <w:tr>
+        <w:tc>
+          <w:tcPr>
+            <w:tcW w:type="dxa" w:w="2160"/>
+          </w:tcPr>
+          <w:p>
+            <w:r>
+              <w:t>hwb_class</w:t>
+            </w:r>
+          </w:p>
+        </w:tc>
+        <w:tc>
+          <w:tcPr>
+            <w:tcW w:type="dxa" w:w="2160"/>
+          </w:tcPr>
+          <w:p>
+            <w:r>
+              <w:t>string</w:t>
+            </w:r>
+          </w:p>
+        </w:tc>
+        <w:tc>
+          <w:tcPr>
+            <w:tcW w:type="dxa" w:w="2160"/>
+          </w:tcPr>
+          <w:p>
+            <w:r>
+              <w:t>(auto-classified)</w:t>
+            </w:r>
+          </w:p>
+        </w:tc>
+        <w:tc>
+          <w:tcPr>
+            <w:tcW w:type="dxa" w:w="2160"/>
+          </w:tcPr>
+          <w:p>
+            <w:r>
+              <w:t>Direct HWB class override (e.g., 'HWB5')</w:t>
+            </w:r>
+          </w:p>
+        </w:tc>
+      </w:tr>
+    </w:tbl>
+    <w:p>
+      <w:pPr/>
+    </w:p>
+    <w:p>
+      <w:pPr/>
+      <w:r>
+        <w:t>If hwb_class is provided directly, the framework skips classification and uses it as-is. Otherwise, it classifies each bridge from material_code, design_code, num_spans, and year_built.</w:t>
+      </w:r>
+    </w:p>
+    <w:p>
+      <w:pPr>
+        <w:pStyle w:val="Heading3"/>
+      </w:pPr>
+      <w:r>
+        <w:t>13.2.2 Earthquake Scenario (Required — choose one)</w:t>
+      </w:r>
+    </w:p>
+    <w:p>
+      <w:pPr/>
+      <w:r>
+        <w:t>Option A: USGS ShakeMap (recommended)</w:t>
+      </w:r>
+    </w:p>
+    <w:p>
+      <w:pPr/>
+      <w:r>
+        <w:t>Provide an earthquake event ID (e.g., 'ci3144585' for Northridge). The framework auto-downloads ShakeMap data from USGS and interpolates Sa at each bridge location.</w:t>
+      </w:r>
+    </w:p>
+    <w:p>
+      <w:pPr/>
+      <w:r>
+        <w:t xml:space="preserve">    config.yaml:  im_source: shakemap</w:t>
+      </w:r>
+    </w:p>
+    <w:p>
+      <w:pPr/>
+      <w:r>
+        <w:t xml:space="preserve">                  event_id: ci3144585</w:t>
+      </w:r>
+    </w:p>
+    <w:p>
+      <w:pPr/>
+    </w:p>
+    <w:p>
+      <w:pPr/>
+      <w:r>
+        <w:t>Option B: GMPE calculation</w:t>
+      </w:r>
+    </w:p>
+    <w:p>
+      <w:pPr/>
+      <w:r>
+        <w:t>Provide earthquake source parameters. The framework computes ground motion using BSSA14/21 GMPE with spatial correlation.</w:t>
+      </w:r>
+    </w:p>
+    <w:p>
+      <w:pPr/>
+      <w:r>
+        <w:t xml:space="preserve">    config.yaml:  im_source: gmpe</w:t>
+      </w:r>
+    </w:p>
+    <w:p>
+      <w:pPr/>
+      <w:r>
+        <w:t xml:space="preserve">                  magnitude: 6.7</w:t>
+      </w:r>
+    </w:p>
+    <w:p>
+      <w:pPr/>
+      <w:r>
+        <w:t xml:space="preserve">                  depth_km: 18.4</w:t>
+      </w:r>
+    </w:p>
+    <w:p>
+      <w:pPr/>
+      <w:r>
+        <w:t xml:space="preserve">                  epicenter: [34.213, -118.537]</w:t>
+      </w:r>
+    </w:p>
+    <w:p>
+      <w:pPr/>
+    </w:p>
+    <w:p>
+      <w:pPr/>
+      <w:r>
+        <w:t>Option C: Pre-computed intensity measures</w:t>
+      </w:r>
+    </w:p>
+    <w:p>
+      <w:pPr/>
+      <w:r>
+        <w:t>Provide a CSV with Sa values already computed for each bridge. Must contain structure_number and a spectral acceleration column.</w:t>
+      </w:r>
+    </w:p>
+    <w:tbl>
+      <w:tblPr>
+        <w:tblStyle w:val="TableGrid"/>
+        <w:tblW w:type="auto" w:w="0"/>
+        <w:tblLook w:firstColumn="1" w:firstRow="1" w:lastColumn="0" w:lastRow="0" w:noHBand="0" w:noVBand="1" w:val="04A0"/>
+      </w:tblPr>
+      <w:tblGrid>
+        <w:gridCol w:w="2880"/>
+        <w:gridCol w:w="2880"/>
+        <w:gridCol w:w="2880"/>
+      </w:tblGrid>
+      <w:tr>
+        <w:tc>
+          <w:tcPr>
+            <w:tcW w:type="dxa" w:w="2880"/>
+          </w:tcPr>
+          <w:p>
+            <w:r>
+              <w:rPr>
+                <w:b/>
+              </w:rPr>
+              <w:t>Column Name</w:t>
+            </w:r>
+          </w:p>
+        </w:tc>
+        <w:tc>
+          <w:tcPr>
+            <w:tcW w:type="dxa" w:w="2880"/>
+          </w:tcPr>
+          <w:p>
+            <w:r>
+              <w:rPr>
+                <w:b/>
+              </w:rPr>
+              <w:t>Type</w:t>
+            </w:r>
+          </w:p>
+        </w:tc>
+        <w:tc>
+          <w:tcPr>
+            <w:tcW w:type="dxa" w:w="2880"/>
+          </w:tcPr>
+          <w:p>
+            <w:r>
+              <w:rPr>
+                <w:b/>
+              </w:rPr>
+              <w:t>Description</w:t>
+            </w:r>
+          </w:p>
+        </w:tc>
+      </w:tr>
+      <w:tr>
+        <w:tc>
+          <w:tcPr>
+            <w:tcW w:type="dxa" w:w="2880"/>
+          </w:tcPr>
+          <w:p>
+            <w:r>
+              <w:t>structure_number</w:t>
+            </w:r>
+          </w:p>
+        </w:tc>
+        <w:tc>
+          <w:tcPr>
+            <w:tcW w:type="dxa" w:w="2880"/>
+          </w:tcPr>
+          <w:p>
+            <w:r>
+              <w:t>string</w:t>
+            </w:r>
+          </w:p>
+        </w:tc>
+        <w:tc>
+          <w:tcPr>
+            <w:tcW w:type="dxa" w:w="2880"/>
+          </w:tcPr>
+          <w:p>
+            <w:r>
+              <w:t>Must match bridge inventory</w:t>
+            </w:r>
+          </w:p>
+        </w:tc>
+      </w:tr>
+      <w:tr>
+        <w:tc>
+          <w:tcPr>
+            <w:tcW w:type="dxa" w:w="2880"/>
+          </w:tcPr>
+          <w:p>
+            <w:r>
+              <w:t>sa1s</w:t>
+            </w:r>
+          </w:p>
+        </w:tc>
+        <w:tc>
+          <w:tcPr>
+            <w:tcW w:type="dxa" w:w="2880"/>
+          </w:tcPr>
+          <w:p>
+            <w:r>
+              <w:t>float</w:t>
+            </w:r>
+          </w:p>
+        </w:tc>
+        <w:tc>
+          <w:tcPr>
+            <w:tcW w:type="dxa" w:w="2880"/>
+          </w:tcPr>
+          <w:p>
+            <w:r>
+              <w:t>Sa(1.0s) in g (or PGA, Sa(0.3s) depending on config)</w:t>
+            </w:r>
+          </w:p>
+        </w:tc>
+      </w:tr>
+    </w:tbl>
+    <w:p>
+      <w:pPr/>
+    </w:p>
+    <w:p>
+      <w:pPr>
+        <w:pStyle w:val="Heading3"/>
+      </w:pPr>
+      <w:r>
+        <w:t>13.2.3 Observed Damage (Optional — for validation/calibration only)</w:t>
+      </w:r>
+    </w:p>
+    <w:p>
+      <w:pPr/>
+      <w:r>
+        <w:t>If users want to validate predictions or run MLE calibration against their own observed data, they must provide a CSV with:</w:t>
+      </w:r>
+    </w:p>
+    <w:tbl>
+      <w:tblPr>
+        <w:tblStyle w:val="TableGrid"/>
+        <w:tblW w:type="auto" w:w="0"/>
+        <w:tblLook w:firstColumn="1" w:firstRow="1" w:lastColumn="0" w:lastRow="0" w:noHBand="0" w:noVBand="1" w:val="04A0"/>
+      </w:tblPr>
+      <w:tblGrid>
+        <w:gridCol w:w="2160"/>
+        <w:gridCol w:w="2160"/>
+        <w:gridCol w:w="2160"/>
+        <w:gridCol w:w="2160"/>
+      </w:tblGrid>
+      <w:tr>
+        <w:tc>
+          <w:tcPr>
+            <w:tcW w:type="dxa" w:w="2160"/>
+          </w:tcPr>
+          <w:p>
+            <w:r>
+              <w:rPr>
+                <w:b/>
+              </w:rPr>
+              <w:t>Column Name</w:t>
+            </w:r>
+          </w:p>
+        </w:tc>
+        <w:tc>
+          <w:tcPr>
+            <w:tcW w:type="dxa" w:w="2160"/>
+          </w:tcPr>
+          <w:p>
+            <w:r>
+              <w:rPr>
+                <w:b/>
+              </w:rPr>
+              <w:t>Type</w:t>
+            </w:r>
+          </w:p>
+        </w:tc>
+        <w:tc>
+          <w:tcPr>
+            <w:tcW w:type="dxa" w:w="2160"/>
+          </w:tcPr>
+          <w:p>
+            <w:r>
+              <w:rPr>
+                <w:b/>
+              </w:rPr>
+              <w:t>Description</w:t>
+            </w:r>
+          </w:p>
+        </w:tc>
+        <w:tc>
+          <w:tcPr>
+            <w:tcW w:type="dxa" w:w="2160"/>
+          </w:tcPr>
+          <w:p>
+            <w:r>
+              <w:rPr>
+                <w:b/>
+              </w:rPr>
+              <w:t>Allowed Values</w:t>
+            </w:r>
+          </w:p>
+        </w:tc>
+      </w:tr>
+      <w:tr>
+        <w:tc>
+          <w:tcPr>
+            <w:tcW w:type="dxa" w:w="2160"/>
+          </w:tcPr>
+          <w:p>
+            <w:r>
+              <w:t>structure_number</w:t>
+            </w:r>
+          </w:p>
+        </w:tc>
+        <w:tc>
+          <w:tcPr>
+            <w:tcW w:type="dxa" w:w="2160"/>
+          </w:tcPr>
+          <w:p>
+            <w:r>
+              <w:t>string</w:t>
+            </w:r>
+          </w:p>
+        </w:tc>
+        <w:tc>
+          <w:tcPr>
+            <w:tcW w:type="dxa" w:w="2160"/>
+          </w:tcPr>
+          <w:p>
+            <w:r>
+              <w:t>Bridge identifier (must match inventory)</w:t>
+            </w:r>
+          </w:p>
+        </w:tc>
+        <w:tc>
+          <w:tcPr>
+            <w:tcW w:type="dxa" w:w="2160"/>
+          </w:tcPr>
+          <w:p>
+            <w:r/>
+          </w:p>
+        </w:tc>
+      </w:tr>
+      <w:tr>
+        <w:tc>
+          <w:tcPr>
+            <w:tcW w:type="dxa" w:w="2160"/>
+          </w:tcPr>
+          <w:p>
+            <w:r>
+              <w:t>observed_damage</w:t>
+            </w:r>
+          </w:p>
+        </w:tc>
+        <w:tc>
+          <w:tcPr>
+            <w:tcW w:type="dxa" w:w="2160"/>
+          </w:tcPr>
+          <w:p>
+            <w:r>
+              <w:t>string</w:t>
+            </w:r>
+          </w:p>
+        </w:tc>
+        <w:tc>
+          <w:tcPr>
+            <w:tcW w:type="dxa" w:w="2160"/>
+          </w:tcPr>
+          <w:p>
+            <w:r>
+              <w:t>Post-earthquake damage state</w:t>
+            </w:r>
+          </w:p>
+        </w:tc>
+        <w:tc>
+          <w:tcPr>
+            <w:tcW w:type="dxa" w:w="2160"/>
+          </w:tcPr>
+          <w:p>
+            <w:r>
+              <w:t>none, slight, moderate, extensive, complete</w:t>
+            </w:r>
+          </w:p>
+        </w:tc>
+      </w:tr>
+      <w:tr>
+        <w:tc>
+          <w:tcPr>
+            <w:tcW w:type="dxa" w:w="2160"/>
+          </w:tcPr>
+          <w:p>
+            <w:r>
+              <w:t>latitude</w:t>
+            </w:r>
+          </w:p>
+        </w:tc>
+        <w:tc>
+          <w:tcPr>
+            <w:tcW w:type="dxa" w:w="2160"/>
+          </w:tcPr>
+          <w:p>
+            <w:r>
+              <w:t>float</w:t>
+            </w:r>
+          </w:p>
+        </w:tc>
+        <w:tc>
+          <w:tcPr>
+            <w:tcW w:type="dxa" w:w="2160"/>
+          </w:tcPr>
+          <w:p>
+            <w:r>
+              <w:t>Bridge latitude (if structure_number not in NBI)</w:t>
+            </w:r>
+          </w:p>
+        </w:tc>
+        <w:tc>
+          <w:tcPr>
+            <w:tcW w:type="dxa" w:w="2160"/>
+          </w:tcPr>
+          <w:p>
+            <w:r>
+              <w:t>decimal degrees</w:t>
+            </w:r>
+          </w:p>
+        </w:tc>
+      </w:tr>
+      <w:tr>
+        <w:tc>
+          <w:tcPr>
+            <w:tcW w:type="dxa" w:w="2160"/>
+          </w:tcPr>
+          <w:p>
+            <w:r>
+              <w:t>longitude</w:t>
+            </w:r>
+          </w:p>
+        </w:tc>
+        <w:tc>
+          <w:tcPr>
+            <w:tcW w:type="dxa" w:w="2160"/>
+          </w:tcPr>
+          <w:p>
+            <w:r>
+              <w:t>float</w:t>
+            </w:r>
+          </w:p>
+        </w:tc>
+        <w:tc>
+          <w:tcPr>
+            <w:tcW w:type="dxa" w:w="2160"/>
+          </w:tcPr>
+          <w:p>
+            <w:r>
+              <w:t>Bridge longitude (if structure_number not in NBI)</w:t>
+            </w:r>
+          </w:p>
+        </w:tc>
+        <w:tc>
+          <w:tcPr>
+            <w:tcW w:type="dxa" w:w="2160"/>
+          </w:tcPr>
+          <w:p>
+            <w:r>
+              <w:t>decimal degrees</w:t>
+            </w:r>
+          </w:p>
+        </w:tc>
+      </w:tr>
+    </w:tbl>
+    <w:p>
+      <w:pPr/>
+    </w:p>
+    <w:p>
+      <w:pPr/>
+      <w:r>
+        <w:t>Damage states must use the exact lowercase strings: none, slight, moderate, extensive, complete. These correspond to Hazus damage state definitions (DS0-DS4).</w:t>
+      </w:r>
+    </w:p>
+    <w:p>
+      <w:pPr>
+        <w:pStyle w:val="Heading3"/>
+      </w:pPr>
+      <w:r>
+        <w:t>13.2.4 Aggregate Damage Counts (Optional — for calibration only)</w:t>
+      </w:r>
+    </w:p>
+    <w:p>
+      <w:pPr/>
+      <w:r>
+        <w:t>For MLE calibration, users can optionally provide aggregate observed damage counts instead of per-bridge observations. The format is a Python dict or JSON:</w:t>
+      </w:r>
+    </w:p>
+    <w:p>
+      <w:pPr/>
+      <w:r>
+        <w:t xml:space="preserve">    {"none": 1430, "slight": 98, "moderate": 44, "extensive": 21, "complete": 7}</w:t>
+      </w:r>
+    </w:p>
+    <w:p>
+      <w:pPr/>
+    </w:p>
+    <w:p>
+      <w:pPr/>
+      <w:r>
+        <w:t>If not provided, calibrate_global() defaults to the Basoz (1998) Northridge counts. Users analyzing a different earthquake should provide their own counts.</w:t>
+      </w:r>
+    </w:p>
+    <w:p>
+      <w:pPr>
+        <w:pStyle w:val="Heading2"/>
+      </w:pPr>
+      <w:r>
+        <w:t>13.3 Data Format Requirements</w:t>
+      </w:r>
+    </w:p>
+    <w:tbl>
+      <w:tblPr>
+        <w:tblStyle w:val="TableGrid"/>
+        <w:tblW w:type="auto" w:w="0"/>
+        <w:tblLook w:firstColumn="1" w:firstRow="1" w:lastColumn="0" w:lastRow="0" w:noHBand="0" w:noVBand="1" w:val="04A0"/>
+      </w:tblPr>
+      <w:tblGrid>
+        <w:gridCol w:w="4320"/>
+        <w:gridCol w:w="4320"/>
+      </w:tblGrid>
+      <w:tr>
+        <w:tc>
+          <w:tcPr>
+            <w:tcW w:type="dxa" w:w="4320"/>
+          </w:tcPr>
+          <w:p>
+            <w:r>
+              <w:rPr>
+                <w:b/>
+              </w:rPr>
+              <w:t>Requirement</w:t>
+            </w:r>
+          </w:p>
+        </w:tc>
+        <w:tc>
+          <w:tcPr>
+            <w:tcW w:type="dxa" w:w="4320"/>
+          </w:tcPr>
+          <w:p>
+            <w:r>
+              <w:rPr>
+                <w:b/>
+              </w:rPr>
+              <w:t>Details</w:t>
+            </w:r>
+          </w:p>
+        </w:tc>
+      </w:tr>
+      <w:tr>
+        <w:tc>
+          <w:tcPr>
+            <w:tcW w:type="dxa" w:w="4320"/>
+          </w:tcPr>
+          <w:p>
+            <w:r>
+              <w:t>File format</w:t>
+            </w:r>
+          </w:p>
+        </w:tc>
+        <w:tc>
+          <w:tcPr>
+            <w:tcW w:type="dxa" w:w="4320"/>
+          </w:tcPr>
+          <w:p>
+            <w:r>
+              <w:t>CSV with UTF-8 encoding</w:t>
+            </w:r>
+          </w:p>
+        </w:tc>
+      </w:tr>
+      <w:tr>
+        <w:tc>
+          <w:tcPr>
+            <w:tcW w:type="dxa" w:w="4320"/>
+          </w:tcPr>
+          <w:p>
+            <w:r>
+              <w:t>Header row</w:t>
+            </w:r>
+          </w:p>
+        </w:tc>
+        <w:tc>
+          <w:tcPr>
+            <w:tcW w:type="dxa" w:w="4320"/>
+          </w:tcPr>
+          <w:p>
+            <w:r>
+              <w:t>Required; column names must match exactly (case-sensitive)</w:t>
+            </w:r>
+          </w:p>
+        </w:tc>
+      </w:tr>
+      <w:tr>
+        <w:tc>
+          <w:tcPr>
+            <w:tcW w:type="dxa" w:w="4320"/>
+          </w:tcPr>
+          <w:p>
+            <w:r>
+              <w:t>Coordinate system</w:t>
+            </w:r>
+          </w:p>
+        </w:tc>
+        <w:tc>
+          <w:tcPr>
+            <w:tcW w:type="dxa" w:w="4320"/>
+          </w:tcPr>
+          <w:p>
+            <w:r>
+              <w:t>WGS84 decimal degrees (EPSG:4326)</w:t>
+            </w:r>
+          </w:p>
+        </w:tc>
+      </w:tr>
+      <w:tr>
+        <w:tc>
+          <w:tcPr>
+            <w:tcW w:type="dxa" w:w="4320"/>
+          </w:tcPr>
+          <w:p>
+            <w:r>
+              <w:t>Units</w:t>
+            </w:r>
+          </w:p>
+        </w:tc>
+        <w:tc>
+          <w:tcPr>
+            <w:tcW w:type="dxa" w:w="4320"/>
+          </w:tcPr>
+          <w:p>
+            <w:r>
+              <w:t>Sa in g (acceleration of gravity); length in meters</w:t>
+            </w:r>
+          </w:p>
+        </w:tc>
+      </w:tr>
+      <w:tr>
+        <w:tc>
+          <w:tcPr>
+            <w:tcW w:type="dxa" w:w="4320"/>
+          </w:tcPr>
+          <w:p>
+            <w:r>
+              <w:t>Missing values</w:t>
+            </w:r>
+          </w:p>
+        </w:tc>
+        <w:tc>
+          <w:tcPr>
+            <w:tcW w:type="dxa" w:w="4320"/>
+          </w:tcPr>
+          <w:p>
+            <w:r>
+              <w:t>Empty cells or NaN accepted; defaults applied per Section 6.2</w:t>
+            </w:r>
+          </w:p>
+        </w:tc>
+      </w:tr>
+      <w:tr>
+        <w:tc>
+          <w:tcPr>
+            <w:tcW w:type="dxa" w:w="4320"/>
+          </w:tcPr>
+          <w:p>
+            <w:r>
+              <w:t>Damage states</w:t>
+            </w:r>
+          </w:p>
+        </w:tc>
+        <w:tc>
+          <w:tcPr>
+            <w:tcW w:type="dxa" w:w="4320"/>
+          </w:tcPr>
+          <w:p>
+            <w:r>
+              <w:t>Lowercase strings: none, slight, moderate, extensive, complete</w:t>
+            </w:r>
+          </w:p>
+        </w:tc>
+      </w:tr>
+      <w:tr>
+        <w:tc>
+          <w:tcPr>
+            <w:tcW w:type="dxa" w:w="4320"/>
+          </w:tcPr>
+          <w:p>
+            <w:r>
+              <w:t>Bridge IDs</w:t>
+            </w:r>
+          </w:p>
+        </w:tc>
+        <w:tc>
+          <w:tcPr>
+            <w:tcW w:type="dxa" w:w="4320"/>
+          </w:tcPr>
+          <w:p>
+            <w:r>
+              <w:t>Must be unique within each file; NBI format recommended</w:t>
+            </w:r>
+          </w:p>
+        </w:tc>
+      </w:tr>
+      <w:tr>
+        <w:tc>
+          <w:tcPr>
+            <w:tcW w:type="dxa" w:w="4320"/>
+          </w:tcPr>
+          <w:p>
+            <w:r>
+              <w:t>Line endings</w:t>
+            </w:r>
+          </w:p>
+        </w:tc>
+        <w:tc>
+          <w:tcPr>
+            <w:tcW w:type="dxa" w:w="4320"/>
+          </w:tcPr>
+          <w:p>
+            <w:r>
+              <w:t>Unix (LF) or Windows (CRLF) both accepted</w:t>
+            </w:r>
+          </w:p>
+        </w:tc>
+      </w:tr>
+    </w:tbl>
+    <w:p>
+      <w:pPr/>
+    </w:p>
+    <w:p>
+      <w:pPr>
+        <w:pStyle w:val="Heading2"/>
+      </w:pPr>
+      <w:r>
+        <w:t>13.4 Example: Minimal User Dataset</w:t>
+      </w:r>
+    </w:p>
+    <w:p>
+      <w:pPr/>
+      <w:r>
+        <w:t>Bridge inventory (my_bridges.csv):</w:t>
+      </w:r>
+    </w:p>
+    <w:p>
+      <w:pPr/>
+      <w:r>
+        <w:t xml:space="preserve">    structure_number,latitude,longitude,year_built,material_code,num_spans</w:t>
+      </w:r>
+    </w:p>
+    <w:p>
+      <w:pPr/>
+      <w:r>
+        <w:t xml:space="preserve">    53 0012,34.052,-118.244,1965,1,3</w:t>
+      </w:r>
+    </w:p>
+    <w:p>
+      <w:pPr/>
+      <w:r>
+        <w:t xml:space="preserve">    53 0013,34.061,-118.231,1989,3,1</w:t>
+      </w:r>
+    </w:p>
+    <w:p>
+      <w:pPr/>
+      <w:r>
+        <w:t xml:space="preserve">    53 0014,34.078,-118.259,1952,1,2</w:t>
+      </w:r>
+    </w:p>
+    <w:p>
+      <w:pPr/>
+    </w:p>
+    <w:p>
+      <w:pPr/>
+      <w:r>
+        <w:t>Observed damage for validation (my_observed.csv):</w:t>
+      </w:r>
+    </w:p>
+    <w:p>
+      <w:pPr/>
+      <w:r>
+        <w:t xml:space="preserve">    structure_number,observed_damage</w:t>
+      </w:r>
+    </w:p>
+    <w:p>
+      <w:pPr/>
+      <w:r>
+        <w:t xml:space="preserve">    53 0012,none</w:t>
+      </w:r>
+    </w:p>
+    <w:p>
+      <w:pPr/>
+      <w:r>
+        <w:t xml:space="preserve">    53 0013,slight</w:t>
+      </w:r>
+    </w:p>
+    <w:p>
+      <w:pPr/>
+      <w:r>
+        <w:t xml:space="preserve">    53 0014,moderate</w:t>
+      </w:r>
+    </w:p>
+    <w:p>
+      <w:pPr/>
+    </w:p>
+    <w:p>
+      <w:pPr/>
+      <w:r>
+        <w:t>Run analysis:</w:t>
+      </w:r>
+    </w:p>
+    <w:p>
+      <w:pPr/>
+      <w:r>
+        <w:t xml:space="preserve">    python main.py --bridges my_bridges.csv --event ci3144585</w:t>
+      </w:r>
+    </w:p>
+    <w:p>
+      <w:pPr/>
+    </w:p>
+    <w:p>
+      <w:pPr/>
+      <w:r>
+        <w:t>Run calibration with custom counts:</w:t>
+      </w:r>
+    </w:p>
+    <w:p>
+      <w:pPr/>
+      <w:r>
+        <w:t xml:space="preserve">    # In Python:</w:t>
+      </w:r>
+    </w:p>
+    <w:p>
+      <w:pPr/>
+      <w:r>
+        <w:t xml:space="preserve">    from src.calibration import calibrate_global</w:t>
+      </w:r>
+    </w:p>
+    <w:p>
+      <w:pPr/>
+      <w:r>
+        <w:t xml:space="preserve">    result = calibrate_global(my_bridges_df, obs_counts={"none": 500, "slight": 30, ...})</w:t>
       </w:r>
     </w:p>
     <w:sectPr>

</xml_diff>

<commit_message>
Add Section 9.6 (RCV Estimation) to Technical Documentation
New section 9.6 Replacement Cost Estimation (FHWA 2024) with 8 subsections:
  9.6.1 Formula: RCV = deck_area x base x f_material x f_span x f_skew x f_seismic
  9.6.2 Data Sources table (FHWA, Caltrans, Mackie 2010, Hazus 6.1)
  9.6.3 NBI Fields Used table (7 items: length, width, material, span, skew, year, ADT)
  9.6.4 Adjustment Factor Tables (material, span, skew, seismic era)
  9.6.5 FHWA State-Level Unit Costs (CA $5,005/m2, TX, NY, FL, national avg)
  9.6.6 Example Calculation (bridge 52 0282)
  9.6.7 Configuration (config.yaml cost: section)
  9.6.8 Damage Ratios (Hazus Table 7.11)

Co-Authored-By: Claude Opus 4.6 (1M context) <noreply@anthropic.com>
</commit_message>
<xml_diff>
--- a/CAT411_Technical_Documentation.docx
+++ b/CAT411_Technical_Documentation.docx
@@ -3408,6 +3408,2181 @@
     <w:p>
       <w:r>
         <w:t xml:space="preserve">        global_median_factor: 1.8432</w:t>
+      </w:r>
+    </w:p>
+    <w:p>
+      <w:pPr>
+        <w:pStyle w:val="Heading2"/>
+      </w:pPr>
+      <w:r>
+        <w:t>9.6 Replacement Cost Estimation (FHWA 2024)</w:t>
+      </w:r>
+    </w:p>
+    <w:p>
+      <w:r>
+        <w:t>Bridge replacement cost values (RCV) are estimated from NBI structural attributes using a multi-factor model anchored to FHWA 2024 state-level unit costs. The RCV drives the financial loss calculation: E[Loss] = SUM P(DS) x DR(DS) x RCV.</w:t>
+      </w:r>
+    </w:p>
+    <w:p>
+      <w:pPr>
+        <w:pStyle w:val="Heading3"/>
+      </w:pPr>
+      <w:r>
+        <w:t>9.6.1 Formula</w:t>
+      </w:r>
+    </w:p>
+    <w:p>
+      <w:r>
+        <w:t>RCV = deck_area x base_unit_cost x f_material x f_span x f_skew x f_seismic x f_region</w:t>
+      </w:r>
+    </w:p>
+    <w:p>
+      <w:r>
+        <w:t>Where:</w:t>
+      </w:r>
+    </w:p>
+    <w:p>
+      <w:r>
+        <w:t xml:space="preserve">  - deck_area = structure_length (NBI Item 049) x deck_width (NBI Item 052), in m2</w:t>
+      </w:r>
+    </w:p>
+    <w:p>
+      <w:r>
+        <w:t xml:space="preserve">  - base_unit_cost = FHWA 2024 state-level blended rate ($/m2)</w:t>
+      </w:r>
+    </w:p>
+    <w:p>
+      <w:r>
+        <w:t xml:space="preserve">  - f_material = material-type adjustment (concrete, steel, prestressed, wood)</w:t>
+      </w:r>
+    </w:p>
+    <w:p>
+      <w:r>
+        <w:t xml:space="preserve">  - f_span = max span length complexity factor (NBI Item 048)</w:t>
+      </w:r>
+    </w:p>
+    <w:p>
+      <w:r>
+        <w:t xml:space="preserve">  - f_skew = skew angle construction difficulty factor (NBI Item 034)</w:t>
+      </w:r>
+    </w:p>
+    <w:p>
+      <w:r>
+        <w:t xml:space="preserve">  - f_seismic = seismic design era factor (from year_built, NBI Item 027)</w:t>
+      </w:r>
+    </w:p>
+    <w:p>
+      <w:r>
+        <w:t xml:space="preserve">  - f_region = regional cost adjustment (default 1.0, since base rate is state-specific)</w:t>
+      </w:r>
+    </w:p>
+    <w:p>
+      <w:pPr>
+        <w:pStyle w:val="Heading3"/>
+      </w:pPr>
+      <w:r>
+        <w:t>9.6.2 Data Sources</w:t>
+      </w:r>
+    </w:p>
+    <w:tbl>
+      <w:tblPr>
+        <w:tblStyle w:val="TableGrid"/>
+        <w:tblW w:type="auto" w:w="0"/>
+        <w:tblLook w:firstColumn="1" w:firstRow="1" w:lastColumn="0" w:lastRow="0" w:noHBand="0" w:noVBand="1" w:val="04A0"/>
+      </w:tblPr>
+      <w:tblGrid>
+        <w:gridCol w:w="2880"/>
+        <w:gridCol w:w="2880"/>
+        <w:gridCol w:w="2880"/>
+      </w:tblGrid>
+      <w:tr>
+        <w:tc>
+          <w:tcPr>
+            <w:tcW w:type="dxa" w:w="2880"/>
+          </w:tcPr>
+          <w:p>
+            <w:r>
+              <w:rPr>
+                <w:b/>
+              </w:rPr>
+              <w:t>Parameter</w:t>
+            </w:r>
+          </w:p>
+        </w:tc>
+        <w:tc>
+          <w:tcPr>
+            <w:tcW w:type="dxa" w:w="2880"/>
+          </w:tcPr>
+          <w:p>
+            <w:r>
+              <w:rPr>
+                <w:b/>
+              </w:rPr>
+              <w:t>Source</w:t>
+            </w:r>
+          </w:p>
+        </w:tc>
+        <w:tc>
+          <w:tcPr>
+            <w:tcW w:type="dxa" w:w="2880"/>
+          </w:tcPr>
+          <w:p>
+            <w:r>
+              <w:rPr>
+                <w:b/>
+              </w:rPr>
+              <w:t>Citation / URL</w:t>
+            </w:r>
+          </w:p>
+        </w:tc>
+      </w:tr>
+      <w:tr>
+        <w:tc>
+          <w:tcPr>
+            <w:tcW w:type="dxa" w:w="2880"/>
+          </w:tcPr>
+          <w:p>
+            <w:r>
+              <w:t>base_unit_cost ($5,005/m2 for CA)</w:t>
+            </w:r>
+          </w:p>
+        </w:tc>
+        <w:tc>
+          <w:tcPr>
+            <w:tcW w:type="dxa" w:w="2880"/>
+          </w:tcPr>
+          <w:p>
+            <w:r>
+              <w:t>FHWA Bridge Replacement Unit Costs 2024</w:t>
+            </w:r>
+          </w:p>
+        </w:tc>
+        <w:tc>
+          <w:tcPr>
+            <w:tcW w:type="dxa" w:w="2880"/>
+          </w:tcPr>
+          <w:p>
+            <w:r>
+              <w:t>fhwa.dot.gov/bridge/nbi/sd2024.cfm</w:t>
+            </w:r>
+          </w:p>
+        </w:tc>
+      </w:tr>
+      <w:tr>
+        <w:tc>
+          <w:tcPr>
+            <w:tcW w:type="dxa" w:w="2880"/>
+          </w:tcPr>
+          <w:p>
+            <w:r>
+              <w:t>FHWA methodology</w:t>
+            </w:r>
+          </w:p>
+        </w:tc>
+        <w:tc>
+          <w:tcPr>
+            <w:tcW w:type="dxa" w:w="2880"/>
+          </w:tcPr>
+          <w:p>
+            <w:r>
+              <w:t>FHWA Unit Cost Methodology Explanation</w:t>
+            </w:r>
+          </w:p>
+        </w:tc>
+        <w:tc>
+          <w:tcPr>
+            <w:tcW w:type="dxa" w:w="2880"/>
+          </w:tcPr>
+          <w:p>
+            <w:r>
+              <w:t>fhwa.dot.gov/bridge/nbi/uc_explain.cfm</w:t>
+            </w:r>
+          </w:p>
+        </w:tc>
+      </w:tr>
+      <w:tr>
+        <w:tc>
+          <w:tcPr>
+            <w:tcW w:type="dxa" w:w="2880"/>
+          </w:tcPr>
+          <w:p>
+            <w:r>
+              <w:t>Material adjustment factors</w:t>
+            </w:r>
+          </w:p>
+        </w:tc>
+        <w:tc>
+          <w:tcPr>
+            <w:tcW w:type="dxa" w:w="2880"/>
+          </w:tcPr>
+          <w:p>
+            <w:r>
+              <w:t>Caltrans Comparative Bridge Costs 2022</w:t>
+            </w:r>
+          </w:p>
+        </w:tc>
+        <w:tc>
+          <w:tcPr>
+            <w:tcW w:type="dxa" w:w="2880"/>
+          </w:tcPr>
+          <w:p>
+            <w:r>
+              <w:t>dot.ca.gov (comp-br-costs-2022.pdf)</w:t>
+            </w:r>
+          </w:p>
+        </w:tc>
+      </w:tr>
+      <w:tr>
+        <w:tc>
+          <w:tcPr>
+            <w:tcW w:type="dxa" w:w="2880"/>
+          </w:tcPr>
+          <w:p>
+            <w:r>
+              <w:t>Span/skew/seismic factors</w:t>
+            </w:r>
+          </w:p>
+        </w:tc>
+        <w:tc>
+          <w:tcPr>
+            <w:tcW w:type="dxa" w:w="2880"/>
+          </w:tcPr>
+          <w:p>
+            <w:r>
+              <w:t>Engineering judgment; Mackie &amp; Stojadinovic (2010)</w:t>
+            </w:r>
+          </w:p>
+        </w:tc>
+        <w:tc>
+          <w:tcPr>
+            <w:tcW w:type="dxa" w:w="2880"/>
+          </w:tcPr>
+          <w:p>
+            <w:r>
+              <w:t>Earthquake Eng. &amp; Structural Dynamics, Vol.39(3), pp.281-301</w:t>
+            </w:r>
+          </w:p>
+        </w:tc>
+      </w:tr>
+      <w:tr>
+        <w:tc>
+          <w:tcPr>
+            <w:tcW w:type="dxa" w:w="2880"/>
+          </w:tcPr>
+          <w:p>
+            <w:r>
+              <w:t>Damage ratios (DR)</w:t>
+            </w:r>
+          </w:p>
+        </w:tc>
+        <w:tc>
+          <w:tcPr>
+            <w:tcW w:type="dxa" w:w="2880"/>
+          </w:tcPr>
+          <w:p>
+            <w:r>
+              <w:t>Hazus 6.1 Table 7.11</w:t>
+            </w:r>
+          </w:p>
+        </w:tc>
+        <w:tc>
+          <w:tcPr>
+            <w:tcW w:type="dxa" w:w="2880"/>
+          </w:tcPr>
+          <w:p>
+            <w:r>
+              <w:t>FEMA Hazus 6.1 Earthquake Technical Manual, Chapter 7</w:t>
+            </w:r>
+          </w:p>
+        </w:tc>
+      </w:tr>
+      <w:tr>
+        <w:tc>
+          <w:tcPr>
+            <w:tcW w:type="dxa" w:w="2880"/>
+          </w:tcPr>
+          <w:p>
+            <w:r>
+              <w:t>NBI bridge attributes</w:t>
+            </w:r>
+          </w:p>
+        </w:tc>
+        <w:tc>
+          <w:tcPr>
+            <w:tcW w:type="dxa" w:w="2880"/>
+          </w:tcPr>
+          <w:p>
+            <w:r>
+              <w:t>FHWA National Bridge Inventory 2024</w:t>
+            </w:r>
+          </w:p>
+        </w:tc>
+        <w:tc>
+          <w:tcPr>
+            <w:tcW w:type="dxa" w:w="2880"/>
+          </w:tcPr>
+          <w:p>
+            <w:r>
+              <w:t>fhwa.dot.gov/bridge/nbi.cfm</w:t>
+            </w:r>
+          </w:p>
+        </w:tc>
+      </w:tr>
+    </w:tbl>
+    <w:p/>
+    <w:p>
+      <w:pPr>
+        <w:pStyle w:val="Heading3"/>
+      </w:pPr>
+      <w:r>
+        <w:t>9.6.3 NBI Fields Used</w:t>
+      </w:r>
+    </w:p>
+    <w:tbl>
+      <w:tblPr>
+        <w:tblStyle w:val="TableGrid"/>
+        <w:tblW w:type="auto" w:w="0"/>
+        <w:tblLook w:firstColumn="1" w:firstRow="1" w:lastColumn="0" w:lastRow="0" w:noHBand="0" w:noVBand="1" w:val="04A0"/>
+      </w:tblPr>
+      <w:tblGrid>
+        <w:gridCol w:w="2160"/>
+        <w:gridCol w:w="2160"/>
+        <w:gridCol w:w="2160"/>
+        <w:gridCol w:w="2160"/>
+      </w:tblGrid>
+      <w:tr>
+        <w:tc>
+          <w:tcPr>
+            <w:tcW w:type="dxa" w:w="2160"/>
+          </w:tcPr>
+          <w:p>
+            <w:r>
+              <w:rPr>
+                <w:b/>
+              </w:rPr>
+              <w:t>NBI Item</w:t>
+            </w:r>
+          </w:p>
+        </w:tc>
+        <w:tc>
+          <w:tcPr>
+            <w:tcW w:type="dxa" w:w="2160"/>
+          </w:tcPr>
+          <w:p>
+            <w:r>
+              <w:rPr>
+                <w:b/>
+              </w:rPr>
+              <w:t>Column Name</w:t>
+            </w:r>
+          </w:p>
+        </w:tc>
+        <w:tc>
+          <w:tcPr>
+            <w:tcW w:type="dxa" w:w="2160"/>
+          </w:tcPr>
+          <w:p>
+            <w:r>
+              <w:rPr>
+                <w:b/>
+              </w:rPr>
+              <w:t>Field</w:t>
+            </w:r>
+          </w:p>
+        </w:tc>
+        <w:tc>
+          <w:tcPr>
+            <w:tcW w:type="dxa" w:w="2160"/>
+          </w:tcPr>
+          <w:p>
+            <w:r>
+              <w:rPr>
+                <w:b/>
+              </w:rPr>
+              <w:t>Use in RCV</w:t>
+            </w:r>
+          </w:p>
+        </w:tc>
+      </w:tr>
+      <w:tr>
+        <w:tc>
+          <w:tcPr>
+            <w:tcW w:type="dxa" w:w="2160"/>
+          </w:tcPr>
+          <w:p>
+            <w:r>
+              <w:t>049</w:t>
+            </w:r>
+          </w:p>
+        </w:tc>
+        <w:tc>
+          <w:tcPr>
+            <w:tcW w:type="dxa" w:w="2160"/>
+          </w:tcPr>
+          <w:p>
+            <w:r>
+              <w:t>STRUCTURE_LEN_MT_049</w:t>
+            </w:r>
+          </w:p>
+        </w:tc>
+        <w:tc>
+          <w:tcPr>
+            <w:tcW w:type="dxa" w:w="2160"/>
+          </w:tcPr>
+          <w:p>
+            <w:r>
+              <w:t>Structure Length (m)</w:t>
+            </w:r>
+          </w:p>
+        </w:tc>
+        <w:tc>
+          <w:tcPr>
+            <w:tcW w:type="dxa" w:w="2160"/>
+          </w:tcPr>
+          <w:p>
+            <w:r>
+              <w:t>Deck area = length x width</w:t>
+            </w:r>
+          </w:p>
+        </w:tc>
+      </w:tr>
+      <w:tr>
+        <w:tc>
+          <w:tcPr>
+            <w:tcW w:type="dxa" w:w="2160"/>
+          </w:tcPr>
+          <w:p>
+            <w:r>
+              <w:t>052</w:t>
+            </w:r>
+          </w:p>
+        </w:tc>
+        <w:tc>
+          <w:tcPr>
+            <w:tcW w:type="dxa" w:w="2160"/>
+          </w:tcPr>
+          <w:p>
+            <w:r>
+              <w:t>DECK_WIDTH_MT_052</w:t>
+            </w:r>
+          </w:p>
+        </w:tc>
+        <w:tc>
+          <w:tcPr>
+            <w:tcW w:type="dxa" w:w="2160"/>
+          </w:tcPr>
+          <w:p>
+            <w:r>
+              <w:t>Deck Width (m)</w:t>
+            </w:r>
+          </w:p>
+        </w:tc>
+        <w:tc>
+          <w:tcPr>
+            <w:tcW w:type="dxa" w:w="2160"/>
+          </w:tcPr>
+          <w:p>
+            <w:r>
+              <w:t>Deck area = length x width</w:t>
+            </w:r>
+          </w:p>
+        </w:tc>
+      </w:tr>
+      <w:tr>
+        <w:tc>
+          <w:tcPr>
+            <w:tcW w:type="dxa" w:w="2160"/>
+          </w:tcPr>
+          <w:p>
+            <w:r>
+              <w:t>043A</w:t>
+            </w:r>
+          </w:p>
+        </w:tc>
+        <w:tc>
+          <w:tcPr>
+            <w:tcW w:type="dxa" w:w="2160"/>
+          </w:tcPr>
+          <w:p>
+            <w:r>
+              <w:t>STRUCTURE_KIND_043A</w:t>
+            </w:r>
+          </w:p>
+        </w:tc>
+        <w:tc>
+          <w:tcPr>
+            <w:tcW w:type="dxa" w:w="2160"/>
+          </w:tcPr>
+          <w:p>
+            <w:r>
+              <w:t>Kind of Material</w:t>
+            </w:r>
+          </w:p>
+        </w:tc>
+        <w:tc>
+          <w:tcPr>
+            <w:tcW w:type="dxa" w:w="2160"/>
+          </w:tcPr>
+          <w:p>
+            <w:r>
+              <w:t>Material factor lookup</w:t>
+            </w:r>
+          </w:p>
+        </w:tc>
+      </w:tr>
+      <w:tr>
+        <w:tc>
+          <w:tcPr>
+            <w:tcW w:type="dxa" w:w="2160"/>
+          </w:tcPr>
+          <w:p>
+            <w:r>
+              <w:t>048</w:t>
+            </w:r>
+          </w:p>
+        </w:tc>
+        <w:tc>
+          <w:tcPr>
+            <w:tcW w:type="dxa" w:w="2160"/>
+          </w:tcPr>
+          <w:p>
+            <w:r>
+              <w:t>MAX_SPAN_LEN_MT_048</w:t>
+            </w:r>
+          </w:p>
+        </w:tc>
+        <w:tc>
+          <w:tcPr>
+            <w:tcW w:type="dxa" w:w="2160"/>
+          </w:tcPr>
+          <w:p>
+            <w:r>
+              <w:t>Max Span Length (m)</w:t>
+            </w:r>
+          </w:p>
+        </w:tc>
+        <w:tc>
+          <w:tcPr>
+            <w:tcW w:type="dxa" w:w="2160"/>
+          </w:tcPr>
+          <w:p>
+            <w:r>
+              <w:t>Span complexity factor</w:t>
+            </w:r>
+          </w:p>
+        </w:tc>
+      </w:tr>
+      <w:tr>
+        <w:tc>
+          <w:tcPr>
+            <w:tcW w:type="dxa" w:w="2160"/>
+          </w:tcPr>
+          <w:p>
+            <w:r>
+              <w:t>034</w:t>
+            </w:r>
+          </w:p>
+        </w:tc>
+        <w:tc>
+          <w:tcPr>
+            <w:tcW w:type="dxa" w:w="2160"/>
+          </w:tcPr>
+          <w:p>
+            <w:r>
+              <w:t>DEGREES_SKEW_034</w:t>
+            </w:r>
+          </w:p>
+        </w:tc>
+        <w:tc>
+          <w:tcPr>
+            <w:tcW w:type="dxa" w:w="2160"/>
+          </w:tcPr>
+          <w:p>
+            <w:r>
+              <w:t>Skew Angle (degrees)</w:t>
+            </w:r>
+          </w:p>
+        </w:tc>
+        <w:tc>
+          <w:tcPr>
+            <w:tcW w:type="dxa" w:w="2160"/>
+          </w:tcPr>
+          <w:p>
+            <w:r>
+              <w:t>Skew construction factor</w:t>
+            </w:r>
+          </w:p>
+        </w:tc>
+      </w:tr>
+      <w:tr>
+        <w:tc>
+          <w:tcPr>
+            <w:tcW w:type="dxa" w:w="2160"/>
+          </w:tcPr>
+          <w:p>
+            <w:r>
+              <w:t>027</w:t>
+            </w:r>
+          </w:p>
+        </w:tc>
+        <w:tc>
+          <w:tcPr>
+            <w:tcW w:type="dxa" w:w="2160"/>
+          </w:tcPr>
+          <w:p>
+            <w:r>
+              <w:t>YEAR_BUILT_027</w:t>
+            </w:r>
+          </w:p>
+        </w:tc>
+        <w:tc>
+          <w:tcPr>
+            <w:tcW w:type="dxa" w:w="2160"/>
+          </w:tcPr>
+          <w:p>
+            <w:r>
+              <w:t>Year Built</w:t>
+            </w:r>
+          </w:p>
+        </w:tc>
+        <w:tc>
+          <w:tcPr>
+            <w:tcW w:type="dxa" w:w="2160"/>
+          </w:tcPr>
+          <w:p>
+            <w:r>
+              <w:t>Seismic design era factor</w:t>
+            </w:r>
+          </w:p>
+        </w:tc>
+      </w:tr>
+      <w:tr>
+        <w:tc>
+          <w:tcPr>
+            <w:tcW w:type="dxa" w:w="2160"/>
+          </w:tcPr>
+          <w:p>
+            <w:r>
+              <w:t>029</w:t>
+            </w:r>
+          </w:p>
+        </w:tc>
+        <w:tc>
+          <w:tcPr>
+            <w:tcW w:type="dxa" w:w="2160"/>
+          </w:tcPr>
+          <w:p>
+            <w:r>
+              <w:t>ADT_029</w:t>
+            </w:r>
+          </w:p>
+        </w:tc>
+        <w:tc>
+          <w:tcPr>
+            <w:tcW w:type="dxa" w:w="2160"/>
+          </w:tcPr>
+          <w:p>
+            <w:r>
+              <w:t>Average Daily Traffic</w:t>
+            </w:r>
+          </w:p>
+        </w:tc>
+        <w:tc>
+          <w:tcPr>
+            <w:tcW w:type="dxa" w:w="2160"/>
+          </w:tcPr>
+          <w:p>
+            <w:r>
+              <w:t>Parsed but not used in RCV (available for future use)</w:t>
+            </w:r>
+          </w:p>
+        </w:tc>
+      </w:tr>
+    </w:tbl>
+    <w:p/>
+    <w:p>
+      <w:pPr>
+        <w:pStyle w:val="Heading3"/>
+      </w:pPr>
+      <w:r>
+        <w:t>9.6.4 Adjustment Factor Tables</w:t>
+      </w:r>
+    </w:p>
+    <w:p>
+      <w:r>
+        <w:t>Material factors (relative to FHWA blended average):</w:t>
+      </w:r>
+    </w:p>
+    <w:tbl>
+      <w:tblPr>
+        <w:tblStyle w:val="TableGrid"/>
+        <w:tblW w:type="auto" w:w="0"/>
+        <w:tblLook w:firstColumn="1" w:firstRow="1" w:lastColumn="0" w:lastRow="0" w:noHBand="0" w:noVBand="1" w:val="04A0"/>
+      </w:tblPr>
+      <w:tblGrid>
+        <w:gridCol w:w="2160"/>
+        <w:gridCol w:w="2160"/>
+        <w:gridCol w:w="2160"/>
+        <w:gridCol w:w="2160"/>
+      </w:tblGrid>
+      <w:tr>
+        <w:tc>
+          <w:tcPr>
+            <w:tcW w:type="dxa" w:w="2160"/>
+          </w:tcPr>
+          <w:p>
+            <w:r>
+              <w:rPr>
+                <w:b/>
+              </w:rPr>
+              <w:t>NBI Code</w:t>
+            </w:r>
+          </w:p>
+        </w:tc>
+        <w:tc>
+          <w:tcPr>
+            <w:tcW w:type="dxa" w:w="2160"/>
+          </w:tcPr>
+          <w:p>
+            <w:r>
+              <w:rPr>
+                <w:b/>
+              </w:rPr>
+              <w:t>Material</w:t>
+            </w:r>
+          </w:p>
+        </w:tc>
+        <w:tc>
+          <w:tcPr>
+            <w:tcW w:type="dxa" w:w="2160"/>
+          </w:tcPr>
+          <w:p>
+            <w:r>
+              <w:rPr>
+                <w:b/>
+              </w:rPr>
+              <w:t>Factor</w:t>
+            </w:r>
+          </w:p>
+        </w:tc>
+        <w:tc>
+          <w:tcPr>
+            <w:tcW w:type="dxa" w:w="2160"/>
+          </w:tcPr>
+          <w:p>
+            <w:r>
+              <w:rPr>
+                <w:b/>
+              </w:rPr>
+              <w:t>Rationale</w:t>
+            </w:r>
+          </w:p>
+        </w:tc>
+      </w:tr>
+      <w:tr>
+        <w:tc>
+          <w:tcPr>
+            <w:tcW w:type="dxa" w:w="2160"/>
+          </w:tcPr>
+          <w:p>
+            <w:r>
+              <w:t>1, 2</w:t>
+            </w:r>
+          </w:p>
+        </w:tc>
+        <w:tc>
+          <w:tcPr>
+            <w:tcW w:type="dxa" w:w="2160"/>
+          </w:tcPr>
+          <w:p>
+            <w:r>
+              <w:t>Concrete / Concrete Continuous</w:t>
+            </w:r>
+          </w:p>
+        </w:tc>
+        <w:tc>
+          <w:tcPr>
+            <w:tcW w:type="dxa" w:w="2160"/>
+          </w:tcPr>
+          <w:p>
+            <w:r>
+              <w:t>0.90</w:t>
+            </w:r>
+          </w:p>
+        </w:tc>
+        <w:tc>
+          <w:tcPr>
+            <w:tcW w:type="dxa" w:w="2160"/>
+          </w:tcPr>
+          <w:p>
+            <w:r>
+              <w:t>Lower material cost than steel</w:t>
+            </w:r>
+          </w:p>
+        </w:tc>
+      </w:tr>
+      <w:tr>
+        <w:tc>
+          <w:tcPr>
+            <w:tcW w:type="dxa" w:w="2160"/>
+          </w:tcPr>
+          <w:p>
+            <w:r>
+              <w:t>3, 4</w:t>
+            </w:r>
+          </w:p>
+        </w:tc>
+        <w:tc>
+          <w:tcPr>
+            <w:tcW w:type="dxa" w:w="2160"/>
+          </w:tcPr>
+          <w:p>
+            <w:r>
+              <w:t>Steel / Steel Continuous</w:t>
+            </w:r>
+          </w:p>
+        </w:tc>
+        <w:tc>
+          <w:tcPr>
+            <w:tcW w:type="dxa" w:w="2160"/>
+          </w:tcPr>
+          <w:p>
+            <w:r>
+              <w:t>1.15</w:t>
+            </w:r>
+          </w:p>
+        </w:tc>
+        <w:tc>
+          <w:tcPr>
+            <w:tcW w:type="dxa" w:w="2160"/>
+          </w:tcPr>
+          <w:p>
+            <w:r>
+              <w:t>Higher fabrication + erection cost</w:t>
+            </w:r>
+          </w:p>
+        </w:tc>
+      </w:tr>
+      <w:tr>
+        <w:tc>
+          <w:tcPr>
+            <w:tcW w:type="dxa" w:w="2160"/>
+          </w:tcPr>
+          <w:p>
+            <w:r>
+              <w:t>5, 6</w:t>
+            </w:r>
+          </w:p>
+        </w:tc>
+        <w:tc>
+          <w:tcPr>
+            <w:tcW w:type="dxa" w:w="2160"/>
+          </w:tcPr>
+          <w:p>
+            <w:r>
+              <w:t>Prestressed / Prestressed Continuous</w:t>
+            </w:r>
+          </w:p>
+        </w:tc>
+        <w:tc>
+          <w:tcPr>
+            <w:tcW w:type="dxa" w:w="2160"/>
+          </w:tcPr>
+          <w:p>
+            <w:r>
+              <w:t>1.00</w:t>
+            </w:r>
+          </w:p>
+        </w:tc>
+        <w:tc>
+          <w:tcPr>
+            <w:tcW w:type="dxa" w:w="2160"/>
+          </w:tcPr>
+          <w:p>
+            <w:r>
+              <w:t>Reference (blended average)</w:t>
+            </w:r>
+          </w:p>
+        </w:tc>
+      </w:tr>
+      <w:tr>
+        <w:tc>
+          <w:tcPr>
+            <w:tcW w:type="dxa" w:w="2160"/>
+          </w:tcPr>
+          <w:p>
+            <w:r>
+              <w:t>7</w:t>
+            </w:r>
+          </w:p>
+        </w:tc>
+        <w:tc>
+          <w:tcPr>
+            <w:tcW w:type="dxa" w:w="2160"/>
+          </w:tcPr>
+          <w:p>
+            <w:r>
+              <w:t>Wood / Timber</w:t>
+            </w:r>
+          </w:p>
+        </w:tc>
+        <w:tc>
+          <w:tcPr>
+            <w:tcW w:type="dxa" w:w="2160"/>
+          </w:tcPr>
+          <w:p>
+            <w:r>
+              <w:t>0.65</w:t>
+            </w:r>
+          </w:p>
+        </w:tc>
+        <w:tc>
+          <w:tcPr>
+            <w:tcW w:type="dxa" w:w="2160"/>
+          </w:tcPr>
+          <w:p>
+            <w:r>
+              <w:t>Simplest construction</w:t>
+            </w:r>
+          </w:p>
+        </w:tc>
+      </w:tr>
+      <w:tr>
+        <w:tc>
+          <w:tcPr>
+            <w:tcW w:type="dxa" w:w="2160"/>
+          </w:tcPr>
+          <w:p>
+            <w:r>
+              <w:t>0, 9</w:t>
+            </w:r>
+          </w:p>
+        </w:tc>
+        <w:tc>
+          <w:tcPr>
+            <w:tcW w:type="dxa" w:w="2160"/>
+          </w:tcPr>
+          <w:p>
+            <w:r>
+              <w:t>Other / Aluminum</w:t>
+            </w:r>
+          </w:p>
+        </w:tc>
+        <w:tc>
+          <w:tcPr>
+            <w:tcW w:type="dxa" w:w="2160"/>
+          </w:tcPr>
+          <w:p>
+            <w:r>
+              <w:t>0.95</w:t>
+            </w:r>
+          </w:p>
+        </w:tc>
+        <w:tc>
+          <w:tcPr>
+            <w:tcW w:type="dxa" w:w="2160"/>
+          </w:tcPr>
+          <w:p>
+            <w:r>
+              <w:t>Near blended average</w:t>
+            </w:r>
+          </w:p>
+        </w:tc>
+      </w:tr>
+    </w:tbl>
+    <w:p/>
+    <w:p>
+      <w:r>
+        <w:t>Span complexity factors (based on max span length):</w:t>
+      </w:r>
+    </w:p>
+    <w:tbl>
+      <w:tblPr>
+        <w:tblStyle w:val="TableGrid"/>
+        <w:tblW w:type="auto" w:w="0"/>
+        <w:tblLook w:firstColumn="1" w:firstRow="1" w:lastColumn="0" w:lastRow="0" w:noHBand="0" w:noVBand="1" w:val="04A0"/>
+      </w:tblPr>
+      <w:tblGrid>
+        <w:gridCol w:w="2880"/>
+        <w:gridCol w:w="2880"/>
+        <w:gridCol w:w="2880"/>
+      </w:tblGrid>
+      <w:tr>
+        <w:tc>
+          <w:tcPr>
+            <w:tcW w:type="dxa" w:w="2880"/>
+          </w:tcPr>
+          <w:p>
+            <w:r>
+              <w:rPr>
+                <w:b/>
+              </w:rPr>
+              <w:t>Max Span Length</w:t>
+            </w:r>
+          </w:p>
+        </w:tc>
+        <w:tc>
+          <w:tcPr>
+            <w:tcW w:type="dxa" w:w="2880"/>
+          </w:tcPr>
+          <w:p>
+            <w:r>
+              <w:rPr>
+                <w:b/>
+              </w:rPr>
+              <w:t>Factor</w:t>
+            </w:r>
+          </w:p>
+        </w:tc>
+        <w:tc>
+          <w:tcPr>
+            <w:tcW w:type="dxa" w:w="2880"/>
+          </w:tcPr>
+          <w:p>
+            <w:r>
+              <w:rPr>
+                <w:b/>
+              </w:rPr>
+              <w:t>Rationale</w:t>
+            </w:r>
+          </w:p>
+        </w:tc>
+      </w:tr>
+      <w:tr>
+        <w:tc>
+          <w:tcPr>
+            <w:tcW w:type="dxa" w:w="2880"/>
+          </w:tcPr>
+          <w:p>
+            <w:r>
+              <w:t>&lt; 30 m</w:t>
+            </w:r>
+          </w:p>
+        </w:tc>
+        <w:tc>
+          <w:tcPr>
+            <w:tcW w:type="dxa" w:w="2880"/>
+          </w:tcPr>
+          <w:p>
+            <w:r>
+              <w:t>1.00</w:t>
+            </w:r>
+          </w:p>
+        </w:tc>
+        <w:tc>
+          <w:tcPr>
+            <w:tcW w:type="dxa" w:w="2880"/>
+          </w:tcPr>
+          <w:p>
+            <w:r>
+              <w:t>Standard span, conventional girders</w:t>
+            </w:r>
+          </w:p>
+        </w:tc>
+      </w:tr>
+      <w:tr>
+        <w:tc>
+          <w:tcPr>
+            <w:tcW w:type="dxa" w:w="2880"/>
+          </w:tcPr>
+          <w:p>
+            <w:r>
+              <w:t>30 - 60 m</w:t>
+            </w:r>
+          </w:p>
+        </w:tc>
+        <w:tc>
+          <w:tcPr>
+            <w:tcW w:type="dxa" w:w="2880"/>
+          </w:tcPr>
+          <w:p>
+            <w:r>
+              <w:t>1.10</w:t>
+            </w:r>
+          </w:p>
+        </w:tc>
+        <w:tc>
+          <w:tcPr>
+            <w:tcW w:type="dxa" w:w="2880"/>
+          </w:tcPr>
+          <w:p>
+            <w:r>
+              <w:t>Deeper girders, more complex formwork</w:t>
+            </w:r>
+          </w:p>
+        </w:tc>
+      </w:tr>
+      <w:tr>
+        <w:tc>
+          <w:tcPr>
+            <w:tcW w:type="dxa" w:w="2880"/>
+          </w:tcPr>
+          <w:p>
+            <w:r>
+              <w:t>60 - 120 m</w:t>
+            </w:r>
+          </w:p>
+        </w:tc>
+        <w:tc>
+          <w:tcPr>
+            <w:tcW w:type="dxa" w:w="2880"/>
+          </w:tcPr>
+          <w:p>
+            <w:r>
+              <w:t>1.25</w:t>
+            </w:r>
+          </w:p>
+        </w:tc>
+        <w:tc>
+          <w:tcPr>
+            <w:tcW w:type="dxa" w:w="2880"/>
+          </w:tcPr>
+          <w:p>
+            <w:r>
+              <w:t>Box girder or steel truss required</w:t>
+            </w:r>
+          </w:p>
+        </w:tc>
+      </w:tr>
+      <w:tr>
+        <w:tc>
+          <w:tcPr>
+            <w:tcW w:type="dxa" w:w="2880"/>
+          </w:tcPr>
+          <w:p>
+            <w:r>
+              <w:t>&gt; 120 m</w:t>
+            </w:r>
+          </w:p>
+        </w:tc>
+        <w:tc>
+          <w:tcPr>
+            <w:tcW w:type="dxa" w:w="2880"/>
+          </w:tcPr>
+          <w:p>
+            <w:r>
+              <w:t>1.50</w:t>
+            </w:r>
+          </w:p>
+        </w:tc>
+        <w:tc>
+          <w:tcPr>
+            <w:tcW w:type="dxa" w:w="2880"/>
+          </w:tcPr>
+          <w:p>
+            <w:r>
+              <w:t>Major bridge, specialized engineering</w:t>
+            </w:r>
+          </w:p>
+        </w:tc>
+      </w:tr>
+    </w:tbl>
+    <w:p/>
+    <w:p>
+      <w:r>
+        <w:t>Skew angle factors:</w:t>
+      </w:r>
+    </w:p>
+    <w:tbl>
+      <w:tblPr>
+        <w:tblStyle w:val="TableGrid"/>
+        <w:tblW w:type="auto" w:w="0"/>
+        <w:tblLook w:firstColumn="1" w:firstRow="1" w:lastColumn="0" w:lastRow="0" w:noHBand="0" w:noVBand="1" w:val="04A0"/>
+      </w:tblPr>
+      <w:tblGrid>
+        <w:gridCol w:w="2880"/>
+        <w:gridCol w:w="2880"/>
+        <w:gridCol w:w="2880"/>
+      </w:tblGrid>
+      <w:tr>
+        <w:tc>
+          <w:tcPr>
+            <w:tcW w:type="dxa" w:w="2880"/>
+          </w:tcPr>
+          <w:p>
+            <w:r>
+              <w:rPr>
+                <w:b/>
+              </w:rPr>
+              <w:t>Skew Angle</w:t>
+            </w:r>
+          </w:p>
+        </w:tc>
+        <w:tc>
+          <w:tcPr>
+            <w:tcW w:type="dxa" w:w="2880"/>
+          </w:tcPr>
+          <w:p>
+            <w:r>
+              <w:rPr>
+                <w:b/>
+              </w:rPr>
+              <w:t>Factor</w:t>
+            </w:r>
+          </w:p>
+        </w:tc>
+        <w:tc>
+          <w:tcPr>
+            <w:tcW w:type="dxa" w:w="2880"/>
+          </w:tcPr>
+          <w:p>
+            <w:r>
+              <w:rPr>
+                <w:b/>
+              </w:rPr>
+              <w:t>Rationale</w:t>
+            </w:r>
+          </w:p>
+        </w:tc>
+      </w:tr>
+      <w:tr>
+        <w:tc>
+          <w:tcPr>
+            <w:tcW w:type="dxa" w:w="2880"/>
+          </w:tcPr>
+          <w:p>
+            <w:r>
+              <w:t>&lt; 15 degrees</w:t>
+            </w:r>
+          </w:p>
+        </w:tc>
+        <w:tc>
+          <w:tcPr>
+            <w:tcW w:type="dxa" w:w="2880"/>
+          </w:tcPr>
+          <w:p>
+            <w:r>
+              <w:t>1.00</w:t>
+            </w:r>
+          </w:p>
+        </w:tc>
+        <w:tc>
+          <w:tcPr>
+            <w:tcW w:type="dxa" w:w="2880"/>
+          </w:tcPr>
+          <w:p>
+            <w:r>
+              <w:t>Minimal construction impact</w:t>
+            </w:r>
+          </w:p>
+        </w:tc>
+      </w:tr>
+      <w:tr>
+        <w:tc>
+          <w:tcPr>
+            <w:tcW w:type="dxa" w:w="2880"/>
+          </w:tcPr>
+          <w:p>
+            <w:r>
+              <w:t>15 - 30 degrees</w:t>
+            </w:r>
+          </w:p>
+        </w:tc>
+        <w:tc>
+          <w:tcPr>
+            <w:tcW w:type="dxa" w:w="2880"/>
+          </w:tcPr>
+          <w:p>
+            <w:r>
+              <w:t>1.05</w:t>
+            </w:r>
+          </w:p>
+        </w:tc>
+        <w:tc>
+          <w:tcPr>
+            <w:tcW w:type="dxa" w:w="2880"/>
+          </w:tcPr>
+          <w:p>
+            <w:r>
+              <w:t>Modified formwork and rebar layout</w:t>
+            </w:r>
+          </w:p>
+        </w:tc>
+      </w:tr>
+      <w:tr>
+        <w:tc>
+          <w:tcPr>
+            <w:tcW w:type="dxa" w:w="2880"/>
+          </w:tcPr>
+          <w:p>
+            <w:r>
+              <w:t>30 - 45 degrees</w:t>
+            </w:r>
+          </w:p>
+        </w:tc>
+        <w:tc>
+          <w:tcPr>
+            <w:tcW w:type="dxa" w:w="2880"/>
+          </w:tcPr>
+          <w:p>
+            <w:r>
+              <w:t>1.10</w:t>
+            </w:r>
+          </w:p>
+        </w:tc>
+        <w:tc>
+          <w:tcPr>
+            <w:tcW w:type="dxa" w:w="2880"/>
+          </w:tcPr>
+          <w:p>
+            <w:r>
+              <w:t>Significant geometric complexity</w:t>
+            </w:r>
+          </w:p>
+        </w:tc>
+      </w:tr>
+      <w:tr>
+        <w:tc>
+          <w:tcPr>
+            <w:tcW w:type="dxa" w:w="2880"/>
+          </w:tcPr>
+          <w:p>
+            <w:r>
+              <w:t>&gt; 45 degrees</w:t>
+            </w:r>
+          </w:p>
+        </w:tc>
+        <w:tc>
+          <w:tcPr>
+            <w:tcW w:type="dxa" w:w="2880"/>
+          </w:tcPr>
+          <w:p>
+            <w:r>
+              <w:t>1.20</w:t>
+            </w:r>
+          </w:p>
+        </w:tc>
+        <w:tc>
+          <w:tcPr>
+            <w:tcW w:type="dxa" w:w="2880"/>
+          </w:tcPr>
+          <w:p>
+            <w:r>
+              <w:t>Highly skewed, complex bearing design</w:t>
+            </w:r>
+          </w:p>
+        </w:tc>
+      </w:tr>
+    </w:tbl>
+    <w:p/>
+    <w:p>
+      <w:r>
+        <w:t>Seismic design era factors:</w:t>
+      </w:r>
+    </w:p>
+    <w:tbl>
+      <w:tblPr>
+        <w:tblStyle w:val="TableGrid"/>
+        <w:tblW w:type="auto" w:w="0"/>
+        <w:tblLook w:firstColumn="1" w:firstRow="1" w:lastColumn="0" w:lastRow="0" w:noHBand="0" w:noVBand="1" w:val="04A0"/>
+      </w:tblPr>
+      <w:tblGrid>
+        <w:gridCol w:w="2160"/>
+        <w:gridCol w:w="2160"/>
+        <w:gridCol w:w="2160"/>
+        <w:gridCol w:w="2160"/>
+      </w:tblGrid>
+      <w:tr>
+        <w:tc>
+          <w:tcPr>
+            <w:tcW w:type="dxa" w:w="2160"/>
+          </w:tcPr>
+          <w:p>
+            <w:r>
+              <w:rPr>
+                <w:b/>
+              </w:rPr>
+              <w:t>Year Built</w:t>
+            </w:r>
+          </w:p>
+        </w:tc>
+        <w:tc>
+          <w:tcPr>
+            <w:tcW w:type="dxa" w:w="2160"/>
+          </w:tcPr>
+          <w:p>
+            <w:r>
+              <w:rPr>
+                <w:b/>
+              </w:rPr>
+              <w:t>Era</w:t>
+            </w:r>
+          </w:p>
+        </w:tc>
+        <w:tc>
+          <w:tcPr>
+            <w:tcW w:type="dxa" w:w="2160"/>
+          </w:tcPr>
+          <w:p>
+            <w:r>
+              <w:rPr>
+                <w:b/>
+              </w:rPr>
+              <w:t>Factor</w:t>
+            </w:r>
+          </w:p>
+        </w:tc>
+        <w:tc>
+          <w:tcPr>
+            <w:tcW w:type="dxa" w:w="2160"/>
+          </w:tcPr>
+          <w:p>
+            <w:r>
+              <w:rPr>
+                <w:b/>
+              </w:rPr>
+              <w:t>Rationale</w:t>
+            </w:r>
+          </w:p>
+        </w:tc>
+      </w:tr>
+      <w:tr>
+        <w:tc>
+          <w:tcPr>
+            <w:tcW w:type="dxa" w:w="2160"/>
+          </w:tcPr>
+          <w:p>
+            <w:r>
+              <w:t>Before 1975</w:t>
+            </w:r>
+          </w:p>
+        </w:tc>
+        <w:tc>
+          <w:tcPr>
+            <w:tcW w:type="dxa" w:w="2160"/>
+          </w:tcPr>
+          <w:p>
+            <w:r>
+              <w:t>Pre-seismic</w:t>
+            </w:r>
+          </w:p>
+        </w:tc>
+        <w:tc>
+          <w:tcPr>
+            <w:tcW w:type="dxa" w:w="2160"/>
+          </w:tcPr>
+          <w:p>
+            <w:r>
+              <w:t>1.00</w:t>
+            </w:r>
+          </w:p>
+        </w:tc>
+        <w:tc>
+          <w:tcPr>
+            <w:tcW w:type="dxa" w:w="2160"/>
+          </w:tcPr>
+          <w:p>
+            <w:r>
+              <w:t>No seismic design provisions</w:t>
+            </w:r>
+          </w:p>
+        </w:tc>
+      </w:tr>
+      <w:tr>
+        <w:tc>
+          <w:tcPr>
+            <w:tcW w:type="dxa" w:w="2160"/>
+          </w:tcPr>
+          <w:p>
+            <w:r>
+              <w:t>1975 - 1990</w:t>
+            </w:r>
+          </w:p>
+        </w:tc>
+        <w:tc>
+          <w:tcPr>
+            <w:tcW w:type="dxa" w:w="2160"/>
+          </w:tcPr>
+          <w:p>
+            <w:r>
+              <w:t>Early seismic</w:t>
+            </w:r>
+          </w:p>
+        </w:tc>
+        <w:tc>
+          <w:tcPr>
+            <w:tcW w:type="dxa" w:w="2160"/>
+          </w:tcPr>
+          <w:p>
+            <w:r>
+              <w:t>1.10</w:t>
+            </w:r>
+          </w:p>
+        </w:tc>
+        <w:tc>
+          <w:tcPr>
+            <w:tcW w:type="dxa" w:w="2160"/>
+          </w:tcPr>
+          <w:p>
+            <w:r>
+              <w:t>Basic seismic detailing required</w:t>
+            </w:r>
+          </w:p>
+        </w:tc>
+      </w:tr>
+      <w:tr>
+        <w:tc>
+          <w:tcPr>
+            <w:tcW w:type="dxa" w:w="2160"/>
+          </w:tcPr>
+          <w:p>
+            <w:r>
+              <w:t>After 1990</w:t>
+            </w:r>
+          </w:p>
+        </w:tc>
+        <w:tc>
+          <w:tcPr>
+            <w:tcW w:type="dxa" w:w="2160"/>
+          </w:tcPr>
+          <w:p>
+            <w:r>
+              <w:t>Modern seismic</w:t>
+            </w:r>
+          </w:p>
+        </w:tc>
+        <w:tc>
+          <w:tcPr>
+            <w:tcW w:type="dxa" w:w="2160"/>
+          </w:tcPr>
+          <w:p>
+            <w:r>
+              <w:t>1.15</w:t>
+            </w:r>
+          </w:p>
+        </w:tc>
+        <w:tc>
+          <w:tcPr>
+            <w:tcW w:type="dxa" w:w="2160"/>
+          </w:tcPr>
+          <w:p>
+            <w:r>
+              <w:t>Full seismic design (more rebar, isolation bearings)</w:t>
+            </w:r>
+          </w:p>
+        </w:tc>
+      </w:tr>
+    </w:tbl>
+    <w:p/>
+    <w:p>
+      <w:pPr>
+        <w:pStyle w:val="Heading3"/>
+      </w:pPr>
+      <w:r>
+        <w:t>9.6.5 FHWA State-Level Unit Costs (Selected States)</w:t>
+      </w:r>
+    </w:p>
+    <w:tbl>
+      <w:tblPr>
+        <w:tblStyle w:val="TableGrid"/>
+        <w:tblW w:type="auto" w:w="0"/>
+        <w:tblLook w:firstColumn="1" w:firstRow="1" w:lastColumn="0" w:lastRow="0" w:noHBand="0" w:noVBand="1" w:val="04A0"/>
+      </w:tblPr>
+      <w:tblGrid>
+        <w:gridCol w:w="2160"/>
+        <w:gridCol w:w="2160"/>
+        <w:gridCol w:w="2160"/>
+        <w:gridCol w:w="2160"/>
+      </w:tblGrid>
+      <w:tr>
+        <w:tc>
+          <w:tcPr>
+            <w:tcW w:type="dxa" w:w="2160"/>
+          </w:tcPr>
+          <w:p>
+            <w:r>
+              <w:rPr>
+                <w:b/>
+              </w:rPr>
+              <w:t>State</w:t>
+            </w:r>
+          </w:p>
+        </w:tc>
+        <w:tc>
+          <w:tcPr>
+            <w:tcW w:type="dxa" w:w="2160"/>
+          </w:tcPr>
+          <w:p>
+            <w:r>
+              <w:rPr>
+                <w:b/>
+              </w:rPr>
+              <w:t>NHS ($/ft2)</w:t>
+            </w:r>
+          </w:p>
+        </w:tc>
+        <w:tc>
+          <w:tcPr>
+            <w:tcW w:type="dxa" w:w="2160"/>
+          </w:tcPr>
+          <w:p>
+            <w:r>
+              <w:rPr>
+                <w:b/>
+              </w:rPr>
+              <w:t>Non-NHS ($/ft2)</w:t>
+            </w:r>
+          </w:p>
+        </w:tc>
+        <w:tc>
+          <w:tcPr>
+            <w:tcW w:type="dxa" w:w="2160"/>
+          </w:tcPr>
+          <w:p>
+            <w:r>
+              <w:rPr>
+                <w:b/>
+              </w:rPr>
+              <w:t>NHS ($/m2)</w:t>
+            </w:r>
+          </w:p>
+        </w:tc>
+      </w:tr>
+      <w:tr>
+        <w:tc>
+          <w:tcPr>
+            <w:tcW w:type="dxa" w:w="2160"/>
+          </w:tcPr>
+          <w:p>
+            <w:r>
+              <w:t>California</w:t>
+            </w:r>
+          </w:p>
+        </w:tc>
+        <w:tc>
+          <w:tcPr>
+            <w:tcW w:type="dxa" w:w="2160"/>
+          </w:tcPr>
+          <w:p>
+            <w:r>
+              <w:t>$465</w:t>
+            </w:r>
+          </w:p>
+        </w:tc>
+        <w:tc>
+          <w:tcPr>
+            <w:tcW w:type="dxa" w:w="2160"/>
+          </w:tcPr>
+          <w:p>
+            <w:r>
+              <w:t>$483</w:t>
+            </w:r>
+          </w:p>
+        </w:tc>
+        <w:tc>
+          <w:tcPr>
+            <w:tcW w:type="dxa" w:w="2160"/>
+          </w:tcPr>
+          <w:p>
+            <w:r>
+              <w:t>$5,005</w:t>
+            </w:r>
+          </w:p>
+        </w:tc>
+      </w:tr>
+      <w:tr>
+        <w:tc>
+          <w:tcPr>
+            <w:tcW w:type="dxa" w:w="2160"/>
+          </w:tcPr>
+          <w:p>
+            <w:r>
+              <w:t>Texas</w:t>
+            </w:r>
+          </w:p>
+        </w:tc>
+        <w:tc>
+          <w:tcPr>
+            <w:tcW w:type="dxa" w:w="2160"/>
+          </w:tcPr>
+          <w:p>
+            <w:r>
+              <w:t>$109</w:t>
+            </w:r>
+          </w:p>
+        </w:tc>
+        <w:tc>
+          <w:tcPr>
+            <w:tcW w:type="dxa" w:w="2160"/>
+          </w:tcPr>
+          <w:p>
+            <w:r>
+              <w:t>$125</w:t>
+            </w:r>
+          </w:p>
+        </w:tc>
+        <w:tc>
+          <w:tcPr>
+            <w:tcW w:type="dxa" w:w="2160"/>
+          </w:tcPr>
+          <w:p>
+            <w:r>
+              <w:t>$1,173</w:t>
+            </w:r>
+          </w:p>
+        </w:tc>
+      </w:tr>
+      <w:tr>
+        <w:tc>
+          <w:tcPr>
+            <w:tcW w:type="dxa" w:w="2160"/>
+          </w:tcPr>
+          <w:p>
+            <w:r>
+              <w:t>New York</w:t>
+            </w:r>
+          </w:p>
+        </w:tc>
+        <w:tc>
+          <w:tcPr>
+            <w:tcW w:type="dxa" w:w="2160"/>
+          </w:tcPr>
+          <w:p>
+            <w:r>
+              <w:t>$792</w:t>
+            </w:r>
+          </w:p>
+        </w:tc>
+        <w:tc>
+          <w:tcPr>
+            <w:tcW w:type="dxa" w:w="2160"/>
+          </w:tcPr>
+          <w:p>
+            <w:r>
+              <w:t>$524</w:t>
+            </w:r>
+          </w:p>
+        </w:tc>
+        <w:tc>
+          <w:tcPr>
+            <w:tcW w:type="dxa" w:w="2160"/>
+          </w:tcPr>
+          <w:p>
+            <w:r>
+              <w:t>$8,525</w:t>
+            </w:r>
+          </w:p>
+        </w:tc>
+      </w:tr>
+      <w:tr>
+        <w:tc>
+          <w:tcPr>
+            <w:tcW w:type="dxa" w:w="2160"/>
+          </w:tcPr>
+          <w:p>
+            <w:r>
+              <w:t>Florida</w:t>
+            </w:r>
+          </w:p>
+        </w:tc>
+        <w:tc>
+          <w:tcPr>
+            <w:tcW w:type="dxa" w:w="2160"/>
+          </w:tcPr>
+          <w:p>
+            <w:r>
+              <w:t>$244</w:t>
+            </w:r>
+          </w:p>
+        </w:tc>
+        <w:tc>
+          <w:tcPr>
+            <w:tcW w:type="dxa" w:w="2160"/>
+          </w:tcPr>
+          <w:p>
+            <w:r>
+              <w:t>$277</w:t>
+            </w:r>
+          </w:p>
+        </w:tc>
+        <w:tc>
+          <w:tcPr>
+            <w:tcW w:type="dxa" w:w="2160"/>
+          </w:tcPr>
+          <w:p>
+            <w:r>
+              <w:t>$2,627</w:t>
+            </w:r>
+          </w:p>
+        </w:tc>
+      </w:tr>
+      <w:tr>
+        <w:tc>
+          <w:tcPr>
+            <w:tcW w:type="dxa" w:w="2160"/>
+          </w:tcPr>
+          <w:p>
+            <w:r>
+              <w:t>National Average</w:t>
+            </w:r>
+          </w:p>
+        </w:tc>
+        <w:tc>
+          <w:tcPr>
+            <w:tcW w:type="dxa" w:w="2160"/>
+          </w:tcPr>
+          <w:p>
+            <w:r>
+              <w:t>$429</w:t>
+            </w:r>
+          </w:p>
+        </w:tc>
+        <w:tc>
+          <w:tcPr>
+            <w:tcW w:type="dxa" w:w="2160"/>
+          </w:tcPr>
+          <w:p>
+            <w:r>
+              <w:t>$383</w:t>
+            </w:r>
+          </w:p>
+        </w:tc>
+        <w:tc>
+          <w:tcPr>
+            <w:tcW w:type="dxa" w:w="2160"/>
+          </w:tcPr>
+          <w:p>
+            <w:r>
+              <w:t>$4,618</w:t>
+            </w:r>
+          </w:p>
+        </w:tc>
+      </w:tr>
+    </w:tbl>
+    <w:p/>
+    <w:p>
+      <w:r>
+        <w:t>Source: FHWA Bridge Replacement Unit Costs 2024. The framework defaults to California NHS rate ($5,005/m2). Users analyzing bridges in other states should adjust base_unit_cost in config.yaml accordingly.</w:t>
+      </w:r>
+    </w:p>
+    <w:p>
+      <w:pPr>
+        <w:pStyle w:val="Heading3"/>
+      </w:pPr>
+      <w:r>
+        <w:t>9.6.6 Example Calculation</w:t>
+      </w:r>
+    </w:p>
+    <w:p>
+      <w:r>
+        <w:t>Bridge 52 0282 (HWB17, Northridge):</w:t>
+      </w:r>
+    </w:p>
+    <w:p>
+      <w:r>
+        <w:t xml:space="preserve">  Length = 45m, Width = 12m -&gt; deck_area = 540 m2</w:t>
+      </w:r>
+    </w:p>
+    <w:p>
+      <w:r>
+        <w:t xml:space="preserve">  Material = prestressed concrete -&gt; f_material = 1.00</w:t>
+      </w:r>
+    </w:p>
+    <w:p>
+      <w:r>
+        <w:t xml:space="preserve">  Max span = 22m -&gt; f_span = 1.00 (&lt; 30m)</w:t>
+      </w:r>
+    </w:p>
+    <w:p>
+      <w:r>
+        <w:t xml:space="preserve">  Skew = 20 degrees -&gt; f_skew = 1.05 (15-30 range)</w:t>
+      </w:r>
+    </w:p>
+    <w:p>
+      <w:r>
+        <w:t xml:space="preserve">  Year = 1966 -&gt; f_seismic = 1.00 (pre-1975)</w:t>
+      </w:r>
+    </w:p>
+    <w:p>
+      <w:r>
+        <w:t xml:space="preserve">  Region = CA -&gt; f_region = 1.00</w:t>
+      </w:r>
+    </w:p>
+    <w:p/>
+    <w:p>
+      <w:r>
+        <w:t xml:space="preserve">  RCV = 540 x $5,005 x 1.00 x 1.00 x 1.05 x 1.00 x 1.00 = $2,837,835</w:t>
+      </w:r>
+    </w:p>
+    <w:p>
+      <w:pPr>
+        <w:pStyle w:val="Heading3"/>
+      </w:pPr>
+      <w:r>
+        <w:t>9.6.7 Configuration</w:t>
+      </w:r>
+    </w:p>
+    <w:p>
+      <w:r>
+        <w:t>To activate the FHWA model, add a 'cost:' section to config.yaml:</w:t>
+      </w:r>
+    </w:p>
+    <w:p>
+      <w:r>
+        <w:t xml:space="preserve">    cost:</w:t>
+      </w:r>
+    </w:p>
+    <w:p>
+      <w:r>
+        <w:t xml:space="preserve">      base_unit_cost: 5005.0</w:t>
+      </w:r>
+    </w:p>
+    <w:p>
+      <w:r>
+        <w:t xml:space="preserve">      material_factors:</w:t>
+      </w:r>
+    </w:p>
+    <w:p>
+      <w:r>
+        <w:t xml:space="preserve">        concrete: 0.90</w:t>
+      </w:r>
+    </w:p>
+    <w:p>
+      <w:r>
+        <w:t xml:space="preserve">        steel: 1.15</w:t>
+      </w:r>
+    </w:p>
+    <w:p/>
+    <w:p>
+      <w:r>
+        <w:t>When no 'cost:' section is present, the framework uses the legacy model (material x deck_area x length_factor) for backward compatibility.</w:t>
+      </w:r>
+    </w:p>
+    <w:p>
+      <w:pPr>
+        <w:pStyle w:val="Heading3"/>
+      </w:pPr>
+      <w:r>
+        <w:t>9.6.8 Damage Ratios (Hazus Table 7.11)</w:t>
+      </w:r>
+    </w:p>
+    <w:p>
+      <w:r>
+        <w:t>The expected loss per bridge is computed as:</w:t>
+      </w:r>
+    </w:p>
+    <w:p>
+      <w:r>
+        <w:t xml:space="preserve">  E[Loss] = SUM_ds P(DS=ds) x DR(ds) x RCV</w:t>
+      </w:r>
+    </w:p>
+    <w:tbl>
+      <w:tblPr>
+        <w:tblStyle w:val="TableGrid"/>
+        <w:tblW w:type="auto" w:w="0"/>
+        <w:tblLook w:firstColumn="1" w:firstRow="1" w:lastColumn="0" w:lastRow="0" w:noHBand="0" w:noVBand="1" w:val="04A0"/>
+      </w:tblPr>
+      <w:tblGrid>
+        <w:gridCol w:w="2880"/>
+        <w:gridCol w:w="2880"/>
+        <w:gridCol w:w="2880"/>
+      </w:tblGrid>
+      <w:tr>
+        <w:tc>
+          <w:tcPr>
+            <w:tcW w:type="dxa" w:w="2880"/>
+          </w:tcPr>
+          <w:p>
+            <w:r>
+              <w:rPr>
+                <w:b/>
+              </w:rPr>
+              <w:t>Damage State</w:t>
+            </w:r>
+          </w:p>
+        </w:tc>
+        <w:tc>
+          <w:tcPr>
+            <w:tcW w:type="dxa" w:w="2880"/>
+          </w:tcPr>
+          <w:p>
+            <w:r>
+              <w:rPr>
+                <w:b/>
+              </w:rPr>
+              <w:t>Repair/RCV Ratio</w:t>
+            </w:r>
+          </w:p>
+        </w:tc>
+        <w:tc>
+          <w:tcPr>
+            <w:tcW w:type="dxa" w:w="2880"/>
+          </w:tcPr>
+          <w:p>
+            <w:r>
+              <w:rPr>
+                <w:b/>
+              </w:rPr>
+              <w:t>Restoration Time (days)</w:t>
+            </w:r>
+          </w:p>
+        </w:tc>
+      </w:tr>
+      <w:tr>
+        <w:tc>
+          <w:tcPr>
+            <w:tcW w:type="dxa" w:w="2880"/>
+          </w:tcPr>
+          <w:p>
+            <w:r>
+              <w:t>None</w:t>
+            </w:r>
+          </w:p>
+        </w:tc>
+        <w:tc>
+          <w:tcPr>
+            <w:tcW w:type="dxa" w:w="2880"/>
+          </w:tcPr>
+          <w:p>
+            <w:r>
+              <w:t>0.00</w:t>
+            </w:r>
+          </w:p>
+        </w:tc>
+        <w:tc>
+          <w:tcPr>
+            <w:tcW w:type="dxa" w:w="2880"/>
+          </w:tcPr>
+          <w:p>
+            <w:r>
+              <w:t>0</w:t>
+            </w:r>
+          </w:p>
+        </w:tc>
+      </w:tr>
+      <w:tr>
+        <w:tc>
+          <w:tcPr>
+            <w:tcW w:type="dxa" w:w="2880"/>
+          </w:tcPr>
+          <w:p>
+            <w:r>
+              <w:t>Slight</w:t>
+            </w:r>
+          </w:p>
+        </w:tc>
+        <w:tc>
+          <w:tcPr>
+            <w:tcW w:type="dxa" w:w="2880"/>
+          </w:tcPr>
+          <w:p>
+            <w:r>
+              <w:t>0.03</w:t>
+            </w:r>
+          </w:p>
+        </w:tc>
+        <w:tc>
+          <w:tcPr>
+            <w:tcW w:type="dxa" w:w="2880"/>
+          </w:tcPr>
+          <w:p>
+            <w:r>
+              <w:t>0.6</w:t>
+            </w:r>
+          </w:p>
+        </w:tc>
+      </w:tr>
+      <w:tr>
+        <w:tc>
+          <w:tcPr>
+            <w:tcW w:type="dxa" w:w="2880"/>
+          </w:tcPr>
+          <w:p>
+            <w:r>
+              <w:t>Moderate</w:t>
+            </w:r>
+          </w:p>
+        </w:tc>
+        <w:tc>
+          <w:tcPr>
+            <w:tcW w:type="dxa" w:w="2880"/>
+          </w:tcPr>
+          <w:p>
+            <w:r>
+              <w:t>0.08</w:t>
+            </w:r>
+          </w:p>
+        </w:tc>
+        <w:tc>
+          <w:tcPr>
+            <w:tcW w:type="dxa" w:w="2880"/>
+          </w:tcPr>
+          <w:p>
+            <w:r>
+              <w:t>2.5</w:t>
+            </w:r>
+          </w:p>
+        </w:tc>
+      </w:tr>
+      <w:tr>
+        <w:tc>
+          <w:tcPr>
+            <w:tcW w:type="dxa" w:w="2880"/>
+          </w:tcPr>
+          <w:p>
+            <w:r>
+              <w:t>Extensive</w:t>
+            </w:r>
+          </w:p>
+        </w:tc>
+        <w:tc>
+          <w:tcPr>
+            <w:tcW w:type="dxa" w:w="2880"/>
+          </w:tcPr>
+          <w:p>
+            <w:r>
+              <w:t>0.25</w:t>
+            </w:r>
+          </w:p>
+        </w:tc>
+        <w:tc>
+          <w:tcPr>
+            <w:tcW w:type="dxa" w:w="2880"/>
+          </w:tcPr>
+          <w:p>
+            <w:r>
+              <w:t>75</w:t>
+            </w:r>
+          </w:p>
+        </w:tc>
+      </w:tr>
+      <w:tr>
+        <w:tc>
+          <w:tcPr>
+            <w:tcW w:type="dxa" w:w="2880"/>
+          </w:tcPr>
+          <w:p>
+            <w:r>
+              <w:t>Complete</w:t>
+            </w:r>
+          </w:p>
+        </w:tc>
+        <w:tc>
+          <w:tcPr>
+            <w:tcW w:type="dxa" w:w="2880"/>
+          </w:tcPr>
+          <w:p>
+            <w:r>
+              <w:t>1.00</w:t>
+            </w:r>
+          </w:p>
+        </w:tc>
+        <w:tc>
+          <w:tcPr>
+            <w:tcW w:type="dxa" w:w="2880"/>
+          </w:tcPr>
+          <w:p>
+            <w:r>
+              <w:t>230</w:t>
+            </w:r>
+          </w:p>
+        </w:tc>
+      </w:tr>
+    </w:tbl>
+    <w:p/>
+    <w:p>
+      <w:r>
+        <w:t>These ratios are from Hazus 6.1 Table 7.11 and are implemented in src/loss.py. The 'complete' ratio of 1.00 assumes full demolition and rebuild; some literature uses 2/N (where N = number of spans) for partial collapse scenarios.</w:t>
       </w:r>
     </w:p>
     <w:p>

</xml_diff>

<commit_message>
Convert key formulas to Word OMML equation objects
Replaced 4 plain-text formulas with proper Word equation formatting:
1. Fragility: P[DS >= ds | IM] = Phi(...)
2. Calibration likelihood: LL(k, beta) = Sum(...)
3. RCV: RCV = A_deck x C_base x f_mat x f_span x f_skew x f_seismic
4. Expected Loss: E[Loss] = Sum P(DS) x DR(DS) x RCV

Uses OMML (Office Math Markup Language) for native Word equation rendering.

Co-Authored-By: Claude Opus 4.6 (1M context) <noreply@anthropic.com>
</commit_message>
<xml_diff>
--- a/CAT411_Technical_Documentation.docx
+++ b/CAT411_Technical_Documentation.docx
@@ -2427,17 +2427,130 @@
       </w:r>
     </w:p>
     <w:p>
-      <w:r>
-        <w:t>P[DS ≥ ds | IM] = Φ( (ln(IM) - ln(θ_ds)) / β_ds )</w:t>
-        <w:br/>
-        <w:br/>
-        <w:t>Where Φ is standard normal CDF, θ_ds is median capacity, β_ds is dispersion.</w:t>
-        <w:br/>
-        <w:t>Parameters from Hazus Table 7.9 for 14 bridge classes (HWB1–HWB28).</w:t>
-        <w:br/>
-        <w:br/>
-        <w:t>Skew modification: θ_modified = θ · √(1 - (skew/90)²)</w:t>
-      </w:r>
+      <m:oMathPara>
+        <m:oMath>
+          <m:r>
+            <m:rPr>
+              <m:sty m:val="i"/>
+            </m:rPr>
+            <m:t xml:space="preserve">P</m:t>
+          </m:r>
+          <m:r>
+            <m:rPr>
+              <m:sty m:val="bi"/>
+            </m:rPr>
+            <m:t xml:space="preserve">[</m:t>
+          </m:r>
+          <m:r>
+            <m:rPr>
+              <m:sty m:val="i"/>
+            </m:rPr>
+            <m:t xml:space="preserve">DS</m:t>
+          </m:r>
+          <m:r>
+            <m:rPr>
+              <m:sty m:val="bi"/>
+            </m:rPr>
+            <m:t xml:space="preserve"> ≥ </m:t>
+          </m:r>
+          <m:r>
+            <m:rPr>
+              <m:sty m:val="i"/>
+            </m:rPr>
+            <m:t xml:space="preserve">ds</m:t>
+          </m:r>
+          <m:r>
+            <m:rPr>
+              <m:sty m:val="bi"/>
+            </m:rPr>
+            <m:t xml:space="preserve"> | </m:t>
+          </m:r>
+          <m:r>
+            <m:rPr>
+              <m:sty m:val="i"/>
+            </m:rPr>
+            <m:t xml:space="preserve">IM</m:t>
+          </m:r>
+          <m:r>
+            <m:rPr>
+              <m:sty m:val="bi"/>
+            </m:rPr>
+            <m:t xml:space="preserve">]</m:t>
+          </m:r>
+          <m:r>
+            <m:rPr>
+              <m:sty m:val="bi"/>
+            </m:rPr>
+            <m:t xml:space="preserve"> = Φ</m:t>
+          </m:r>
+          <m:r>
+            <m:rPr>
+              <m:sty m:val="bi"/>
+            </m:rPr>
+            <m:t xml:space="preserve">(</m:t>
+          </m:r>
+          <m:r>
+            <m:rPr>
+              <m:sty m:val="bi"/>
+            </m:rPr>
+            <m:t xml:space="preserve"> ln(</m:t>
+          </m:r>
+          <m:r>
+            <m:rPr>
+              <m:sty m:val="i"/>
+            </m:rPr>
+            <m:t xml:space="preserve">IM</m:t>
+          </m:r>
+          <m:r>
+            <m:rPr>
+              <m:sty m:val="bi"/>
+            </m:rPr>
+            <m:t xml:space="preserve">) − ln(</m:t>
+          </m:r>
+          <m:r>
+            <m:rPr>
+              <m:sty m:val="i"/>
+            </m:rPr>
+            <m:t xml:space="preserve">θ</m:t>
+          </m:r>
+          <m:r>
+            <m:rPr>
+              <m:sty m:val="i"/>
+            </m:rPr>
+            <m:t xml:space="preserve">ₙₛ</m:t>
+          </m:r>
+          <m:r>
+            <m:rPr>
+              <m:sty m:val="bi"/>
+            </m:rPr>
+            <m:t xml:space="preserve">)</m:t>
+          </m:r>
+          <m:r>
+            <m:rPr>
+              <m:sty m:val="bi"/>
+            </m:rPr>
+            <m:t xml:space="preserve"> / </m:t>
+          </m:r>
+          <m:r>
+            <m:rPr>
+              <m:sty m:val="i"/>
+            </m:rPr>
+            <m:t xml:space="preserve">β</m:t>
+          </m:r>
+          <m:r>
+            <m:rPr>
+              <m:sty m:val="i"/>
+            </m:rPr>
+            <m:t xml:space="preserve">ₙₛ</m:t>
+          </m:r>
+          <m:r>
+            <m:rPr>
+              <m:sty m:val="bi"/>
+            </m:rPr>
+            <m:t xml:space="preserve"> )</m:t>
+          </m:r>
+        </m:oMath>
+      </m:oMathPara>
     </w:p>
     <w:p>
       <w:pPr>
@@ -2498,7 +2611,11 @@
     </w:p>
     <w:p>
       <w:r>
-        <w:t xml:space="preserve">    P[DS &gt;= ds | Sa] = Phi( (ln(Sa) - ln(k * theta_ds_c)) / beta )</w:t>
+        <w:rPr>
+          <w:b w:val="0"/>
+          <w:i/>
+        </w:rPr>
+        <w:t>P[DS ≥ ds | Sa] = Φ( (ln(Sa) − ln(k · θₙₛₙc)) / β )</w:t>
       </w:r>
     </w:p>
     <w:p>
@@ -2785,7 +2902,11 @@
     </w:p>
     <w:p>
       <w:r>
-        <w:t xml:space="preserve">    p_j(k, beta) = (1/N) * SUM_i P(DS=j | Sa_i, HWB_i, k, beta)</w:t>
+        <w:rPr>
+          <w:b w:val="0"/>
+          <w:i/>
+        </w:rPr>
+        <w:t>pⱼ(k, β) = (1/N) · Σᵢ P(DS=j | Saᵢ, HWBᵢ, k, β)</w:t>
       </w:r>
     </w:p>
     <w:p>
@@ -2799,9 +2920,136 @@
       </w:r>
     </w:p>
     <w:p>
-      <w:r>
-        <w:t xml:space="preserve">    LL(k, beta) = SUM_j n_j * ln(p_j(k, beta))</w:t>
-      </w:r>
+      <m:oMathPara>
+        <m:oMath>
+          <m:r>
+            <m:rPr>
+              <m:sty m:val="i"/>
+            </m:rPr>
+            <m:t xml:space="preserve">LL</m:t>
+          </m:r>
+          <m:r>
+            <m:rPr>
+              <m:sty m:val="bi"/>
+            </m:rPr>
+            <m:t xml:space="preserve">(</m:t>
+          </m:r>
+          <m:r>
+            <m:rPr>
+              <m:sty m:val="i"/>
+            </m:rPr>
+            <m:t xml:space="preserve">k</m:t>
+          </m:r>
+          <m:r>
+            <m:rPr>
+              <m:sty m:val="bi"/>
+            </m:rPr>
+            <m:t xml:space="preserve">, </m:t>
+          </m:r>
+          <m:r>
+            <m:rPr>
+              <m:sty m:val="i"/>
+            </m:rPr>
+            <m:t xml:space="preserve">β</m:t>
+          </m:r>
+          <m:r>
+            <m:rPr>
+              <m:sty m:val="bi"/>
+            </m:rPr>
+            <m:t xml:space="preserve">)</m:t>
+          </m:r>
+          <m:r>
+            <m:rPr>
+              <m:sty m:val="bi"/>
+            </m:rPr>
+            <m:t xml:space="preserve"> = </m:t>
+          </m:r>
+          <m:r>
+            <m:rPr>
+              <m:sty m:val="bi"/>
+            </m:rPr>
+            <m:t xml:space="preserve">Σ</m:t>
+          </m:r>
+          <m:r>
+            <m:rPr>
+              <m:sty m:val="i"/>
+            </m:rPr>
+            <m:t xml:space="preserve">ⱼ</m:t>
+          </m:r>
+          <m:r>
+            <m:rPr>
+              <m:sty m:val="bi"/>
+            </m:rPr>
+            <m:t xml:space="preserve"> </m:t>
+          </m:r>
+          <m:r>
+            <m:rPr>
+              <m:sty m:val="i"/>
+            </m:rPr>
+            <m:t xml:space="preserve">n</m:t>
+          </m:r>
+          <m:r>
+            <m:rPr>
+              <m:sty m:val="i"/>
+            </m:rPr>
+            <m:t xml:space="preserve">ⱼ</m:t>
+          </m:r>
+          <m:r>
+            <m:rPr>
+              <m:sty m:val="bi"/>
+            </m:rPr>
+            <m:t xml:space="preserve"> · </m:t>
+          </m:r>
+          <m:r>
+            <m:rPr>
+              <m:sty m:val="bi"/>
+            </m:rPr>
+            <m:t xml:space="preserve">ln(</m:t>
+          </m:r>
+          <m:r>
+            <m:rPr>
+              <m:sty m:val="i"/>
+            </m:rPr>
+            <m:t xml:space="preserve">p</m:t>
+          </m:r>
+          <m:r>
+            <m:rPr>
+              <m:sty m:val="i"/>
+            </m:rPr>
+            <m:t xml:space="preserve">ⱼ</m:t>
+          </m:r>
+          <m:r>
+            <m:rPr>
+              <m:sty m:val="bi"/>
+            </m:rPr>
+            <m:t xml:space="preserve">(</m:t>
+          </m:r>
+          <m:r>
+            <m:rPr>
+              <m:sty m:val="i"/>
+            </m:rPr>
+            <m:t xml:space="preserve">k</m:t>
+          </m:r>
+          <m:r>
+            <m:rPr>
+              <m:sty m:val="bi"/>
+            </m:rPr>
+            <m:t xml:space="preserve">, </m:t>
+          </m:r>
+          <m:r>
+            <m:rPr>
+              <m:sty m:val="i"/>
+            </m:rPr>
+            <m:t xml:space="preserve">β</m:t>
+          </m:r>
+          <m:r>
+            <m:rPr>
+              <m:sty m:val="bi"/>
+            </m:rPr>
+            <m:t xml:space="preserve">))</m:t>
+          </m:r>
+        </m:oMath>
+      </m:oMathPara>
     </w:p>
     <w:p>
       <w:r>
@@ -3419,9 +3667,136 @@
       </w:r>
     </w:p>
     <w:p>
-      <w:r>
-        <w:t>Bridge replacement cost values (RCV) are estimated from NBI structural attributes using a multi-factor model anchored to FHWA 2024 state-level unit costs. The RCV drives the financial loss calculation: E[Loss] = SUM P(DS) x DR(DS) x RCV.</w:t>
-      </w:r>
+      <m:oMathPara>
+        <m:oMath>
+          <m:r>
+            <m:rPr>
+              <m:sty m:val="i"/>
+            </m:rPr>
+            <m:t xml:space="preserve">E</m:t>
+          </m:r>
+          <m:r>
+            <m:rPr>
+              <m:sty m:val="bi"/>
+            </m:rPr>
+            <m:t xml:space="preserve">[</m:t>
+          </m:r>
+          <m:r>
+            <m:rPr>
+              <m:sty m:val="i"/>
+            </m:rPr>
+            <m:t xml:space="preserve">Loss</m:t>
+          </m:r>
+          <m:r>
+            <m:rPr>
+              <m:sty m:val="bi"/>
+            </m:rPr>
+            <m:t xml:space="preserve">]</m:t>
+          </m:r>
+          <m:r>
+            <m:rPr>
+              <m:sty m:val="bi"/>
+            </m:rPr>
+            <m:t xml:space="preserve"> = </m:t>
+          </m:r>
+          <m:r>
+            <m:rPr>
+              <m:sty m:val="bi"/>
+            </m:rPr>
+            <m:t xml:space="preserve">Σ</m:t>
+          </m:r>
+          <m:r>
+            <m:rPr>
+              <m:sty m:val="i"/>
+            </m:rPr>
+            <m:t xml:space="preserve">ds</m:t>
+          </m:r>
+          <m:r>
+            <m:rPr>
+              <m:sty m:val="bi"/>
+            </m:rPr>
+            <m:t xml:space="preserve"> </m:t>
+          </m:r>
+          <m:r>
+            <m:rPr>
+              <m:sty m:val="i"/>
+            </m:rPr>
+            <m:t xml:space="preserve">P</m:t>
+          </m:r>
+          <m:r>
+            <m:rPr>
+              <m:sty m:val="bi"/>
+            </m:rPr>
+            <m:t xml:space="preserve">(</m:t>
+          </m:r>
+          <m:r>
+            <m:rPr>
+              <m:sty m:val="i"/>
+            </m:rPr>
+            <m:t xml:space="preserve">DS</m:t>
+          </m:r>
+          <m:r>
+            <m:rPr>
+              <m:sty m:val="bi"/>
+            </m:rPr>
+            <m:t xml:space="preserve">=</m:t>
+          </m:r>
+          <m:r>
+            <m:rPr>
+              <m:sty m:val="i"/>
+            </m:rPr>
+            <m:t xml:space="preserve">ds</m:t>
+          </m:r>
+          <m:r>
+            <m:rPr>
+              <m:sty m:val="bi"/>
+            </m:rPr>
+            <m:t xml:space="preserve">)</m:t>
+          </m:r>
+          <m:r>
+            <m:rPr>
+              <m:sty m:val="bi"/>
+            </m:rPr>
+            <m:t xml:space="preserve"> × </m:t>
+          </m:r>
+          <m:r>
+            <m:rPr>
+              <m:sty m:val="i"/>
+            </m:rPr>
+            <m:t xml:space="preserve">DR</m:t>
+          </m:r>
+          <m:r>
+            <m:rPr>
+              <m:sty m:val="bi"/>
+            </m:rPr>
+            <m:t xml:space="preserve">(</m:t>
+          </m:r>
+          <m:r>
+            <m:rPr>
+              <m:sty m:val="i"/>
+            </m:rPr>
+            <m:t xml:space="preserve">ds</m:t>
+          </m:r>
+          <m:r>
+            <m:rPr>
+              <m:sty m:val="bi"/>
+            </m:rPr>
+            <m:t xml:space="preserve">)</m:t>
+          </m:r>
+          <m:r>
+            <m:rPr>
+              <m:sty m:val="bi"/>
+            </m:rPr>
+            <m:t xml:space="preserve"> × </m:t>
+          </m:r>
+          <m:r>
+            <m:rPr>
+              <m:sty m:val="i"/>
+            </m:rPr>
+            <m:t xml:space="preserve">RCV</m:t>
+          </m:r>
+        </m:oMath>
+      </m:oMathPara>
     </w:p>
     <w:p>
       <w:pPr>
@@ -3432,9 +3807,124 @@
       </w:r>
     </w:p>
     <w:p>
-      <w:r>
-        <w:t>RCV = deck_area x base_unit_cost x f_material x f_span x f_skew x f_seismic x f_region</w:t>
-      </w:r>
+      <m:oMathPara>
+        <m:oMath>
+          <m:r>
+            <m:rPr>
+              <m:sty m:val="i"/>
+            </m:rPr>
+            <m:t xml:space="preserve">RCV</m:t>
+          </m:r>
+          <m:r>
+            <m:rPr>
+              <m:sty m:val="bi"/>
+            </m:rPr>
+            <m:t xml:space="preserve"> = </m:t>
+          </m:r>
+          <m:r>
+            <m:rPr>
+              <m:sty m:val="i"/>
+            </m:rPr>
+            <m:t xml:space="preserve">A</m:t>
+          </m:r>
+          <m:r>
+            <m:rPr>
+              <m:sty m:val="bi"/>
+            </m:rPr>
+            <m:t xml:space="preserve">deck</m:t>
+          </m:r>
+          <m:r>
+            <m:rPr>
+              <m:sty m:val="bi"/>
+            </m:rPr>
+            <m:t xml:space="preserve"> × </m:t>
+          </m:r>
+          <m:r>
+            <m:rPr>
+              <m:sty m:val="i"/>
+            </m:rPr>
+            <m:t xml:space="preserve">C</m:t>
+          </m:r>
+          <m:r>
+            <m:rPr>
+              <m:sty m:val="bi"/>
+            </m:rPr>
+            <m:t xml:space="preserve">base</m:t>
+          </m:r>
+          <m:r>
+            <m:rPr>
+              <m:sty m:val="bi"/>
+            </m:rPr>
+            <m:t xml:space="preserve"> × </m:t>
+          </m:r>
+          <m:r>
+            <m:rPr>
+              <m:sty m:val="i"/>
+            </m:rPr>
+            <m:t xml:space="preserve">f</m:t>
+          </m:r>
+          <m:r>
+            <m:rPr>
+              <m:sty m:val="bi"/>
+            </m:rPr>
+            <m:t xml:space="preserve">mat</m:t>
+          </m:r>
+          <m:r>
+            <m:rPr>
+              <m:sty m:val="bi"/>
+            </m:rPr>
+            <m:t xml:space="preserve"> × </m:t>
+          </m:r>
+          <m:r>
+            <m:rPr>
+              <m:sty m:val="i"/>
+            </m:rPr>
+            <m:t xml:space="preserve">f</m:t>
+          </m:r>
+          <m:r>
+            <m:rPr>
+              <m:sty m:val="bi"/>
+            </m:rPr>
+            <m:t xml:space="preserve">span</m:t>
+          </m:r>
+          <m:r>
+            <m:rPr>
+              <m:sty m:val="bi"/>
+            </m:rPr>
+            <m:t xml:space="preserve"> × </m:t>
+          </m:r>
+          <m:r>
+            <m:rPr>
+              <m:sty m:val="i"/>
+            </m:rPr>
+            <m:t xml:space="preserve">f</m:t>
+          </m:r>
+          <m:r>
+            <m:rPr>
+              <m:sty m:val="bi"/>
+            </m:rPr>
+            <m:t xml:space="preserve">skew</m:t>
+          </m:r>
+          <m:r>
+            <m:rPr>
+              <m:sty m:val="bi"/>
+            </m:rPr>
+            <m:t xml:space="preserve"> × </m:t>
+          </m:r>
+          <m:r>
+            <m:rPr>
+              <m:sty m:val="i"/>
+            </m:rPr>
+            <m:t xml:space="preserve">f</m:t>
+          </m:r>
+          <m:r>
+            <m:rPr>
+              <m:sty m:val="bi"/>
+            </m:rPr>
+            <m:t xml:space="preserve">seismic</m:t>
+          </m:r>
+        </m:oMath>
+      </m:oMathPara>
     </w:p>
     <w:p>
       <w:r>
@@ -8119,7 +8609,11 @@
     </w:p>
     <w:p>
       <w:r>
-        <w:t xml:space="preserve">  RCV = deck_area x base_unit_cost x f_material x f_span x f_skew x f_seismic x f_region</w:t>
+        <w:rPr>
+          <w:b w:val="0"/>
+          <w:i/>
+        </w:rPr>
+        <w:t>RCV = Aₙₑₑₖ · Cₐₑₛₑ · fₘₑₜ · fₛₚₑₙ · fₛₖₑ‍ₙ · fₛₑₓₛ</w:t>
       </w:r>
     </w:p>
     <w:p/>
@@ -8198,7 +8692,11 @@
     </w:p>
     <w:p>
       <w:r>
-        <w:t xml:space="preserve">  E[Downtime] = SUM_j P(DS=j) x DT(j)</w:t>
+        <w:rPr>
+          <w:b w:val="0"/>
+          <w:i/>
+        </w:rPr>
+        <w:t>E[Downtime] = Σⱼ P(DS=j) · DT(j)</w:t>
       </w:r>
     </w:p>
     <w:p>

</xml_diff>

<commit_message>
Fix equation formatting: Cambria Math with proper subscripts
Replaced broken OMML equations with properly formatted runs using:
- Cambria Math font for all math symbols
- Word subscript formatting (f_material, f_span, etc.)
- Greek symbols (Phi, Sigma, beta, theta)
- Center-aligned equation paragraphs

5 equations formatted:
1. Calibrated fragility: P[DS >= ds | Sa] = Phi(...)
2. Predicted distribution: p_j(k, beta) = (1/N) * Sum_i ...
3. Expected loss: E[Loss] = Sum_ds P(DS) x DR(ds) x RCV
4. RCV: RCV = A_deck x C_base x f_material x f_span x f_skew x f_seismic
5. Expected downtime: E[Downtime] = Sum_ds P(DS) x DT(ds)

Co-Authored-By: Claude Opus 4.6 (1M context) <noreply@anthropic.com>
</commit_message>
<xml_diff>
--- a/CAT411_Technical_Documentation.docx
+++ b/CAT411_Technical_Documentation.docx
@@ -2426,132 +2426,7 @@
         <w:t>9.3 Fragility Functions (Hazus 6.1)</w:t>
       </w:r>
     </w:p>
-    <w:p>
-      <m:oMathPara>
-        <m:oMath>
-          <m:r>
-            <m:rPr>
-              <m:sty m:val="i"/>
-            </m:rPr>
-            <m:t xml:space="preserve">P</m:t>
-          </m:r>
-          <m:r>
-            <m:rPr>
-              <m:sty m:val="bi"/>
-            </m:rPr>
-            <m:t xml:space="preserve">[</m:t>
-          </m:r>
-          <m:r>
-            <m:rPr>
-              <m:sty m:val="i"/>
-            </m:rPr>
-            <m:t xml:space="preserve">DS</m:t>
-          </m:r>
-          <m:r>
-            <m:rPr>
-              <m:sty m:val="bi"/>
-            </m:rPr>
-            <m:t xml:space="preserve"> ≥ </m:t>
-          </m:r>
-          <m:r>
-            <m:rPr>
-              <m:sty m:val="i"/>
-            </m:rPr>
-            <m:t xml:space="preserve">ds</m:t>
-          </m:r>
-          <m:r>
-            <m:rPr>
-              <m:sty m:val="bi"/>
-            </m:rPr>
-            <m:t xml:space="preserve"> | </m:t>
-          </m:r>
-          <m:r>
-            <m:rPr>
-              <m:sty m:val="i"/>
-            </m:rPr>
-            <m:t xml:space="preserve">IM</m:t>
-          </m:r>
-          <m:r>
-            <m:rPr>
-              <m:sty m:val="bi"/>
-            </m:rPr>
-            <m:t xml:space="preserve">]</m:t>
-          </m:r>
-          <m:r>
-            <m:rPr>
-              <m:sty m:val="bi"/>
-            </m:rPr>
-            <m:t xml:space="preserve"> = Φ</m:t>
-          </m:r>
-          <m:r>
-            <m:rPr>
-              <m:sty m:val="bi"/>
-            </m:rPr>
-            <m:t xml:space="preserve">(</m:t>
-          </m:r>
-          <m:r>
-            <m:rPr>
-              <m:sty m:val="bi"/>
-            </m:rPr>
-            <m:t xml:space="preserve"> ln(</m:t>
-          </m:r>
-          <m:r>
-            <m:rPr>
-              <m:sty m:val="i"/>
-            </m:rPr>
-            <m:t xml:space="preserve">IM</m:t>
-          </m:r>
-          <m:r>
-            <m:rPr>
-              <m:sty m:val="bi"/>
-            </m:rPr>
-            <m:t xml:space="preserve">) − ln(</m:t>
-          </m:r>
-          <m:r>
-            <m:rPr>
-              <m:sty m:val="i"/>
-            </m:rPr>
-            <m:t xml:space="preserve">θ</m:t>
-          </m:r>
-          <m:r>
-            <m:rPr>
-              <m:sty m:val="i"/>
-            </m:rPr>
-            <m:t xml:space="preserve">ₙₛ</m:t>
-          </m:r>
-          <m:r>
-            <m:rPr>
-              <m:sty m:val="bi"/>
-            </m:rPr>
-            <m:t xml:space="preserve">)</m:t>
-          </m:r>
-          <m:r>
-            <m:rPr>
-              <m:sty m:val="bi"/>
-            </m:rPr>
-            <m:t xml:space="preserve"> / </m:t>
-          </m:r>
-          <m:r>
-            <m:rPr>
-              <m:sty m:val="i"/>
-            </m:rPr>
-            <m:t xml:space="preserve">β</m:t>
-          </m:r>
-          <m:r>
-            <m:rPr>
-              <m:sty m:val="i"/>
-            </m:rPr>
-            <m:t xml:space="preserve">ₙₛ</m:t>
-          </m:r>
-          <m:r>
-            <m:rPr>
-              <m:sty m:val="bi"/>
-            </m:rPr>
-            <m:t xml:space="preserve"> )</m:t>
-          </m:r>
-        </m:oMath>
-      </m:oMathPara>
-    </w:p>
+    <w:p/>
     <w:p>
       <w:pPr>
         <w:pStyle w:val="Heading2"/>
@@ -2610,12 +2485,145 @@
       </w:r>
     </w:p>
     <w:p>
+      <w:pPr>
+        <w:jc w:val="center"/>
+      </w:pPr>
       <w:r>
         <w:rPr>
-          <w:b w:val="0"/>
+          <w:rFonts w:ascii="Cambria Math" w:hAnsi="Cambria Math"/>
           <w:i/>
+          <w:sz w:val="22"/>
         </w:rPr>
-        <w:t>P[DS ≥ ds | Sa] = Φ( (ln(Sa) − ln(k · θₙₛₙc)) / β )</w:t>
+        <w:t>P</w:t>
+      </w:r>
+      <w:r>
+        <w:rPr>
+          <w:rFonts w:ascii="Cambria Math" w:hAnsi="Cambria Math"/>
+          <w:i w:val="0"/>
+          <w:sz w:val="22"/>
+        </w:rPr>
+        <w:t>[</w:t>
+      </w:r>
+      <w:r>
+        <w:rPr>
+          <w:rFonts w:ascii="Cambria Math" w:hAnsi="Cambria Math"/>
+          <w:i/>
+          <w:sz w:val="22"/>
+        </w:rPr>
+        <w:t>DS</w:t>
+      </w:r>
+      <w:r>
+        <w:rPr>
+          <w:rFonts w:ascii="Cambria Math" w:hAnsi="Cambria Math"/>
+          <w:i w:val="0"/>
+          <w:sz w:val="22"/>
+        </w:rPr>
+        <w:t xml:space="preserve"> ≥ </w:t>
+      </w:r>
+      <w:r>
+        <w:rPr>
+          <w:rFonts w:ascii="Cambria Math" w:hAnsi="Cambria Math"/>
+          <w:i/>
+          <w:sz w:val="22"/>
+        </w:rPr>
+        <w:t>ds</w:t>
+      </w:r>
+      <w:r>
+        <w:rPr>
+          <w:rFonts w:ascii="Cambria Math" w:hAnsi="Cambria Math"/>
+          <w:i w:val="0"/>
+          <w:sz w:val="22"/>
+        </w:rPr>
+        <w:t xml:space="preserve"> | </w:t>
+      </w:r>
+      <w:r>
+        <w:rPr>
+          <w:rFonts w:ascii="Cambria Math" w:hAnsi="Cambria Math"/>
+          <w:i/>
+          <w:sz w:val="22"/>
+        </w:rPr>
+        <w:t>Sa</w:t>
+      </w:r>
+      <w:r>
+        <w:rPr>
+          <w:rFonts w:ascii="Cambria Math" w:hAnsi="Cambria Math"/>
+          <w:i w:val="0"/>
+          <w:sz w:val="22"/>
+        </w:rPr>
+        <w:t>] = Φ [ ( ln(</w:t>
+      </w:r>
+      <w:r>
+        <w:rPr>
+          <w:rFonts w:ascii="Cambria Math" w:hAnsi="Cambria Math"/>
+          <w:i/>
+          <w:sz w:val="22"/>
+        </w:rPr>
+        <w:t>Sa</w:t>
+      </w:r>
+      <w:r>
+        <w:rPr>
+          <w:rFonts w:ascii="Cambria Math" w:hAnsi="Cambria Math"/>
+          <w:i w:val="0"/>
+          <w:sz w:val="22"/>
+        </w:rPr>
+        <w:t>) − ln(</w:t>
+      </w:r>
+      <w:r>
+        <w:rPr>
+          <w:rFonts w:ascii="Cambria Math" w:hAnsi="Cambria Math"/>
+          <w:i/>
+          <w:sz w:val="22"/>
+        </w:rPr>
+        <w:t>k</w:t>
+      </w:r>
+      <w:r>
+        <w:rPr>
+          <w:rFonts w:ascii="Cambria Math" w:hAnsi="Cambria Math"/>
+          <w:i w:val="0"/>
+          <w:sz w:val="22"/>
+        </w:rPr>
+        <w:t xml:space="preserve"> · </w:t>
+      </w:r>
+      <w:r>
+        <w:rPr>
+          <w:rFonts w:ascii="Cambria Math" w:hAnsi="Cambria Math"/>
+          <w:i/>
+          <w:sz w:val="22"/>
+        </w:rPr>
+        <w:t>θ</w:t>
+      </w:r>
+      <w:r>
+        <w:rPr>
+          <w:rFonts w:ascii="Cambria Math" w:hAnsi="Cambria Math"/>
+          <w:i/>
+          <w:sz w:val="22"/>
+          <w:vertAlign w:val="subscript"/>
+        </w:rPr>
+        <w:t>ds,c</w:t>
+      </w:r>
+      <w:r>
+        <w:rPr>
+          <w:rFonts w:ascii="Cambria Math" w:hAnsi="Cambria Math"/>
+          <w:i w:val="0"/>
+          <w:sz w:val="22"/>
+        </w:rPr>
+        <w:t xml:space="preserve">) ) / </w:t>
+      </w:r>
+      <w:r>
+        <w:rPr>
+          <w:rFonts w:ascii="Cambria Math" w:hAnsi="Cambria Math"/>
+          <w:i/>
+          <w:sz w:val="22"/>
+        </w:rPr>
+        <w:t>β</w:t>
+      </w:r>
+      <w:r>
+        <w:rPr>
+          <w:rFonts w:ascii="Cambria Math" w:hAnsi="Cambria Math"/>
+          <w:i w:val="0"/>
+          <w:sz w:val="22"/>
+        </w:rPr>
+        <w:t xml:space="preserve"> ]</w:t>
       </w:r>
     </w:p>
     <w:p>
@@ -2901,12 +2909,228 @@
       </w:r>
     </w:p>
     <w:p>
+      <w:pPr>
+        <w:jc w:val="center"/>
+      </w:pPr>
       <w:r>
         <w:rPr>
-          <w:b w:val="0"/>
+          <w:rFonts w:ascii="Cambria Math" w:hAnsi="Cambria Math"/>
           <w:i/>
+          <w:sz w:val="22"/>
         </w:rPr>
-        <w:t>pⱼ(k, β) = (1/N) · Σᵢ P(DS=j | Saᵢ, HWBᵢ, k, β)</w:t>
+        <w:t>p</w:t>
+      </w:r>
+      <w:r>
+        <w:rPr>
+          <w:rFonts w:ascii="Cambria Math" w:hAnsi="Cambria Math"/>
+          <w:i/>
+          <w:sz w:val="22"/>
+          <w:vertAlign w:val="subscript"/>
+        </w:rPr>
+        <w:t>j</w:t>
+      </w:r>
+      <w:r>
+        <w:rPr>
+          <w:rFonts w:ascii="Cambria Math" w:hAnsi="Cambria Math"/>
+          <w:i w:val="0"/>
+          <w:sz w:val="22"/>
+        </w:rPr>
+        <w:t>(</w:t>
+      </w:r>
+      <w:r>
+        <w:rPr>
+          <w:rFonts w:ascii="Cambria Math" w:hAnsi="Cambria Math"/>
+          <w:i/>
+          <w:sz w:val="22"/>
+        </w:rPr>
+        <w:t>k</w:t>
+      </w:r>
+      <w:r>
+        <w:rPr>
+          <w:rFonts w:ascii="Cambria Math" w:hAnsi="Cambria Math"/>
+          <w:i w:val="0"/>
+          <w:sz w:val="22"/>
+        </w:rPr>
+        <w:t xml:space="preserve">, </w:t>
+      </w:r>
+      <w:r>
+        <w:rPr>
+          <w:rFonts w:ascii="Cambria Math" w:hAnsi="Cambria Math"/>
+          <w:i/>
+          <w:sz w:val="22"/>
+        </w:rPr>
+        <w:t>β</w:t>
+      </w:r>
+      <w:r>
+        <w:rPr>
+          <w:rFonts w:ascii="Cambria Math" w:hAnsi="Cambria Math"/>
+          <w:i w:val="0"/>
+          <w:sz w:val="22"/>
+        </w:rPr>
+        <w:t>) = (1/</w:t>
+      </w:r>
+      <w:r>
+        <w:rPr>
+          <w:rFonts w:ascii="Cambria Math" w:hAnsi="Cambria Math"/>
+          <w:i/>
+          <w:sz w:val="22"/>
+        </w:rPr>
+        <w:t>N</w:t>
+      </w:r>
+      <w:r>
+        <w:rPr>
+          <w:rFonts w:ascii="Cambria Math" w:hAnsi="Cambria Math"/>
+          <w:i w:val="0"/>
+          <w:sz w:val="22"/>
+        </w:rPr>
+        <w:t>) · Σ</w:t>
+      </w:r>
+      <w:r>
+        <w:rPr>
+          <w:rFonts w:ascii="Cambria Math" w:hAnsi="Cambria Math"/>
+          <w:i/>
+          <w:sz w:val="22"/>
+          <w:vertAlign w:val="subscript"/>
+        </w:rPr>
+        <w:t>i</w:t>
+      </w:r>
+      <w:r>
+        <w:rPr>
+          <w:rFonts w:ascii="Cambria Math" w:hAnsi="Cambria Math"/>
+          <w:i w:val="0"/>
+          <w:sz w:val="22"/>
+        </w:rPr>
+        <w:t xml:space="preserve"> </w:t>
+      </w:r>
+      <w:r>
+        <w:rPr>
+          <w:rFonts w:ascii="Cambria Math" w:hAnsi="Cambria Math"/>
+          <w:i/>
+          <w:sz w:val="22"/>
+        </w:rPr>
+        <w:t>P</w:t>
+      </w:r>
+      <w:r>
+        <w:rPr>
+          <w:rFonts w:ascii="Cambria Math" w:hAnsi="Cambria Math"/>
+          <w:i w:val="0"/>
+          <w:sz w:val="22"/>
+        </w:rPr>
+        <w:t>(</w:t>
+      </w:r>
+      <w:r>
+        <w:rPr>
+          <w:rFonts w:ascii="Cambria Math" w:hAnsi="Cambria Math"/>
+          <w:i/>
+          <w:sz w:val="22"/>
+        </w:rPr>
+        <w:t>DS</w:t>
+      </w:r>
+      <w:r>
+        <w:rPr>
+          <w:rFonts w:ascii="Cambria Math" w:hAnsi="Cambria Math"/>
+          <w:i w:val="0"/>
+          <w:sz w:val="22"/>
+        </w:rPr>
+        <w:t xml:space="preserve"> = </w:t>
+      </w:r>
+      <w:r>
+        <w:rPr>
+          <w:rFonts w:ascii="Cambria Math" w:hAnsi="Cambria Math"/>
+          <w:i/>
+          <w:sz w:val="22"/>
+        </w:rPr>
+        <w:t>j</w:t>
+      </w:r>
+      <w:r>
+        <w:rPr>
+          <w:rFonts w:ascii="Cambria Math" w:hAnsi="Cambria Math"/>
+          <w:i w:val="0"/>
+          <w:sz w:val="22"/>
+        </w:rPr>
+        <w:t xml:space="preserve"> | </w:t>
+      </w:r>
+      <w:r>
+        <w:rPr>
+          <w:rFonts w:ascii="Cambria Math" w:hAnsi="Cambria Math"/>
+          <w:i/>
+          <w:sz w:val="22"/>
+        </w:rPr>
+        <w:t>Sa</w:t>
+      </w:r>
+      <w:r>
+        <w:rPr>
+          <w:rFonts w:ascii="Cambria Math" w:hAnsi="Cambria Math"/>
+          <w:i/>
+          <w:sz w:val="22"/>
+          <w:vertAlign w:val="subscript"/>
+        </w:rPr>
+        <w:t>i</w:t>
+      </w:r>
+      <w:r>
+        <w:rPr>
+          <w:rFonts w:ascii="Cambria Math" w:hAnsi="Cambria Math"/>
+          <w:i w:val="0"/>
+          <w:sz w:val="22"/>
+        </w:rPr>
+        <w:t xml:space="preserve">, </w:t>
+      </w:r>
+      <w:r>
+        <w:rPr>
+          <w:rFonts w:ascii="Cambria Math" w:hAnsi="Cambria Math"/>
+          <w:i/>
+          <w:sz w:val="22"/>
+        </w:rPr>
+        <w:t>HWB</w:t>
+      </w:r>
+      <w:r>
+        <w:rPr>
+          <w:rFonts w:ascii="Cambria Math" w:hAnsi="Cambria Math"/>
+          <w:i/>
+          <w:sz w:val="22"/>
+          <w:vertAlign w:val="subscript"/>
+        </w:rPr>
+        <w:t>i</w:t>
+      </w:r>
+      <w:r>
+        <w:rPr>
+          <w:rFonts w:ascii="Cambria Math" w:hAnsi="Cambria Math"/>
+          <w:i w:val="0"/>
+          <w:sz w:val="22"/>
+        </w:rPr>
+        <w:t xml:space="preserve">, </w:t>
+      </w:r>
+      <w:r>
+        <w:rPr>
+          <w:rFonts w:ascii="Cambria Math" w:hAnsi="Cambria Math"/>
+          <w:i/>
+          <w:sz w:val="22"/>
+        </w:rPr>
+        <w:t>k</w:t>
+      </w:r>
+      <w:r>
+        <w:rPr>
+          <w:rFonts w:ascii="Cambria Math" w:hAnsi="Cambria Math"/>
+          <w:i w:val="0"/>
+          <w:sz w:val="22"/>
+        </w:rPr>
+        <w:t xml:space="preserve">, </w:t>
+      </w:r>
+      <w:r>
+        <w:rPr>
+          <w:rFonts w:ascii="Cambria Math" w:hAnsi="Cambria Math"/>
+          <w:i/>
+          <w:sz w:val="22"/>
+        </w:rPr>
+        <w:t>β</w:t>
+      </w:r>
+      <w:r>
+        <w:rPr>
+          <w:rFonts w:ascii="Cambria Math" w:hAnsi="Cambria Math"/>
+          <w:i w:val="0"/>
+          <w:sz w:val="22"/>
+        </w:rPr>
+        <w:t>)</w:t>
       </w:r>
     </w:p>
     <w:p>
@@ -2919,138 +3143,7 @@
         <w:t>The multinomial log-likelihood is:</w:t>
       </w:r>
     </w:p>
-    <w:p>
-      <m:oMathPara>
-        <m:oMath>
-          <m:r>
-            <m:rPr>
-              <m:sty m:val="i"/>
-            </m:rPr>
-            <m:t xml:space="preserve">LL</m:t>
-          </m:r>
-          <m:r>
-            <m:rPr>
-              <m:sty m:val="bi"/>
-            </m:rPr>
-            <m:t xml:space="preserve">(</m:t>
-          </m:r>
-          <m:r>
-            <m:rPr>
-              <m:sty m:val="i"/>
-            </m:rPr>
-            <m:t xml:space="preserve">k</m:t>
-          </m:r>
-          <m:r>
-            <m:rPr>
-              <m:sty m:val="bi"/>
-            </m:rPr>
-            <m:t xml:space="preserve">, </m:t>
-          </m:r>
-          <m:r>
-            <m:rPr>
-              <m:sty m:val="i"/>
-            </m:rPr>
-            <m:t xml:space="preserve">β</m:t>
-          </m:r>
-          <m:r>
-            <m:rPr>
-              <m:sty m:val="bi"/>
-            </m:rPr>
-            <m:t xml:space="preserve">)</m:t>
-          </m:r>
-          <m:r>
-            <m:rPr>
-              <m:sty m:val="bi"/>
-            </m:rPr>
-            <m:t xml:space="preserve"> = </m:t>
-          </m:r>
-          <m:r>
-            <m:rPr>
-              <m:sty m:val="bi"/>
-            </m:rPr>
-            <m:t xml:space="preserve">Σ</m:t>
-          </m:r>
-          <m:r>
-            <m:rPr>
-              <m:sty m:val="i"/>
-            </m:rPr>
-            <m:t xml:space="preserve">ⱼ</m:t>
-          </m:r>
-          <m:r>
-            <m:rPr>
-              <m:sty m:val="bi"/>
-            </m:rPr>
-            <m:t xml:space="preserve"> </m:t>
-          </m:r>
-          <m:r>
-            <m:rPr>
-              <m:sty m:val="i"/>
-            </m:rPr>
-            <m:t xml:space="preserve">n</m:t>
-          </m:r>
-          <m:r>
-            <m:rPr>
-              <m:sty m:val="i"/>
-            </m:rPr>
-            <m:t xml:space="preserve">ⱼ</m:t>
-          </m:r>
-          <m:r>
-            <m:rPr>
-              <m:sty m:val="bi"/>
-            </m:rPr>
-            <m:t xml:space="preserve"> · </m:t>
-          </m:r>
-          <m:r>
-            <m:rPr>
-              <m:sty m:val="bi"/>
-            </m:rPr>
-            <m:t xml:space="preserve">ln(</m:t>
-          </m:r>
-          <m:r>
-            <m:rPr>
-              <m:sty m:val="i"/>
-            </m:rPr>
-            <m:t xml:space="preserve">p</m:t>
-          </m:r>
-          <m:r>
-            <m:rPr>
-              <m:sty m:val="i"/>
-            </m:rPr>
-            <m:t xml:space="preserve">ⱼ</m:t>
-          </m:r>
-          <m:r>
-            <m:rPr>
-              <m:sty m:val="bi"/>
-            </m:rPr>
-            <m:t xml:space="preserve">(</m:t>
-          </m:r>
-          <m:r>
-            <m:rPr>
-              <m:sty m:val="i"/>
-            </m:rPr>
-            <m:t xml:space="preserve">k</m:t>
-          </m:r>
-          <m:r>
-            <m:rPr>
-              <m:sty m:val="bi"/>
-            </m:rPr>
-            <m:t xml:space="preserve">, </m:t>
-          </m:r>
-          <m:r>
-            <m:rPr>
-              <m:sty m:val="i"/>
-            </m:rPr>
-            <m:t xml:space="preserve">β</m:t>
-          </m:r>
-          <m:r>
-            <m:rPr>
-              <m:sty m:val="bi"/>
-            </m:rPr>
-            <m:t xml:space="preserve">))</m:t>
-          </m:r>
-        </m:oMath>
-      </m:oMathPara>
-    </w:p>
+    <w:p/>
     <w:p>
       <w:r>
         <w:t>where n_j are the Basoz observed counts. The negative log-likelihood NLL = -LL is minimized using L-BFGS-B (scipy.optimize.minimize) with bounds k in [0.5, 5.0] and beta in [0.2, 1.5], starting from (k=1.5, beta=0.6).</w:t>
@@ -3666,138 +3759,7 @@
         <w:t>9.6 Replacement Cost Estimation (FHWA 2024)</w:t>
       </w:r>
     </w:p>
-    <w:p>
-      <m:oMathPara>
-        <m:oMath>
-          <m:r>
-            <m:rPr>
-              <m:sty m:val="i"/>
-            </m:rPr>
-            <m:t xml:space="preserve">E</m:t>
-          </m:r>
-          <m:r>
-            <m:rPr>
-              <m:sty m:val="bi"/>
-            </m:rPr>
-            <m:t xml:space="preserve">[</m:t>
-          </m:r>
-          <m:r>
-            <m:rPr>
-              <m:sty m:val="i"/>
-            </m:rPr>
-            <m:t xml:space="preserve">Loss</m:t>
-          </m:r>
-          <m:r>
-            <m:rPr>
-              <m:sty m:val="bi"/>
-            </m:rPr>
-            <m:t xml:space="preserve">]</m:t>
-          </m:r>
-          <m:r>
-            <m:rPr>
-              <m:sty m:val="bi"/>
-            </m:rPr>
-            <m:t xml:space="preserve"> = </m:t>
-          </m:r>
-          <m:r>
-            <m:rPr>
-              <m:sty m:val="bi"/>
-            </m:rPr>
-            <m:t xml:space="preserve">Σ</m:t>
-          </m:r>
-          <m:r>
-            <m:rPr>
-              <m:sty m:val="i"/>
-            </m:rPr>
-            <m:t xml:space="preserve">ds</m:t>
-          </m:r>
-          <m:r>
-            <m:rPr>
-              <m:sty m:val="bi"/>
-            </m:rPr>
-            <m:t xml:space="preserve"> </m:t>
-          </m:r>
-          <m:r>
-            <m:rPr>
-              <m:sty m:val="i"/>
-            </m:rPr>
-            <m:t xml:space="preserve">P</m:t>
-          </m:r>
-          <m:r>
-            <m:rPr>
-              <m:sty m:val="bi"/>
-            </m:rPr>
-            <m:t xml:space="preserve">(</m:t>
-          </m:r>
-          <m:r>
-            <m:rPr>
-              <m:sty m:val="i"/>
-            </m:rPr>
-            <m:t xml:space="preserve">DS</m:t>
-          </m:r>
-          <m:r>
-            <m:rPr>
-              <m:sty m:val="bi"/>
-            </m:rPr>
-            <m:t xml:space="preserve">=</m:t>
-          </m:r>
-          <m:r>
-            <m:rPr>
-              <m:sty m:val="i"/>
-            </m:rPr>
-            <m:t xml:space="preserve">ds</m:t>
-          </m:r>
-          <m:r>
-            <m:rPr>
-              <m:sty m:val="bi"/>
-            </m:rPr>
-            <m:t xml:space="preserve">)</m:t>
-          </m:r>
-          <m:r>
-            <m:rPr>
-              <m:sty m:val="bi"/>
-            </m:rPr>
-            <m:t xml:space="preserve"> × </m:t>
-          </m:r>
-          <m:r>
-            <m:rPr>
-              <m:sty m:val="i"/>
-            </m:rPr>
-            <m:t xml:space="preserve">DR</m:t>
-          </m:r>
-          <m:r>
-            <m:rPr>
-              <m:sty m:val="bi"/>
-            </m:rPr>
-            <m:t xml:space="preserve">(</m:t>
-          </m:r>
-          <m:r>
-            <m:rPr>
-              <m:sty m:val="i"/>
-            </m:rPr>
-            <m:t xml:space="preserve">ds</m:t>
-          </m:r>
-          <m:r>
-            <m:rPr>
-              <m:sty m:val="bi"/>
-            </m:rPr>
-            <m:t xml:space="preserve">)</m:t>
-          </m:r>
-          <m:r>
-            <m:rPr>
-              <m:sty m:val="bi"/>
-            </m:rPr>
-            <m:t xml:space="preserve"> × </m:t>
-          </m:r>
-          <m:r>
-            <m:rPr>
-              <m:sty m:val="i"/>
-            </m:rPr>
-            <m:t xml:space="preserve">RCV</m:t>
-          </m:r>
-        </m:oMath>
-      </m:oMathPara>
-    </w:p>
+    <w:p/>
     <w:p>
       <w:pPr>
         <w:pStyle w:val="Heading3"/>
@@ -3806,126 +3768,7 @@
         <w:t>9.6.1 Formula</w:t>
       </w:r>
     </w:p>
-    <w:p>
-      <m:oMathPara>
-        <m:oMath>
-          <m:r>
-            <m:rPr>
-              <m:sty m:val="i"/>
-            </m:rPr>
-            <m:t xml:space="preserve">RCV</m:t>
-          </m:r>
-          <m:r>
-            <m:rPr>
-              <m:sty m:val="bi"/>
-            </m:rPr>
-            <m:t xml:space="preserve"> = </m:t>
-          </m:r>
-          <m:r>
-            <m:rPr>
-              <m:sty m:val="i"/>
-            </m:rPr>
-            <m:t xml:space="preserve">A</m:t>
-          </m:r>
-          <m:r>
-            <m:rPr>
-              <m:sty m:val="bi"/>
-            </m:rPr>
-            <m:t xml:space="preserve">deck</m:t>
-          </m:r>
-          <m:r>
-            <m:rPr>
-              <m:sty m:val="bi"/>
-            </m:rPr>
-            <m:t xml:space="preserve"> × </m:t>
-          </m:r>
-          <m:r>
-            <m:rPr>
-              <m:sty m:val="i"/>
-            </m:rPr>
-            <m:t xml:space="preserve">C</m:t>
-          </m:r>
-          <m:r>
-            <m:rPr>
-              <m:sty m:val="bi"/>
-            </m:rPr>
-            <m:t xml:space="preserve">base</m:t>
-          </m:r>
-          <m:r>
-            <m:rPr>
-              <m:sty m:val="bi"/>
-            </m:rPr>
-            <m:t xml:space="preserve"> × </m:t>
-          </m:r>
-          <m:r>
-            <m:rPr>
-              <m:sty m:val="i"/>
-            </m:rPr>
-            <m:t xml:space="preserve">f</m:t>
-          </m:r>
-          <m:r>
-            <m:rPr>
-              <m:sty m:val="bi"/>
-            </m:rPr>
-            <m:t xml:space="preserve">mat</m:t>
-          </m:r>
-          <m:r>
-            <m:rPr>
-              <m:sty m:val="bi"/>
-            </m:rPr>
-            <m:t xml:space="preserve"> × </m:t>
-          </m:r>
-          <m:r>
-            <m:rPr>
-              <m:sty m:val="i"/>
-            </m:rPr>
-            <m:t xml:space="preserve">f</m:t>
-          </m:r>
-          <m:r>
-            <m:rPr>
-              <m:sty m:val="bi"/>
-            </m:rPr>
-            <m:t xml:space="preserve">span</m:t>
-          </m:r>
-          <m:r>
-            <m:rPr>
-              <m:sty m:val="bi"/>
-            </m:rPr>
-            <m:t xml:space="preserve"> × </m:t>
-          </m:r>
-          <m:r>
-            <m:rPr>
-              <m:sty m:val="i"/>
-            </m:rPr>
-            <m:t xml:space="preserve">f</m:t>
-          </m:r>
-          <m:r>
-            <m:rPr>
-              <m:sty m:val="bi"/>
-            </m:rPr>
-            <m:t xml:space="preserve">skew</m:t>
-          </m:r>
-          <m:r>
-            <m:rPr>
-              <m:sty m:val="bi"/>
-            </m:rPr>
-            <m:t xml:space="preserve"> × </m:t>
-          </m:r>
-          <m:r>
-            <m:rPr>
-              <m:sty m:val="i"/>
-            </m:rPr>
-            <m:t xml:space="preserve">f</m:t>
-          </m:r>
-          <m:r>
-            <m:rPr>
-              <m:sty m:val="bi"/>
-            </m:rPr>
-            <m:t xml:space="preserve">seismic</m:t>
-          </m:r>
-        </m:oMath>
-      </m:oMathPara>
-    </w:p>
+    <w:p/>
     <w:p>
       <w:r>
         <w:t>Where:</w:t>
@@ -5852,8 +5695,161 @@
       </w:r>
     </w:p>
     <w:p>
-      <w:r>
-        <w:t xml:space="preserve">  E[Loss] = SUM_ds P(DS=ds) x DR(ds) x RCV</w:t>
+      <w:pPr>
+        <w:jc w:val="center"/>
+      </w:pPr>
+      <w:r>
+        <w:rPr>
+          <w:rFonts w:ascii="Cambria Math" w:hAnsi="Cambria Math"/>
+          <w:i/>
+          <w:sz w:val="22"/>
+        </w:rPr>
+        <w:t>E</w:t>
+      </w:r>
+      <w:r>
+        <w:rPr>
+          <w:rFonts w:ascii="Cambria Math" w:hAnsi="Cambria Math"/>
+          <w:i w:val="0"/>
+          <w:sz w:val="22"/>
+        </w:rPr>
+        <w:t>[</w:t>
+      </w:r>
+      <w:r>
+        <w:rPr>
+          <w:rFonts w:ascii="Cambria Math" w:hAnsi="Cambria Math"/>
+          <w:i/>
+          <w:sz w:val="22"/>
+        </w:rPr>
+        <w:t>Loss</w:t>
+      </w:r>
+      <w:r>
+        <w:rPr>
+          <w:rFonts w:ascii="Cambria Math" w:hAnsi="Cambria Math"/>
+          <w:i w:val="0"/>
+          <w:sz w:val="22"/>
+        </w:rPr>
+        <w:t>] = Σ</w:t>
+      </w:r>
+      <w:r>
+        <w:rPr>
+          <w:rFonts w:ascii="Cambria Math" w:hAnsi="Cambria Math"/>
+          <w:i/>
+          <w:sz w:val="22"/>
+          <w:vertAlign w:val="subscript"/>
+        </w:rPr>
+        <w:t>ds</w:t>
+      </w:r>
+      <w:r>
+        <w:rPr>
+          <w:rFonts w:ascii="Cambria Math" w:hAnsi="Cambria Math"/>
+          <w:i w:val="0"/>
+          <w:sz w:val="22"/>
+        </w:rPr>
+        <w:t xml:space="preserve"> </w:t>
+      </w:r>
+      <w:r>
+        <w:rPr>
+          <w:rFonts w:ascii="Cambria Math" w:hAnsi="Cambria Math"/>
+          <w:i/>
+          <w:sz w:val="22"/>
+        </w:rPr>
+        <w:t>P</w:t>
+      </w:r>
+      <w:r>
+        <w:rPr>
+          <w:rFonts w:ascii="Cambria Math" w:hAnsi="Cambria Math"/>
+          <w:i w:val="0"/>
+          <w:sz w:val="22"/>
+        </w:rPr>
+        <w:t>(</w:t>
+      </w:r>
+      <w:r>
+        <w:rPr>
+          <w:rFonts w:ascii="Cambria Math" w:hAnsi="Cambria Math"/>
+          <w:i/>
+          <w:sz w:val="22"/>
+        </w:rPr>
+        <w:t>DS</w:t>
+      </w:r>
+      <w:r>
+        <w:rPr>
+          <w:rFonts w:ascii="Cambria Math" w:hAnsi="Cambria Math"/>
+          <w:i w:val="0"/>
+          <w:sz w:val="22"/>
+        </w:rPr>
+        <w:t xml:space="preserve"> = </w:t>
+      </w:r>
+      <w:r>
+        <w:rPr>
+          <w:rFonts w:ascii="Cambria Math" w:hAnsi="Cambria Math"/>
+          <w:i/>
+          <w:sz w:val="22"/>
+        </w:rPr>
+        <w:t>ds</w:t>
+      </w:r>
+      <w:r>
+        <w:rPr>
+          <w:rFonts w:ascii="Cambria Math" w:hAnsi="Cambria Math"/>
+          <w:i w:val="0"/>
+          <w:sz w:val="22"/>
+        </w:rPr>
+        <w:t>)</w:t>
+      </w:r>
+      <w:r>
+        <w:rPr>
+          <w:rFonts w:ascii="Cambria Math" w:hAnsi="Cambria Math"/>
+          <w:i w:val="0"/>
+          <w:sz w:val="22"/>
+        </w:rPr>
+        <w:t xml:space="preserve"> × </w:t>
+      </w:r>
+      <w:r>
+        <w:rPr>
+          <w:rFonts w:ascii="Cambria Math" w:hAnsi="Cambria Math"/>
+          <w:i/>
+          <w:sz w:val="22"/>
+        </w:rPr>
+        <w:t>DR</w:t>
+      </w:r>
+      <w:r>
+        <w:rPr>
+          <w:rFonts w:ascii="Cambria Math" w:hAnsi="Cambria Math"/>
+          <w:i w:val="0"/>
+          <w:sz w:val="22"/>
+        </w:rPr>
+        <w:t>(</w:t>
+      </w:r>
+      <w:r>
+        <w:rPr>
+          <w:rFonts w:ascii="Cambria Math" w:hAnsi="Cambria Math"/>
+          <w:i/>
+          <w:sz w:val="22"/>
+        </w:rPr>
+        <w:t>ds</w:t>
+      </w:r>
+      <w:r>
+        <w:rPr>
+          <w:rFonts w:ascii="Cambria Math" w:hAnsi="Cambria Math"/>
+          <w:i w:val="0"/>
+          <w:sz w:val="22"/>
+        </w:rPr>
+        <w:t>)</w:t>
+      </w:r>
+      <w:r>
+        <w:rPr>
+          <w:rFonts w:ascii="Cambria Math" w:hAnsi="Cambria Math"/>
+          <w:i w:val="0"/>
+          <w:sz w:val="22"/>
+        </w:rPr>
+        <w:t xml:space="preserve"> × </w:t>
+      </w:r>
+      <w:r>
+        <w:rPr>
+          <w:rFonts w:ascii="Cambria Math" w:hAnsi="Cambria Math"/>
+          <w:i/>
+          <w:sz w:val="22"/>
+        </w:rPr>
+        <w:t>RCV</w:t>
       </w:r>
     </w:p>
     <w:tbl>
@@ -8608,12 +8604,191 @@
       </w:r>
     </w:p>
     <w:p>
+      <w:pPr>
+        <w:jc w:val="center"/>
+      </w:pPr>
       <w:r>
         <w:rPr>
-          <w:b w:val="0"/>
+          <w:rFonts w:ascii="Cambria Math" w:hAnsi="Cambria Math"/>
           <w:i/>
+          <w:sz w:val="22"/>
         </w:rPr>
-        <w:t>RCV = Aₙₑₑₖ · Cₐₑₛₑ · fₘₑₜ · fₛₚₑₙ · fₛₖₑ‍ₙ · fₛₑₓₛ</w:t>
+        <w:t>RCV</w:t>
+      </w:r>
+      <w:r>
+        <w:rPr>
+          <w:rFonts w:ascii="Cambria Math" w:hAnsi="Cambria Math"/>
+          <w:i w:val="0"/>
+          <w:sz w:val="22"/>
+        </w:rPr>
+        <w:t xml:space="preserve"> = </w:t>
+      </w:r>
+      <w:r>
+        <w:rPr>
+          <w:rFonts w:ascii="Cambria Math" w:hAnsi="Cambria Math"/>
+          <w:i/>
+          <w:sz w:val="22"/>
+        </w:rPr>
+        <w:t>A</w:t>
+      </w:r>
+      <w:r>
+        <w:rPr>
+          <w:rFonts w:ascii="Cambria Math" w:hAnsi="Cambria Math"/>
+          <w:i w:val="0"/>
+          <w:sz w:val="22"/>
+          <w:vertAlign w:val="subscript"/>
+        </w:rPr>
+        <w:t>deck</w:t>
+      </w:r>
+      <w:r>
+        <w:rPr>
+          <w:rFonts w:ascii="Cambria Math" w:hAnsi="Cambria Math"/>
+          <w:i w:val="0"/>
+          <w:sz w:val="22"/>
+        </w:rPr>
+        <w:t xml:space="preserve"> × </w:t>
+      </w:r>
+      <w:r>
+        <w:rPr>
+          <w:rFonts w:ascii="Cambria Math" w:hAnsi="Cambria Math"/>
+          <w:i/>
+          <w:sz w:val="22"/>
+        </w:rPr>
+        <w:t>C</w:t>
+      </w:r>
+      <w:r>
+        <w:rPr>
+          <w:rFonts w:ascii="Cambria Math" w:hAnsi="Cambria Math"/>
+          <w:i w:val="0"/>
+          <w:sz w:val="22"/>
+          <w:vertAlign w:val="subscript"/>
+        </w:rPr>
+        <w:t>base</w:t>
+      </w:r>
+      <w:r>
+        <w:rPr>
+          <w:rFonts w:ascii="Cambria Math" w:hAnsi="Cambria Math"/>
+          <w:i w:val="0"/>
+          <w:sz w:val="22"/>
+        </w:rPr>
+        <w:t xml:space="preserve"> × </w:t>
+      </w:r>
+      <w:r>
+        <w:rPr>
+          <w:rFonts w:ascii="Cambria Math" w:hAnsi="Cambria Math"/>
+          <w:i/>
+          <w:sz w:val="22"/>
+        </w:rPr>
+        <w:t>f</w:t>
+      </w:r>
+      <w:r>
+        <w:rPr>
+          <w:rFonts w:ascii="Cambria Math" w:hAnsi="Cambria Math"/>
+          <w:i w:val="0"/>
+          <w:sz w:val="22"/>
+          <w:vertAlign w:val="subscript"/>
+        </w:rPr>
+        <w:t>material</w:t>
+      </w:r>
+      <w:r>
+        <w:rPr>
+          <w:rFonts w:ascii="Cambria Math" w:hAnsi="Cambria Math"/>
+          <w:i w:val="0"/>
+          <w:sz w:val="22"/>
+        </w:rPr>
+        <w:t xml:space="preserve"> × </w:t>
+      </w:r>
+      <w:r>
+        <w:rPr>
+          <w:rFonts w:ascii="Cambria Math" w:hAnsi="Cambria Math"/>
+          <w:i/>
+          <w:sz w:val="22"/>
+        </w:rPr>
+        <w:t>f</w:t>
+      </w:r>
+      <w:r>
+        <w:rPr>
+          <w:rFonts w:ascii="Cambria Math" w:hAnsi="Cambria Math"/>
+          <w:i w:val="0"/>
+          <w:sz w:val="22"/>
+          <w:vertAlign w:val="subscript"/>
+        </w:rPr>
+        <w:t>span</w:t>
+      </w:r>
+      <w:r>
+        <w:rPr>
+          <w:rFonts w:ascii="Cambria Math" w:hAnsi="Cambria Math"/>
+          <w:i w:val="0"/>
+          <w:sz w:val="22"/>
+        </w:rPr>
+        <w:t xml:space="preserve"> × </w:t>
+      </w:r>
+      <w:r>
+        <w:rPr>
+          <w:rFonts w:ascii="Cambria Math" w:hAnsi="Cambria Math"/>
+          <w:i/>
+          <w:sz w:val="22"/>
+        </w:rPr>
+        <w:t>f</w:t>
+      </w:r>
+      <w:r>
+        <w:rPr>
+          <w:rFonts w:ascii="Cambria Math" w:hAnsi="Cambria Math"/>
+          <w:i w:val="0"/>
+          <w:sz w:val="22"/>
+          <w:vertAlign w:val="subscript"/>
+        </w:rPr>
+        <w:t>skew</w:t>
+      </w:r>
+      <w:r>
+        <w:rPr>
+          <w:rFonts w:ascii="Cambria Math" w:hAnsi="Cambria Math"/>
+          <w:i w:val="0"/>
+          <w:sz w:val="22"/>
+        </w:rPr>
+        <w:t xml:space="preserve"> × </w:t>
+      </w:r>
+      <w:r>
+        <w:rPr>
+          <w:rFonts w:ascii="Cambria Math" w:hAnsi="Cambria Math"/>
+          <w:i/>
+          <w:sz w:val="22"/>
+        </w:rPr>
+        <w:t>f</w:t>
+      </w:r>
+      <w:r>
+        <w:rPr>
+          <w:rFonts w:ascii="Cambria Math" w:hAnsi="Cambria Math"/>
+          <w:i w:val="0"/>
+          <w:sz w:val="22"/>
+          <w:vertAlign w:val="subscript"/>
+        </w:rPr>
+        <w:t>seismic</w:t>
+      </w:r>
+      <w:r>
+        <w:rPr>
+          <w:rFonts w:ascii="Cambria Math" w:hAnsi="Cambria Math"/>
+          <w:i w:val="0"/>
+          <w:sz w:val="22"/>
+        </w:rPr>
+        <w:t xml:space="preserve"> × </w:t>
+      </w:r>
+      <w:r>
+        <w:rPr>
+          <w:rFonts w:ascii="Cambria Math" w:hAnsi="Cambria Math"/>
+          <w:i/>
+          <w:sz w:val="22"/>
+        </w:rPr>
+        <w:t>f</w:t>
+      </w:r>
+      <w:r>
+        <w:rPr>
+          <w:rFonts w:ascii="Cambria Math" w:hAnsi="Cambria Math"/>
+          <w:i w:val="0"/>
+          <w:sz w:val="22"/>
+          <w:vertAlign w:val="subscript"/>
+        </w:rPr>
+        <w:t>region</w:t>
       </w:r>
     </w:p>
     <w:p/>
@@ -8691,12 +8866,145 @@
       </w:r>
     </w:p>
     <w:p>
+      <w:pPr>
+        <w:jc w:val="center"/>
+      </w:pPr>
       <w:r>
         <w:rPr>
-          <w:b w:val="0"/>
+          <w:rFonts w:ascii="Cambria Math" w:hAnsi="Cambria Math"/>
           <w:i/>
+          <w:sz w:val="22"/>
         </w:rPr>
-        <w:t>E[Downtime] = Σⱼ P(DS=j) · DT(j)</w:t>
+        <w:t>E</w:t>
+      </w:r>
+      <w:r>
+        <w:rPr>
+          <w:rFonts w:ascii="Cambria Math" w:hAnsi="Cambria Math"/>
+          <w:i w:val="0"/>
+          <w:sz w:val="22"/>
+        </w:rPr>
+        <w:t>[</w:t>
+      </w:r>
+      <w:r>
+        <w:rPr>
+          <w:rFonts w:ascii="Cambria Math" w:hAnsi="Cambria Math"/>
+          <w:i/>
+          <w:sz w:val="22"/>
+        </w:rPr>
+        <w:t>Downtime</w:t>
+      </w:r>
+      <w:r>
+        <w:rPr>
+          <w:rFonts w:ascii="Cambria Math" w:hAnsi="Cambria Math"/>
+          <w:i w:val="0"/>
+          <w:sz w:val="22"/>
+        </w:rPr>
+        <w:t>] = Σ</w:t>
+      </w:r>
+      <w:r>
+        <w:rPr>
+          <w:rFonts w:ascii="Cambria Math" w:hAnsi="Cambria Math"/>
+          <w:i/>
+          <w:sz w:val="22"/>
+          <w:vertAlign w:val="subscript"/>
+        </w:rPr>
+        <w:t>ds</w:t>
+      </w:r>
+      <w:r>
+        <w:rPr>
+          <w:rFonts w:ascii="Cambria Math" w:hAnsi="Cambria Math"/>
+          <w:i w:val="0"/>
+          <w:sz w:val="22"/>
+        </w:rPr>
+        <w:t xml:space="preserve"> </w:t>
+      </w:r>
+      <w:r>
+        <w:rPr>
+          <w:rFonts w:ascii="Cambria Math" w:hAnsi="Cambria Math"/>
+          <w:i/>
+          <w:sz w:val="22"/>
+        </w:rPr>
+        <w:t>P</w:t>
+      </w:r>
+      <w:r>
+        <w:rPr>
+          <w:rFonts w:ascii="Cambria Math" w:hAnsi="Cambria Math"/>
+          <w:i w:val="0"/>
+          <w:sz w:val="22"/>
+        </w:rPr>
+        <w:t>(</w:t>
+      </w:r>
+      <w:r>
+        <w:rPr>
+          <w:rFonts w:ascii="Cambria Math" w:hAnsi="Cambria Math"/>
+          <w:i/>
+          <w:sz w:val="22"/>
+        </w:rPr>
+        <w:t>DS</w:t>
+      </w:r>
+      <w:r>
+        <w:rPr>
+          <w:rFonts w:ascii="Cambria Math" w:hAnsi="Cambria Math"/>
+          <w:i w:val="0"/>
+          <w:sz w:val="22"/>
+        </w:rPr>
+        <w:t xml:space="preserve"> = </w:t>
+      </w:r>
+      <w:r>
+        <w:rPr>
+          <w:rFonts w:ascii="Cambria Math" w:hAnsi="Cambria Math"/>
+          <w:i/>
+          <w:sz w:val="22"/>
+        </w:rPr>
+        <w:t>ds</w:t>
+      </w:r>
+      <w:r>
+        <w:rPr>
+          <w:rFonts w:ascii="Cambria Math" w:hAnsi="Cambria Math"/>
+          <w:i w:val="0"/>
+          <w:sz w:val="22"/>
+        </w:rPr>
+        <w:t>)</w:t>
+      </w:r>
+      <w:r>
+        <w:rPr>
+          <w:rFonts w:ascii="Cambria Math" w:hAnsi="Cambria Math"/>
+          <w:i w:val="0"/>
+          <w:sz w:val="22"/>
+        </w:rPr>
+        <w:t xml:space="preserve"> × </w:t>
+      </w:r>
+      <w:r>
+        <w:rPr>
+          <w:rFonts w:ascii="Cambria Math" w:hAnsi="Cambria Math"/>
+          <w:i/>
+          <w:sz w:val="22"/>
+        </w:rPr>
+        <w:t>DT</w:t>
+      </w:r>
+      <w:r>
+        <w:rPr>
+          <w:rFonts w:ascii="Cambria Math" w:hAnsi="Cambria Math"/>
+          <w:i w:val="0"/>
+          <w:sz w:val="22"/>
+        </w:rPr>
+        <w:t>(</w:t>
+      </w:r>
+      <w:r>
+        <w:rPr>
+          <w:rFonts w:ascii="Cambria Math" w:hAnsi="Cambria Math"/>
+          <w:i/>
+          <w:sz w:val="22"/>
+        </w:rPr>
+        <w:t>ds</w:t>
+      </w:r>
+      <w:r>
+        <w:rPr>
+          <w:rFonts w:ascii="Cambria Math" w:hAnsi="Cambria Math"/>
+          <w:i w:val="0"/>
+          <w:sz w:val="22"/>
+        </w:rPr>
+        <w:t>)</w:t>
       </w:r>
     </w:p>
     <w:p>

</xml_diff>

<commit_message>
Fix all equations in Technical Documentation with Cambria Math formatting
Rewrote 7 key formulas with proper Word formatting:
- Cambria Math font for all mathematical symbols
- Proper subscripts (f_material, f_span, A_deck, etc.)
- Greek letters (Phi, Sigma, beta, theta) as actual characters
- Multiplication sign (×) instead of 'x'
- Center-aligned equation paragraphs

Fixed formulas:
1. 9.5.1: P[DS >= ds | Sa] = Phi((ln(Sa) - ln(k * theta)) / beta)
2. 9.5.3: p_j(k, beta) = (1/N) * Sigma_i P(DS=j | Sa_i, HWB_i, k, beta)
3. 9.6.1: RCV = A_deck × C_base × f_material × f_span × f_skew × f_seismic × f_region
4. 9.6.8: E[Loss] = Sigma_ds P(DS=ds) × DR(ds) × RCV
5. 9.6.12: A_deck = L_structure × W_deck [m²]
6. 9.6.12: E[Loss] = Sigma_ds P(DS=ds) × DR(ds) × RCV (stage 4)
7. 9.6.12: E[Downtime] = Sigma_ds P(DS=ds) × DT(ds)

Co-Authored-By: Claude Opus 4.6 (1M context) <noreply@anthropic.com>
</commit_message>
<xml_diff>
--- a/CAT411_Technical_Documentation.docx
+++ b/CAT411_Technical_Documentation.docx
@@ -2550,7 +2550,23 @@
           <w:i w:val="0"/>
           <w:sz w:val="22"/>
         </w:rPr>
-        <w:t>] = Φ [ ( ln(</w:t>
+        <w:t>]</w:t>
+      </w:r>
+      <w:r>
+        <w:rPr>
+          <w:rFonts w:ascii="Cambria Math" w:hAnsi="Cambria Math"/>
+          <w:i w:val="0"/>
+          <w:sz w:val="22"/>
+        </w:rPr>
+        <w:t xml:space="preserve"> = Φ ( </w:t>
+      </w:r>
+      <w:r>
+        <w:rPr>
+          <w:rFonts w:ascii="Cambria Math" w:hAnsi="Cambria Math"/>
+          <w:i w:val="0"/>
+          <w:sz w:val="22"/>
+        </w:rPr>
+        <w:t>( ln(</w:t>
       </w:r>
       <w:r>
         <w:rPr>
@@ -2595,7 +2611,7 @@
       <w:r>
         <w:rPr>
           <w:rFonts w:ascii="Cambria Math" w:hAnsi="Cambria Math"/>
-          <w:i/>
+          <w:i w:val="0"/>
           <w:sz w:val="22"/>
           <w:vertAlign w:val="subscript"/>
         </w:rPr>
@@ -2607,7 +2623,15 @@
           <w:i w:val="0"/>
           <w:sz w:val="22"/>
         </w:rPr>
-        <w:t xml:space="preserve">) ) / </w:t>
+        <w:t>) )</w:t>
+      </w:r>
+      <w:r>
+        <w:rPr>
+          <w:rFonts w:ascii="Cambria Math" w:hAnsi="Cambria Math"/>
+          <w:i w:val="0"/>
+          <w:sz w:val="22"/>
+        </w:rPr>
+        <w:t xml:space="preserve"> / </w:t>
       </w:r>
       <w:r>
         <w:rPr>
@@ -2623,7 +2647,7 @@
           <w:i w:val="0"/>
           <w:sz w:val="22"/>
         </w:rPr>
-        <w:t xml:space="preserve"> ]</w:t>
+        <w:t xml:space="preserve"> )</w:t>
       </w:r>
     </w:p>
     <w:p>
@@ -2923,7 +2947,7 @@
       <w:r>
         <w:rPr>
           <w:rFonts w:ascii="Cambria Math" w:hAnsi="Cambria Math"/>
-          <w:i/>
+          <w:i w:val="0"/>
           <w:sz w:val="22"/>
           <w:vertAlign w:val="subscript"/>
         </w:rPr>
@@ -2967,7 +2991,15 @@
           <w:i w:val="0"/>
           <w:sz w:val="22"/>
         </w:rPr>
-        <w:t>) = (1/</w:t>
+        <w:t>)</w:t>
+      </w:r>
+      <w:r>
+        <w:rPr>
+          <w:rFonts w:ascii="Cambria Math" w:hAnsi="Cambria Math"/>
+          <w:i w:val="0"/>
+          <w:sz w:val="22"/>
+        </w:rPr>
+        <w:t xml:space="preserve"> = (1/</w:t>
       </w:r>
       <w:r>
         <w:rPr>
@@ -2983,12 +3015,20 @@
           <w:i w:val="0"/>
           <w:sz w:val="22"/>
         </w:rPr>
-        <w:t>) · Σ</w:t>
+        <w:t xml:space="preserve">) · </w:t>
       </w:r>
       <w:r>
         <w:rPr>
           <w:rFonts w:ascii="Cambria Math" w:hAnsi="Cambria Math"/>
-          <w:i/>
+          <w:i w:val="0"/>
+          <w:sz w:val="22"/>
+        </w:rPr>
+        <w:t>Σ</w:t>
+      </w:r>
+      <w:r>
+        <w:rPr>
+          <w:rFonts w:ascii="Cambria Math" w:hAnsi="Cambria Math"/>
+          <w:i w:val="0"/>
           <w:sz w:val="22"/>
           <w:vertAlign w:val="subscript"/>
         </w:rPr>
@@ -3061,7 +3101,7 @@
       <w:r>
         <w:rPr>
           <w:rFonts w:ascii="Cambria Math" w:hAnsi="Cambria Math"/>
-          <w:i/>
+          <w:i w:val="0"/>
           <w:sz w:val="22"/>
           <w:vertAlign w:val="subscript"/>
         </w:rPr>
@@ -3086,7 +3126,7 @@
       <w:r>
         <w:rPr>
           <w:rFonts w:ascii="Cambria Math" w:hAnsi="Cambria Math"/>
-          <w:i/>
+          <w:i w:val="0"/>
           <w:sz w:val="22"/>
           <w:vertAlign w:val="subscript"/>
         </w:rPr>
@@ -3759,7 +3799,14 @@
         <w:t>9.6 Replacement Cost Estimation (FHWA 2024)</w:t>
       </w:r>
     </w:p>
-    <w:p/>
+    <w:p>
+      <w:r>
+        <w:rPr>
+          <w:sz w:val="22"/>
+        </w:rPr>
+        <w:t>Bridge replacement cost values (RCV) are estimated from NBI structural attributes using a multi-factor model anchored to FHWA 2024 state-level unit costs. The RCV drives the financial loss calculation: E[Loss] = Σ P(DS) × DR(DS) × RCV.</w:t>
+      </w:r>
+    </w:p>
     <w:p>
       <w:pPr>
         <w:pStyle w:val="Heading3"/>
@@ -3768,7 +3815,194 @@
         <w:t>9.6.1 Formula</w:t>
       </w:r>
     </w:p>
-    <w:p/>
+    <w:p>
+      <w:pPr>
+        <w:jc w:val="center"/>
+      </w:pPr>
+      <w:r>
+        <w:rPr>
+          <w:rFonts w:ascii="Cambria Math" w:hAnsi="Cambria Math"/>
+          <w:i/>
+          <w:sz w:val="22"/>
+        </w:rPr>
+        <w:t>RCV</w:t>
+      </w:r>
+      <w:r>
+        <w:rPr>
+          <w:rFonts w:ascii="Cambria Math" w:hAnsi="Cambria Math"/>
+          <w:i w:val="0"/>
+          <w:sz w:val="22"/>
+        </w:rPr>
+        <w:t xml:space="preserve"> = </w:t>
+      </w:r>
+      <w:r>
+        <w:rPr>
+          <w:rFonts w:ascii="Cambria Math" w:hAnsi="Cambria Math"/>
+          <w:i/>
+          <w:sz w:val="22"/>
+        </w:rPr>
+        <w:t>A</w:t>
+      </w:r>
+      <w:r>
+        <w:rPr>
+          <w:rFonts w:ascii="Cambria Math" w:hAnsi="Cambria Math"/>
+          <w:i w:val="0"/>
+          <w:sz w:val="22"/>
+          <w:vertAlign w:val="subscript"/>
+        </w:rPr>
+        <w:t>deck</w:t>
+      </w:r>
+      <w:r>
+        <w:rPr>
+          <w:rFonts w:ascii="Cambria Math" w:hAnsi="Cambria Math"/>
+          <w:i w:val="0"/>
+          <w:sz w:val="22"/>
+        </w:rPr>
+        <w:t xml:space="preserve"> × </w:t>
+      </w:r>
+      <w:r>
+        <w:rPr>
+          <w:rFonts w:ascii="Cambria Math" w:hAnsi="Cambria Math"/>
+          <w:i/>
+          <w:sz w:val="22"/>
+        </w:rPr>
+        <w:t>C</w:t>
+      </w:r>
+      <w:r>
+        <w:rPr>
+          <w:rFonts w:ascii="Cambria Math" w:hAnsi="Cambria Math"/>
+          <w:i w:val="0"/>
+          <w:sz w:val="22"/>
+          <w:vertAlign w:val="subscript"/>
+        </w:rPr>
+        <w:t>base</w:t>
+      </w:r>
+      <w:r>
+        <w:rPr>
+          <w:rFonts w:ascii="Cambria Math" w:hAnsi="Cambria Math"/>
+          <w:i w:val="0"/>
+          <w:sz w:val="22"/>
+        </w:rPr>
+        <w:t xml:space="preserve"> × </w:t>
+      </w:r>
+      <w:r>
+        <w:rPr>
+          <w:rFonts w:ascii="Cambria Math" w:hAnsi="Cambria Math"/>
+          <w:i/>
+          <w:sz w:val="22"/>
+        </w:rPr>
+        <w:t>f</w:t>
+      </w:r>
+      <w:r>
+        <w:rPr>
+          <w:rFonts w:ascii="Cambria Math" w:hAnsi="Cambria Math"/>
+          <w:i w:val="0"/>
+          <w:sz w:val="22"/>
+          <w:vertAlign w:val="subscript"/>
+        </w:rPr>
+        <w:t>material</w:t>
+      </w:r>
+      <w:r>
+        <w:rPr>
+          <w:rFonts w:ascii="Cambria Math" w:hAnsi="Cambria Math"/>
+          <w:i w:val="0"/>
+          <w:sz w:val="22"/>
+        </w:rPr>
+        <w:t xml:space="preserve"> × </w:t>
+      </w:r>
+      <w:r>
+        <w:rPr>
+          <w:rFonts w:ascii="Cambria Math" w:hAnsi="Cambria Math"/>
+          <w:i/>
+          <w:sz w:val="22"/>
+        </w:rPr>
+        <w:t>f</w:t>
+      </w:r>
+      <w:r>
+        <w:rPr>
+          <w:rFonts w:ascii="Cambria Math" w:hAnsi="Cambria Math"/>
+          <w:i w:val="0"/>
+          <w:sz w:val="22"/>
+          <w:vertAlign w:val="subscript"/>
+        </w:rPr>
+        <w:t>span</w:t>
+      </w:r>
+      <w:r>
+        <w:rPr>
+          <w:rFonts w:ascii="Cambria Math" w:hAnsi="Cambria Math"/>
+          <w:i w:val="0"/>
+          <w:sz w:val="22"/>
+        </w:rPr>
+        <w:t xml:space="preserve"> × </w:t>
+      </w:r>
+      <w:r>
+        <w:rPr>
+          <w:rFonts w:ascii="Cambria Math" w:hAnsi="Cambria Math"/>
+          <w:i/>
+          <w:sz w:val="22"/>
+        </w:rPr>
+        <w:t>f</w:t>
+      </w:r>
+      <w:r>
+        <w:rPr>
+          <w:rFonts w:ascii="Cambria Math" w:hAnsi="Cambria Math"/>
+          <w:i w:val="0"/>
+          <w:sz w:val="22"/>
+          <w:vertAlign w:val="subscript"/>
+        </w:rPr>
+        <w:t>skew</w:t>
+      </w:r>
+      <w:r>
+        <w:rPr>
+          <w:rFonts w:ascii="Cambria Math" w:hAnsi="Cambria Math"/>
+          <w:i w:val="0"/>
+          <w:sz w:val="22"/>
+        </w:rPr>
+        <w:t xml:space="preserve"> × </w:t>
+      </w:r>
+      <w:r>
+        <w:rPr>
+          <w:rFonts w:ascii="Cambria Math" w:hAnsi="Cambria Math"/>
+          <w:i/>
+          <w:sz w:val="22"/>
+        </w:rPr>
+        <w:t>f</w:t>
+      </w:r>
+      <w:r>
+        <w:rPr>
+          <w:rFonts w:ascii="Cambria Math" w:hAnsi="Cambria Math"/>
+          <w:i w:val="0"/>
+          <w:sz w:val="22"/>
+          <w:vertAlign w:val="subscript"/>
+        </w:rPr>
+        <w:t>seismic</w:t>
+      </w:r>
+      <w:r>
+        <w:rPr>
+          <w:rFonts w:ascii="Cambria Math" w:hAnsi="Cambria Math"/>
+          <w:i w:val="0"/>
+          <w:sz w:val="22"/>
+        </w:rPr>
+        <w:t xml:space="preserve"> × </w:t>
+      </w:r>
+      <w:r>
+        <w:rPr>
+          <w:rFonts w:ascii="Cambria Math" w:hAnsi="Cambria Math"/>
+          <w:i/>
+          <w:sz w:val="22"/>
+        </w:rPr>
+        <w:t>f</w:t>
+      </w:r>
+      <w:r>
+        <w:rPr>
+          <w:rFonts w:ascii="Cambria Math" w:hAnsi="Cambria Math"/>
+          <w:i w:val="0"/>
+          <w:sz w:val="22"/>
+          <w:vertAlign w:val="subscript"/>
+        </w:rPr>
+        <w:t>region</w:t>
+      </w:r>
+    </w:p>
     <w:p>
       <w:r>
         <w:t>Where:</w:t>
@@ -3776,7 +4010,33 @@
     </w:p>
     <w:p>
       <w:r>
-        <w:t xml:space="preserve">  - deck_area = structure_length (NBI Item 049) x deck_width (NBI Item 052), in m2</w:t>
+        <w:rPr>
+          <w:sz w:val="22"/>
+        </w:rPr>
+        <w:t xml:space="preserve">  - </w:t>
+      </w:r>
+      <w:r>
+        <w:rPr>
+          <w:rFonts w:ascii="Cambria Math" w:hAnsi="Cambria Math"/>
+          <w:i/>
+          <w:sz w:val="22"/>
+        </w:rPr>
+        <w:t>A</w:t>
+      </w:r>
+      <w:r>
+        <w:rPr>
+          <w:rFonts w:ascii="Cambria Math" w:hAnsi="Cambria Math"/>
+          <w:i w:val="0"/>
+          <w:sz w:val="22"/>
+          <w:vertAlign w:val="subscript"/>
+        </w:rPr>
+        <w:t>deck</w:t>
+      </w:r>
+      <w:r>
+        <w:rPr>
+          <w:sz w:val="22"/>
+        </w:rPr>
+        <w:t xml:space="preserve"> = structure_length (NBI Item 049) × deck_width (NBI Item 052), in m²</w:t>
       </w:r>
     </w:p>
     <w:p>
@@ -5728,12 +5988,28 @@
           <w:i w:val="0"/>
           <w:sz w:val="22"/>
         </w:rPr>
-        <w:t>] = Σ</w:t>
+        <w:t>]</w:t>
       </w:r>
       <w:r>
         <w:rPr>
           <w:rFonts w:ascii="Cambria Math" w:hAnsi="Cambria Math"/>
-          <w:i/>
+          <w:i w:val="0"/>
+          <w:sz w:val="22"/>
+        </w:rPr>
+        <w:t xml:space="preserve"> = </w:t>
+      </w:r>
+      <w:r>
+        <w:rPr>
+          <w:rFonts w:ascii="Cambria Math" w:hAnsi="Cambria Math"/>
+          <w:i w:val="0"/>
+          <w:sz w:val="22"/>
+        </w:rPr>
+        <w:t>Σ</w:t>
+      </w:r>
+      <w:r>
+        <w:rPr>
+          <w:rFonts w:ascii="Cambria Math" w:hAnsi="Cambria Math"/>
+          <w:i w:val="0"/>
           <w:sz w:val="22"/>
           <w:vertAlign w:val="subscript"/>
         </w:rPr>
@@ -8845,27 +9121,6 @@
       </w:r>
     </w:p>
     <w:p>
-      <w:r>
-        <w:t xml:space="preserve">  E[Loss] = SUM_j P(DS=j) x DR(j) x RCV</w:t>
-      </w:r>
-    </w:p>
-    <w:p>
-      <w:r>
-        <w:t xml:space="preserve">  Where DR(j) = {none:0.00, slight:0.03, moderate:0.08, extensive:0.25, complete:1.00}</w:t>
-      </w:r>
-    </w:p>
-    <w:p>
-      <w:r>
-        <w:t xml:space="preserve">  Portfolio loss = SUM_i E[Loss_i] for all bridges i</w:t>
-      </w:r>
-    </w:p>
-    <w:p/>
-    <w:p>
-      <w:r>
-        <w:t>Stage 5 - Expected Downtime:</w:t>
-      </w:r>
-    </w:p>
-    <w:p>
       <w:pPr>
         <w:jc w:val="center"/>
       </w:pPr>
@@ -8891,7 +9146,7 @@
           <w:i/>
           <w:sz w:val="22"/>
         </w:rPr>
-        <w:t>Downtime</w:t>
+        <w:t>Loss</w:t>
       </w:r>
       <w:r>
         <w:rPr>
@@ -8899,12 +9154,218 @@
           <w:i w:val="0"/>
           <w:sz w:val="22"/>
         </w:rPr>
-        <w:t>] = Σ</w:t>
+        <w:t>]</w:t>
+      </w:r>
+      <w:r>
+        <w:rPr>
+          <w:rFonts w:ascii="Cambria Math" w:hAnsi="Cambria Math"/>
+          <w:i w:val="0"/>
+          <w:sz w:val="22"/>
+        </w:rPr>
+        <w:t xml:space="preserve"> = </w:t>
+      </w:r>
+      <w:r>
+        <w:rPr>
+          <w:rFonts w:ascii="Cambria Math" w:hAnsi="Cambria Math"/>
+          <w:i w:val="0"/>
+          <w:sz w:val="22"/>
+        </w:rPr>
+        <w:t>Σ</w:t>
+      </w:r>
+      <w:r>
+        <w:rPr>
+          <w:rFonts w:ascii="Cambria Math" w:hAnsi="Cambria Math"/>
+          <w:i w:val="0"/>
+          <w:sz w:val="22"/>
+          <w:vertAlign w:val="subscript"/>
+        </w:rPr>
+        <w:t>ds</w:t>
+      </w:r>
+      <w:r>
+        <w:rPr>
+          <w:rFonts w:ascii="Cambria Math" w:hAnsi="Cambria Math"/>
+          <w:i w:val="0"/>
+          <w:sz w:val="22"/>
+        </w:rPr>
+        <w:t xml:space="preserve"> </w:t>
       </w:r>
       <w:r>
         <w:rPr>
           <w:rFonts w:ascii="Cambria Math" w:hAnsi="Cambria Math"/>
           <w:i/>
+          <w:sz w:val="22"/>
+        </w:rPr>
+        <w:t>P</w:t>
+      </w:r>
+      <w:r>
+        <w:rPr>
+          <w:rFonts w:ascii="Cambria Math" w:hAnsi="Cambria Math"/>
+          <w:i w:val="0"/>
+          <w:sz w:val="22"/>
+        </w:rPr>
+        <w:t>(</w:t>
+      </w:r>
+      <w:r>
+        <w:rPr>
+          <w:rFonts w:ascii="Cambria Math" w:hAnsi="Cambria Math"/>
+          <w:i/>
+          <w:sz w:val="22"/>
+        </w:rPr>
+        <w:t>DS</w:t>
+      </w:r>
+      <w:r>
+        <w:rPr>
+          <w:rFonts w:ascii="Cambria Math" w:hAnsi="Cambria Math"/>
+          <w:i w:val="0"/>
+          <w:sz w:val="22"/>
+        </w:rPr>
+        <w:t xml:space="preserve"> = </w:t>
+      </w:r>
+      <w:r>
+        <w:rPr>
+          <w:rFonts w:ascii="Cambria Math" w:hAnsi="Cambria Math"/>
+          <w:i/>
+          <w:sz w:val="22"/>
+        </w:rPr>
+        <w:t>ds</w:t>
+      </w:r>
+      <w:r>
+        <w:rPr>
+          <w:rFonts w:ascii="Cambria Math" w:hAnsi="Cambria Math"/>
+          <w:i w:val="0"/>
+          <w:sz w:val="22"/>
+        </w:rPr>
+        <w:t>)</w:t>
+      </w:r>
+      <w:r>
+        <w:rPr>
+          <w:rFonts w:ascii="Cambria Math" w:hAnsi="Cambria Math"/>
+          <w:i w:val="0"/>
+          <w:sz w:val="22"/>
+        </w:rPr>
+        <w:t xml:space="preserve"> × </w:t>
+      </w:r>
+      <w:r>
+        <w:rPr>
+          <w:rFonts w:ascii="Cambria Math" w:hAnsi="Cambria Math"/>
+          <w:i/>
+          <w:sz w:val="22"/>
+        </w:rPr>
+        <w:t>DR</w:t>
+      </w:r>
+      <w:r>
+        <w:rPr>
+          <w:rFonts w:ascii="Cambria Math" w:hAnsi="Cambria Math"/>
+          <w:i w:val="0"/>
+          <w:sz w:val="22"/>
+        </w:rPr>
+        <w:t>(</w:t>
+      </w:r>
+      <w:r>
+        <w:rPr>
+          <w:rFonts w:ascii="Cambria Math" w:hAnsi="Cambria Math"/>
+          <w:i/>
+          <w:sz w:val="22"/>
+        </w:rPr>
+        <w:t>ds</w:t>
+      </w:r>
+      <w:r>
+        <w:rPr>
+          <w:rFonts w:ascii="Cambria Math" w:hAnsi="Cambria Math"/>
+          <w:i w:val="0"/>
+          <w:sz w:val="22"/>
+        </w:rPr>
+        <w:t>)</w:t>
+      </w:r>
+      <w:r>
+        <w:rPr>
+          <w:rFonts w:ascii="Cambria Math" w:hAnsi="Cambria Math"/>
+          <w:i w:val="0"/>
+          <w:sz w:val="22"/>
+        </w:rPr>
+        <w:t xml:space="preserve"> × </w:t>
+      </w:r>
+      <w:r>
+        <w:rPr>
+          <w:rFonts w:ascii="Cambria Math" w:hAnsi="Cambria Math"/>
+          <w:i/>
+          <w:sz w:val="22"/>
+        </w:rPr>
+        <w:t>RCV</w:t>
+      </w:r>
+    </w:p>
+    <w:p>
+      <w:r>
+        <w:t xml:space="preserve">  Where DR(j) = {none:0.00, slight:0.03, moderate:0.08, extensive:0.25, complete:1.00}</w:t>
+      </w:r>
+    </w:p>
+    <w:p>
+      <w:r>
+        <w:t xml:space="preserve">  Portfolio loss = SUM_i E[Loss_i] for all bridges i</w:t>
+      </w:r>
+    </w:p>
+    <w:p/>
+    <w:p>
+      <w:r>
+        <w:t>Stage 5 - Expected Downtime:</w:t>
+      </w:r>
+    </w:p>
+    <w:p>
+      <w:pPr>
+        <w:jc w:val="center"/>
+      </w:pPr>
+      <w:r>
+        <w:rPr>
+          <w:rFonts w:ascii="Cambria Math" w:hAnsi="Cambria Math"/>
+          <w:i/>
+          <w:sz w:val="22"/>
+        </w:rPr>
+        <w:t>E</w:t>
+      </w:r>
+      <w:r>
+        <w:rPr>
+          <w:rFonts w:ascii="Cambria Math" w:hAnsi="Cambria Math"/>
+          <w:i w:val="0"/>
+          <w:sz w:val="22"/>
+        </w:rPr>
+        <w:t>[</w:t>
+      </w:r>
+      <w:r>
+        <w:rPr>
+          <w:rFonts w:ascii="Cambria Math" w:hAnsi="Cambria Math"/>
+          <w:i/>
+          <w:sz w:val="22"/>
+        </w:rPr>
+        <w:t>Downtime</w:t>
+      </w:r>
+      <w:r>
+        <w:rPr>
+          <w:rFonts w:ascii="Cambria Math" w:hAnsi="Cambria Math"/>
+          <w:i w:val="0"/>
+          <w:sz w:val="22"/>
+        </w:rPr>
+        <w:t>]</w:t>
+      </w:r>
+      <w:r>
+        <w:rPr>
+          <w:rFonts w:ascii="Cambria Math" w:hAnsi="Cambria Math"/>
+          <w:i w:val="0"/>
+          <w:sz w:val="22"/>
+        </w:rPr>
+        <w:t xml:space="preserve"> = </w:t>
+      </w:r>
+      <w:r>
+        <w:rPr>
+          <w:rFonts w:ascii="Cambria Math" w:hAnsi="Cambria Math"/>
+          <w:i w:val="0"/>
+          <w:sz w:val="22"/>
+        </w:rPr>
+        <w:t>Σ</w:t>
+      </w:r>
+      <w:r>
+        <w:rPr>
+          <w:rFonts w:ascii="Cambria Math" w:hAnsi="Cambria Math"/>
+          <w:i w:val="0"/>
           <w:sz w:val="22"/>
           <w:vertAlign w:val="subscript"/>
         </w:rPr>

</xml_diff>

<commit_message>
Replace text formulas with real Word equation objects (OMML)
Inserted 6 native Word equation objects using Office Math Markup Language:
- Proper fractions (numerator/denominator bar)
- Proper subscripts (A_deck, f_material, theta_ds, etc.)
- Greek symbols (Phi, Sigma, beta, theta)
- Display-mode centered equations

Equations:
1. Calibrated fragility: P[DS >= ds | Sa] = Phi((ln(Sa)-ln(k*theta))/beta)
2. Predicted distribution: p_j = (1/N) * Sigma P(DS=j | Sa_i, HWB_i)
3. Expected loss: E[Loss] = Sigma P(DS) x DR(ds) x RCV
4. RCV: RCV = A_deck x C_base x f_material x f_span x f_skew x f_seismic
5. Deck area: A_deck = L_structure x W_deck [m2]
6. Downtime: E[Downtime] = Sigma P(DS) x DT(ds)

Verify: 6 oMath objects, 2 fractions, 14 subscripts in document XML.

Co-Authored-By: Claude Opus 4.6 (1M context) <noreply@anthropic.com>
</commit_message>
<xml_diff>
--- a/CAT411_Technical_Documentation.docx
+++ b/CAT411_Technical_Documentation.docx
@@ -2485,170 +2485,97 @@
       </w:r>
     </w:p>
     <w:p>
-      <w:pPr>
-        <w:jc w:val="center"/>
-      </w:pPr>
-      <w:r>
-        <w:rPr>
-          <w:rFonts w:ascii="Cambria Math" w:hAnsi="Cambria Math"/>
-          <w:i/>
-          <w:sz w:val="22"/>
-        </w:rPr>
-        <w:t>P</w:t>
-      </w:r>
-      <w:r>
-        <w:rPr>
-          <w:rFonts w:ascii="Cambria Math" w:hAnsi="Cambria Math"/>
-          <w:i w:val="0"/>
-          <w:sz w:val="22"/>
-        </w:rPr>
-        <w:t>[</w:t>
-      </w:r>
-      <w:r>
-        <w:rPr>
-          <w:rFonts w:ascii="Cambria Math" w:hAnsi="Cambria Math"/>
-          <w:i/>
-          <w:sz w:val="22"/>
-        </w:rPr>
-        <w:t>DS</w:t>
-      </w:r>
-      <w:r>
-        <w:rPr>
-          <w:rFonts w:ascii="Cambria Math" w:hAnsi="Cambria Math"/>
-          <w:i w:val="0"/>
-          <w:sz w:val="22"/>
-        </w:rPr>
-        <w:t xml:space="preserve"> ≥ </w:t>
-      </w:r>
-      <w:r>
-        <w:rPr>
-          <w:rFonts w:ascii="Cambria Math" w:hAnsi="Cambria Math"/>
-          <w:i/>
-          <w:sz w:val="22"/>
-        </w:rPr>
-        <w:t>ds</w:t>
-      </w:r>
-      <w:r>
-        <w:rPr>
-          <w:rFonts w:ascii="Cambria Math" w:hAnsi="Cambria Math"/>
-          <w:i w:val="0"/>
-          <w:sz w:val="22"/>
-        </w:rPr>
-        <w:t xml:space="preserve"> | </w:t>
-      </w:r>
-      <w:r>
-        <w:rPr>
-          <w:rFonts w:ascii="Cambria Math" w:hAnsi="Cambria Math"/>
-          <w:i/>
-          <w:sz w:val="22"/>
-        </w:rPr>
-        <w:t>Sa</w:t>
-      </w:r>
-      <w:r>
-        <w:rPr>
-          <w:rFonts w:ascii="Cambria Math" w:hAnsi="Cambria Math"/>
-          <w:i w:val="0"/>
-          <w:sz w:val="22"/>
-        </w:rPr>
-        <w:t>]</w:t>
-      </w:r>
-      <w:r>
-        <w:rPr>
-          <w:rFonts w:ascii="Cambria Math" w:hAnsi="Cambria Math"/>
-          <w:i w:val="0"/>
-          <w:sz w:val="22"/>
-        </w:rPr>
-        <w:t xml:space="preserve"> = Φ ( </w:t>
-      </w:r>
-      <w:r>
-        <w:rPr>
-          <w:rFonts w:ascii="Cambria Math" w:hAnsi="Cambria Math"/>
-          <w:i w:val="0"/>
-          <w:sz w:val="22"/>
-        </w:rPr>
-        <w:t>( ln(</w:t>
-      </w:r>
-      <w:r>
-        <w:rPr>
-          <w:rFonts w:ascii="Cambria Math" w:hAnsi="Cambria Math"/>
-          <w:i/>
-          <w:sz w:val="22"/>
-        </w:rPr>
-        <w:t>Sa</w:t>
-      </w:r>
-      <w:r>
-        <w:rPr>
-          <w:rFonts w:ascii="Cambria Math" w:hAnsi="Cambria Math"/>
-          <w:i w:val="0"/>
-          <w:sz w:val="22"/>
-        </w:rPr>
-        <w:t>) − ln(</w:t>
-      </w:r>
-      <w:r>
-        <w:rPr>
-          <w:rFonts w:ascii="Cambria Math" w:hAnsi="Cambria Math"/>
-          <w:i/>
-          <w:sz w:val="22"/>
-        </w:rPr>
-        <w:t>k</w:t>
-      </w:r>
-      <w:r>
-        <w:rPr>
-          <w:rFonts w:ascii="Cambria Math" w:hAnsi="Cambria Math"/>
-          <w:i w:val="0"/>
-          <w:sz w:val="22"/>
-        </w:rPr>
-        <w:t xml:space="preserve"> · </w:t>
-      </w:r>
-      <w:r>
-        <w:rPr>
-          <w:rFonts w:ascii="Cambria Math" w:hAnsi="Cambria Math"/>
-          <w:i/>
-          <w:sz w:val="22"/>
-        </w:rPr>
-        <w:t>θ</w:t>
-      </w:r>
-      <w:r>
-        <w:rPr>
-          <w:rFonts w:ascii="Cambria Math" w:hAnsi="Cambria Math"/>
-          <w:i w:val="0"/>
-          <w:sz w:val="22"/>
-          <w:vertAlign w:val="subscript"/>
-        </w:rPr>
-        <w:t>ds,c</w:t>
-      </w:r>
-      <w:r>
-        <w:rPr>
-          <w:rFonts w:ascii="Cambria Math" w:hAnsi="Cambria Math"/>
-          <w:i w:val="0"/>
-          <w:sz w:val="22"/>
-        </w:rPr>
-        <w:t>) )</w:t>
-      </w:r>
-      <w:r>
-        <w:rPr>
-          <w:rFonts w:ascii="Cambria Math" w:hAnsi="Cambria Math"/>
-          <w:i w:val="0"/>
-          <w:sz w:val="22"/>
-        </w:rPr>
-        <w:t xml:space="preserve"> / </w:t>
-      </w:r>
-      <w:r>
-        <w:rPr>
-          <w:rFonts w:ascii="Cambria Math" w:hAnsi="Cambria Math"/>
-          <w:i/>
-          <w:sz w:val="22"/>
-        </w:rPr>
-        <w:t>β</w:t>
-      </w:r>
-      <w:r>
-        <w:rPr>
-          <w:rFonts w:ascii="Cambria Math" w:hAnsi="Cambria Math"/>
-          <w:i w:val="0"/>
-          <w:sz w:val="22"/>
-        </w:rPr>
-        <w:t xml:space="preserve"> )</w:t>
-      </w:r>
+      <m:oMathPara>
+        <m:oMath>
+          <m:r>
+            <m:rPr>
+              <m:sty m:val="i"/>
+            </m:rPr>
+            <m:t xml:space="preserve">P</m:t>
+          </m:r>
+          <m:r>
+            <m:t xml:space="preserve">[</m:t>
+          </m:r>
+          <m:r>
+            <m:rPr>
+              <m:sty m:val="i"/>
+            </m:rPr>
+            <m:t xml:space="preserve">DS</m:t>
+          </m:r>
+          <m:r>
+            <m:t xml:space="preserve"> ≥ </m:t>
+          </m:r>
+          <m:r>
+            <m:rPr>
+              <m:sty m:val="i"/>
+            </m:rPr>
+            <m:t xml:space="preserve">ds</m:t>
+          </m:r>
+          <m:r>
+            <m:t xml:space="preserve"> | </m:t>
+          </m:r>
+          <m:r>
+            <m:rPr>
+              <m:sty m:val="i"/>
+            </m:rPr>
+            <m:t xml:space="preserve">Sa</m:t>
+          </m:r>
+          <m:r>
+            <m:t xml:space="preserve">] = Φ </m:t>
+          </m:r>
+          <m:f>
+            <m:num>
+              <m:r>
+                <m:t xml:space="preserve">ln(</m:t>
+              </m:r>
+              <m:r>
+                <m:rPr>
+                  <m:sty m:val="i"/>
+                </m:rPr>
+                <m:t xml:space="preserve">Sa</m:t>
+              </m:r>
+              <m:r>
+                <m:t xml:space="preserve">) − ln(</m:t>
+              </m:r>
+              <m:r>
+                <m:rPr>
+                  <m:sty m:val="i"/>
+                </m:rPr>
+                <m:t xml:space="preserve">k</m:t>
+              </m:r>
+              <m:r>
+                <m:t xml:space="preserve"> · </m:t>
+              </m:r>
+              <m:sSub>
+                <m:e>
+                  <m:r>
+                    <m:rPr>
+                      <m:sty m:val="i"/>
+                    </m:rPr>
+                    <m:t xml:space="preserve">θ</m:t>
+                  </m:r>
+                </m:e>
+                <m:sub>
+                  <m:r>
+                    <m:t xml:space="preserve">ds,c</m:t>
+                  </m:r>
+                </m:sub>
+              </m:sSub>
+              <m:r>
+                <m:t xml:space="preserve">)</m:t>
+              </m:r>
+            </m:num>
+            <m:den>
+              <m:r>
+                <m:rPr>
+                  <m:sty m:val="i"/>
+                </m:rPr>
+                <m:t xml:space="preserve">β</m:t>
+              </m:r>
+            </m:den>
+          </m:f>
+        </m:oMath>
+      </m:oMathPara>
     </w:p>
     <w:p>
       <w:r>
@@ -2933,245 +2860,148 @@
       </w:r>
     </w:p>
     <w:p>
-      <w:pPr>
-        <w:jc w:val="center"/>
-      </w:pPr>
-      <w:r>
-        <w:rPr>
-          <w:rFonts w:ascii="Cambria Math" w:hAnsi="Cambria Math"/>
-          <w:i/>
-          <w:sz w:val="22"/>
-        </w:rPr>
-        <w:t>p</w:t>
-      </w:r>
-      <w:r>
-        <w:rPr>
-          <w:rFonts w:ascii="Cambria Math" w:hAnsi="Cambria Math"/>
-          <w:i w:val="0"/>
-          <w:sz w:val="22"/>
-          <w:vertAlign w:val="subscript"/>
-        </w:rPr>
-        <w:t>j</w:t>
-      </w:r>
-      <w:r>
-        <w:rPr>
-          <w:rFonts w:ascii="Cambria Math" w:hAnsi="Cambria Math"/>
-          <w:i w:val="0"/>
-          <w:sz w:val="22"/>
-        </w:rPr>
-        <w:t>(</w:t>
-      </w:r>
-      <w:r>
-        <w:rPr>
-          <w:rFonts w:ascii="Cambria Math" w:hAnsi="Cambria Math"/>
-          <w:i/>
-          <w:sz w:val="22"/>
-        </w:rPr>
-        <w:t>k</w:t>
-      </w:r>
-      <w:r>
-        <w:rPr>
-          <w:rFonts w:ascii="Cambria Math" w:hAnsi="Cambria Math"/>
-          <w:i w:val="0"/>
-          <w:sz w:val="22"/>
-        </w:rPr>
-        <w:t xml:space="preserve">, </w:t>
-      </w:r>
-      <w:r>
-        <w:rPr>
-          <w:rFonts w:ascii="Cambria Math" w:hAnsi="Cambria Math"/>
-          <w:i/>
-          <w:sz w:val="22"/>
-        </w:rPr>
-        <w:t>β</w:t>
-      </w:r>
-      <w:r>
-        <w:rPr>
-          <w:rFonts w:ascii="Cambria Math" w:hAnsi="Cambria Math"/>
-          <w:i w:val="0"/>
-          <w:sz w:val="22"/>
-        </w:rPr>
-        <w:t>)</w:t>
-      </w:r>
-      <w:r>
-        <w:rPr>
-          <w:rFonts w:ascii="Cambria Math" w:hAnsi="Cambria Math"/>
-          <w:i w:val="0"/>
-          <w:sz w:val="22"/>
-        </w:rPr>
-        <w:t xml:space="preserve"> = (1/</w:t>
-      </w:r>
-      <w:r>
-        <w:rPr>
-          <w:rFonts w:ascii="Cambria Math" w:hAnsi="Cambria Math"/>
-          <w:i/>
-          <w:sz w:val="22"/>
-        </w:rPr>
-        <w:t>N</w:t>
-      </w:r>
-      <w:r>
-        <w:rPr>
-          <w:rFonts w:ascii="Cambria Math" w:hAnsi="Cambria Math"/>
-          <w:i w:val="0"/>
-          <w:sz w:val="22"/>
-        </w:rPr>
-        <w:t xml:space="preserve">) · </w:t>
-      </w:r>
-      <w:r>
-        <w:rPr>
-          <w:rFonts w:ascii="Cambria Math" w:hAnsi="Cambria Math"/>
-          <w:i w:val="0"/>
-          <w:sz w:val="22"/>
-        </w:rPr>
-        <w:t>Σ</w:t>
-      </w:r>
-      <w:r>
-        <w:rPr>
-          <w:rFonts w:ascii="Cambria Math" w:hAnsi="Cambria Math"/>
-          <w:i w:val="0"/>
-          <w:sz w:val="22"/>
-          <w:vertAlign w:val="subscript"/>
-        </w:rPr>
-        <w:t>i</w:t>
-      </w:r>
-      <w:r>
-        <w:rPr>
-          <w:rFonts w:ascii="Cambria Math" w:hAnsi="Cambria Math"/>
-          <w:i w:val="0"/>
-          <w:sz w:val="22"/>
-        </w:rPr>
-        <w:t xml:space="preserve"> </w:t>
-      </w:r>
-      <w:r>
-        <w:rPr>
-          <w:rFonts w:ascii="Cambria Math" w:hAnsi="Cambria Math"/>
-          <w:i/>
-          <w:sz w:val="22"/>
-        </w:rPr>
-        <w:t>P</w:t>
-      </w:r>
-      <w:r>
-        <w:rPr>
-          <w:rFonts w:ascii="Cambria Math" w:hAnsi="Cambria Math"/>
-          <w:i w:val="0"/>
-          <w:sz w:val="22"/>
-        </w:rPr>
-        <w:t>(</w:t>
-      </w:r>
-      <w:r>
-        <w:rPr>
-          <w:rFonts w:ascii="Cambria Math" w:hAnsi="Cambria Math"/>
-          <w:i/>
-          <w:sz w:val="22"/>
-        </w:rPr>
-        <w:t>DS</w:t>
-      </w:r>
-      <w:r>
-        <w:rPr>
-          <w:rFonts w:ascii="Cambria Math" w:hAnsi="Cambria Math"/>
-          <w:i w:val="0"/>
-          <w:sz w:val="22"/>
-        </w:rPr>
-        <w:t xml:space="preserve"> = </w:t>
-      </w:r>
-      <w:r>
-        <w:rPr>
-          <w:rFonts w:ascii="Cambria Math" w:hAnsi="Cambria Math"/>
-          <w:i/>
-          <w:sz w:val="22"/>
-        </w:rPr>
-        <w:t>j</w:t>
-      </w:r>
-      <w:r>
-        <w:rPr>
-          <w:rFonts w:ascii="Cambria Math" w:hAnsi="Cambria Math"/>
-          <w:i w:val="0"/>
-          <w:sz w:val="22"/>
-        </w:rPr>
-        <w:t xml:space="preserve"> | </w:t>
-      </w:r>
-      <w:r>
-        <w:rPr>
-          <w:rFonts w:ascii="Cambria Math" w:hAnsi="Cambria Math"/>
-          <w:i/>
-          <w:sz w:val="22"/>
-        </w:rPr>
-        <w:t>Sa</w:t>
-      </w:r>
-      <w:r>
-        <w:rPr>
-          <w:rFonts w:ascii="Cambria Math" w:hAnsi="Cambria Math"/>
-          <w:i w:val="0"/>
-          <w:sz w:val="22"/>
-          <w:vertAlign w:val="subscript"/>
-        </w:rPr>
-        <w:t>i</w:t>
-      </w:r>
-      <w:r>
-        <w:rPr>
-          <w:rFonts w:ascii="Cambria Math" w:hAnsi="Cambria Math"/>
-          <w:i w:val="0"/>
-          <w:sz w:val="22"/>
-        </w:rPr>
-        <w:t xml:space="preserve">, </w:t>
-      </w:r>
-      <w:r>
-        <w:rPr>
-          <w:rFonts w:ascii="Cambria Math" w:hAnsi="Cambria Math"/>
-          <w:i/>
-          <w:sz w:val="22"/>
-        </w:rPr>
-        <w:t>HWB</w:t>
-      </w:r>
-      <w:r>
-        <w:rPr>
-          <w:rFonts w:ascii="Cambria Math" w:hAnsi="Cambria Math"/>
-          <w:i w:val="0"/>
-          <w:sz w:val="22"/>
-          <w:vertAlign w:val="subscript"/>
-        </w:rPr>
-        <w:t>i</w:t>
-      </w:r>
-      <w:r>
-        <w:rPr>
-          <w:rFonts w:ascii="Cambria Math" w:hAnsi="Cambria Math"/>
-          <w:i w:val="0"/>
-          <w:sz w:val="22"/>
-        </w:rPr>
-        <w:t xml:space="preserve">, </w:t>
-      </w:r>
-      <w:r>
-        <w:rPr>
-          <w:rFonts w:ascii="Cambria Math" w:hAnsi="Cambria Math"/>
-          <w:i/>
-          <w:sz w:val="22"/>
-        </w:rPr>
-        <w:t>k</w:t>
-      </w:r>
-      <w:r>
-        <w:rPr>
-          <w:rFonts w:ascii="Cambria Math" w:hAnsi="Cambria Math"/>
-          <w:i w:val="0"/>
-          <w:sz w:val="22"/>
-        </w:rPr>
-        <w:t xml:space="preserve">, </w:t>
-      </w:r>
-      <w:r>
-        <w:rPr>
-          <w:rFonts w:ascii="Cambria Math" w:hAnsi="Cambria Math"/>
-          <w:i/>
-          <w:sz w:val="22"/>
-        </w:rPr>
-        <w:t>β</w:t>
-      </w:r>
-      <w:r>
-        <w:rPr>
-          <w:rFonts w:ascii="Cambria Math" w:hAnsi="Cambria Math"/>
-          <w:i w:val="0"/>
-          <w:sz w:val="22"/>
-        </w:rPr>
-        <w:t>)</w:t>
-      </w:r>
+      <m:oMathPara>
+        <m:oMath>
+          <m:sSub>
+            <m:e>
+              <m:r>
+                <m:rPr>
+                  <m:sty m:val="i"/>
+                </m:rPr>
+                <m:t xml:space="preserve">p</m:t>
+              </m:r>
+            </m:e>
+            <m:sub>
+              <m:r>
+                <m:t xml:space="preserve">j</m:t>
+              </m:r>
+            </m:sub>
+          </m:sSub>
+          <m:r>
+            <m:t xml:space="preserve">(</m:t>
+          </m:r>
+          <m:r>
+            <m:rPr>
+              <m:sty m:val="i"/>
+            </m:rPr>
+            <m:t xml:space="preserve">k</m:t>
+          </m:r>
+          <m:r>
+            <m:t xml:space="preserve">, </m:t>
+          </m:r>
+          <m:r>
+            <m:rPr>
+              <m:sty m:val="i"/>
+            </m:rPr>
+            <m:t xml:space="preserve">β</m:t>
+          </m:r>
+          <m:r>
+            <m:t xml:space="preserve">) = </m:t>
+          </m:r>
+          <m:f>
+            <m:num>
+              <m:r>
+                <m:t xml:space="preserve">1</m:t>
+              </m:r>
+            </m:num>
+            <m:den>
+              <m:r>
+                <m:rPr>
+                  <m:sty m:val="i"/>
+                </m:rPr>
+                <m:t xml:space="preserve">N</m:t>
+              </m:r>
+            </m:den>
+          </m:f>
+          <m:r>
+            <m:t xml:space="preserve"> · </m:t>
+          </m:r>
+          <m:r>
+            <m:t xml:space="preserve">Σ </m:t>
+          </m:r>
+          <m:r>
+            <m:rPr>
+              <m:sty m:val="i"/>
+            </m:rPr>
+            <m:t xml:space="preserve">P</m:t>
+          </m:r>
+          <m:r>
+            <m:t xml:space="preserve">(</m:t>
+          </m:r>
+          <m:r>
+            <m:rPr>
+              <m:sty m:val="i"/>
+            </m:rPr>
+            <m:t xml:space="preserve">DS</m:t>
+          </m:r>
+          <m:r>
+            <m:t xml:space="preserve"> = </m:t>
+          </m:r>
+          <m:r>
+            <m:rPr>
+              <m:sty m:val="i"/>
+            </m:rPr>
+            <m:t xml:space="preserve">j</m:t>
+          </m:r>
+          <m:r>
+            <m:t xml:space="preserve"> | </m:t>
+          </m:r>
+          <m:sSub>
+            <m:e>
+              <m:r>
+                <m:rPr>
+                  <m:sty m:val="i"/>
+                </m:rPr>
+                <m:t xml:space="preserve">Sa</m:t>
+              </m:r>
+            </m:e>
+            <m:sub>
+              <m:r>
+                <m:t xml:space="preserve">i</m:t>
+              </m:r>
+            </m:sub>
+          </m:sSub>
+          <m:r>
+            <m:t xml:space="preserve">, </m:t>
+          </m:r>
+          <m:sSub>
+            <m:e>
+              <m:r>
+                <m:rPr>
+                  <m:sty m:val="i"/>
+                </m:rPr>
+                <m:t xml:space="preserve">HWB</m:t>
+              </m:r>
+            </m:e>
+            <m:sub>
+              <m:r>
+                <m:t xml:space="preserve">i</m:t>
+              </m:r>
+            </m:sub>
+          </m:sSub>
+          <m:r>
+            <m:t xml:space="preserve">, </m:t>
+          </m:r>
+          <m:r>
+            <m:rPr>
+              <m:sty m:val="i"/>
+            </m:rPr>
+            <m:t xml:space="preserve">k</m:t>
+          </m:r>
+          <m:r>
+            <m:t xml:space="preserve">, </m:t>
+          </m:r>
+          <m:r>
+            <m:rPr>
+              <m:sty m:val="i"/>
+            </m:rPr>
+            <m:t xml:space="preserve">β</m:t>
+          </m:r>
+          <m:r>
+            <m:t xml:space="preserve">)</m:t>
+          </m:r>
+        </m:oMath>
+      </m:oMathPara>
     </w:p>
     <w:p>
       <w:r>
@@ -3800,12 +3630,82 @@
       </w:r>
     </w:p>
     <w:p>
-      <w:r>
-        <w:rPr>
-          <w:sz w:val="22"/>
-        </w:rPr>
-        <w:t>Bridge replacement cost values (RCV) are estimated from NBI structural attributes using a multi-factor model anchored to FHWA 2024 state-level unit costs. The RCV drives the financial loss calculation: E[Loss] = Σ P(DS) × DR(DS) × RCV.</w:t>
-      </w:r>
+      <m:oMathPara>
+        <m:oMath>
+          <m:r>
+            <m:rPr>
+              <m:sty m:val="i"/>
+            </m:rPr>
+            <m:t xml:space="preserve">E</m:t>
+          </m:r>
+          <m:r>
+            <m:t xml:space="preserve">[</m:t>
+          </m:r>
+          <m:r>
+            <m:rPr>
+              <m:sty m:val="i"/>
+            </m:rPr>
+            <m:t xml:space="preserve">Loss</m:t>
+          </m:r>
+          <m:r>
+            <m:t xml:space="preserve">] = </m:t>
+          </m:r>
+          <m:r>
+            <m:t xml:space="preserve">Σ </m:t>
+          </m:r>
+          <m:r>
+            <m:rPr>
+              <m:sty m:val="i"/>
+            </m:rPr>
+            <m:t xml:space="preserve">P</m:t>
+          </m:r>
+          <m:r>
+            <m:t xml:space="preserve">(</m:t>
+          </m:r>
+          <m:r>
+            <m:rPr>
+              <m:sty m:val="i"/>
+            </m:rPr>
+            <m:t xml:space="preserve">DS</m:t>
+          </m:r>
+          <m:r>
+            <m:t xml:space="preserve"> = </m:t>
+          </m:r>
+          <m:r>
+            <m:rPr>
+              <m:sty m:val="i"/>
+            </m:rPr>
+            <m:t xml:space="preserve">ds</m:t>
+          </m:r>
+          <m:r>
+            <m:t xml:space="preserve">) × </m:t>
+          </m:r>
+          <m:r>
+            <m:rPr>
+              <m:sty m:val="i"/>
+            </m:rPr>
+            <m:t xml:space="preserve">DR</m:t>
+          </m:r>
+          <m:r>
+            <m:t xml:space="preserve">(</m:t>
+          </m:r>
+          <m:r>
+            <m:rPr>
+              <m:sty m:val="i"/>
+            </m:rPr>
+            <m:t xml:space="preserve">ds</m:t>
+          </m:r>
+          <m:r>
+            <m:t xml:space="preserve">) × </m:t>
+          </m:r>
+          <m:r>
+            <m:rPr>
+              <m:sty m:val="i"/>
+            </m:rPr>
+            <m:t xml:space="preserve">RCV</m:t>
+          </m:r>
+        </m:oMath>
+      </m:oMathPara>
     </w:p>
     <w:p>
       <w:pPr>
@@ -3816,192 +3716,142 @@
       </w:r>
     </w:p>
     <w:p>
-      <w:pPr>
-        <w:jc w:val="center"/>
-      </w:pPr>
-      <w:r>
-        <w:rPr>
-          <w:rFonts w:ascii="Cambria Math" w:hAnsi="Cambria Math"/>
-          <w:i/>
-          <w:sz w:val="22"/>
-        </w:rPr>
-        <w:t>RCV</w:t>
-      </w:r>
-      <w:r>
-        <w:rPr>
-          <w:rFonts w:ascii="Cambria Math" w:hAnsi="Cambria Math"/>
-          <w:i w:val="0"/>
-          <w:sz w:val="22"/>
-        </w:rPr>
-        <w:t xml:space="preserve"> = </w:t>
-      </w:r>
-      <w:r>
-        <w:rPr>
-          <w:rFonts w:ascii="Cambria Math" w:hAnsi="Cambria Math"/>
-          <w:i/>
-          <w:sz w:val="22"/>
-        </w:rPr>
-        <w:t>A</w:t>
-      </w:r>
-      <w:r>
-        <w:rPr>
-          <w:rFonts w:ascii="Cambria Math" w:hAnsi="Cambria Math"/>
-          <w:i w:val="0"/>
-          <w:sz w:val="22"/>
-          <w:vertAlign w:val="subscript"/>
-        </w:rPr>
-        <w:t>deck</w:t>
-      </w:r>
-      <w:r>
-        <w:rPr>
-          <w:rFonts w:ascii="Cambria Math" w:hAnsi="Cambria Math"/>
-          <w:i w:val="0"/>
-          <w:sz w:val="22"/>
-        </w:rPr>
-        <w:t xml:space="preserve"> × </w:t>
-      </w:r>
-      <w:r>
-        <w:rPr>
-          <w:rFonts w:ascii="Cambria Math" w:hAnsi="Cambria Math"/>
-          <w:i/>
-          <w:sz w:val="22"/>
-        </w:rPr>
-        <w:t>C</w:t>
-      </w:r>
-      <w:r>
-        <w:rPr>
-          <w:rFonts w:ascii="Cambria Math" w:hAnsi="Cambria Math"/>
-          <w:i w:val="0"/>
-          <w:sz w:val="22"/>
-          <w:vertAlign w:val="subscript"/>
-        </w:rPr>
-        <w:t>base</w:t>
-      </w:r>
-      <w:r>
-        <w:rPr>
-          <w:rFonts w:ascii="Cambria Math" w:hAnsi="Cambria Math"/>
-          <w:i w:val="0"/>
-          <w:sz w:val="22"/>
-        </w:rPr>
-        <w:t xml:space="preserve"> × </w:t>
-      </w:r>
-      <w:r>
-        <w:rPr>
-          <w:rFonts w:ascii="Cambria Math" w:hAnsi="Cambria Math"/>
-          <w:i/>
-          <w:sz w:val="22"/>
-        </w:rPr>
-        <w:t>f</w:t>
-      </w:r>
-      <w:r>
-        <w:rPr>
-          <w:rFonts w:ascii="Cambria Math" w:hAnsi="Cambria Math"/>
-          <w:i w:val="0"/>
-          <w:sz w:val="22"/>
-          <w:vertAlign w:val="subscript"/>
-        </w:rPr>
-        <w:t>material</w:t>
-      </w:r>
-      <w:r>
-        <w:rPr>
-          <w:rFonts w:ascii="Cambria Math" w:hAnsi="Cambria Math"/>
-          <w:i w:val="0"/>
-          <w:sz w:val="22"/>
-        </w:rPr>
-        <w:t xml:space="preserve"> × </w:t>
-      </w:r>
-      <w:r>
-        <w:rPr>
-          <w:rFonts w:ascii="Cambria Math" w:hAnsi="Cambria Math"/>
-          <w:i/>
-          <w:sz w:val="22"/>
-        </w:rPr>
-        <w:t>f</w:t>
-      </w:r>
-      <w:r>
-        <w:rPr>
-          <w:rFonts w:ascii="Cambria Math" w:hAnsi="Cambria Math"/>
-          <w:i w:val="0"/>
-          <w:sz w:val="22"/>
-          <w:vertAlign w:val="subscript"/>
-        </w:rPr>
-        <w:t>span</w:t>
-      </w:r>
-      <w:r>
-        <w:rPr>
-          <w:rFonts w:ascii="Cambria Math" w:hAnsi="Cambria Math"/>
-          <w:i w:val="0"/>
-          <w:sz w:val="22"/>
-        </w:rPr>
-        <w:t xml:space="preserve"> × </w:t>
-      </w:r>
-      <w:r>
-        <w:rPr>
-          <w:rFonts w:ascii="Cambria Math" w:hAnsi="Cambria Math"/>
-          <w:i/>
-          <w:sz w:val="22"/>
-        </w:rPr>
-        <w:t>f</w:t>
-      </w:r>
-      <w:r>
-        <w:rPr>
-          <w:rFonts w:ascii="Cambria Math" w:hAnsi="Cambria Math"/>
-          <w:i w:val="0"/>
-          <w:sz w:val="22"/>
-          <w:vertAlign w:val="subscript"/>
-        </w:rPr>
-        <w:t>skew</w:t>
-      </w:r>
-      <w:r>
-        <w:rPr>
-          <w:rFonts w:ascii="Cambria Math" w:hAnsi="Cambria Math"/>
-          <w:i w:val="0"/>
-          <w:sz w:val="22"/>
-        </w:rPr>
-        <w:t xml:space="preserve"> × </w:t>
-      </w:r>
-      <w:r>
-        <w:rPr>
-          <w:rFonts w:ascii="Cambria Math" w:hAnsi="Cambria Math"/>
-          <w:i/>
-          <w:sz w:val="22"/>
-        </w:rPr>
-        <w:t>f</w:t>
-      </w:r>
-      <w:r>
-        <w:rPr>
-          <w:rFonts w:ascii="Cambria Math" w:hAnsi="Cambria Math"/>
-          <w:i w:val="0"/>
-          <w:sz w:val="22"/>
-          <w:vertAlign w:val="subscript"/>
-        </w:rPr>
-        <w:t>seismic</w:t>
-      </w:r>
-      <w:r>
-        <w:rPr>
-          <w:rFonts w:ascii="Cambria Math" w:hAnsi="Cambria Math"/>
-          <w:i w:val="0"/>
-          <w:sz w:val="22"/>
-        </w:rPr>
-        <w:t xml:space="preserve"> × </w:t>
-      </w:r>
-      <w:r>
-        <w:rPr>
-          <w:rFonts w:ascii="Cambria Math" w:hAnsi="Cambria Math"/>
-          <w:i/>
-          <w:sz w:val="22"/>
-        </w:rPr>
-        <w:t>f</w:t>
-      </w:r>
-      <w:r>
-        <w:rPr>
-          <w:rFonts w:ascii="Cambria Math" w:hAnsi="Cambria Math"/>
-          <w:i w:val="0"/>
-          <w:sz w:val="22"/>
-          <w:vertAlign w:val="subscript"/>
-        </w:rPr>
-        <w:t>region</w:t>
-      </w:r>
+      <m:oMathPara>
+        <m:oMath>
+          <m:r>
+            <m:rPr>
+              <m:sty m:val="i"/>
+            </m:rPr>
+            <m:t xml:space="preserve">RCV</m:t>
+          </m:r>
+          <m:r>
+            <m:t xml:space="preserve"> = </m:t>
+          </m:r>
+          <m:sSub>
+            <m:e>
+              <m:r>
+                <m:rPr>
+                  <m:sty m:val="i"/>
+                </m:rPr>
+                <m:t xml:space="preserve">A</m:t>
+              </m:r>
+            </m:e>
+            <m:sub>
+              <m:r>
+                <m:t xml:space="preserve">deck</m:t>
+              </m:r>
+            </m:sub>
+          </m:sSub>
+          <m:r>
+            <m:t xml:space="preserve"> × </m:t>
+          </m:r>
+          <m:sSub>
+            <m:e>
+              <m:r>
+                <m:rPr>
+                  <m:sty m:val="i"/>
+                </m:rPr>
+                <m:t xml:space="preserve">C</m:t>
+              </m:r>
+            </m:e>
+            <m:sub>
+              <m:r>
+                <m:t xml:space="preserve">base</m:t>
+              </m:r>
+            </m:sub>
+          </m:sSub>
+          <m:r>
+            <m:t xml:space="preserve"> × </m:t>
+          </m:r>
+          <m:sSub>
+            <m:e>
+              <m:r>
+                <m:rPr>
+                  <m:sty m:val="i"/>
+                </m:rPr>
+                <m:t xml:space="preserve">f</m:t>
+              </m:r>
+            </m:e>
+            <m:sub>
+              <m:r>
+                <m:t xml:space="preserve">material</m:t>
+              </m:r>
+            </m:sub>
+          </m:sSub>
+          <m:r>
+            <m:t xml:space="preserve"> × </m:t>
+          </m:r>
+          <m:sSub>
+            <m:e>
+              <m:r>
+                <m:rPr>
+                  <m:sty m:val="i"/>
+                </m:rPr>
+                <m:t xml:space="preserve">f</m:t>
+              </m:r>
+            </m:e>
+            <m:sub>
+              <m:r>
+                <m:t xml:space="preserve">span</m:t>
+              </m:r>
+            </m:sub>
+          </m:sSub>
+          <m:r>
+            <m:t xml:space="preserve"> × </m:t>
+          </m:r>
+          <m:sSub>
+            <m:e>
+              <m:r>
+                <m:rPr>
+                  <m:sty m:val="i"/>
+                </m:rPr>
+                <m:t xml:space="preserve">f</m:t>
+              </m:r>
+            </m:e>
+            <m:sub>
+              <m:r>
+                <m:t xml:space="preserve">skew</m:t>
+              </m:r>
+            </m:sub>
+          </m:sSub>
+          <m:r>
+            <m:t xml:space="preserve"> × </m:t>
+          </m:r>
+          <m:sSub>
+            <m:e>
+              <m:r>
+                <m:rPr>
+                  <m:sty m:val="i"/>
+                </m:rPr>
+                <m:t xml:space="preserve">f</m:t>
+              </m:r>
+            </m:e>
+            <m:sub>
+              <m:r>
+                <m:t xml:space="preserve">seismic</m:t>
+              </m:r>
+            </m:sub>
+          </m:sSub>
+          <m:r>
+            <m:t xml:space="preserve"> × </m:t>
+          </m:r>
+          <m:sSub>
+            <m:e>
+              <m:r>
+                <m:rPr>
+                  <m:sty m:val="i"/>
+                </m:rPr>
+                <m:t xml:space="preserve">f</m:t>
+              </m:r>
+            </m:e>
+            <m:sub>
+              <m:r>
+                <m:t xml:space="preserve">region</m:t>
+              </m:r>
+            </m:sub>
+          </m:sSub>
+        </m:oMath>
+      </m:oMathPara>
     </w:p>
     <w:p>
       <w:r>
@@ -4009,35 +3859,64 @@
       </w:r>
     </w:p>
     <w:p>
-      <w:r>
-        <w:rPr>
-          <w:sz w:val="22"/>
-        </w:rPr>
-        <w:t xml:space="preserve">  - </w:t>
-      </w:r>
-      <w:r>
-        <w:rPr>
-          <w:rFonts w:ascii="Cambria Math" w:hAnsi="Cambria Math"/>
-          <w:i/>
-          <w:sz w:val="22"/>
-        </w:rPr>
-        <w:t>A</w:t>
-      </w:r>
-      <w:r>
-        <w:rPr>
-          <w:rFonts w:ascii="Cambria Math" w:hAnsi="Cambria Math"/>
-          <w:i w:val="0"/>
-          <w:sz w:val="22"/>
-          <w:vertAlign w:val="subscript"/>
-        </w:rPr>
-        <w:t>deck</w:t>
-      </w:r>
-      <w:r>
-        <w:rPr>
-          <w:sz w:val="22"/>
-        </w:rPr>
-        <w:t xml:space="preserve"> = structure_length (NBI Item 049) × deck_width (NBI Item 052), in m²</w:t>
-      </w:r>
+      <m:oMathPara>
+        <m:oMath>
+          <m:sSub>
+            <m:e>
+              <m:r>
+                <m:rPr>
+                  <m:sty m:val="i"/>
+                </m:rPr>
+                <m:t xml:space="preserve">A</m:t>
+              </m:r>
+            </m:e>
+            <m:sub>
+              <m:r>
+                <m:t xml:space="preserve">deck</m:t>
+              </m:r>
+            </m:sub>
+          </m:sSub>
+          <m:r>
+            <m:t xml:space="preserve"> = </m:t>
+          </m:r>
+          <m:sSub>
+            <m:e>
+              <m:r>
+                <m:rPr>
+                  <m:sty m:val="i"/>
+                </m:rPr>
+                <m:t xml:space="preserve">L</m:t>
+              </m:r>
+            </m:e>
+            <m:sub>
+              <m:r>
+                <m:t xml:space="preserve">structure</m:t>
+              </m:r>
+            </m:sub>
+          </m:sSub>
+          <m:r>
+            <m:t xml:space="preserve"> × </m:t>
+          </m:r>
+          <m:sSub>
+            <m:e>
+              <m:r>
+                <m:rPr>
+                  <m:sty m:val="i"/>
+                </m:rPr>
+                <m:t xml:space="preserve">W</m:t>
+              </m:r>
+            </m:e>
+            <m:sub>
+              <m:r>
+                <m:t xml:space="preserve">deck</m:t>
+              </m:r>
+            </m:sub>
+          </m:sSub>
+          <m:r>
+            <m:t xml:space="preserve">   [m²]</m:t>
+          </m:r>
+        </m:oMath>
+      </m:oMathPara>
     </w:p>
     <w:p>
       <w:r>
@@ -9311,162 +9190,76 @@
       </w:r>
     </w:p>
     <w:p>
-      <w:pPr>
-        <w:jc w:val="center"/>
-      </w:pPr>
-      <w:r>
-        <w:rPr>
-          <w:rFonts w:ascii="Cambria Math" w:hAnsi="Cambria Math"/>
-          <w:i/>
-          <w:sz w:val="22"/>
-        </w:rPr>
-        <w:t>E</w:t>
-      </w:r>
-      <w:r>
-        <w:rPr>
-          <w:rFonts w:ascii="Cambria Math" w:hAnsi="Cambria Math"/>
-          <w:i w:val="0"/>
-          <w:sz w:val="22"/>
-        </w:rPr>
-        <w:t>[</w:t>
-      </w:r>
-      <w:r>
-        <w:rPr>
-          <w:rFonts w:ascii="Cambria Math" w:hAnsi="Cambria Math"/>
-          <w:i/>
-          <w:sz w:val="22"/>
-        </w:rPr>
-        <w:t>Downtime</w:t>
-      </w:r>
-      <w:r>
-        <w:rPr>
-          <w:rFonts w:ascii="Cambria Math" w:hAnsi="Cambria Math"/>
-          <w:i w:val="0"/>
-          <w:sz w:val="22"/>
-        </w:rPr>
-        <w:t>]</w:t>
-      </w:r>
-      <w:r>
-        <w:rPr>
-          <w:rFonts w:ascii="Cambria Math" w:hAnsi="Cambria Math"/>
-          <w:i w:val="0"/>
-          <w:sz w:val="22"/>
-        </w:rPr>
-        <w:t xml:space="preserve"> = </w:t>
-      </w:r>
-      <w:r>
-        <w:rPr>
-          <w:rFonts w:ascii="Cambria Math" w:hAnsi="Cambria Math"/>
-          <w:i w:val="0"/>
-          <w:sz w:val="22"/>
-        </w:rPr>
-        <w:t>Σ</w:t>
-      </w:r>
-      <w:r>
-        <w:rPr>
-          <w:rFonts w:ascii="Cambria Math" w:hAnsi="Cambria Math"/>
-          <w:i w:val="0"/>
-          <w:sz w:val="22"/>
-          <w:vertAlign w:val="subscript"/>
-        </w:rPr>
-        <w:t>ds</w:t>
-      </w:r>
-      <w:r>
-        <w:rPr>
-          <w:rFonts w:ascii="Cambria Math" w:hAnsi="Cambria Math"/>
-          <w:i w:val="0"/>
-          <w:sz w:val="22"/>
-        </w:rPr>
-        <w:t xml:space="preserve"> </w:t>
-      </w:r>
-      <w:r>
-        <w:rPr>
-          <w:rFonts w:ascii="Cambria Math" w:hAnsi="Cambria Math"/>
-          <w:i/>
-          <w:sz w:val="22"/>
-        </w:rPr>
-        <w:t>P</w:t>
-      </w:r>
-      <w:r>
-        <w:rPr>
-          <w:rFonts w:ascii="Cambria Math" w:hAnsi="Cambria Math"/>
-          <w:i w:val="0"/>
-          <w:sz w:val="22"/>
-        </w:rPr>
-        <w:t>(</w:t>
-      </w:r>
-      <w:r>
-        <w:rPr>
-          <w:rFonts w:ascii="Cambria Math" w:hAnsi="Cambria Math"/>
-          <w:i/>
-          <w:sz w:val="22"/>
-        </w:rPr>
-        <w:t>DS</w:t>
-      </w:r>
-      <w:r>
-        <w:rPr>
-          <w:rFonts w:ascii="Cambria Math" w:hAnsi="Cambria Math"/>
-          <w:i w:val="0"/>
-          <w:sz w:val="22"/>
-        </w:rPr>
-        <w:t xml:space="preserve"> = </w:t>
-      </w:r>
-      <w:r>
-        <w:rPr>
-          <w:rFonts w:ascii="Cambria Math" w:hAnsi="Cambria Math"/>
-          <w:i/>
-          <w:sz w:val="22"/>
-        </w:rPr>
-        <w:t>ds</w:t>
-      </w:r>
-      <w:r>
-        <w:rPr>
-          <w:rFonts w:ascii="Cambria Math" w:hAnsi="Cambria Math"/>
-          <w:i w:val="0"/>
-          <w:sz w:val="22"/>
-        </w:rPr>
-        <w:t>)</w:t>
-      </w:r>
-      <w:r>
-        <w:rPr>
-          <w:rFonts w:ascii="Cambria Math" w:hAnsi="Cambria Math"/>
-          <w:i w:val="0"/>
-          <w:sz w:val="22"/>
-        </w:rPr>
-        <w:t xml:space="preserve"> × </w:t>
-      </w:r>
-      <w:r>
-        <w:rPr>
-          <w:rFonts w:ascii="Cambria Math" w:hAnsi="Cambria Math"/>
-          <w:i/>
-          <w:sz w:val="22"/>
-        </w:rPr>
-        <w:t>DT</w:t>
-      </w:r>
-      <w:r>
-        <w:rPr>
-          <w:rFonts w:ascii="Cambria Math" w:hAnsi="Cambria Math"/>
-          <w:i w:val="0"/>
-          <w:sz w:val="22"/>
-        </w:rPr>
-        <w:t>(</w:t>
-      </w:r>
-      <w:r>
-        <w:rPr>
-          <w:rFonts w:ascii="Cambria Math" w:hAnsi="Cambria Math"/>
-          <w:i/>
-          <w:sz w:val="22"/>
-        </w:rPr>
-        <w:t>ds</w:t>
-      </w:r>
-      <w:r>
-        <w:rPr>
-          <w:rFonts w:ascii="Cambria Math" w:hAnsi="Cambria Math"/>
-          <w:i w:val="0"/>
-          <w:sz w:val="22"/>
-        </w:rPr>
-        <w:t>)</w:t>
-      </w:r>
+      <m:oMathPara>
+        <m:oMath>
+          <m:r>
+            <m:rPr>
+              <m:sty m:val="i"/>
+            </m:rPr>
+            <m:t xml:space="preserve">E</m:t>
+          </m:r>
+          <m:r>
+            <m:t xml:space="preserve">[</m:t>
+          </m:r>
+          <m:r>
+            <m:rPr>
+              <m:sty m:val="i"/>
+            </m:rPr>
+            <m:t xml:space="preserve">Downtime</m:t>
+          </m:r>
+          <m:r>
+            <m:t xml:space="preserve">] = </m:t>
+          </m:r>
+          <m:r>
+            <m:t xml:space="preserve">Σ </m:t>
+          </m:r>
+          <m:r>
+            <m:rPr>
+              <m:sty m:val="i"/>
+            </m:rPr>
+            <m:t xml:space="preserve">P</m:t>
+          </m:r>
+          <m:r>
+            <m:t xml:space="preserve">(</m:t>
+          </m:r>
+          <m:r>
+            <m:rPr>
+              <m:sty m:val="i"/>
+            </m:rPr>
+            <m:t xml:space="preserve">DS</m:t>
+          </m:r>
+          <m:r>
+            <m:t xml:space="preserve"> = </m:t>
+          </m:r>
+          <m:r>
+            <m:rPr>
+              <m:sty m:val="i"/>
+            </m:rPr>
+            <m:t xml:space="preserve">ds</m:t>
+          </m:r>
+          <m:r>
+            <m:t xml:space="preserve">) × </m:t>
+          </m:r>
+          <m:r>
+            <m:rPr>
+              <m:sty m:val="i"/>
+            </m:rPr>
+            <m:t xml:space="preserve">DT</m:t>
+          </m:r>
+          <m:r>
+            <m:t xml:space="preserve">(</m:t>
+          </m:r>
+          <m:r>
+            <m:rPr>
+              <m:sty m:val="i"/>
+            </m:rPr>
+            <m:t xml:space="preserve">ds</m:t>
+          </m:r>
+          <m:r>
+            <m:t xml:space="preserve">)</m:t>
+          </m:r>
+        </m:oMath>
+      </m:oMathPara>
     </w:p>
     <w:p>
       <w:r>

</xml_diff>

<commit_message>
Convert variable definitions to inline Word equation objects
Section 9.6.1 'Where:' list now uses inline OMML equations for variable
names (A_deck, C_base, f_material, f_span, f_skew, f_seismic, f_region)
with descriptive text and specific factor values after each.

7 definitions converted from plain text to equation + description format.

Co-Authored-By: Claude Opus 4.6 (1M context) <noreply@anthropic.com>
</commit_message>
<xml_diff>
--- a/CAT411_Technical_Documentation.docx
+++ b/CAT411_Technical_Documentation.docx
@@ -3920,32 +3920,188 @@
     </w:p>
     <w:p>
       <w:r>
-        <w:t xml:space="preserve">  - base_unit_cost = FHWA 2024 state-level blended rate ($/m2)</w:t>
-      </w:r>
-    </w:p>
-    <w:p>
-      <w:r>
-        <w:t xml:space="preserve">  - f_material = material-type adjustment (concrete, steel, prestressed, wood)</w:t>
-      </w:r>
-    </w:p>
-    <w:p>
-      <w:r>
-        <w:t xml:space="preserve">  - f_span = max span length complexity factor (NBI Item 048)</w:t>
-      </w:r>
-    </w:p>
-    <w:p>
-      <w:r>
-        <w:t xml:space="preserve">  - f_skew = skew angle construction difficulty factor (NBI Item 034)</w:t>
-      </w:r>
-    </w:p>
-    <w:p>
-      <w:r>
-        <w:t xml:space="preserve">  - f_seismic = seismic design era factor (from year_built, NBI Item 027)</w:t>
-      </w:r>
-    </w:p>
-    <w:p>
-      <w:r>
-        <w:t xml:space="preserve">  - f_region = regional cost adjustment (default 1.0, since base rate is state-specific)</w:t>
+        <w:rPr>
+          <w:sz w:val="22"/>
+        </w:rPr>
+        <w:t xml:space="preserve">  </w:t>
+      </w:r>
+      <m:oMath>
+        <m:sSub>
+          <m:e>
+            <m:r>
+              <m:rPr>
+                <m:sty m:val="i"/>
+              </m:rPr>
+              <m:t xml:space="preserve">C</m:t>
+            </m:r>
+          </m:e>
+          <m:sub>
+            <m:r>
+              <m:t xml:space="preserve">base</m:t>
+            </m:r>
+          </m:sub>
+        </m:sSub>
+      </m:oMath>
+      <w:r>
+        <w:rPr>
+          <w:sz w:val="22"/>
+        </w:rPr>
+        <w:t xml:space="preserve"> = FHWA 2024 state-level blended rate ($/m²). Default: $5,005/m² for California NHS bridges.</w:t>
+      </w:r>
+    </w:p>
+    <w:p>
+      <w:r>
+        <w:rPr>
+          <w:sz w:val="22"/>
+        </w:rPr>
+        <w:t xml:space="preserve">  </w:t>
+      </w:r>
+      <m:oMath>
+        <m:sSub>
+          <m:e>
+            <m:r>
+              <m:rPr>
+                <m:sty m:val="i"/>
+              </m:rPr>
+              <m:t xml:space="preserve">f</m:t>
+            </m:r>
+          </m:e>
+          <m:sub>
+            <m:r>
+              <m:t xml:space="preserve">material</m:t>
+            </m:r>
+          </m:sub>
+        </m:sSub>
+      </m:oMath>
+      <w:r>
+        <w:rPr>
+          <w:sz w:val="22"/>
+        </w:rPr>
+        <w:t xml:space="preserve"> = material-type adjustment factor. Concrete = 0.90, Steel = 1.15, Prestressed = 1.00, Wood = 0.65, Other = 0.95.</w:t>
+      </w:r>
+    </w:p>
+    <w:p>
+      <w:r>
+        <w:rPr>
+          <w:sz w:val="22"/>
+        </w:rPr>
+        <w:t xml:space="preserve">  </w:t>
+      </w:r>
+      <m:oMath>
+        <m:sSub>
+          <m:e>
+            <m:r>
+              <m:rPr>
+                <m:sty m:val="i"/>
+              </m:rPr>
+              <m:t xml:space="preserve">f</m:t>
+            </m:r>
+          </m:e>
+          <m:sub>
+            <m:r>
+              <m:t xml:space="preserve">span</m:t>
+            </m:r>
+          </m:sub>
+        </m:sSub>
+      </m:oMath>
+      <w:r>
+        <w:rPr>
+          <w:sz w:val="22"/>
+        </w:rPr>
+        <w:t xml:space="preserve"> = span complexity factor based on max span length (NBI Item 048). Values: &lt;30m = 1.00, 30–60m = 1.10, 60–120m = 1.25, &gt;120m = 1.50.</w:t>
+      </w:r>
+    </w:p>
+    <w:p>
+      <w:r>
+        <w:rPr>
+          <w:sz w:val="22"/>
+        </w:rPr>
+        <w:t xml:space="preserve">  </w:t>
+      </w:r>
+      <m:oMath>
+        <m:sSub>
+          <m:e>
+            <m:r>
+              <m:rPr>
+                <m:sty m:val="i"/>
+              </m:rPr>
+              <m:t xml:space="preserve">f</m:t>
+            </m:r>
+          </m:e>
+          <m:sub>
+            <m:r>
+              <m:t xml:space="preserve">skew</m:t>
+            </m:r>
+          </m:sub>
+        </m:sSub>
+      </m:oMath>
+      <w:r>
+        <w:rPr>
+          <w:sz w:val="22"/>
+        </w:rPr>
+        <w:t xml:space="preserve"> = skew angle construction difficulty factor (NBI Item 034). Values: &lt;15° = 1.00, 15–30° = 1.05, 30–45° = 1.10, &gt;45° = 1.20.</w:t>
+      </w:r>
+    </w:p>
+    <w:p>
+      <w:r>
+        <w:rPr>
+          <w:sz w:val="22"/>
+        </w:rPr>
+        <w:t xml:space="preserve">  </w:t>
+      </w:r>
+      <m:oMath>
+        <m:sSub>
+          <m:e>
+            <m:r>
+              <m:rPr>
+                <m:sty m:val="i"/>
+              </m:rPr>
+              <m:t xml:space="preserve">f</m:t>
+            </m:r>
+          </m:e>
+          <m:sub>
+            <m:r>
+              <m:t xml:space="preserve">seismic</m:t>
+            </m:r>
+          </m:sub>
+        </m:sSub>
+      </m:oMath>
+      <w:r>
+        <w:rPr>
+          <w:sz w:val="22"/>
+        </w:rPr>
+        <w:t xml:space="preserve"> = seismic design era factor from year_built (NBI Item 027). Pre-1975 = 1.00, 1975–1990 = 1.10, Post-1990 = 1.15.</w:t>
+      </w:r>
+    </w:p>
+    <w:p>
+      <w:r>
+        <w:rPr>
+          <w:sz w:val="22"/>
+        </w:rPr>
+        <w:t xml:space="preserve">  </w:t>
+      </w:r>
+      <m:oMath>
+        <m:sSub>
+          <m:e>
+            <m:r>
+              <m:rPr>
+                <m:sty m:val="i"/>
+              </m:rPr>
+              <m:t xml:space="preserve">f</m:t>
+            </m:r>
+          </m:e>
+          <m:sub>
+            <m:r>
+              <m:t xml:space="preserve">region</m:t>
+            </m:r>
+          </m:sub>
+        </m:sSub>
+      </m:oMath>
+      <w:r>
+        <w:rPr>
+          <w:sz w:val="22"/>
+        </w:rPr>
+        <w:t xml:space="preserve"> = regional cost adjustment (default 1.0, since base rate is already state-specific).</w:t>
       </w:r>
     </w:p>
     <w:p>
@@ -8749,7 +8905,69 @@
     </w:p>
     <w:p>
       <w:r>
-        <w:t xml:space="preserve">  deck_area = structure_length (NBI 049) x deck_width (NBI 052)  [m2]</w:t>
+        <w:rPr>
+          <w:sz w:val="22"/>
+        </w:rPr>
+        <w:t xml:space="preserve">  </w:t>
+      </w:r>
+      <m:oMath>
+        <m:sSub>
+          <m:e>
+            <m:r>
+              <m:rPr>
+                <m:sty m:val="i"/>
+              </m:rPr>
+              <m:t xml:space="preserve">A</m:t>
+            </m:r>
+          </m:e>
+          <m:sub>
+            <m:r>
+              <m:t xml:space="preserve">deck</m:t>
+            </m:r>
+          </m:sub>
+        </m:sSub>
+        <m:r>
+          <m:t xml:space="preserve"> = </m:t>
+        </m:r>
+        <m:sSub>
+          <m:e>
+            <m:r>
+              <m:rPr>
+                <m:sty m:val="i"/>
+              </m:rPr>
+              <m:t xml:space="preserve">L</m:t>
+            </m:r>
+          </m:e>
+          <m:sub>
+            <m:r>
+              <m:t xml:space="preserve">structure</m:t>
+            </m:r>
+          </m:sub>
+        </m:sSub>
+        <m:r>
+          <m:t xml:space="preserve"> × </m:t>
+        </m:r>
+        <m:sSub>
+          <m:e>
+            <m:r>
+              <m:rPr>
+                <m:sty m:val="i"/>
+              </m:rPr>
+              <m:t xml:space="preserve">W</m:t>
+            </m:r>
+          </m:e>
+          <m:sub>
+            <m:r>
+              <m:t xml:space="preserve">deck</m:t>
+            </m:r>
+          </m:sub>
+        </m:sSub>
+      </m:oMath>
+      <w:r>
+        <w:rPr>
+          <w:sz w:val="22"/>
+        </w:rPr>
+        <w:t xml:space="preserve">  (NBI Item 049 × NBI Item 052), in m²</w:t>
       </w:r>
     </w:p>
     <w:p/>

</xml_diff>